<commit_message>
Complete report with student Mac Q5 results and screenshots
</commit_message>
<xml_diff>
--- a/Floating_Point_Report_Q0.docx
+++ b/Floating_Point_Report_Q0.docx
@@ -123,7 +123,7 @@
         </w:rPr>
       </w:pPr>
       <w:r>
-        <w:t>本報告整理我於 2026/10/04 親自執行的 Windows／WSL 實驗與截圖。Windows 採集時間為 20:07:12；WSL 批次於 20:13:49 開始，結果目錄為 results/linux-20261004-201349，executed_by=student，failed_experiments=0。所有數據由此批次讀取；助手先前的試跑不混入表格。Mac Q5 的本人重跑與截圖尚待補入。</w:t>
+        <w:t>本報告整理我於 2026/10/04 親自執行的 Windows／WSL 與 Mac Q5 實驗。Windows 採集時間為 20:07:12；WSL 批次於 20:13:49 開始，結果目錄為 results/linux-20261004-201349。Mac Q5 於 21:10:48 開始，結果目錄為 results/q5-darwin-20261004-211048-student-wdBjAR。兩批皆標示 executed_by=student，failed_experiments=0；助手試跑不混入本人數據。</w:t>
       </w:r>
     </w:p>
     <w:p>
@@ -344,16 +344,8 @@
             <w:shd w:fill="E8EDF2"/>
           </w:tcPr>
           <w:p>
-            <w:pPr>
-              <w:keepNext w:val="0"/>
-              <w:spacing w:before="60" w:after="60"/>
-            </w:pPr>
-            <w:r>
-              <w:rPr>
-                <w:b/>
-                <w:sz w:val="20"/>
-              </w:rPr>
-              <w:t>輔助平台（本人提供）</w:t>
+            <w:r>
+              <w:t>輔助平台（本人實測）</w:t>
             </w:r>
           </w:p>
         </w:tc>
@@ -584,16 +576,8 @@
             <w:shd w:fill="FFFFFF"/>
           </w:tcPr>
           <w:p>
-            <w:pPr>
-              <w:keepNext w:val="0"/>
-              <w:spacing w:after="60" w:before="60"/>
-            </w:pPr>
-            <w:r>
-              <w:rPr>
-                <w:b w:val="0"/>
-                <w:sz w:val="20"/>
-              </w:rPr>
-              <w:t>aarch64-apple-darwin27（先前 Mac 助手紀錄）</w:t>
+            <w:r>
+              <w:t>aarch64-apple-darwin27</w:t>
             </w:r>
           </w:p>
         </w:tc>
@@ -666,18 +650,10 @@
             <w:shd w:fill="F7F8FA"/>
           </w:tcPr>
           <w:p>
-            <w:pPr>
-              <w:keepNext w:val="0"/>
-              <w:spacing w:after="60" w:before="60"/>
-            </w:pPr>
-            <w:r>
-              <w:rPr>
-                <w:b w:val="0"/>
-                <w:sz w:val="20"/>
-              </w:rPr>
-              <w:t>macOS 27.0.1，build 26A434</w:t>
+            <w:r>
+              <w:t>macOS 27.0.1</w:t>
               <w:br/>
-              <w:t>先前助手採集；本人 Q5 待補</w:t>
+              <w:t>Build 26A434</w:t>
             </w:r>
           </w:p>
         </w:tc>
@@ -830,18 +806,10 @@
             <w:shd w:fill="F7F8FA"/>
           </w:tcPr>
           <w:p>
-            <w:pPr>
-              <w:keepNext w:val="0"/>
-              <w:spacing w:after="60" w:before="60"/>
-            </w:pPr>
-            <w:r>
-              <w:rPr>
-                <w:b w:val="0"/>
-                <w:sz w:val="20"/>
-              </w:rPr>
+            <w:r>
               <w:t>GNU GCC 16.2.0</w:t>
               <w:br/>
-              <w:t>Homebrew；本人重跑待補</w:t>
+              <w:t>Homebrew GCC 16.2.0</w:t>
             </w:r>
           </w:p>
         </w:tc>
@@ -916,16 +884,10 @@
             <w:shd w:fill="FFFFFF"/>
           </w:tcPr>
           <w:p>
-            <w:pPr>
-              <w:keepNext w:val="0"/>
-              <w:spacing w:after="60" w:before="60"/>
-            </w:pPr>
-            <w:r>
-              <w:rPr>
-                <w:b w:val="0"/>
-                <w:sz w:val="20"/>
-              </w:rPr>
-              <w:t>Q5 將使用相同旗標</w:t>
+            <w:r>
+              <w:t>Q5 使用相同旗標</w:t>
+              <w:br/>
+              <w:t>-O2 -frounding-math</w:t>
             </w:r>
           </w:p>
         </w:tc>
@@ -998,16 +960,8 @@
             <w:shd w:fill="F7F8FA"/>
           </w:tcPr>
           <w:p>
-            <w:pPr>
-              <w:keepNext w:val="0"/>
-              <w:spacing w:before="60" w:after="60"/>
-            </w:pPr>
-            <w:r>
-              <w:rPr>
-                <w:b w:val="0"/>
-                <w:sz w:val="20"/>
-              </w:rPr>
-              <w:t>待採集</w:t>
+            <w:r>
+              <w:t>實體核心 10／執行緒 10</w:t>
             </w:r>
           </w:p>
         </w:tc>
@@ -1080,16 +1034,10 @@
             <w:shd w:fill="FFFFFF"/>
           </w:tcPr>
           <w:p>
-            <w:pPr>
-              <w:keepNext w:val="0"/>
-              <w:spacing w:before="60" w:after="60"/>
-            </w:pPr>
-            <w:r>
-              <w:rPr>
-                <w:b w:val="0"/>
-                <w:sz w:val="20"/>
-              </w:rPr>
-              <w:t>24 GB（本人提供）</w:t>
+            <w:r>
+              <w:t>25,769,803,776 bytes</w:t>
+              <w:br/>
+              <w:t>24 GiB（sysctl 實測）</w:t>
             </w:r>
           </w:p>
         </w:tc>
@@ -1162,16 +1110,10 @@
             <w:shd w:fill="F7F8FA"/>
           </w:tcPr>
           <w:p>
-            <w:pPr>
-              <w:keepNext w:val="0"/>
-              <w:spacing w:before="60" w:after="60"/>
-            </w:pPr>
-            <w:r>
-              <w:rPr>
-                <w:b w:val="0"/>
-                <w:sz w:val="20"/>
-              </w:rPr>
-              <w:t>不適用／Darwin kernel 待採集</w:t>
+            <w:r>
+              <w:t>Darwin 27.0.0</w:t>
+              <w:br/>
+              <w:t>ARM64_T8132</w:t>
             </w:r>
           </w:p>
         </w:tc>
@@ -1244,16 +1186,10 @@
             <w:shd w:fill="FFFFFF"/>
           </w:tcPr>
           <w:p>
-            <w:pPr>
-              <w:keepNext w:val="0"/>
-              <w:spacing w:after="60" w:before="60"/>
-            </w:pPr>
-            <w:r>
-              <w:rPr>
-                <w:b w:val="0"/>
-                <w:sz w:val="20"/>
-              </w:rPr>
-              <w:t>本人實際連結紀錄待補</w:t>
+            <w:r>
+              <w:t>Homebrew libstdc++.6.dylib</w:t>
+              <w:br/>
+              <w:t>系統 libSystem.B.dylib</w:t>
             </w:r>
           </w:p>
         </w:tc>
@@ -1326,18 +1262,10 @@
             <w:shd w:fill="F7F8FA"/>
           </w:tcPr>
           <w:p>
-            <w:pPr>
-              <w:keepNext w:val="0"/>
-              <w:spacing w:after="60" w:before="60"/>
-            </w:pPr>
-            <w:r>
-              <w:rPr>
-                <w:b w:val="0"/>
-                <w:sz w:val="20"/>
-              </w:rPr>
-              <w:t>裝置資訊由本人提供</w:t>
+            <w:r>
+              <w:t>本人 Q5：2026/10/04 21:10:48</w:t>
               <w:br/>
-              <w:t>本人 Q5 執行時間／電源待補</w:t>
+              <w:t>電源狀態未採集</w:t>
             </w:r>
           </w:p>
         </w:tc>
@@ -2294,6 +2222,70 @@
     <w:p>
       <w:r>
         <w:t>本次型態表與正式數據均使用 GCC 16.2.0。__float128 只偵測大小，未做其計算或效能比較。</w:t>
+      </w:r>
+    </w:p>
+    <w:p>
+      <w:pPr>
+        <w:pStyle w:val="21"/>
+        <w:pageBreakBefore/>
+      </w:pPr>
+      <w:r>
+        <w:t>Mac 本人環境採集</w:t>
+      </w:r>
+    </w:p>
+    <w:p>
+      <w:pPr>
+        <w:keepNext/>
+      </w:pPr>
+      <w:r>
+        <w:drawing>
+          <wp:inline xmlns:a="http://schemas.openxmlformats.org/drawingml/2006/main" xmlns:pic="http://schemas.openxmlformats.org/drawingml/2006/picture">
+            <wp:extent cx="5943600" cy="2785866"/>
+            <wp:docPr id="19" name="Picture 19"/>
+            <wp:cNvGraphicFramePr>
+              <a:graphicFrameLocks noChangeAspect="1"/>
+            </wp:cNvGraphicFramePr>
+            <a:graphic>
+              <a:graphicData uri="http://schemas.openxmlformats.org/drawingml/2006/picture">
+                <pic:pic>
+                  <pic:nvPicPr>
+                    <pic:cNvPr id="0" name="截圖 2026-10-04 晚上9.15.04.png"/>
+                    <pic:cNvPicPr/>
+                  </pic:nvPicPr>
+                  <pic:blipFill>
+                    <a:blip r:embed="rId27"/>
+                    <a:stretch>
+                      <a:fillRect/>
+                    </a:stretch>
+                  </pic:blipFill>
+                  <pic:spPr>
+                    <a:xfrm>
+                      <a:off x="0" y="0"/>
+                      <a:ext cx="5943600" cy="2785866"/>
+                    </a:xfrm>
+                    <a:prstGeom prst="rect"/>
+                  </pic:spPr>
+                </pic:pic>
+              </a:graphicData>
+            </a:graphic>
+          </wp:inline>
+        </w:drawing>
+      </w:r>
+    </w:p>
+    <w:p>
+      <w:pPr>
+        <w:spacing w:after="200"/>
+      </w:pPr>
+      <w:r>
+        <w:rPr>
+          <w:sz w:val="18"/>
+        </w:rPr>
+        <w:t>圖 0-5 Mac 本人 macOS build、M4 核心／記憶體、GCC 16.2.0 與 target。（原檔：截圖 2026-10-04 晚上9.15.04.png）</w:t>
+      </w:r>
+    </w:p>
+    <w:p>
+      <w:r>
+        <w:t>本次 Mac 的 Q5 由原生 arm64 程式執行。sysctl 的 hw.model 為 Mac16,12；完整 uname、otool runtime 依賴與 Xcode SDK 路徑保存在本人結果目錄。電源與溫度未採集；本次 Mac 不提供效能計時比較。</w:t>
       </w:r>
     </w:p>
     <w:p>
@@ -8625,7 +8617,7 @@
         </w:rPr>
       </w:pPr>
       <w:r>
-        <w:t>本節的 Windows／WSL 部分已由本人完成。A 使用同一 binary、同一數值輸入，只更動 rounding environment；B 準備用 GNU GCC 16.2.0、同 source／flags，在兩平台 nearest 下比較 long double ABI。Mac 先前助手測試可用於流程預檢，但本報告的本人跨平台結論暫不完成，等本人在 Mac 重跑並截圖後補入。</w:t>
+        <w:t>本人已在 Windows／WSL 與 Apple M4 Mac 完成 Q5。案例 A 使用各平台的同一 binary、同一輸入，只改變 rounding environment；案例 B 使用相同 Q5／common 來源、GNU GCC release 16.2.0 與逐字相同旗標，在 nearest 下比較 long double ABI。pair checker 的 compiler family、version、flags 與 source 四項皆 MATCH；完整版本與 vendor configuration 另存於原始資料，兩端不是同一 compiler binary。</w:t>
       </w:r>
     </w:p>
     <w:tbl>
@@ -8760,16 +8752,10 @@
             <w:shd w:fill="FFFFFF"/>
           </w:tcPr>
           <w:p>
-            <w:pPr>
-              <w:keepNext w:val="0"/>
-              <w:spacing w:after="60" w:before="60"/>
-            </w:pPr>
-            <w:r>
-              <w:rPr>
-                <w:b w:val="0"/>
-                <w:sz w:val="19"/>
-              </w:rPr>
-              <w:t>待本人跑後用 pair checker 核對</w:t>
+            <w:r>
+              <w:t>Q5／common 四個來源 SHA-256</w:t>
+              <w:br/>
+              <w:t>與本人 WSL 全部 MATCH</w:t>
             </w:r>
           </w:p>
         </w:tc>
@@ -8824,16 +8810,10 @@
             <w:shd w:fill="F7F8FA"/>
           </w:tcPr>
           <w:p>
-            <w:pPr>
-              <w:keepNext w:val="0"/>
-              <w:spacing w:after="60" w:before="60"/>
-            </w:pPr>
-            <w:r>
-              <w:rPr>
-                <w:b w:val="0"/>
-                <w:sz w:val="19"/>
-              </w:rPr>
-              <w:t>預定 Homebrew GNU GCC 16.2.0</w:t>
+            <w:r>
+              <w:t>GNU GCC 16.2.0</w:t>
+              <w:br/>
+              <w:t>Homebrew build</w:t>
             </w:r>
           </w:p>
         </w:tc>
@@ -8886,16 +8866,8 @@
             <w:shd w:fill="FFFFFF"/>
           </w:tcPr>
           <w:p>
-            <w:pPr>
-              <w:keepNext w:val="0"/>
-              <w:spacing w:after="60" w:before="60"/>
-            </w:pPr>
-            <w:r>
-              <w:rPr>
-                <w:b w:val="0"/>
-                <w:sz w:val="19"/>
-              </w:rPr>
-              <w:t>必須使用同旗標；待紀錄</w:t>
+            <w:r>
+              <w:t>-std=c++20 -Wall -Wextra -fno-lto -ffp-contract=off -O2 -fno-fast-math -frounding-math</w:t>
             </w:r>
           </w:p>
         </w:tc>
@@ -8948,16 +8920,8 @@
             <w:shd w:fill="F7F8FA"/>
           </w:tcPr>
           <w:p>
-            <w:pPr>
-              <w:keepNext w:val="0"/>
-              <w:spacing w:after="60" w:before="60"/>
-            </w:pPr>
-            <w:r>
-              <w:rPr>
-                <w:b w:val="0"/>
-                <w:sz w:val="19"/>
-              </w:rPr>
-              <w:t>待本人執行採集</w:t>
+            <w:r>
+              <w:t>aarch64-apple-darwin27</w:t>
             </w:r>
           </w:p>
         </w:tc>
@@ -9012,16 +8976,10 @@
             <w:shd w:fill="FFFFFF"/>
           </w:tcPr>
           <w:p>
-            <w:pPr>
-              <w:keepNext w:val="0"/>
-              <w:spacing w:after="60" w:before="60"/>
-            </w:pPr>
-            <w:r>
-              <w:rPr>
-                <w:b w:val="0"/>
-                <w:sz w:val="19"/>
-              </w:rPr>
-              <w:t>待本人結果與截圖</w:t>
+            <w:r>
+              <w:t>long double 8 bytes／53 digits</w:t>
+              <w:br/>
+              <w:t>(2^53+1)-2^53 = 0</w:t>
             </w:r>
           </w:p>
         </w:tc>
@@ -9076,16 +9034,10 @@
             <w:shd w:fill="F7F8FA"/>
           </w:tcPr>
           <w:p>
-            <w:pPr>
-              <w:keepNext w:val="0"/>
-              <w:spacing w:after="60" w:before="60"/>
-            </w:pPr>
-            <w:r>
-              <w:rPr>
-                <w:b w:val="0"/>
-                <w:sz w:val="19"/>
-              </w:rPr>
-              <w:t>待本人實際依賴紀錄</w:t>
+            <w:r>
+              <w:t>macOS 27.0.1／Darwin 27.0.0</w:t>
+              <w:br/>
+              <w:t>Homebrew libstdc++、libSystem</w:t>
             </w:r>
           </w:p>
         </w:tc>
@@ -9116,7 +9068,7 @@
         </w:rPr>
       </w:pPr>
       <w:r>
-        <w:t>候選 A：add_double(1.0, 2^-53)，以 HW2_ROUNDING 選 mode；候選 B：nearest 下對 long double 計算 (2^53+1)-2^53，加法結果明確存回型態。獨立函式、關閉 LTO、-frounding-math 保留執行期運算；本案例不使用越界、未初始化值、資料競爭等一般 C++ UB。Windows 結果已採集；Mac 本人對照待補。[2]</w:t>
+        <w:t>案例 A：add_double(1.0, 2^-53)，以 HW2_ROUNDING 選 mode；案例 B：nearest 下以 long double 計算 (2^53+1)-2^53，加法結果經 memory barrier 明確存回型態。輸入有限且不溢位，不使用越界、未初始化值或資料競爭；使用本機 GCC 支援的 inline asm，並核對兩端實際產生碼。獨立函式、關閉 LTO 與 fast-math，使本例的加法、儲存與減法仍可觀察。[2]</w:t>
       </w:r>
     </w:p>
     <w:p>
@@ -9238,7 +9190,540 @@
         </w:rPr>
       </w:pPr>
       <w:r>
-        <w:t>Mac 待補：在專案根目錄執行 CXX=g++-16 bash scripts/run_q5.sh run，保存本人 q5-nearest.txt、版本／flags／來源雜湊與截圖，再與本次 Windows 目錄執行 verify_q5_pair.py。不得以已保存的 Mac assistant 紀錄冒充本人執行。</w:t>
+        <w:t>Mac 本人採集目錄：results/q5-darwin-20261004-211048-student-wdBjAR。下列新增證據均來自本人執行與截圖；先前 assistant 目錄只保留為流程預檢。正式命令：CXX=g++-16 bash scripts/run_q5.sh run；核對命令：python3 scripts/verify_q5_pair.py results/linux-20261004-201349 results/q5-darwin-20261004-211048-student-wdBjAR。</w:t>
+      </w:r>
+    </w:p>
+    <w:p>
+      <w:pPr>
+        <w:keepNext/>
+      </w:pPr>
+      <w:r>
+        <w:drawing>
+          <wp:inline xmlns:a="http://schemas.openxmlformats.org/drawingml/2006/main" xmlns:pic="http://schemas.openxmlformats.org/drawingml/2006/picture">
+            <wp:extent cx="5943600" cy="976001"/>
+            <wp:docPr id="20" name="Picture 20"/>
+            <wp:cNvGraphicFramePr>
+              <a:graphicFrameLocks noChangeAspect="1"/>
+            </wp:cNvGraphicFramePr>
+            <a:graphic>
+              <a:graphicData uri="http://schemas.openxmlformats.org/drawingml/2006/picture">
+                <pic:pic>
+                  <pic:nvPicPr>
+                    <pic:cNvPr id="0" name="截圖 2026-10-04 晚上9.15.48.png"/>
+                    <pic:cNvPicPr/>
+                  </pic:nvPicPr>
+                  <pic:blipFill>
+                    <a:blip r:embed="rId28"/>
+                    <a:stretch>
+                      <a:fillRect/>
+                    </a:stretch>
+                  </pic:blipFill>
+                  <pic:spPr>
+                    <a:xfrm>
+                      <a:off x="0" y="0"/>
+                      <a:ext cx="5943600" cy="976001"/>
+                    </a:xfrm>
+                    <a:prstGeom prst="rect"/>
+                  </pic:spPr>
+                </pic:pic>
+              </a:graphicData>
+            </a:graphic>
+          </wp:inline>
+        </w:drawing>
+      </w:r>
+    </w:p>
+    <w:p>
+      <w:pPr>
+        <w:spacing w:after="200"/>
+      </w:pPr>
+      <w:r>
+        <w:rPr>
+          <w:sz w:val="18"/>
+        </w:rPr>
+        <w:t>圖 5-3 本人兩端 GCC family／release、逐字旗標與來源的四項 MATCH。（原檔：截圖 2026-10-04 晚上9.15.48.png）</w:t>
+      </w:r>
+    </w:p>
+    <w:p>
+      <w:pPr>
+        <w:pStyle w:val="21"/>
+      </w:pPr>
+      <w:r>
+        <w:t>兩平台本人 Q5 結果對照</w:t>
+      </w:r>
+    </w:p>
+    <w:tbl>
+      <w:tblPr>
+        <w:tblW w:type="auto" w:w="0"/>
+        <w:tblLook w:firstColumn="1" w:firstRow="1" w:lastColumn="0" w:lastRow="0" w:noHBand="0" w:noVBand="1" w:val="04A0"/>
+      </w:tblPr>
+      <w:tblGrid>
+        <w:gridCol w:w="3312"/>
+        <w:gridCol w:w="3312"/>
+        <w:gridCol w:w="3312"/>
+      </w:tblGrid>
+      <w:tr>
+        <w:trPr>
+          <w:tblHeader/>
+        </w:trPr>
+        <w:tc>
+          <w:tcPr>
+            <w:tcW w:type="dxa" w:w="4176"/>
+            <w:shd w:fill="E8EDF2"/>
+          </w:tcPr>
+          <w:p>
+            <w:pPr>
+              <w:spacing w:after="60"/>
+            </w:pPr>
+            <w:r>
+              <w:rPr>
+                <w:b/>
+                <w:sz w:val="20"/>
+              </w:rPr>
+              <w:t>觀察</w:t>
+            </w:r>
+          </w:p>
+        </w:tc>
+        <w:tc>
+          <w:tcPr>
+            <w:tcW w:type="dxa" w:w="2592"/>
+            <w:shd w:fill="E8EDF2"/>
+          </w:tcPr>
+          <w:p>
+            <w:pPr>
+              <w:spacing w:after="60"/>
+            </w:pPr>
+            <w:r>
+              <w:rPr>
+                <w:b/>
+                <w:sz w:val="20"/>
+              </w:rPr>
+              <w:t>Windows／WSL 本人</w:t>
+            </w:r>
+          </w:p>
+        </w:tc>
+        <w:tc>
+          <w:tcPr>
+            <w:tcW w:type="dxa" w:w="2592"/>
+            <w:shd w:fill="E8EDF2"/>
+          </w:tcPr>
+          <w:p>
+            <w:pPr>
+              <w:spacing w:after="60"/>
+            </w:pPr>
+            <w:r>
+              <w:rPr>
+                <w:b/>
+                <w:sz w:val="20"/>
+              </w:rPr>
+              <w:t>Apple M4 Mac 本人</w:t>
+            </w:r>
+          </w:p>
+        </w:tc>
+      </w:tr>
+      <w:tr>
+        <w:tc>
+          <w:tcPr>
+            <w:tcW w:type="dxa" w:w="4176"/>
+          </w:tcPr>
+          <w:p>
+            <w:pPr>
+              <w:spacing w:after="60"/>
+            </w:pPr>
+            <w:r>
+              <w:rPr>
+                <w:sz w:val="20"/>
+              </w:rPr>
+              <w:t>long double sizeof／digits</w:t>
+            </w:r>
+          </w:p>
+        </w:tc>
+        <w:tc>
+          <w:tcPr>
+            <w:tcW w:type="dxa" w:w="2592"/>
+          </w:tcPr>
+          <w:p>
+            <w:pPr>
+              <w:spacing w:after="60"/>
+            </w:pPr>
+            <w:r>
+              <w:rPr>
+                <w:sz w:val="20"/>
+              </w:rPr>
+              <w:t>16 bytes／64 bits</w:t>
+            </w:r>
+          </w:p>
+        </w:tc>
+        <w:tc>
+          <w:tcPr>
+            <w:tcW w:type="dxa" w:w="2592"/>
+          </w:tcPr>
+          <w:p>
+            <w:pPr>
+              <w:spacing w:after="60"/>
+            </w:pPr>
+            <w:r>
+              <w:rPr>
+                <w:sz w:val="20"/>
+              </w:rPr>
+              <w:t>8 bytes／53 bits</w:t>
+            </w:r>
+          </w:p>
+        </w:tc>
+      </w:tr>
+      <w:tr>
+        <w:tc>
+          <w:tcPr>
+            <w:tcW w:type="dxa" w:w="4176"/>
+          </w:tcPr>
+          <w:p>
+            <w:pPr>
+              <w:spacing w:after="60"/>
+            </w:pPr>
+            <w:r>
+              <w:rPr>
+                <w:sz w:val="20"/>
+              </w:rPr>
+              <w:t>max_exponent</w:t>
+            </w:r>
+          </w:p>
+        </w:tc>
+        <w:tc>
+          <w:tcPr>
+            <w:tcW w:type="dxa" w:w="2592"/>
+          </w:tcPr>
+          <w:p>
+            <w:pPr>
+              <w:spacing w:after="60"/>
+            </w:pPr>
+            <w:r>
+              <w:rPr>
+                <w:sz w:val="20"/>
+              </w:rPr>
+              <w:t>16384</w:t>
+            </w:r>
+          </w:p>
+        </w:tc>
+        <w:tc>
+          <w:tcPr>
+            <w:tcW w:type="dxa" w:w="2592"/>
+          </w:tcPr>
+          <w:p>
+            <w:pPr>
+              <w:spacing w:after="60"/>
+            </w:pPr>
+            <w:r>
+              <w:rPr>
+                <w:sz w:val="20"/>
+              </w:rPr>
+              <w:t>1024</w:t>
+            </w:r>
+          </w:p>
+        </w:tc>
+      </w:tr>
+      <w:tr>
+        <w:tc>
+          <w:tcPr>
+            <w:tcW w:type="dxa" w:w="4176"/>
+          </w:tcPr>
+          <w:p>
+            <w:pPr>
+              <w:spacing w:after="60"/>
+            </w:pPr>
+            <w:r>
+              <w:rPr>
+                <w:sz w:val="20"/>
+              </w:rPr>
+              <w:t>ABI 案例捨入狀態</w:t>
+            </w:r>
+          </w:p>
+        </w:tc>
+        <w:tc>
+          <w:tcPr>
+            <w:tcW w:type="dxa" w:w="2592"/>
+          </w:tcPr>
+          <w:p>
+            <w:pPr>
+              <w:spacing w:after="60"/>
+            </w:pPr>
+            <w:r>
+              <w:rPr>
+                <w:sz w:val="20"/>
+              </w:rPr>
+              <w:t>FE_TONEAREST</w:t>
+            </w:r>
+          </w:p>
+        </w:tc>
+        <w:tc>
+          <w:tcPr>
+            <w:tcW w:type="dxa" w:w="2592"/>
+          </w:tcPr>
+          <w:p>
+            <w:pPr>
+              <w:spacing w:after="60"/>
+            </w:pPr>
+            <w:r>
+              <w:rPr>
+                <w:sz w:val="20"/>
+              </w:rPr>
+              <w:t>FE_TONEAREST</w:t>
+            </w:r>
+          </w:p>
+        </w:tc>
+      </w:tr>
+      <w:tr>
+        <w:tc>
+          <w:tcPr>
+            <w:tcW w:type="dxa" w:w="4176"/>
+          </w:tcPr>
+          <w:p>
+            <w:pPr>
+              <w:spacing w:after="60"/>
+            </w:pPr>
+            <w:r>
+              <w:rPr>
+                <w:sz w:val="20"/>
+              </w:rPr>
+              <w:t>(2^53+1)-2^53</w:t>
+            </w:r>
+          </w:p>
+        </w:tc>
+        <w:tc>
+          <w:tcPr>
+            <w:tcW w:type="dxa" w:w="2592"/>
+          </w:tcPr>
+          <w:p>
+            <w:pPr>
+              <w:spacing w:after="60"/>
+            </w:pPr>
+            <w:r>
+              <w:rPr>
+                <w:sz w:val="20"/>
+              </w:rPr>
+              <w:t>1，hex 0x8p-3</w:t>
+            </w:r>
+          </w:p>
+        </w:tc>
+        <w:tc>
+          <w:tcPr>
+            <w:tcW w:type="dxa" w:w="2592"/>
+          </w:tcPr>
+          <w:p>
+            <w:pPr>
+              <w:spacing w:after="60"/>
+            </w:pPr>
+            <w:r>
+              <w:rPr>
+                <w:sz w:val="20"/>
+              </w:rPr>
+              <w:t>0，hex 0x0p+0</w:t>
+            </w:r>
+          </w:p>
+        </w:tc>
+      </w:tr>
+      <w:tr>
+        <w:tc>
+          <w:tcPr>
+            <w:tcW w:type="dxa" w:w="4176"/>
+          </w:tcPr>
+          <w:p>
+            <w:pPr>
+              <w:spacing w:after="60"/>
+            </w:pPr>
+            <w:r>
+              <w:rPr>
+                <w:sz w:val="20"/>
+              </w:rPr>
+              <w:t>double 1+2^-53：nearest／down／towardzero</w:t>
+            </w:r>
+          </w:p>
+        </w:tc>
+        <w:tc>
+          <w:tcPr>
+            <w:tcW w:type="dxa" w:w="2592"/>
+          </w:tcPr>
+          <w:p>
+            <w:pPr>
+              <w:spacing w:after="60"/>
+            </w:pPr>
+            <w:r>
+              <w:rPr>
+                <w:sz w:val="20"/>
+              </w:rPr>
+              <w:t>0x1p+0</w:t>
+            </w:r>
+          </w:p>
+        </w:tc>
+        <w:tc>
+          <w:tcPr>
+            <w:tcW w:type="dxa" w:w="2592"/>
+          </w:tcPr>
+          <w:p>
+            <w:pPr>
+              <w:spacing w:after="60"/>
+            </w:pPr>
+            <w:r>
+              <w:rPr>
+                <w:sz w:val="20"/>
+              </w:rPr>
+              <w:t>0x1p+0</w:t>
+            </w:r>
+          </w:p>
+        </w:tc>
+      </w:tr>
+      <w:tr>
+        <w:tc>
+          <w:tcPr>
+            <w:tcW w:type="dxa" w:w="4176"/>
+          </w:tcPr>
+          <w:p>
+            <w:pPr>
+              <w:spacing w:after="60"/>
+            </w:pPr>
+            <w:r>
+              <w:rPr>
+                <w:sz w:val="20"/>
+              </w:rPr>
+              <w:t>double 1+2^-53：upward</w:t>
+            </w:r>
+          </w:p>
+        </w:tc>
+        <w:tc>
+          <w:tcPr>
+            <w:tcW w:type="dxa" w:w="2592"/>
+          </w:tcPr>
+          <w:p>
+            <w:pPr>
+              <w:spacing w:after="60"/>
+            </w:pPr>
+            <w:r>
+              <w:rPr>
+                <w:sz w:val="20"/>
+              </w:rPr>
+              <w:t>0x1.0000000000001p+0</w:t>
+            </w:r>
+          </w:p>
+        </w:tc>
+        <w:tc>
+          <w:tcPr>
+            <w:tcW w:type="dxa" w:w="2592"/>
+          </w:tcPr>
+          <w:p>
+            <w:pPr>
+              <w:spacing w:after="60"/>
+            </w:pPr>
+            <w:r>
+              <w:rPr>
+                <w:sz w:val="20"/>
+              </w:rPr>
+              <w:t>0x1.0000000000001p+0</w:t>
+            </w:r>
+          </w:p>
+        </w:tc>
+      </w:tr>
+    </w:tbl>
+    <w:p>
+      <w:pPr>
+        <w:keepNext/>
+      </w:pPr>
+      <w:r>
+        <w:drawing>
+          <wp:inline xmlns:a="http://schemas.openxmlformats.org/drawingml/2006/main" xmlns:pic="http://schemas.openxmlformats.org/drawingml/2006/picture">
+            <wp:extent cx="4937760" cy="2681584"/>
+            <wp:docPr id="21" name="Picture 21"/>
+            <wp:cNvGraphicFramePr>
+              <a:graphicFrameLocks noChangeAspect="1"/>
+            </wp:cNvGraphicFramePr>
+            <a:graphic>
+              <a:graphicData uri="http://schemas.openxmlformats.org/drawingml/2006/picture">
+                <pic:pic>
+                  <pic:nvPicPr>
+                    <pic:cNvPr id="0" name="截圖 2026-10-04 晚上9.16.28.png"/>
+                    <pic:cNvPicPr/>
+                  </pic:nvPicPr>
+                  <pic:blipFill>
+                    <a:blip r:embed="rId29"/>
+                    <a:stretch>
+                      <a:fillRect/>
+                    </a:stretch>
+                  </pic:blipFill>
+                  <pic:spPr>
+                    <a:xfrm>
+                      <a:off x="0" y="0"/>
+                      <a:ext cx="4937760" cy="2681584"/>
+                    </a:xfrm>
+                    <a:prstGeom prst="rect"/>
+                  </pic:spPr>
+                </pic:pic>
+              </a:graphicData>
+            </a:graphic>
+          </wp:inline>
+        </w:drawing>
+      </w:r>
+    </w:p>
+    <w:p>
+      <w:pPr>
+        <w:spacing w:after="200"/>
+      </w:pPr>
+      <w:r>
+        <w:rPr>
+          <w:sz w:val="18"/>
+        </w:rPr>
+        <w:t>圖 5-4 Mac 本人四模式：double 的受控捨入差異與 nearest long double 結果 0。（原檔：截圖 2026-10-04 晚上9.16.28.png）</w:t>
+      </w:r>
+    </w:p>
+    <w:p>
+      <w:pPr>
+        <w:keepNext/>
+      </w:pPr>
+      <w:r>
+        <w:drawing>
+          <wp:inline xmlns:a="http://schemas.openxmlformats.org/drawingml/2006/main" xmlns:pic="http://schemas.openxmlformats.org/drawingml/2006/picture">
+            <wp:extent cx="5120640" cy="1711389"/>
+            <wp:docPr id="22" name="Picture 22"/>
+            <wp:cNvGraphicFramePr>
+              <a:graphicFrameLocks noChangeAspect="1"/>
+            </wp:cNvGraphicFramePr>
+            <a:graphic>
+              <a:graphicData uri="http://schemas.openxmlformats.org/drawingml/2006/picture">
+                <pic:pic>
+                  <pic:nvPicPr>
+                    <pic:cNvPr id="0" name="截圖 2026-10-04 晚上9.17.09.png"/>
+                    <pic:cNvPicPr/>
+                  </pic:nvPicPr>
+                  <pic:blipFill>
+                    <a:blip r:embed="rId30"/>
+                    <a:stretch>
+                      <a:fillRect/>
+                    </a:stretch>
+                  </pic:blipFill>
+                  <pic:spPr>
+                    <a:xfrm>
+                      <a:off x="0" y="0"/>
+                      <a:ext cx="5120640" cy="1711389"/>
+                    </a:xfrm>
+                    <a:prstGeom prst="rect"/>
+                  </pic:spPr>
+                </pic:pic>
+              </a:graphicData>
+            </a:graphic>
+          </wp:inline>
+        </w:drawing>
+      </w:r>
+    </w:p>
+    <w:p>
+      <w:pPr>
+        <w:spacing w:after="200"/>
+      </w:pPr>
+      <w:r>
+        <w:rPr>
+          <w:sz w:val="18"/>
+        </w:rPr>
+        <w:t>圖 5-5 Mac 的 FADD D 暫存器、STR／LDR 與 FSUB；加法存回後才減回。（原檔：截圖 2026-10-04 晚上9.17.09.png）</w:t>
+      </w:r>
+    </w:p>
+    <w:p>
+      <w:r>
+        <w:t>WSL 的相同函式使用 FLDT、FADD、FSTPT、FLDT、FSUBP；Mac 使用 FADD d1、STR d1、LDR d31、FSUB d0。記憶體 barrier 使中間值必須存回 long double 的平台表示，沒有把整式常數折疊或消去；Mac D 暫存器的運算為 64-bit floating point。完整 .s 與反組譯均保存在兩端 student 目錄。</w:t>
       </w:r>
     </w:p>
     <w:p>
@@ -9270,7 +9755,7 @@
         </w:rPr>
       </w:pPr>
       <w:r>
-        <w:t>候選 A：double 的 1+2^-53 是 1 與下一個 representable 值之間的中點。本人結果在 nearest／downward／towardzero 為 0x1p+0，upward 為 0x1.0000000000001p+0；同 binary SHA-256 可排除編譯變動。候選 B：WSL long double 有 64 位有效精度，能保留 2^53+1，實測減回 2^53 為 1。Apple 官方 arm64 ABI 規定 long double 等同 double，因此預期有效精度較小可能產生差異，但本人 Mac 結果與條件核對尚待完成。[6]</w:t>
+        <w:t>案例 A：double 的 1+2^-53 為 1 與下一個可表示值的中點。兩平台本人結果皆在 nearest／downward／towardzero 得 0x1p+0，upward 得 0x1.0000000000001p+0；應比較 hexfloat，十進位格式化也受捨入模式影響。案例 B：WSL long double 的有效位數為 64，能精確保留 2^53+1，再減 2^53 得 1；Mac 的有效位數為 53，2^53 附近相鄰值間隔為 2，2^53+1 是中點，nearest ties-to-even 存回 2^53，因此減法得 0。兩端產生碼都保留加、存回與減，差異符合 long double 型態精度及 ABI，無需假設未定義行為。Apple arm64 ABI 的 long double 與 double 相同，與本次 8 bytes／53 digits 的實測一致。[6]</w:t>
       </w:r>
     </w:p>
     <w:p>
@@ -9302,7 +9787,7 @@
         </w:rPr>
       </w:pPr>
       <w:r>
-        <w:t>候選 A 的受控環境差異已由本人驗證；候選 B 暫不宣稱完成跨平台加分證據。相同 release 不表示 compiler binary／configuration／vendor patch 相同，需一併保存；GCC 對 frounding-math 的文件限制也使旗標本身不足以保證行為，應以此案例的產生碼與實測共同核對。[2]</w:t>
+        <w:t>相同來源、GNU GCC release 16.2.0 與旗標下，本人實測 long double 計算於 WSL 得 1、Mac 得 0；nearest 狀態及加法存回的產生碼支持 ABI 精度差異的解釋。相同型態名稱不保證相同精度，相同 release 也不等同 compiler binary。GCC 的 frounding-math 有文件限制，本例以旗標、產生碼和實測共同驗證。[2]</w:t>
       </w:r>
     </w:p>
     <w:p>
@@ -9357,7 +9842,7 @@
         </w:rPr>
       </w:pPr>
       <w:r>
-        <w:t>本機結果支持按需求選擇浮點型態：float／double 不會僅因大小不同就有固定速度比例；較高精度能保留某些小增量，但仍是有限精度。std::sqrt 可能經 compiler builtin 或 libm，兩者最終都可使用硬體。fast-math 能改重結合與特殊值語意；十進位輸出也不能概括為中點一律進位。這些結論分別由 Q1～Q4 的數據與截圖支持，Q5 的本人 Mac 對照仍待完成。</w:t>
+        <w:t>本機結果支持按需求選擇浮點型態：float／double 沒有固定速度比例；較高精度能保留某些小增量，但仍是有限精度。std::sqrt 可經 compiler builtin 或 libm，兩者最終都可使用硬體。fast-math 會改變重結合與特殊值語意；十進位輸出不能概括為中點一律進位。Q5 又實測到 WSL 與 Mac 的 long double 有效精度不同，使同一運算分別得 1 與 0；跨平台重現還必須記錄 ABI、型態參數、compiler、旗標、runtime 與捨入狀態。Mac 本次只做 Q5，不作跨平台速度比較。</w:t>
       </w:r>
     </w:p>
     <w:p>
@@ -10478,7 +10963,7 @@
         </w:rPr>
       </w:pPr>
       <w:r>
-        <w:t>以下依目前實際分工揭露；本人 Mac Q5 完成後還需更新其執行紀錄。</w:t>
+        <w:t>以下依本人實際執行與 Codex 協助範圍揭露。</w:t>
       </w:r>
     </w:p>
     <w:p>
@@ -10489,7 +10974,7 @@
         </w:rPr>
       </w:pPr>
       <w:r>
-        <w:t>我提供 Windows／Mac 設備與 compiler 資訊，親自在 Windows PowerShell／WSL 執行環境採集與完整 Q0～Q6 批次，並以終端顯示本人結果後截圖。Codex 協助建立程式、建置與保存腳本、安裝 WSL GCC 16.2.0、查閱來源、先做助手驗證，以及將我的真實數據與截圖整理成表格和分析。助手試跑目錄標為 assistant；本報告主要表格取自我執行的 linux-20261004-201349，不混用助手計時。原因分析文字由 AI 協助草擬，我仍需逐段驗證理解；本人 Mac Q5 尚待完成。</w:t>
+        <w:t>我提供 Windows／Mac 設備資訊，親自在 Windows PowerShell／WSL 執行環境採集與完整 Q0～Q6 批次，再於 Mac 執行 Q5、採集環境與 compiler 資訊，並顯示結果後截圖。Codex 協助建立程式與保存腳本、安裝 WSL GCC 16.2.0、查閱來源、做 assistant 預檢，以及將本人真實數據與截圖整理成表格和分析。本報告取用 linux-20261004-201349 與 q5-darwin-20261004-211048-student-wdBjAR 的本人結果，不混用 assistant 計時。原因分析由 AI 協助草擬，我仍需逐段驗證理解。</w:t>
       </w:r>
     </w:p>
     <w:tbl>
@@ -10583,16 +11068,8 @@
             <w:shd w:fill="FFFFFF"/>
           </w:tcPr>
           <w:p>
-            <w:pPr>
-              <w:keepNext w:val="0"/>
-              <w:spacing w:after="60" w:before="60"/>
-            </w:pPr>
-            <w:r>
-              <w:rPr>
-                <w:b w:val="0"/>
-                <w:sz w:val="20"/>
-              </w:rPr>
-              <w:t>提供設備資訊；Windows／WSL 採集、完整執行與截圖；Mac 本人 Q5 待補</w:t>
+            <w:r>
+              <w:t>提供設備資訊；Windows／WSL 環境、完整批次與截圖；Mac Q5 執行、环境採集與四張截圖</w:t>
             </w:r>
           </w:p>
         </w:tc>
@@ -10778,7 +11255,7 @@
         <w:br/>
         <w:t>https://developer.apple.com/documentation/xcode/writing-arm64-code-for-apple-platforms</w:t>
         <w:br/>
-        <w:t>Apple ABI；本人 Mac Q5 待補。</w:t>
+        <w:t>Apple arm64 ABI；本次本人 Mac long double 8 bytes／53 digits 的實測及產生碼與此規定一致。</w:t>
       </w:r>
     </w:p>
     <w:p>
@@ -10796,7 +11273,7 @@
         </w:rPr>
       </w:pPr>
       <w:r>
-        <w:t>目前完成與待補範圍</w:t>
+        <w:t>目前完成範圍與提交檢查</w:t>
       </w:r>
     </w:p>
     <w:p>
@@ -10807,7 +11284,7 @@
         </w:rPr>
       </w:pPr>
       <w:r>
-        <w:t>Windows／WSL 的本人數據、原始 log 與截圖已整理。待補本人 Mac Q5 的版本／flags／source／ABI 證據、實測輸出與截圖，再完成最後跨平台結論。提交時另輸出 PDF，命名為 113062331_林欣磊.pdf。</w:t>
+        <w:t>Windows／WSL 本人數據、Mac 本人 Q5、兩端條件核對、原始 log 與必要截圖均已整理。Mac 電源狀態未採集，如實列為未記錄；本次未宣稱 Mac benchmark 效能。提交前仍需本人確認分析與 AI 揭露，另輸出 PDF，命名為 113062331_林欣磊.pdf。</w:t>
       </w:r>
     </w:p>
     <w:p>
@@ -20707,7 +21184,7 @@
     </w:p>
     <w:p>
       <w:r>
-        <w:t>本人結果目錄：results/linux-20261004-201349/。Windows snapshot：results/q0-windows/20261004-200712/。原始檔案與 screenshot 一起提交版本庫；截圖僅由 Word 原生裁去空白或顯示局部，未重繪數字。未重複貼入的圖片仍保存在 screenshot。</w:t>
+        <w:t>本人 WSL 結果：results/linux-20261004-201349/；Windows snapshot：results/q0-windows/20261004-200712/；本人 Mac Q5：results/q5-darwin-20261004-211048-student-wdBjAR/。Windows 圖片位於 screenshot，Mac 圖片位於 mac截圖。原始檔與截圖均保留；Word 只裁去空白或縮放，未重繪數字。</w:t>
       </w:r>
     </w:p>
     <w:p>
@@ -21607,10 +22084,98 @@
           </w:p>
         </w:tc>
       </w:tr>
+      <w:tr>
+        <w:tc>
+          <w:tcPr>
+            <w:tcW w:type="dxa" w:w="1728"/>
+          </w:tcPr>
+          <w:p>
+            <w:r>
+              <w:t>圖 0-5</w:t>
+            </w:r>
+          </w:p>
+        </w:tc>
+        <w:tc>
+          <w:tcPr>
+            <w:tcW w:type="dxa" w:w="7632"/>
+          </w:tcPr>
+          <w:p>
+            <w:r>
+              <w:t>mac截圖/截圖 2026-10-04 晚上9.15.04.png</w:t>
+            </w:r>
+          </w:p>
+        </w:tc>
+      </w:tr>
+      <w:tr>
+        <w:tc>
+          <w:tcPr>
+            <w:tcW w:type="dxa" w:w="1728"/>
+          </w:tcPr>
+          <w:p>
+            <w:r>
+              <w:t>圖 5-3</w:t>
+            </w:r>
+          </w:p>
+        </w:tc>
+        <w:tc>
+          <w:tcPr>
+            <w:tcW w:type="dxa" w:w="7632"/>
+          </w:tcPr>
+          <w:p>
+            <w:r>
+              <w:t>mac截圖/截圖 2026-10-04 晚上9.15.48.png</w:t>
+            </w:r>
+          </w:p>
+        </w:tc>
+      </w:tr>
+      <w:tr>
+        <w:tc>
+          <w:tcPr>
+            <w:tcW w:type="dxa" w:w="1728"/>
+          </w:tcPr>
+          <w:p>
+            <w:r>
+              <w:t>圖 5-4</w:t>
+            </w:r>
+          </w:p>
+        </w:tc>
+        <w:tc>
+          <w:tcPr>
+            <w:tcW w:type="dxa" w:w="7632"/>
+          </w:tcPr>
+          <w:p>
+            <w:r>
+              <w:t>mac截圖/截圖 2026-10-04 晚上9.16.28.png</w:t>
+            </w:r>
+          </w:p>
+        </w:tc>
+      </w:tr>
+      <w:tr>
+        <w:tc>
+          <w:tcPr>
+            <w:tcW w:type="dxa" w:w="1728"/>
+          </w:tcPr>
+          <w:p>
+            <w:r>
+              <w:t>圖 5-5</w:t>
+            </w:r>
+          </w:p>
+        </w:tc>
+        <w:tc>
+          <w:tcPr>
+            <w:tcW w:type="dxa" w:w="7632"/>
+          </w:tcPr>
+          <w:p>
+            <w:r>
+              <w:t>mac截圖/截圖 2026-10-04 晚上9.17.09.png</w:t>
+            </w:r>
+          </w:p>
+        </w:tc>
+      </w:tr>
     </w:tbl>
     <w:p>
       <w:r>
-        <w:t>其餘 screenshot：202348 為 Q2 路徑標記；202909／202959 是 Q4 更長的重複顯示，關鍵數值已在圖 4-1 與完整案例表呈現。所有 21 張原圖均保留，避免以重複畫面增加篇幅。</w:t>
+        <w:t>Windows screenshot 共 21 張原圖，18 張已嵌入，另三張為重複顯示。Mac 四張原圖全部嵌入；圖 0-5 為環境，圖 5-3 為條件核對，圖 5-4 為四模式輸出，圖 5-5 為組合語言。全部 25 張原圖均保存。</w:t>
       </w:r>
     </w:p>
     <w:sectPr>

</xml_diff>

<commit_message>
Use direct evidence-based prose and tighten report layout
</commit_message>
<xml_diff>
--- a/Floating_Point_Report_Q0.docx
+++ b/Floating_Point_Report_Q0.docx
@@ -98,13 +98,13 @@
         </w:rPr>
       </w:pPr>
       <w:r>
-        <w:t>我用執行輸出、計時與反組譯回答：這台機器如何處理浮點數，以及我能用什麼證據確認。結果顯示：float 與 double 不存在固定速度比例；GCC 的 fast-math 能改變結果；相同 long double 程式在 WSL 與 Mac 得到不同答案。以下依 Q0～Q7 說明實驗、證據與原因。</w:t>
+        <w:t>本報告以本機輸出、計時與反組譯確認浮點數的實際行為。i7-14650HX／WSL 的 float、double 使用 scalar SSE，long double 使用 x87；fast-math 改變加法順序與結果；M4 Mac 的 long double 精度不同，同一算式得到不同答案。各題以執行證據支持原因，並區分已驗證路徑與理論解釋。</w:t>
       </w:r>
     </w:p>
     <w:p>
       <w:pPr>
         <w:pStyle w:val="1"/>
-        <w:pageBreakBefore/>
+        <w:pageBreakBefore w:val="0"/>
         <w:spacing w:after="100"/>
         <w:rPr>
           <w:lang w:eastAsia="zh-TW"/>
@@ -178,7 +178,7 @@
           </w:tcPr>
           <w:p>
             <w:pPr>
-              <w:keepNext w:val="0"/>
+              <w:keepNext/>
               <w:spacing w:before="40" w:after="40"/>
             </w:pPr>
             <w:r>
@@ -205,6 +205,7 @@
           </w:tcPr>
           <w:p>
             <w:pPr>
+              <w:keepNext/>
               <w:spacing w:before="40" w:after="40"/>
             </w:pPr>
             <w:r>
@@ -231,6 +232,7 @@
           </w:tcPr>
           <w:p>
             <w:pPr>
+              <w:keepNext/>
               <w:spacing w:before="40" w:after="40"/>
             </w:pPr>
             <w:r>
@@ -262,7 +264,7 @@
           </w:tcPr>
           <w:p>
             <w:pPr>
-              <w:keepNext w:val="0"/>
+              <w:keepNext/>
               <w:spacing w:before="40" w:after="40"/>
             </w:pPr>
             <w:r>
@@ -288,7 +290,7 @@
           </w:tcPr>
           <w:p>
             <w:pPr>
-              <w:keepNext w:val="0"/>
+              <w:keepNext/>
               <w:spacing w:before="40" w:after="40"/>
             </w:pPr>
             <w:r>
@@ -314,7 +316,7 @@
           </w:tcPr>
           <w:p>
             <w:pPr>
-              <w:keepNext w:val="0"/>
+              <w:keepNext/>
               <w:spacing w:before="40" w:after="40"/>
             </w:pPr>
             <w:r>
@@ -346,7 +348,7 @@
           </w:tcPr>
           <w:p>
             <w:pPr>
-              <w:keepNext w:val="0"/>
+              <w:keepNext/>
               <w:spacing w:before="40" w:after="40"/>
             </w:pPr>
             <w:r>
@@ -372,7 +374,7 @@
           </w:tcPr>
           <w:p>
             <w:pPr>
-              <w:keepNext w:val="0"/>
+              <w:keepNext/>
               <w:spacing w:before="40" w:after="40"/>
             </w:pPr>
             <w:r>
@@ -398,7 +400,7 @@
           </w:tcPr>
           <w:p>
             <w:pPr>
-              <w:keepNext w:val="0"/>
+              <w:keepNext/>
               <w:spacing w:before="40" w:after="40"/>
             </w:pPr>
             <w:r>
@@ -430,7 +432,7 @@
           </w:tcPr>
           <w:p>
             <w:pPr>
-              <w:keepNext w:val="0"/>
+              <w:keepNext/>
               <w:spacing w:before="40" w:after="40"/>
             </w:pPr>
             <w:r>
@@ -456,7 +458,7 @@
           </w:tcPr>
           <w:p>
             <w:pPr>
-              <w:keepNext w:val="0"/>
+              <w:keepNext/>
               <w:spacing w:after="40" w:before="40"/>
             </w:pPr>
             <w:r>
@@ -482,6 +484,7 @@
           </w:tcPr>
           <w:p>
             <w:pPr>
+              <w:keepNext/>
               <w:spacing w:before="40" w:after="40"/>
             </w:pPr>
             <w:r>
@@ -513,7 +516,7 @@
           </w:tcPr>
           <w:p>
             <w:pPr>
-              <w:keepNext w:val="0"/>
+              <w:keepNext/>
               <w:spacing w:before="40" w:after="40"/>
             </w:pPr>
             <w:r>
@@ -539,7 +542,7 @@
           </w:tcPr>
           <w:p>
             <w:pPr>
-              <w:keepNext w:val="0"/>
+              <w:keepNext/>
               <w:spacing w:after="40" w:before="40"/>
             </w:pPr>
             <w:r>
@@ -567,6 +570,7 @@
           </w:tcPr>
           <w:p>
             <w:pPr>
+              <w:keepNext/>
               <w:spacing w:before="40" w:after="40"/>
             </w:pPr>
             <w:r>
@@ -600,7 +604,7 @@
           </w:tcPr>
           <w:p>
             <w:pPr>
-              <w:keepNext w:val="0"/>
+              <w:keepNext/>
               <w:spacing w:before="40" w:after="40"/>
             </w:pPr>
             <w:r>
@@ -626,7 +630,7 @@
           </w:tcPr>
           <w:p>
             <w:pPr>
-              <w:keepNext w:val="0"/>
+              <w:keepNext/>
               <w:spacing w:before="40" w:after="40"/>
             </w:pPr>
             <w:r>
@@ -652,7 +656,7 @@
           </w:tcPr>
           <w:p>
             <w:pPr>
-              <w:keepNext w:val="0"/>
+              <w:keepNext/>
               <w:spacing w:before="40" w:after="40"/>
             </w:pPr>
             <w:r>
@@ -684,7 +688,7 @@
           </w:tcPr>
           <w:p>
             <w:pPr>
-              <w:keepNext w:val="0"/>
+              <w:keepNext/>
               <w:spacing w:before="40" w:after="40"/>
             </w:pPr>
             <w:r>
@@ -710,7 +714,7 @@
           </w:tcPr>
           <w:p>
             <w:pPr>
-              <w:keepNext w:val="0"/>
+              <w:keepNext/>
               <w:spacing w:after="40" w:before="40"/>
             </w:pPr>
             <w:r>
@@ -738,6 +742,7 @@
           </w:tcPr>
           <w:p>
             <w:pPr>
+              <w:keepNext/>
               <w:spacing w:before="40" w:after="40"/>
             </w:pPr>
             <w:r>
@@ -771,7 +776,7 @@
           </w:tcPr>
           <w:p>
             <w:pPr>
-              <w:keepNext w:val="0"/>
+              <w:keepNext/>
               <w:spacing w:before="40" w:after="40"/>
             </w:pPr>
             <w:r>
@@ -797,7 +802,7 @@
           </w:tcPr>
           <w:p>
             <w:pPr>
-              <w:keepNext w:val="0"/>
+              <w:keepNext/>
               <w:spacing w:after="40" w:before="40"/>
             </w:pPr>
             <w:r>
@@ -827,6 +832,7 @@
           </w:tcPr>
           <w:p>
             <w:pPr>
+              <w:keepNext/>
               <w:spacing w:before="40" w:after="40"/>
             </w:pPr>
             <w:r>
@@ -858,7 +864,7 @@
           </w:tcPr>
           <w:p>
             <w:pPr>
-              <w:keepNext w:val="0"/>
+              <w:keepNext/>
               <w:spacing w:before="40" w:after="40"/>
             </w:pPr>
             <w:r>
@@ -884,7 +890,7 @@
           </w:tcPr>
           <w:p>
             <w:pPr>
-              <w:keepNext w:val="0"/>
+              <w:keepNext/>
               <w:spacing w:before="40" w:after="40"/>
             </w:pPr>
             <w:r>
@@ -912,6 +918,7 @@
           </w:tcPr>
           <w:p>
             <w:pPr>
+              <w:keepNext/>
               <w:spacing w:before="40" w:after="40"/>
             </w:pPr>
             <w:r>
@@ -943,7 +950,7 @@
           </w:tcPr>
           <w:p>
             <w:pPr>
-              <w:keepNext w:val="0"/>
+              <w:keepNext/>
               <w:spacing w:before="40" w:after="40"/>
             </w:pPr>
             <w:r>
@@ -969,7 +976,7 @@
           </w:tcPr>
           <w:p>
             <w:pPr>
-              <w:keepNext w:val="0"/>
+              <w:keepNext/>
               <w:spacing w:before="40" w:after="40"/>
             </w:pPr>
             <w:r>
@@ -997,6 +1004,7 @@
           </w:tcPr>
           <w:p>
             <w:pPr>
+              <w:keepNext/>
               <w:spacing w:before="40" w:after="40"/>
             </w:pPr>
             <w:r>
@@ -1030,7 +1038,7 @@
           </w:tcPr>
           <w:p>
             <w:pPr>
-              <w:keepNext w:val="0"/>
+              <w:keepNext/>
               <w:spacing w:before="40" w:after="40"/>
             </w:pPr>
             <w:r>
@@ -1056,7 +1064,7 @@
           </w:tcPr>
           <w:p>
             <w:pPr>
-              <w:keepNext w:val="0"/>
+              <w:keepNext/>
               <w:spacing w:before="40" w:after="40"/>
             </w:pPr>
             <w:r>
@@ -1084,6 +1092,7 @@
           </w:tcPr>
           <w:p>
             <w:pPr>
+              <w:keepNext/>
               <w:spacing w:before="40" w:after="40"/>
             </w:pPr>
             <w:r>
@@ -1117,7 +1126,7 @@
           </w:tcPr>
           <w:p>
             <w:pPr>
-              <w:keepNext w:val="0"/>
+              <w:keepNext/>
               <w:spacing w:before="40" w:after="40"/>
             </w:pPr>
             <w:r>
@@ -1143,7 +1152,7 @@
           </w:tcPr>
           <w:p>
             <w:pPr>
-              <w:keepNext w:val="0"/>
+              <w:keepNext/>
               <w:spacing w:after="40" w:before="40"/>
             </w:pPr>
             <w:r>
@@ -1171,6 +1180,7 @@
           </w:tcPr>
           <w:p>
             <w:pPr>
+              <w:keepNext/>
               <w:spacing w:before="40" w:after="40"/>
             </w:pPr>
             <w:r>
@@ -1230,6 +1240,7 @@
           </w:tcPr>
           <w:p>
             <w:pPr>
+              <w:keepNext w:val="0"/>
               <w:spacing w:before="40" w:after="40"/>
             </w:pPr>
             <w:r>
@@ -1257,6 +1268,7 @@
           </w:tcPr>
           <w:p>
             <w:pPr>
+              <w:keepNext w:val="0"/>
               <w:spacing w:before="40" w:after="40"/>
             </w:pPr>
             <w:r>
@@ -1282,7 +1294,7 @@
         <w:spacing w:after="100" w:before="0"/>
       </w:pPr>
       <w:r>
-        <w:t>測試日期為 2026/10/04。WSL 的 12 核心／24 執行緒是虛擬拓樸；未固定實體 P/E 核心、即時頻率或溫度，因此 Q1 是這次執行的相對比較。Mac 僅作 Q5 對照，未量測跨平台速度。</w:t>
+        <w:t>測試日期：2026/10/04。WSL 的 12／24 為虛擬拓樸；未固定 P/E 核心、頻率與溫度，Q1 僅比較本次執行。Mac 僅測 Q5，未比較跨平台速度。</w:t>
       </w:r>
     </w:p>
     <w:p>
@@ -1290,7 +1302,7 @@
         <w:spacing w:after="100" w:before="0"/>
       </w:pPr>
       <w:r>
-        <w:t>重現：Windows 執行 experiments/q0_environment/collect_windows.ps1；WSL 執行 bash scripts/run_all.sh；Mac 執行 CXX=g++-16 bash scripts/run_q5.sh run。編譯命令、版本、來源雜湊、runtime 與輸出均由腳本保存。</w:t>
+        <w:t>重現：Windows 執行 experiments/q0_environment/collect_windows.ps1；WSL 執行 bash scripts/run_all.sh；Mac 執行 CXX=g++-16 bash scripts/run_q5.sh run。腳本保存命令、版本、來源雜湊與輸出。</w:t>
       </w:r>
     </w:p>
     <w:p>
@@ -1300,7 +1312,7 @@
         <w:pageBreakBefore w:val="0"/>
       </w:pPr>
       <w:r>
-        <w:t>型態參數也是實驗結果</w:t>
+        <w:t>型態的實測參數</w:t>
       </w:r>
     </w:p>
     <w:p>
@@ -1308,7 +1320,7 @@
         <w:spacing w:after="100" w:before="0"/>
       </w:pPr>
       <w:r>
-        <w:t>q0-types.txt 實測 float／double／long double 的有效位數為 24／53／64。下表說明：sizeof=16 的 long double 並非 binary128，而是此 ABI 為 80-bit extended precision 保留的儲存空間。Mac 的 long double 則實測為 8 bytes／53 位，詳見 Q5。</w:t>
+        <w:t>q0-types.txt 量得 WSL 三型態有效位數為 24／53／64；long double 的 16-byte 儲存空間包含填補，並非 binary128。Mac 為 8 bytes／53 位，Q5 再以數值與指令交叉驗證。</w:t>
       </w:r>
     </w:p>
     <w:tbl>
@@ -1355,7 +1367,7 @@
           </w:tcPr>
           <w:p>
             <w:pPr>
-              <w:keepNext w:val="0"/>
+              <w:keepNext/>
               <w:spacing w:before="40" w:after="40"/>
             </w:pPr>
             <w:r>
@@ -1382,7 +1394,7 @@
           </w:tcPr>
           <w:p>
             <w:pPr>
-              <w:keepNext w:val="0"/>
+              <w:keepNext/>
               <w:spacing w:before="40" w:after="40"/>
             </w:pPr>
             <w:r>
@@ -1409,7 +1421,7 @@
           </w:tcPr>
           <w:p>
             <w:pPr>
-              <w:keepNext w:val="0"/>
+              <w:keepNext/>
               <w:spacing w:before="40" w:after="40"/>
             </w:pPr>
             <w:r>
@@ -1436,7 +1448,7 @@
           </w:tcPr>
           <w:p>
             <w:pPr>
-              <w:keepNext w:val="0"/>
+              <w:keepNext/>
               <w:spacing w:before="40" w:after="40"/>
             </w:pPr>
             <w:r>
@@ -1463,7 +1475,7 @@
           </w:tcPr>
           <w:p>
             <w:pPr>
-              <w:keepNext w:val="0"/>
+              <w:keepNext/>
               <w:spacing w:before="40" w:after="40"/>
             </w:pPr>
             <w:r>
@@ -1490,7 +1502,7 @@
           </w:tcPr>
           <w:p>
             <w:pPr>
-              <w:keepNext w:val="0"/>
+              <w:keepNext/>
               <w:spacing w:before="40" w:after="40"/>
             </w:pPr>
             <w:r>
@@ -1522,7 +1534,7 @@
           </w:tcPr>
           <w:p>
             <w:pPr>
-              <w:keepNext w:val="0"/>
+              <w:keepNext/>
               <w:spacing w:before="40" w:after="40"/>
             </w:pPr>
             <w:r>
@@ -1548,7 +1560,7 @@
           </w:tcPr>
           <w:p>
             <w:pPr>
-              <w:keepNext w:val="0"/>
+              <w:keepNext/>
               <w:spacing w:before="40" w:after="40"/>
             </w:pPr>
             <w:r>
@@ -1574,7 +1586,7 @@
           </w:tcPr>
           <w:p>
             <w:pPr>
-              <w:keepNext w:val="0"/>
+              <w:keepNext/>
               <w:spacing w:before="40" w:after="40"/>
             </w:pPr>
             <w:r>
@@ -1600,7 +1612,7 @@
           </w:tcPr>
           <w:p>
             <w:pPr>
-              <w:keepNext w:val="0"/>
+              <w:keepNext/>
               <w:spacing w:before="40" w:after="40"/>
             </w:pPr>
             <w:r>
@@ -1626,7 +1638,7 @@
           </w:tcPr>
           <w:p>
             <w:pPr>
-              <w:keepNext w:val="0"/>
+              <w:keepNext/>
               <w:spacing w:before="40" w:after="40"/>
             </w:pPr>
             <w:r>
@@ -1652,7 +1664,7 @@
           </w:tcPr>
           <w:p>
             <w:pPr>
-              <w:keepNext w:val="0"/>
+              <w:keepNext/>
               <w:spacing w:before="40" w:after="40"/>
             </w:pPr>
             <w:r>
@@ -1684,7 +1696,7 @@
           </w:tcPr>
           <w:p>
             <w:pPr>
-              <w:keepNext w:val="0"/>
+              <w:keepNext/>
               <w:spacing w:before="40" w:after="40"/>
             </w:pPr>
             <w:r>
@@ -1710,7 +1722,7 @@
           </w:tcPr>
           <w:p>
             <w:pPr>
-              <w:keepNext w:val="0"/>
+              <w:keepNext/>
               <w:spacing w:before="40" w:after="40"/>
             </w:pPr>
             <w:r>
@@ -1736,7 +1748,7 @@
           </w:tcPr>
           <w:p>
             <w:pPr>
-              <w:keepNext w:val="0"/>
+              <w:keepNext/>
               <w:spacing w:before="40" w:after="40"/>
             </w:pPr>
             <w:r>
@@ -1762,7 +1774,7 @@
           </w:tcPr>
           <w:p>
             <w:pPr>
-              <w:keepNext w:val="0"/>
+              <w:keepNext/>
               <w:spacing w:before="40" w:after="40"/>
             </w:pPr>
             <w:r>
@@ -1788,7 +1800,7 @@
           </w:tcPr>
           <w:p>
             <w:pPr>
-              <w:keepNext w:val="0"/>
+              <w:keepNext/>
               <w:spacing w:before="40" w:after="40"/>
             </w:pPr>
             <w:r>
@@ -1814,7 +1826,7 @@
           </w:tcPr>
           <w:p>
             <w:pPr>
-              <w:keepNext w:val="0"/>
+              <w:keepNext/>
               <w:spacing w:before="40" w:after="40"/>
             </w:pPr>
             <w:r>
@@ -2000,7 +2012,7 @@
         <w:spacing w:after="100" w:before="0"/>
       </w:pPr>
       <w:r>
-        <w:t>WSL 同時量得 FLT_EVAL_METHOD=0、FE_TONEAREST、fast-math=false；epsilon 為 2^-23／2^-52／2^-63。__float128 僅偵測大小，未加入本次 benchmark。</w:t>
+        <w:t>WSL：FLT_EVAL_METHOD=0、FE_TONEAREST、fast-math=false；epsilon=2^-23／2^-52／2^-63。__float128 未列入 benchmark。</w:t>
       </w:r>
     </w:p>
     <w:p>
@@ -2052,7 +2064,7 @@
         <w:rPr>
           <w:sz w:val="18"/>
         </w:rPr>
-        <w:t>圖 0-1 型態輸出的左側局部，包含 sizeof、alignment、digits 等；完整欄位保留於原圖與 q0-types.txt。</w:t>
+        <w:t>圖 0-1 q0-types.txt 的 sizeof、digits 與執行環境。</w:t>
       </w:r>
     </w:p>
     <w:p>
@@ -2062,7 +2074,7 @@
       <w:r>
         <w:drawing>
           <wp:inline xmlns:a="http://schemas.openxmlformats.org/drawingml/2006/main" xmlns:pic="http://schemas.openxmlformats.org/drawingml/2006/picture">
-            <wp:extent cx="4754880" cy="2228693"/>
+            <wp:extent cx="4297680" cy="2014396"/>
             <wp:docPr id="19" name="Picture 19"/>
             <wp:cNvGraphicFramePr>
               <a:graphicFrameLocks noChangeAspect="1"/>
@@ -2083,7 +2095,7 @@
                   <pic:spPr>
                     <a:xfrm>
                       <a:off x="0" y="0"/>
-                      <a:ext cx="4754880" cy="2228693"/>
+                      <a:ext cx="4297680" cy="2014396"/>
                     </a:xfrm>
                     <a:prstGeom prst="rect"/>
                   </pic:spPr>
@@ -2102,13 +2114,13 @@
         <w:rPr>
           <w:sz w:val="18"/>
         </w:rPr>
-        <w:t>圖 0-2 Mac macOS build、M4 核心／記憶體、GCC 16.2.0 與 target。</w:t>
+        <w:t>圖 0-2 Mac 的 OS、M4、記憶體與 GCC target。</w:t>
       </w:r>
     </w:p>
     <w:p>
       <w:pPr>
         <w:pStyle w:val="1"/>
-        <w:pageBreakBefore/>
+        <w:pageBreakBefore w:val="0"/>
         <w:spacing w:after="100"/>
         <w:rPr>
           <w:lang w:eastAsia="zh-TW"/>
@@ -2149,7 +2161,7 @@
         </w:rPr>
       </w:pPr>
       <w:r>
-        <w:t>我比較三型態在相同 scalar kernel 的加減、乘法與除法，分別量測一條相依鏈與四條獨立鏈。前者下一步依賴前一步結果，後者允許處理器重疊運算。</w:t>
+        <w:t>比較三型態相同 scalar kernel 的加減、乘、除；一條相依鏈測連續運算，四條獨立鏈測可重疊運算。</w:t>
       </w:r>
     </w:p>
     <w:p>
@@ -2162,7 +2174,7 @@
         </w:rPr>
       </w:pPr>
       <w:r>
-        <w:t>如何讓計時量到實際運算</w:t>
+        <w:t>計時與防止最佳化</w:t>
       </w:r>
     </w:p>
     <w:p>
@@ -2173,7 +2185,7 @@
         </w:rPr>
       </w:pPr>
       <w:r>
-        <w:t>每組暖機 2 次，再做 7 回合，每回合 5,000,000 迭代；一鏈／四鏈每迭代為 2／8 次算術運算。seed=20261004，初值於執行期產生，factor=1+1/1024；用 steady_clock 計時，輪換型態順序並取中位數。</w:t>
+        <w:t>每組暖機 2 次、量測 7 回合，每回合 5,000,000 迭代；一鏈／四鏈各為 2／8 次算術運算。seed=20261004、factor=1+1/1024，初值於執行期產生；steady_clock 計時、輪換型態順序、取中位數。</w:t>
       </w:r>
     </w:p>
     <w:p>
@@ -2184,11 +2196,12 @@
         </w:rPr>
       </w:pPr>
       <w:r>
-        <w:t>kernel 分開編譯、設 noinline，關閉 LTO、fast-math、FMA contraction 與自動向量化；迴圈前後設 barrier，輸出 checksum。反組譯仍有算術迴圈與分支，證明計算未被消去。ns/op 包含迴圈及呼叫成本，不能直接當成硬體單條指令 latency。</w:t>
+        <w:t>kernel 分檔編譯、noinline，停用 LTO、fast-math、FMA contraction 與向量化；barrier 與 checksum 防止消去。反組譯保留算術迴圈與分支。ns/op 含迴圈與呼叫成本，不等同硬體單指令 latency。</w:t>
       </w:r>
     </w:p>
     <w:p>
       <w:pPr>
+        <w:keepLines/>
         <w:spacing w:after="100" w:before="0"/>
       </w:pPr>
       <w:r>
@@ -2216,7 +2229,7 @@
         <w:spacing w:after="100" w:before="0"/>
       </w:pPr>
       <w:r>
-        <w:t>下表為 18 組結果的中位數，單位 ns/op＝總秒數×10^9÷算術運算次數。每組 7 回合共 126 筆，完整樣本與最小／最大值保留於 q1-timing-and-precision.txt、q1-summary.csv。</w:t>
+        <w:t>18 組中位數如下，ns/op＝總秒數×10^9÷算術次數。126 筆原始樣本與範圍保留於 q1-timing-and-precision.txt、q1-summary.csv。</w:t>
       </w:r>
     </w:p>
     <w:tbl>
@@ -2244,6 +2257,7 @@
           </w:tcPr>
           <w:p>
             <w:pPr>
+              <w:keepNext/>
               <w:spacing w:before="40" w:after="40"/>
             </w:pPr>
             <w:r>
@@ -2262,6 +2276,7 @@
           </w:tcPr>
           <w:p>
             <w:pPr>
+              <w:keepNext/>
               <w:spacing w:before="40" w:after="40"/>
             </w:pPr>
             <w:r>
@@ -2280,6 +2295,7 @@
           </w:tcPr>
           <w:p>
             <w:pPr>
+              <w:keepNext/>
               <w:spacing w:before="40" w:after="40"/>
             </w:pPr>
             <w:r>
@@ -2298,6 +2314,7 @@
           </w:tcPr>
           <w:p>
             <w:pPr>
+              <w:keepNext/>
               <w:spacing w:before="40" w:after="40"/>
             </w:pPr>
             <w:r>
@@ -2316,6 +2333,7 @@
           </w:tcPr>
           <w:p>
             <w:pPr>
+              <w:keepNext/>
               <w:spacing w:before="40" w:after="40"/>
             </w:pPr>
             <w:r>
@@ -2339,6 +2357,7 @@
           </w:tcPr>
           <w:p>
             <w:pPr>
+              <w:keepNext/>
               <w:spacing w:before="40" w:after="40"/>
             </w:pPr>
             <w:r>
@@ -2357,6 +2376,7 @@
           </w:tcPr>
           <w:p>
             <w:pPr>
+              <w:keepNext/>
               <w:spacing w:before="40" w:after="40"/>
             </w:pPr>
             <w:r>
@@ -2375,6 +2395,7 @@
           </w:tcPr>
           <w:p>
             <w:pPr>
+              <w:keepNext/>
               <w:spacing w:before="40" w:after="40"/>
             </w:pPr>
             <w:r>
@@ -2393,6 +2414,7 @@
           </w:tcPr>
           <w:p>
             <w:pPr>
+              <w:keepNext/>
               <w:spacing w:before="40" w:after="40"/>
             </w:pPr>
             <w:r>
@@ -2411,6 +2433,7 @@
           </w:tcPr>
           <w:p>
             <w:pPr>
+              <w:keepNext/>
               <w:spacing w:before="40" w:after="40"/>
             </w:pPr>
             <w:r>
@@ -2434,6 +2457,7 @@
           </w:tcPr>
           <w:p>
             <w:pPr>
+              <w:keepNext/>
               <w:spacing w:before="40" w:after="40"/>
             </w:pPr>
             <w:r>
@@ -2452,6 +2476,7 @@
           </w:tcPr>
           <w:p>
             <w:pPr>
+              <w:keepNext/>
               <w:spacing w:before="40" w:after="40"/>
             </w:pPr>
             <w:r>
@@ -2470,6 +2495,7 @@
           </w:tcPr>
           <w:p>
             <w:pPr>
+              <w:keepNext/>
               <w:spacing w:before="40" w:after="40"/>
             </w:pPr>
             <w:r>
@@ -2488,6 +2514,7 @@
           </w:tcPr>
           <w:p>
             <w:pPr>
+              <w:keepNext/>
               <w:spacing w:before="40" w:after="40"/>
             </w:pPr>
             <w:r>
@@ -2506,6 +2533,7 @@
           </w:tcPr>
           <w:p>
             <w:pPr>
+              <w:keepNext/>
               <w:spacing w:before="40" w:after="40"/>
             </w:pPr>
             <w:r>
@@ -2529,6 +2557,7 @@
           </w:tcPr>
           <w:p>
             <w:pPr>
+              <w:keepNext/>
               <w:spacing w:before="40" w:after="40"/>
             </w:pPr>
             <w:r>
@@ -2547,6 +2576,7 @@
           </w:tcPr>
           <w:p>
             <w:pPr>
+              <w:keepNext/>
               <w:spacing w:before="40" w:after="40"/>
             </w:pPr>
             <w:r>
@@ -2565,6 +2595,7 @@
           </w:tcPr>
           <w:p>
             <w:pPr>
+              <w:keepNext/>
               <w:spacing w:before="40" w:after="40"/>
             </w:pPr>
             <w:r>
@@ -2583,6 +2614,7 @@
           </w:tcPr>
           <w:p>
             <w:pPr>
+              <w:keepNext/>
               <w:spacing w:before="40" w:after="40"/>
             </w:pPr>
             <w:r>
@@ -2601,6 +2633,7 @@
           </w:tcPr>
           <w:p>
             <w:pPr>
+              <w:keepNext/>
               <w:spacing w:before="40" w:after="40"/>
             </w:pPr>
             <w:r>
@@ -2624,6 +2657,7 @@
           </w:tcPr>
           <w:p>
             <w:pPr>
+              <w:keepNext/>
               <w:spacing w:before="40" w:after="40"/>
             </w:pPr>
             <w:r>
@@ -2642,6 +2676,7 @@
           </w:tcPr>
           <w:p>
             <w:pPr>
+              <w:keepNext/>
               <w:spacing w:before="40" w:after="40"/>
             </w:pPr>
             <w:r>
@@ -2660,6 +2695,7 @@
           </w:tcPr>
           <w:p>
             <w:pPr>
+              <w:keepNext/>
               <w:spacing w:before="40" w:after="40"/>
             </w:pPr>
             <w:r>
@@ -2678,6 +2714,7 @@
           </w:tcPr>
           <w:p>
             <w:pPr>
+              <w:keepNext/>
               <w:spacing w:before="40" w:after="40"/>
             </w:pPr>
             <w:r>
@@ -2696,6 +2733,7 @@
           </w:tcPr>
           <w:p>
             <w:pPr>
+              <w:keepNext/>
               <w:spacing w:before="40" w:after="40"/>
             </w:pPr>
             <w:r>
@@ -2719,6 +2757,7 @@
           </w:tcPr>
           <w:p>
             <w:pPr>
+              <w:keepNext/>
               <w:spacing w:before="40" w:after="40"/>
             </w:pPr>
             <w:r>
@@ -2737,6 +2776,7 @@
           </w:tcPr>
           <w:p>
             <w:pPr>
+              <w:keepNext/>
               <w:spacing w:before="40" w:after="40"/>
             </w:pPr>
             <w:r>
@@ -2755,6 +2795,7 @@
           </w:tcPr>
           <w:p>
             <w:pPr>
+              <w:keepNext/>
               <w:spacing w:before="40" w:after="40"/>
             </w:pPr>
             <w:r>
@@ -2773,6 +2814,7 @@
           </w:tcPr>
           <w:p>
             <w:pPr>
+              <w:keepNext/>
               <w:spacing w:before="40" w:after="40"/>
             </w:pPr>
             <w:r>
@@ -2791,6 +2833,7 @@
           </w:tcPr>
           <w:p>
             <w:pPr>
+              <w:keepNext/>
               <w:spacing w:before="40" w:after="40"/>
             </w:pPr>
             <w:r>
@@ -2814,6 +2857,7 @@
           </w:tcPr>
           <w:p>
             <w:pPr>
+              <w:keepNext w:val="0"/>
               <w:spacing w:before="40" w:after="40"/>
             </w:pPr>
             <w:r>
@@ -2832,6 +2876,7 @@
           </w:tcPr>
           <w:p>
             <w:pPr>
+              <w:keepNext w:val="0"/>
               <w:spacing w:before="40" w:after="40"/>
             </w:pPr>
             <w:r>
@@ -2850,6 +2895,7 @@
           </w:tcPr>
           <w:p>
             <w:pPr>
+              <w:keepNext w:val="0"/>
               <w:spacing w:before="40" w:after="40"/>
             </w:pPr>
             <w:r>
@@ -2868,6 +2914,7 @@
           </w:tcPr>
           <w:p>
             <w:pPr>
+              <w:keepNext w:val="0"/>
               <w:spacing w:before="40" w:after="40"/>
             </w:pPr>
             <w:r>
@@ -2886,6 +2933,7 @@
           </w:tcPr>
           <w:p>
             <w:pPr>
+              <w:keepNext w:val="0"/>
               <w:spacing w:before="40" w:after="40"/>
             </w:pPr>
             <w:r>
@@ -2912,7 +2960,7 @@
       <w:r>
         <w:drawing>
           <wp:inline xmlns:a="http://schemas.openxmlformats.org/drawingml/2006/main" xmlns:pic="http://schemas.openxmlformats.org/drawingml/2006/picture">
-            <wp:extent cx="4754880" cy="4595227"/>
+            <wp:extent cx="4023360" cy="3888269"/>
             <wp:docPr id="5" name="Picture 5"/>
             <wp:cNvGraphicFramePr>
               <a:graphicFrameLocks noChangeAspect="1"/>
@@ -2933,7 +2981,7 @@
                   <pic:spPr>
                     <a:xfrm>
                       <a:off x="0" y="0"/>
-                      <a:ext cx="4754880" cy="4595227"/>
+                      <a:ext cx="4023360" cy="3888269"/>
                     </a:xfrm>
                     <a:prstGeom prst="rect"/>
                   </pic:spPr>
@@ -2952,7 +3000,7 @@
         <w:rPr>
           <w:sz w:val="18"/>
         </w:rPr>
-        <w:t>圖 1-1 產生的全部 Q1 中位數摘要與迭代設定。</w:t>
+        <w:t>圖 1-1 實測中位數與迭代設定。</w:t>
       </w:r>
     </w:p>
     <w:p>
@@ -2965,7 +3013,7 @@
         </w:rPr>
       </w:pPr>
       <w:r>
-        <w:t>這台機器為什麼出現這些差異</w:t>
+        <w:t>速度差異的本機證據</w:t>
       </w:r>
     </w:p>
     <w:p>
@@ -2976,7 +3024,7 @@
         </w:rPr>
       </w:pPr>
       <w:r>
-        <w:t>單鏈乘法三型態皆約 0.86 ns/op，沒有隨型態大小形成固定倍數；單鏈除法則為 float 2.333、double 3.000、long double 3.327 ns/op。四鏈除法降為 0.618／0.828／0.923 ns/op，說明獨立運算能提高有效吞吐量。指令證據顯示 float／double 走 scalar SSE、long double 走 x87；精度、指令路徑、搬移與相依關係共同影響速度，不能只以 bytes 推算。[4]</w:t>
+        <w:t>單鏈乘法三型態皆約 0.86 ns/op；除法為 2.333／3.000／3.327 ns/op。四鏈除法降至 0.618／0.828／0.923，支持獨立運算提高吞吐量。反組譯顯示 float／double 走 scalar SSE，long double 走 x87；型態大小無法單獨解釋速度。[4]</w:t>
       </w:r>
     </w:p>
     <w:p>
@@ -3000,7 +3048,7 @@
         </w:rPr>
       </w:pPr>
       <w:r>
-        <w:t>加總 10,000 組 [2^24,1,-2^24] 或 [2^53,1,-2^53]，分別正序與反序。所有輸入可精確表示，數學答案都是 10,000；用此整數作參考，不假定 long double 為真值。執行同一程式加 --precision-only。</w:t>
+        <w:t>正序／反序加總 10,000 組 [2^24,1,-2^24] 或 [2^53,1,-2^53]，輸入可精確表示，參考答案為整數 10,000。執行同一程式加 --precision-only。</w:t>
       </w:r>
     </w:p>
     <w:tbl>
@@ -3028,6 +3076,7 @@
           </w:tcPr>
           <w:p>
             <w:pPr>
+              <w:keepNext/>
               <w:spacing w:before="40" w:after="40"/>
             </w:pPr>
             <w:r>
@@ -3046,6 +3095,7 @@
           </w:tcPr>
           <w:p>
             <w:pPr>
+              <w:keepNext/>
               <w:spacing w:before="40" w:after="40"/>
             </w:pPr>
             <w:r>
@@ -3064,6 +3114,7 @@
           </w:tcPr>
           <w:p>
             <w:pPr>
+              <w:keepNext/>
               <w:spacing w:before="40" w:after="40"/>
             </w:pPr>
             <w:r>
@@ -3082,6 +3133,7 @@
           </w:tcPr>
           <w:p>
             <w:pPr>
+              <w:keepNext/>
               <w:spacing w:before="40" w:after="40"/>
             </w:pPr>
             <w:r>
@@ -3100,6 +3152,7 @@
           </w:tcPr>
           <w:p>
             <w:pPr>
+              <w:keepNext/>
               <w:spacing w:before="40" w:after="40"/>
             </w:pPr>
             <w:r>
@@ -3123,6 +3176,7 @@
           </w:tcPr>
           <w:p>
             <w:pPr>
+              <w:keepNext/>
               <w:spacing w:before="40" w:after="40"/>
             </w:pPr>
             <w:r>
@@ -3141,6 +3195,7 @@
           </w:tcPr>
           <w:p>
             <w:pPr>
+              <w:keepNext/>
               <w:spacing w:before="40" w:after="40"/>
             </w:pPr>
             <w:r>
@@ -3159,6 +3214,7 @@
           </w:tcPr>
           <w:p>
             <w:pPr>
+              <w:keepNext/>
               <w:spacing w:before="40" w:after="40"/>
             </w:pPr>
             <w:r>
@@ -3177,6 +3233,7 @@
           </w:tcPr>
           <w:p>
             <w:pPr>
+              <w:keepNext/>
               <w:spacing w:before="40" w:after="40"/>
             </w:pPr>
             <w:r>
@@ -3195,6 +3252,7 @@
           </w:tcPr>
           <w:p>
             <w:pPr>
+              <w:keepNext/>
               <w:spacing w:before="40" w:after="40"/>
             </w:pPr>
             <w:r>
@@ -3218,6 +3276,7 @@
           </w:tcPr>
           <w:p>
             <w:pPr>
+              <w:keepNext/>
               <w:spacing w:before="40" w:after="40"/>
             </w:pPr>
             <w:r>
@@ -3236,6 +3295,7 @@
           </w:tcPr>
           <w:p>
             <w:pPr>
+              <w:keepNext/>
               <w:spacing w:before="40" w:after="40"/>
             </w:pPr>
             <w:r>
@@ -3254,6 +3314,7 @@
           </w:tcPr>
           <w:p>
             <w:pPr>
+              <w:keepNext/>
               <w:spacing w:before="40" w:after="40"/>
             </w:pPr>
             <w:r>
@@ -3272,6 +3333,7 @@
           </w:tcPr>
           <w:p>
             <w:pPr>
+              <w:keepNext/>
               <w:spacing w:before="40" w:after="40"/>
             </w:pPr>
             <w:r>
@@ -3290,6 +3352,7 @@
           </w:tcPr>
           <w:p>
             <w:pPr>
+              <w:keepNext/>
               <w:spacing w:before="40" w:after="40"/>
             </w:pPr>
             <w:r>
@@ -3313,6 +3376,7 @@
           </w:tcPr>
           <w:p>
             <w:pPr>
+              <w:keepNext/>
               <w:spacing w:before="40" w:after="40"/>
             </w:pPr>
             <w:r>
@@ -3331,6 +3395,7 @@
           </w:tcPr>
           <w:p>
             <w:pPr>
+              <w:keepNext/>
               <w:spacing w:before="40" w:after="40"/>
             </w:pPr>
             <w:r>
@@ -3349,6 +3414,7 @@
           </w:tcPr>
           <w:p>
             <w:pPr>
+              <w:keepNext/>
               <w:spacing w:before="40" w:after="40"/>
             </w:pPr>
             <w:r>
@@ -3367,6 +3433,7 @@
           </w:tcPr>
           <w:p>
             <w:pPr>
+              <w:keepNext/>
               <w:spacing w:before="40" w:after="40"/>
             </w:pPr>
             <w:r>
@@ -3385,6 +3452,7 @@
           </w:tcPr>
           <w:p>
             <w:pPr>
+              <w:keepNext/>
               <w:spacing w:before="40" w:after="40"/>
             </w:pPr>
             <w:r>
@@ -3408,6 +3476,7 @@
           </w:tcPr>
           <w:p>
             <w:pPr>
+              <w:keepNext/>
               <w:spacing w:before="40" w:after="40"/>
             </w:pPr>
             <w:r>
@@ -3426,6 +3495,7 @@
           </w:tcPr>
           <w:p>
             <w:pPr>
+              <w:keepNext/>
               <w:spacing w:before="40" w:after="40"/>
             </w:pPr>
             <w:r>
@@ -3444,6 +3514,7 @@
           </w:tcPr>
           <w:p>
             <w:pPr>
+              <w:keepNext/>
               <w:spacing w:before="40" w:after="40"/>
             </w:pPr>
             <w:r>
@@ -3462,6 +3533,7 @@
           </w:tcPr>
           <w:p>
             <w:pPr>
+              <w:keepNext/>
               <w:spacing w:before="40" w:after="40"/>
             </w:pPr>
             <w:r>
@@ -3480,6 +3552,7 @@
           </w:tcPr>
           <w:p>
             <w:pPr>
+              <w:keepNext/>
               <w:spacing w:before="40" w:after="40"/>
             </w:pPr>
             <w:r>
@@ -3503,6 +3576,7 @@
           </w:tcPr>
           <w:p>
             <w:pPr>
+              <w:keepNext/>
               <w:spacing w:before="40" w:after="40"/>
             </w:pPr>
             <w:r>
@@ -3521,6 +3595,7 @@
           </w:tcPr>
           <w:p>
             <w:pPr>
+              <w:keepNext/>
               <w:spacing w:before="40" w:after="40"/>
             </w:pPr>
             <w:r>
@@ -3539,6 +3614,7 @@
           </w:tcPr>
           <w:p>
             <w:pPr>
+              <w:keepNext/>
               <w:spacing w:before="40" w:after="40"/>
             </w:pPr>
             <w:r>
@@ -3557,6 +3633,7 @@
           </w:tcPr>
           <w:p>
             <w:pPr>
+              <w:keepNext/>
               <w:spacing w:before="40" w:after="40"/>
             </w:pPr>
             <w:r>
@@ -3575,6 +3652,7 @@
           </w:tcPr>
           <w:p>
             <w:pPr>
+              <w:keepNext/>
               <w:spacing w:before="40" w:after="40"/>
             </w:pPr>
             <w:r>
@@ -3598,6 +3676,7 @@
           </w:tcPr>
           <w:p>
             <w:pPr>
+              <w:keepNext w:val="0"/>
               <w:spacing w:before="40" w:after="40"/>
             </w:pPr>
             <w:r>
@@ -3616,6 +3695,7 @@
           </w:tcPr>
           <w:p>
             <w:pPr>
+              <w:keepNext w:val="0"/>
               <w:spacing w:before="40" w:after="40"/>
             </w:pPr>
             <w:r>
@@ -3634,6 +3714,7 @@
           </w:tcPr>
           <w:p>
             <w:pPr>
+              <w:keepNext w:val="0"/>
               <w:spacing w:before="40" w:after="40"/>
             </w:pPr>
             <w:r>
@@ -3652,6 +3733,7 @@
           </w:tcPr>
           <w:p>
             <w:pPr>
+              <w:keepNext w:val="0"/>
               <w:spacing w:before="40" w:after="40"/>
             </w:pPr>
             <w:r>
@@ -3670,6 +3752,7 @@
           </w:tcPr>
           <w:p>
             <w:pPr>
+              <w:keepNext w:val="0"/>
               <w:spacing w:before="40" w:after="40"/>
             </w:pPr>
             <w:r>
@@ -3736,7 +3819,7 @@
         <w:rPr>
           <w:sz w:val="18"/>
         </w:rPr>
-        <w:t>圖 1-2 加總順序與型態改變結果。畫面命令指向結果目錄，與原始 log 一致。</w:t>
+        <w:t>圖 1-2 型態與加總順序改變實測結果。</w:t>
       </w:r>
     </w:p>
     <w:p>
@@ -3746,7 +3829,7 @@
         <w:spacing w:after="100"/>
       </w:pPr>
       <w:r>
-        <w:t>從數值表示連結到硬體</w:t>
+        <w:t>表示方式與運算指令</w:t>
       </w:r>
     </w:p>
     <w:p>
@@ -3754,7 +3837,7 @@
         <w:spacing w:after="100" w:before="0"/>
       </w:pPr>
       <w:r>
-        <w:t>binary32／binary64 的 sign、exponent、fraction 欄位為 1／8／23 與 1／11／52，normal 隱含首位使有效位數為 24／53。WSL long double 為 1 sign、15 exponent、64-bit significand 的 extended precision，共 80 位，ABI 儲存空間含填補。反組譯中 float 用 ADDSS／MULSS／DIVSS，double 用 ADDSD／MULSD／DIVSD，long double 用 x87 FADD／FMUL／FDIV；SSE 暫存器不代表本測試已向量化。</w:t>
+        <w:t>binary32／binary64 的 sign、exponent、fraction 為 1／8／23 與 1／11／52，normal 有效位數為 24／53；WSL extended precision 為 1／15／64，共 80 位。產生碼為 float ADDSS／MULSS／DIVSS、double ADDSD／MULSD／DIVSD、long double x87 FADD／FMUL／FDIV，支持 Q0 型態參數與實際運算路徑。</w:t>
       </w:r>
     </w:p>
     <w:p>
@@ -3765,7 +3848,7 @@
       <w:r>
         <w:drawing>
           <wp:inline xmlns:a="http://schemas.openxmlformats.org/drawingml/2006/main" xmlns:pic="http://schemas.openxmlformats.org/drawingml/2006/picture">
-            <wp:extent cx="4754880" cy="2947240"/>
+            <wp:extent cx="3931920" cy="2437141"/>
             <wp:docPr id="8" name="Picture 8"/>
             <wp:cNvGraphicFramePr>
               <a:graphicFrameLocks noChangeAspect="1"/>
@@ -3786,7 +3869,7 @@
                   <pic:spPr>
                     <a:xfrm>
                       <a:off x="0" y="0"/>
-                      <a:ext cx="4754880" cy="2947240"/>
+                      <a:ext cx="3931920" cy="2437141"/>
                     </a:xfrm>
                     <a:prstGeom prst="rect"/>
                   </pic:spPr>
@@ -3816,13 +3899,13 @@
         </w:rPr>
       </w:pPr>
       <w:r>
-        <w:t>加減需對齊指數、運算有效數、正規化並捨入；乘除也只能保留有限精度。這解釋了 2^24 的 float、2^53 的 double 正序都丟失 +1，反序卻得 10,000。long double 的 64 位保住兩案例的小增量；float 在 2^53 兩順序都失去它。改順序有時改善結果，仍需按值域與誤差需求選擇演算法。指令可證明此次採用的路徑，無法揭露 CPU 內部全部微架構。[3][4]</w:t>
+        <w:t>加減對齊指數後只能保留有限有效位數；乘除也需正規化與捨入。實測 float 在 2^24、double 在 2^53 正序丟失 +1，反序得到 10,000；long double 保住兩案例增量，float 在 2^53 兩順序皆丟失。數值與指令共同支持精度解釋；CPU 內部微架構仍不能僅由反組譯確認。[3][4]</w:t>
       </w:r>
     </w:p>
     <w:p>
       <w:pPr>
         <w:pStyle w:val="1"/>
-        <w:pageBreakBefore/>
+        <w:pageBreakBefore w:val="0"/>
         <w:spacing w:after="100"/>
         <w:rPr>
           <w:lang w:eastAsia="zh-TW"/>
@@ -3850,7 +3933,7 @@
         </w:rPr>
       </w:pPr>
       <w:r>
-        <w:t>我選擇 std::sqrt。C++20 浮點 overload 回傳 float、double 或 long double，整數呼叫等效使用 double，程式以 static_assert 核對。函式求非負平方根；負值的 domain error 依 math_errhandling 與實測判斷。[1][5]</w:t>
+        <w:t>選用 std::sqrt。C++20 overload 回傳 float、double、long double，整數呼叫等效使用 double，static_assert 已核對。函式求非負平方根；負值的 domain error 依 math_errhandling 處理。[1][5]</w:t>
       </w:r>
     </w:p>
     <w:p>
@@ -3865,6 +3948,7 @@
     </w:p>
     <w:p>
       <w:pPr>
+        <w:keepLines/>
         <w:spacing w:after="100" w:before="0"/>
       </w:pPr>
       <w:r>
@@ -3881,6 +3965,7 @@
     </w:p>
     <w:p>
       <w:pPr>
+        <w:keepLines/>
         <w:spacing w:after="100" w:before="0"/>
       </w:pPr>
       <w:r>
@@ -3894,7 +3979,7 @@
         <w:spacing w:after="100"/>
       </w:pPr>
       <w:r>
-        <w:t>本機究竟如何求平方根</w:t>
+        <w:t>本機路徑與輸出</w:t>
       </w:r>
     </w:p>
     <w:p>
@@ -3902,7 +3987,7 @@
         <w:spacing w:after="100" w:before="0"/>
       </w:pPr>
       <w:r>
-        <w:t>反組譯顯示 default 版對三型態分別執行 SQRTSS、SQRTSD、FSQRT；負值跳往 sqrtf／sqrt／sqrtl。forced-libm 的 finite implementation 也找到硬體 sqrt 指令，因此本次呼叫函式庫仍可走硬體路徑。30 個輸入／型態組合的兩路徑輸出與例外旗標逐項一致；sqrt(4)=2 且精確，sqrt(2) 設 inexact，sqrt(-1) 回 NaN、errno=33、invalid=true，sqrt(-0) 保留負號。這些輸出驗證數值與錯誤處理，組合語言則證明採用的指令。</w:t>
+        <w:t>default 產生碼為 SQRTSS／SQRTSD／FSQRT，負值轉呼叫 sqrtf／sqrt／sqrtl；forced-libm 的 finite implementation 也含硬體 sqrt。30 組輸入／型態的兩路徑輸出與例外旗標一致：sqrt(4)=2 且精確、sqrt(2) 設 inexact、sqrt(-1) 回 NaN 且 errno=33／invalid=true、sqrt(-0) 保留負號。</w:t>
       </w:r>
     </w:p>
     <w:p>
@@ -3913,7 +3998,7 @@
       <w:r>
         <w:drawing>
           <wp:inline xmlns:a="http://schemas.openxmlformats.org/drawingml/2006/main" xmlns:pic="http://schemas.openxmlformats.org/drawingml/2006/picture">
-            <wp:extent cx="4937760" cy="3134058"/>
+            <wp:extent cx="4389120" cy="2785829"/>
             <wp:docPr id="9" name="Picture 9"/>
             <wp:cNvGraphicFramePr>
               <a:graphicFrameLocks noChangeAspect="1"/>
@@ -3934,7 +4019,7 @@
                   <pic:spPr>
                     <a:xfrm>
                       <a:off x="0" y="0"/>
-                      <a:ext cx="4937760" cy="3134058"/>
+                      <a:ext cx="4389120" cy="2785829"/>
                     </a:xfrm>
                     <a:prstGeom prst="rect"/>
                   </pic:spPr>
@@ -3953,7 +4038,7 @@
         <w:rPr>
           <w:sz w:val="18"/>
         </w:rPr>
-        <w:t>圖 2-1 default 的硬體 sqrt／負值 fallback，以及 forced-libm 的符號載入。</w:t>
+        <w:t>圖 2-1 default 的 sqrt 指令與負值 fallback；forced-libm 載入函式符號。</w:t>
       </w:r>
     </w:p>
     <w:p>
@@ -3963,7 +4048,7 @@
         <w:spacing w:after="100"/>
       </w:pPr>
       <w:r>
-        <w:t>規格與實作能證明到哪一層</w:t>
+        <w:t>指令證據與演算法的界線</w:t>
       </w:r>
     </w:p>
     <w:tbl>
@@ -4000,7 +4085,7 @@
           </w:tcPr>
           <w:p>
             <w:pPr>
-              <w:keepNext w:val="0"/>
+              <w:keepNext/>
               <w:spacing w:after="40" w:before="40"/>
             </w:pPr>
             <w:r>
@@ -4020,7 +4105,7 @@
           </w:tcPr>
           <w:p>
             <w:pPr>
-              <w:keepNext w:val="0"/>
+              <w:keepNext/>
               <w:spacing w:after="40" w:before="40"/>
             </w:pPr>
             <w:r>
@@ -4040,7 +4125,7 @@
           </w:tcPr>
           <w:p>
             <w:pPr>
-              <w:keepNext w:val="0"/>
+              <w:keepNext/>
               <w:spacing w:after="40" w:before="40"/>
             </w:pPr>
             <w:r>
@@ -4066,7 +4151,7 @@
           </w:tcPr>
           <w:p>
             <w:pPr>
-              <w:keepNext w:val="0"/>
+              <w:keepNext/>
               <w:spacing w:after="40" w:before="40"/>
             </w:pPr>
             <w:r>
@@ -4086,7 +4171,7 @@
           </w:tcPr>
           <w:p>
             <w:pPr>
-              <w:keepNext w:val="0"/>
+              <w:keepNext/>
               <w:spacing w:after="40" w:before="40"/>
             </w:pPr>
             <w:r>
@@ -4106,7 +4191,7 @@
           </w:tcPr>
           <w:p>
             <w:pPr>
-              <w:keepNext w:val="0"/>
+              <w:keepNext/>
               <w:spacing w:after="40" w:before="40"/>
             </w:pPr>
             <w:r>
@@ -4132,7 +4217,7 @@
           </w:tcPr>
           <w:p>
             <w:pPr>
-              <w:keepNext w:val="0"/>
+              <w:keepNext/>
               <w:spacing w:after="40" w:before="40"/>
             </w:pPr>
             <w:r>
@@ -4152,7 +4237,7 @@
           </w:tcPr>
           <w:p>
             <w:pPr>
-              <w:keepNext w:val="0"/>
+              <w:keepNext/>
               <w:spacing w:after="40" w:before="40"/>
             </w:pPr>
             <w:r>
@@ -4172,7 +4257,7 @@
           </w:tcPr>
           <w:p>
             <w:pPr>
-              <w:keepNext w:val="0"/>
+              <w:keepNext/>
               <w:spacing w:after="40" w:before="40"/>
             </w:pPr>
             <w:r>
@@ -4257,12 +4342,12 @@
         <w:spacing w:after="100" w:before="0"/>
       </w:pPr>
       <w:r>
-        <w:t>sqrt(2) 的三型態輸出見前表，額外位數反映型態精度。最小 double subnormal 2^-1074 的平方根為 2^-537，實測未設 inexact；極小輸入不必然不精確。</w:t>
+        <w:t>三型態 sqrt(2) 見表。double 最小 subnormal 2^-1074 的平方根為 2^-537，實測未設 inexact；極小輸入不必然不精確。</w:t>
       </w:r>
     </w:p>
     <w:p>
       <w:r>
-        <w:t>glibc generic sqrt 的軟體分支會先縮放輸入、正規化指數與有效數，再用 reciprocal sqrt 表格初值及多項式修正，最後補償誤差並捨入。這是參考演算法；master 未與本機套件 source 精確匹配，不能把它當成本次 CPU 的內部演算法。就本機而言，SQRT 指令與 domain-error fallback 是已驗證的關鍵路徑。[5a]</w:t>
+        <w:t>glibc generic 軟體 sqrt 先縮放與正規化，再用 reciprocal-sqrt 表格初值、多項式修正及誤差補償，最後捨入。此 master 來源未與本機套件精確匹配，只作演算法參考；本機已證明的是硬體 SQRT 與錯誤處理路徑。[5a]</w:t>
       </w:r>
     </w:p>
     <w:p>
@@ -4283,7 +4368,7 @@
         </w:rPr>
       </w:pPr>
       <w:r>
-        <w:t>關閉 fast-math 時，本例保留括號順序與特殊值語意；開啟後 GCC 允許重結合、假定只有有限值，並放寬 errno、signed zero 與捨入環境等要求。IEEE 754 的有限精度捨入使加法不具一般結合律，因此這些轉換可能改變答案。[2]</w:t>
+        <w:t>-ffast-math 允許重結合、有限值假設，並放寬 errno、signed zero 與捨入環境要求。有限精度加法不具一般結合律，這些最佳化可改變答案；以下只改此選項驗證。[2]</w:t>
       </w:r>
     </w:p>
     <w:p>
@@ -4307,11 +4392,12 @@
         </w:rPr>
       </w:pPr>
       <w:r>
-        <w:t>以 argv 讀入 a=1e16、b=-1e16、c=1，比較 (a+b)+c 與 a+(b+c)。運算置於獨立檔案、關閉 LTO，避免常數折疊。兩版皆 -std=c++20 -O3 -fno-lto -ffp-contract=off，只將 -fno-fast-math 換成 -ffast-math。另測 quiet NaN 的 x!=x 作特殊值補充案例。</w:t>
+        <w:t>argv 輸入 a=1e16、b=-1e16、c=1，比較兩種括號順序與 NaN 的 x!=x。運算分檔且停用 LTO，避免常數折疊；兩版皆 -std=c++20 -O3 -fno-lto -ffp-contract=off，僅切換 -fno-fast-math／-ffast-math。</w:t>
       </w:r>
     </w:p>
     <w:p>
       <w:pPr>
+        <w:keepLines/>
         <w:spacing w:after="100" w:before="0"/>
       </w:pPr>
       <w:r>
@@ -4368,7 +4454,7 @@
           </w:tcPr>
           <w:p>
             <w:pPr>
-              <w:keepNext w:val="0"/>
+              <w:keepNext/>
               <w:spacing w:after="40" w:before="40"/>
             </w:pPr>
             <w:r>
@@ -4388,7 +4474,7 @@
           </w:tcPr>
           <w:p>
             <w:pPr>
-              <w:keepNext w:val="0"/>
+              <w:keepNext/>
               <w:spacing w:after="40" w:before="40"/>
             </w:pPr>
             <w:r>
@@ -4408,7 +4494,7 @@
           </w:tcPr>
           <w:p>
             <w:pPr>
-              <w:keepNext w:val="0"/>
+              <w:keepNext/>
               <w:spacing w:after="40" w:before="40"/>
             </w:pPr>
             <w:r>
@@ -4434,7 +4520,7 @@
           </w:tcPr>
           <w:p>
             <w:pPr>
-              <w:keepNext w:val="0"/>
+              <w:keepNext/>
               <w:spacing w:after="40" w:before="40"/>
             </w:pPr>
             <w:r>
@@ -4454,7 +4540,7 @@
           </w:tcPr>
           <w:p>
             <w:pPr>
-              <w:keepNext w:val="0"/>
+              <w:keepNext/>
               <w:spacing w:after="40" w:before="40"/>
             </w:pPr>
             <w:r>
@@ -4474,7 +4560,7 @@
           </w:tcPr>
           <w:p>
             <w:pPr>
-              <w:keepNext w:val="0"/>
+              <w:keepNext/>
               <w:spacing w:after="40" w:before="40"/>
             </w:pPr>
             <w:r>
@@ -4500,7 +4586,7 @@
           </w:tcPr>
           <w:p>
             <w:pPr>
-              <w:keepNext w:val="0"/>
+              <w:keepNext/>
               <w:spacing w:after="40" w:before="40"/>
             </w:pPr>
             <w:r>
@@ -4520,7 +4606,7 @@
           </w:tcPr>
           <w:p>
             <w:pPr>
-              <w:keepNext w:val="0"/>
+              <w:keepNext/>
               <w:spacing w:after="40" w:before="40"/>
             </w:pPr>
             <w:r>
@@ -4540,7 +4626,7 @@
           </w:tcPr>
           <w:p>
             <w:pPr>
-              <w:keepNext w:val="0"/>
+              <w:keepNext/>
               <w:spacing w:after="40" w:before="40"/>
             </w:pPr>
             <w:r>
@@ -4566,7 +4652,7 @@
           </w:tcPr>
           <w:p>
             <w:pPr>
-              <w:keepNext w:val="0"/>
+              <w:keepNext/>
               <w:spacing w:after="40" w:before="40"/>
             </w:pPr>
             <w:r>
@@ -4586,7 +4672,7 @@
           </w:tcPr>
           <w:p>
             <w:pPr>
-              <w:keepNext w:val="0"/>
+              <w:keepNext/>
               <w:spacing w:after="40" w:before="40"/>
             </w:pPr>
             <w:r>
@@ -4606,7 +4692,7 @@
           </w:tcPr>
           <w:p>
             <w:pPr>
-              <w:keepNext w:val="0"/>
+              <w:keepNext/>
               <w:spacing w:after="40" w:before="40"/>
             </w:pPr>
             <w:r>
@@ -4699,7 +4785,7 @@
       <w:r>
         <w:drawing>
           <wp:inline xmlns:a="http://schemas.openxmlformats.org/drawingml/2006/main" xmlns:pic="http://schemas.openxmlformats.org/drawingml/2006/picture">
-            <wp:extent cx="4754880" cy="3682214"/>
+            <wp:extent cx="4389120" cy="2685184"/>
             <wp:docPr id="12" name="Picture 12"/>
             <wp:cNvGraphicFramePr>
               <a:graphicFrameLocks noChangeAspect="1"/>
@@ -4713,6 +4799,7 @@
                   </pic:nvPicPr>
                   <pic:blipFill>
                     <a:blip r:embed="rId19"/>
+                    <a:srcRect t="21000"/>
                     <a:stretch>
                       <a:fillRect/>
                     </a:stretch>
@@ -4720,7 +4807,7 @@
                   <pic:spPr>
                     <a:xfrm>
                       <a:off x="0" y="0"/>
-                      <a:ext cx="4754880" cy="3682214"/>
+                      <a:ext cx="4389120" cy="2685184"/>
                     </a:xfrm>
                     <a:prstGeom prst="rect"/>
                   </pic:spPr>
@@ -4739,7 +4826,7 @@
         <w:rPr>
           <w:sz w:val="18"/>
         </w:rPr>
-        <w:t>圖 3-1 相同 a、b、c 輸入下 strict／fast 的完整輸出。</w:t>
+        <w:t>圖 3-1 strict／fast 在相同輸入下的輸出。</w:t>
       </w:r>
     </w:p>
     <w:p>
@@ -4749,7 +4836,7 @@
       <w:r>
         <w:drawing>
           <wp:inline xmlns:a="http://schemas.openxmlformats.org/drawingml/2006/main" xmlns:pic="http://schemas.openxmlformats.org/drawingml/2006/picture">
-            <wp:extent cx="5943600" cy="2382982"/>
+            <wp:extent cx="5212080" cy="2089692"/>
             <wp:docPr id="23" name="Picture 23"/>
             <wp:cNvGraphicFramePr>
               <a:graphicFrameLocks noChangeAspect="1"/>
@@ -4770,7 +4857,7 @@
                   <pic:spPr>
                     <a:xfrm>
                       <a:off x="0" y="0"/>
-                      <a:ext cx="5943600" cy="2382982"/>
+                      <a:ext cx="5212080" cy="2089692"/>
                     </a:xfrm>
                     <a:prstGeom prst="rect"/>
                   </pic:spPr>
@@ -4789,7 +4876,7 @@
         <w:rPr>
           <w:sz w:val="18"/>
         </w:rPr>
-        <w:t>圖 3-2 ADD 加法順序改變，fast 版也移除 NaN self comparison。</w:t>
+        <w:t>圖 3-2 fast 改變加法順序並移除 NaN 比較。</w:t>
       </w:r>
     </w:p>
     <w:p>
@@ -4802,7 +4889,7 @@
         </w:rPr>
       </w:pPr>
       <w:r>
-        <w:t>結果如何被改變</w:t>
+        <w:t>輸出與指令如何對應</w:t>
       </w:r>
     </w:p>
     <w:p>
@@ -4813,7 +4900,7 @@
         </w:rPr>
       </w:pPr>
       <w:r>
-        <w:t>strict 左結合先抵消為 0，再加 1 得 1；右結合的 -1e16+1 捨入回 -1e16，結果為 0。fast 的組合語言把左結合也改成先加 b+c，輸出便成 0；輸入、source 與其他旗標一致，足以把差異連結到 fast-math。NaN 的 x!=x 在 strict 為 true，fast 則直接以 XOR 回 false，說明有限值假設會破壞這類 NaN 檢查。兩版皆禁用 contraction，這次差異不需要用 FMA 解釋。[2]</w:t>
+        <w:t>strict 左結合先抵消再加 1，得 1；右結合的 -1e16+1 捨入回 -1e16，得 0。fast 產生碼先算 b+c，左結合也變 0。NaN 的 x!=x 由 strict 的 true 變為 fast 的 XOR／false。相同輸入與其他旗標、對照輸出及產生碼共同支持 fast-math 為差異原因；兩版已停用 FMA contraction。[2]</w:t>
       </w:r>
     </w:p>
     <w:p>
@@ -4860,11 +4947,12 @@
         </w:rPr>
       </w:pPr>
       <w:r>
-        <w:t>「固定輸出 9 位小數」不等於「十進位中點一律進位」。我用 1/1024=0.0009765625，此值可精確以二進位表示，正好在第 9 位的中點；因而可排除字面值轉換誤差。比較 printf、iostream、正負值、nextafter 鄰居與四種捨入模式。</w:t>
+        <w:t>1/1024=0.0009765625 可精確以二進位表示，正好是九位小數的中點，排除字面值轉換誤差。比較 printf、iostream、正負值、nextafter 鄰居與四種捨入模式。</w:t>
       </w:r>
     </w:p>
     <w:p>
       <w:pPr>
+        <w:keepLines/>
         <w:spacing w:after="100" w:before="0"/>
       </w:pPr>
       <w:r>
@@ -4923,7 +5011,7 @@
           </w:tcPr>
           <w:p>
             <w:pPr>
-              <w:keepNext w:val="0"/>
+              <w:keepNext/>
               <w:spacing w:after="40" w:before="40"/>
             </w:pPr>
             <w:r>
@@ -4943,7 +5031,7 @@
           </w:tcPr>
           <w:p>
             <w:pPr>
-              <w:keepNext w:val="0"/>
+              <w:keepNext/>
               <w:spacing w:after="40" w:before="40"/>
             </w:pPr>
             <w:r>
@@ -4963,7 +5051,7 @@
           </w:tcPr>
           <w:p>
             <w:pPr>
-              <w:keepNext w:val="0"/>
+              <w:keepNext/>
               <w:spacing w:after="40" w:before="40"/>
             </w:pPr>
             <w:r>
@@ -4989,7 +5077,7 @@
           </w:tcPr>
           <w:p>
             <w:pPr>
-              <w:keepNext w:val="0"/>
+              <w:keepNext/>
               <w:spacing w:after="40" w:before="40"/>
             </w:pPr>
             <w:r>
@@ -5009,7 +5097,7 @@
           </w:tcPr>
           <w:p>
             <w:pPr>
-              <w:keepNext w:val="0"/>
+              <w:keepNext/>
               <w:spacing w:after="40" w:before="40"/>
             </w:pPr>
             <w:r>
@@ -5029,7 +5117,7 @@
           </w:tcPr>
           <w:p>
             <w:pPr>
-              <w:keepNext w:val="0"/>
+              <w:keepNext/>
               <w:spacing w:after="40" w:before="40"/>
             </w:pPr>
             <w:r>
@@ -5055,7 +5143,7 @@
           </w:tcPr>
           <w:p>
             <w:pPr>
-              <w:keepNext w:val="0"/>
+              <w:keepNext/>
               <w:spacing w:after="40" w:before="40"/>
             </w:pPr>
             <w:r>
@@ -5075,7 +5163,7 @@
           </w:tcPr>
           <w:p>
             <w:pPr>
-              <w:keepNext w:val="0"/>
+              <w:keepNext/>
               <w:spacing w:after="40" w:before="40"/>
             </w:pPr>
             <w:r>
@@ -5095,7 +5183,7 @@
           </w:tcPr>
           <w:p>
             <w:pPr>
-              <w:keepNext w:val="0"/>
+              <w:keepNext/>
               <w:spacing w:after="40" w:before="40"/>
             </w:pPr>
             <w:r>
@@ -5121,7 +5209,7 @@
           </w:tcPr>
           <w:p>
             <w:pPr>
-              <w:keepNext w:val="0"/>
+              <w:keepNext/>
               <w:spacing w:after="40" w:before="40"/>
             </w:pPr>
             <w:r>
@@ -5141,7 +5229,7 @@
           </w:tcPr>
           <w:p>
             <w:pPr>
-              <w:keepNext w:val="0"/>
+              <w:keepNext/>
               <w:spacing w:after="40" w:before="40"/>
             </w:pPr>
             <w:r>
@@ -5161,7 +5249,7 @@
           </w:tcPr>
           <w:p>
             <w:pPr>
-              <w:keepNext w:val="0"/>
+              <w:keepNext/>
               <w:spacing w:after="40" w:before="40"/>
             </w:pPr>
             <w:r>
@@ -5251,7 +5339,7 @@
         <w:spacing w:after="100" w:before="0"/>
       </w:pPr>
       <w:r>
-        <w:t>nearest 時兩 API 都輸出 0.000976562，與中點一律進位的 0.000976563 不同；較小／較大鄰居分別輸出 0.000976562／0.000976563。四模式結果見表，兩 API 在 16 個測試組合一致。</w:t>
+        <w:t>nearest 的兩 API 都輸出 0.000976562，反駁「中點一律進位」；較小／較大鄰居輸出 0.000976562／0.000976563。四模式共 16 組結果，兩 API 一致。</w:t>
       </w:r>
     </w:p>
     <w:p>
@@ -5262,7 +5350,7 @@
       <w:r>
         <w:drawing>
           <wp:inline xmlns:a="http://schemas.openxmlformats.org/drawingml/2006/main" xmlns:pic="http://schemas.openxmlformats.org/drawingml/2006/picture">
-            <wp:extent cx="4114800" cy="3485046"/>
+            <wp:extent cx="3657600" cy="3097819"/>
             <wp:docPr id="15" name="Picture 15"/>
             <wp:cNvGraphicFramePr>
               <a:graphicFrameLocks noChangeAspect="1"/>
@@ -5283,7 +5371,7 @@
                   <pic:spPr>
                     <a:xfrm>
                       <a:off x="0" y="0"/>
-                      <a:ext cx="4114800" cy="3485046"/>
+                      <a:ext cx="3657600" cy="3097819"/>
                     </a:xfrm>
                     <a:prstGeom prst="rect"/>
                   </pic:spPr>
@@ -5313,13 +5401,13 @@
         </w:rPr>
       </w:pPr>
       <w:r>
-        <w:t>這台機器的 nearest 輸出符合 ties-to-even，upward／downward 又顯示格式化受捨入環境影響。因此應說「把實際儲存值格式化為指定小數位」，不能無條件宣稱是原始十進位數的四捨五入；也不將本次函式庫行為擴大為所有平台的保證。[5b]</w:t>
+        <w:t>本機 nearest 符合 ties-to-even；upward／downward 改變輸出，證明格式化受捨入環境影響。精確說法是「將實際儲存值格式化至指定小數位」，不能一概稱為原始十進位數的四捨五入。[5b]</w:t>
       </w:r>
     </w:p>
     <w:p>
       <w:pPr>
         <w:pStyle w:val="1"/>
-        <w:pageBreakBefore/>
+        <w:pageBreakBefore w:val="0"/>
         <w:spacing w:after="100"/>
         <w:rPr>
           <w:lang w:eastAsia="zh-TW"/>
@@ -5360,7 +5448,7 @@
         </w:rPr>
       </w:pPr>
       <w:r>
-        <w:t>我在 x86_64 WSL 與 arm64 Mac 以相同來源、GNU GCC release 16.2.0 及逐字相同旗標計算 (2^53+1)-2^53。兩端都先設定 FE_TONEAREST；pair checker 對 compiler family、release、flags、Q5／common 來源雜湊皆 MATCH。GCC 的 vendor build 與 target 不同，完整 configuration 均保留。</w:t>
+        <w:t>x86_64 WSL 與 arm64 Mac 使用相同來源、GNU GCC release 16.2.0、逐字相同旗標及 FE_TONEAREST，計算 (2^53+1)-2^53。pair checker 的 compiler family、release、flags、來源雜湊皆 MATCH；vendor build 與 target 不同，configuration 已保存。</w:t>
       </w:r>
     </w:p>
     <w:p>
@@ -5370,11 +5458,12 @@
         <w:spacing w:after="100"/>
       </w:pPr>
       <w:r>
-        <w:t>輸出與指令是否支持 ABI 差異</w:t>
+        <w:t>跨平台輸出與指令</w:t>
       </w:r>
     </w:p>
     <w:p>
       <w:pPr>
+        <w:keepLines/>
         <w:spacing w:after="100" w:before="0"/>
         <w:rPr>
           <w:lang w:eastAsia="zh-TW"/>
@@ -5443,18 +5532,19 @@
         <w:rPr>
           <w:sz w:val="18"/>
         </w:rPr>
-        <w:t>圖 5-1 同一 binary 的四種捨入模式與 nearest ABI 案例。</w:t>
+        <w:t>圖 5-1 WSL 四模式輸出，ABI 案例皆先設定 nearest。</w:t>
       </w:r>
     </w:p>
     <w:p>
       <w:pPr>
+        <w:keepLines/>
         <w:spacing w:after="100" w:before="0"/>
         <w:rPr>
           <w:lang w:eastAsia="zh-TW"/>
         </w:rPr>
       </w:pPr>
       <w:r>
-        <w:t>編譯／執行：CXX=g++-16 bash scripts/run_q5.sh run。旗標為 -std=c++20 -Wall -Wextra -fno-lto -ffp-contract=off -O2 -fno-fast-math -frounding-math。用 scripts/verify_q5_pair.py 比較兩端結果目錄；圖 5-2 為核對輸出。</w:t>
+        <w:t>編譯／執行：CXX=g++-16 bash scripts/run_q5.sh run。旗標：-std=c++20 -Wall -Wextra -fno-lto -ffp-contract=off -O2 -fno-fast-math -frounding-math。以 scripts/verify_q5_pair.py 核對兩端條件。</w:t>
       </w:r>
     </w:p>
     <w:p>
@@ -5504,7 +5594,7 @@
         <w:rPr>
           <w:sz w:val="18"/>
         </w:rPr>
-        <w:t>圖 5-2 兩端 GCC family／release、逐字旗標與來源的四項 MATCH。</w:t>
+        <w:t>圖 5-2 來源、GCC release 與逐字旗標核對一致。</w:t>
       </w:r>
     </w:p>
     <w:tbl>
@@ -5905,6 +5995,7 @@
           </w:tcPr>
           <w:p>
             <w:pPr>
+              <w:keepNext w:val="0"/>
               <w:spacing w:after="40" w:before="40"/>
             </w:pPr>
             <w:r>
@@ -5923,6 +6014,7 @@
           </w:tcPr>
           <w:p>
             <w:pPr>
+              <w:keepNext w:val="0"/>
               <w:spacing w:after="40" w:before="40"/>
             </w:pPr>
             <w:r>
@@ -5941,6 +6033,7 @@
           </w:tcPr>
           <w:p>
             <w:pPr>
+              <w:keepNext w:val="0"/>
               <w:spacing w:after="40" w:before="40"/>
             </w:pPr>
             <w:r>
@@ -5998,7 +6091,7 @@
         <w:rPr>
           <w:sz w:val="18"/>
         </w:rPr>
-        <w:t>圖 5-3 Mac 的四模式輸出：long double 在 nearest 下減回為 0。</w:t>
+        <w:t>圖 5-3 Mac long double 在 nearest 下得到 0。</w:t>
       </w:r>
     </w:p>
     <w:p>
@@ -6048,7 +6141,7 @@
         <w:rPr>
           <w:sz w:val="18"/>
         </w:rPr>
-        <w:t>圖 5-4 Mac 的 FADD D 暫存器、STR／LDR 與 FSUB；加法存回後才減回。</w:t>
+        <w:t>圖 5-4 Mac FADD D、STR／LDR、FSUB：存回後才相減。</w:t>
       </w:r>
     </w:p>
     <w:p>
@@ -6056,7 +6149,7 @@
         <w:spacing w:after="100" w:before="0"/>
       </w:pPr>
       <w:r>
-        <w:t>WSL 函式用 FLDT、FADD、FSTPT、FLDT、FSUBP；Mac 用 FADD D、STR／LDR、FSUB D。兩端都保留加法、存回與減法，因此差異不是計算被消去。輸入有限且不溢位，沒有越界或未初始化值；inline asm 是此次 GCC 的支援擴充。</w:t>
+        <w:t>WSL 為 FLDT／FADD／FSTPT／FLDT／FSUBP；Mac 為 FADD D／STR／LDR／FSUB D。兩端保留加法、存回與減法，排除計算消去；輸入有限、不溢位且無越界或未初始化值。inline asm 使用 GCC 支援擴充。</w:t>
       </w:r>
     </w:p>
     <w:p>
@@ -6069,7 +6162,7 @@
         </w:rPr>
       </w:pPr>
       <w:r>
-        <w:t>同一計算為何一邊得 1 一邊得 0</w:t>
+        <w:t>ABI 差異的數值驗證</w:t>
       </w:r>
     </w:p>
     <w:p>
@@ -6080,7 +6173,7 @@
         </w:rPr>
       </w:pPr>
       <w:r>
-        <w:t>WSL long double 實測 16 bytes／64 位，能保留 2^53+1，減回得 1。Mac 實測 8 bytes／53 位，2^53 附近的間距為 2，+1 是中點，nearest 存回 2^53，減回便得 0；與 Apple arm64 的 long double ABI 一致。[6] 相同 source、release 和 flags 仍可能因型態表示而不同。本例另以同 binary 的 double 1+2^-53 對照四模式：兩端 nearest／downward／towardzero 得 1，upward 得下一個可表示值。捨入狀態与產生碼一起支持原因，而非僅憑理論推測。</w:t>
+        <w:t>WSL long double 有 64 位精度，保留 2^53+1，減回得 1；Mac 只有 53 位，2^53 附近間距為 2，+1 是中點，nearest 存回 2^53，減回得 0，符合 Apple arm64 ABI。[6] 同 binary 的 double 1+2^-53 在兩端 nearest／downward／towardzero 得 1，upward 得下一個表示值。型態參數、捨入控制、輸出與產生碼共同支持環境差異的解釋。</w:t>
       </w:r>
     </w:p>
     <w:p>
@@ -6480,7 +6573,7 @@
         </w:rPr>
       </w:pPr>
       <w:r>
-        <w:t>我提供設備資訊，在 Windows／WSL 執行 Q0～Q6、在 Mac 執行 Q5，並顯示結果後截圖。Codex 協助程式、保存腳本、工具鏈設定、來源查閱、流程預檢，以及數據整理與分析草稿。正式數據取自兩端 student 結果目錄；assistant 試跑未作為正式 benchmark。原因分析由 AI 協助撰寫，我仍需逐段確認理解。</w:t>
+        <w:t>學生提供設備資訊，執行 Windows／WSL Q0～Q6、Mac Q5 並截圖。Codex 協助程式、保存腳本、工具鏈設定、來源查閱、流程預檢、數據整理與分析草稿。正式數據來自 student 結果目錄，assistant 試跑另存。分析仍須由學生確認理解。</w:t>
       </w:r>
     </w:p>
     <w:p>
@@ -6501,7 +6594,7 @@
         </w:rPr>
       </w:pPr>
       <w:r>
-        <w:t>參考文件用來解釋規格；本機執行路徑以輸出與反組譯確認。查閱日期：2026/10/04。</w:t>
+        <w:t>本機路徑以輸出與反組譯驗證，規格以參考文件解釋。查閱日期：2026/10/04。</w:t>
       </w:r>
     </w:p>
     <w:p>
@@ -6618,7 +6711,7 @@
     </w:p>
     <w:p>
       <w:r>
-        <w:t>WSL：results/linux-20261004-201349/；Mac：results/q5-darwin-20261004-211048-student-wdBjAR/。完整計時、案例、來源雜湊與組合語言保留於 results；截圖保留於 screenshot／mac截圖。各題 experiments README 提供獨立重現步驟。</w:t>
+        <w:t>完整數據、案例、來源雜湊與產生碼：results/linux-20261004-201349/、results/q5-darwin-20261004-211048-student-wdBjAR/。原圖：screenshot／mac截圖。獨立重現方式：各題 experiments README。</w:t>
       </w:r>
     </w:p>
     <w:sectPr>

</xml_diff>

<commit_message>
Align report headings and scope with homework questions
</commit_message>
<xml_diff>
--- a/Floating_Point_Report_Q0.docx
+++ b/Floating_Point_Report_Q0.docx
@@ -11,10 +11,7 @@
         </w:rPr>
       </w:pPr>
       <w:r>
-        <w:rPr>
-          <w:lang w:eastAsia="zh-TW"/>
-        </w:rPr>
-        <w:t>浮點數行為實驗報告</w:t>
+        <w:t>Floating Point 行為專案報告</w:t>
       </w:r>
     </w:p>
     <w:p>
@@ -76,33 +73,6 @@
     </w:p>
     <w:p>
       <w:pPr>
-        <w:pStyle w:val="21"/>
-        <w:pageBreakBefore w:val="0"/>
-        <w:spacing w:after="100"/>
-        <w:rPr>
-          <w:lang w:eastAsia="zh-TW"/>
-        </w:rPr>
-      </w:pPr>
-      <w:r>
-        <w:rPr>
-          <w:lang w:eastAsia="zh-TW"/>
-        </w:rPr>
-        <w:t>報告目的</w:t>
-      </w:r>
-    </w:p>
-    <w:p>
-      <w:pPr>
-        <w:spacing w:after="100" w:before="0"/>
-        <w:rPr>
-          <w:lang w:eastAsia="zh-TW"/>
-        </w:rPr>
-      </w:pPr>
-      <w:r>
-        <w:t>本報告以本機輸出、計時與反組譯確認浮點數的實際行為。i7-14650HX／WSL 的 float、double 使用 scalar SSE，long double 使用 x87；fast-math 改變加法順序與結果；M4 Mac 的 long double 精度不同，同一算式得到不同答案。各題以執行證據支持原因，並區分已驗證路徑與理論解釋。</w:t>
-      </w:r>
-    </w:p>
-    <w:p>
-      <w:pPr>
         <w:pStyle w:val="1"/>
         <w:pageBreakBefore w:val="0"/>
         <w:spacing w:after="100"/>
@@ -111,17 +81,7 @@
         </w:rPr>
       </w:pPr>
       <w:r>
-        <w:rPr>
-          <w:lang w:eastAsia="zh-TW"/>
-        </w:rPr>
-        <w:lastRenderedPageBreak/>
-        <w:t xml:space="preserve">Q0 </w:t>
-      </w:r>
-      <w:r>
-        <w:rPr>
-          <w:lang w:eastAsia="zh-TW"/>
-        </w:rPr>
-        <w:t>實驗環境</w:t>
+        <w:t>Q0. 實驗環境</w:t>
       </w:r>
     </w:p>
     <w:p>
@@ -2127,17 +2087,7 @@
         </w:rPr>
       </w:pPr>
       <w:r>
-        <w:rPr>
-          <w:lang w:eastAsia="zh-TW"/>
-        </w:rPr>
-        <w:lastRenderedPageBreak/>
-        <w:t xml:space="preserve">Q1 </w:t>
-      </w:r>
-      <w:r>
-        <w:rPr>
-          <w:lang w:eastAsia="zh-TW"/>
-        </w:rPr>
-        <w:t>不同浮點型態的效能與精度</w:t>
+        <w:t>Q1. Benchmark</w:t>
       </w:r>
     </w:p>
     <w:p>
@@ -3912,17 +3862,7 @@
         </w:rPr>
       </w:pPr>
       <w:r>
-        <w:rPr>
-          <w:lang w:eastAsia="zh-TW"/>
-        </w:rPr>
-        <w:lastRenderedPageBreak/>
-        <w:t xml:space="preserve">Q2 </w:t>
-      </w:r>
-      <w:r>
-        <w:rPr>
-          <w:lang w:eastAsia="zh-TW"/>
-        </w:rPr>
-        <w:t>數學函式實作</w:t>
+        <w:t>Q2. Library Implementation</w:t>
       </w:r>
     </w:p>
     <w:p>
@@ -4338,14 +4278,6 @@
       </w:tr>
     </w:tbl>
     <w:p>
-      <w:pPr>
-        <w:spacing w:after="100" w:before="0"/>
-      </w:pPr>
-      <w:r>
-        <w:t>三型態 sqrt(2) 見表。double 最小 subnormal 2^-1074 的平方根為 2^-537，實測未設 inexact；極小輸入不必然不精確。</w:t>
-      </w:r>
-    </w:p>
-    <w:p>
       <w:r>
         <w:t>glibc generic 軟體 sqrt 先縮放與正規化，再用 reciprocal-sqrt 表格初值、多項式修正及誤差補償，最後捨入。此 master 來源未與本機套件精確匹配，只作演算法參考；本機已證明的是硬體 SQRT 與錯誤處理路徑。[5a]</w:t>
       </w:r>
@@ -4357,7 +4289,7 @@
         <w:spacing w:after="100"/>
       </w:pPr>
       <w:r>
-        <w:t>Q3 IEEE 754 與 ffast math</w:t>
+        <w:t>Q3. IEEE 754 與 ffast-math</w:t>
       </w:r>
     </w:p>
     <w:p>
@@ -4368,7 +4300,7 @@
         </w:rPr>
       </w:pPr>
       <w:r>
-        <w:t>-ffast-math 允許重結合、有限值假設，並放寬 errno、signed zero 與捨入環境要求。有限精度加法不具一般結合律，這些最佳化可改變答案；以下只改此選項驗證。[2]</w:t>
+        <w:t>關閉 -ffast-math 時，本例保留括號順序與 NaN 判斷；開啟後允許重結合、假定有限值，並放寬 errno、signed zero 與動態捨入要求，以增加最佳化空間。IEEE 754 的有限精度加法不具一般結合律，因此結果可能改變。[2]</w:t>
       </w:r>
     </w:p>
     <w:p>
@@ -4913,17 +4845,7 @@
         </w:rPr>
       </w:pPr>
       <w:r>
-        <w:rPr>
-          <w:lang w:eastAsia="zh-TW"/>
-        </w:rPr>
-        <w:lastRenderedPageBreak/>
-        <w:t xml:space="preserve">Q4 </w:t>
-      </w:r>
-      <w:r>
-        <w:rPr>
-          <w:lang w:eastAsia="zh-TW"/>
-        </w:rPr>
-        <w:t>浮點數輸出</w:t>
+        <w:t>Q4. 浮點數輸出</w:t>
       </w:r>
     </w:p>
     <w:p>
@@ -5414,17 +5336,7 @@
         </w:rPr>
       </w:pPr>
       <w:r>
-        <w:rPr>
-          <w:lang w:eastAsia="zh-TW"/>
-        </w:rPr>
-        <w:lastRenderedPageBreak/>
-        <w:t xml:space="preserve">Q5 </w:t>
-      </w:r>
-      <w:r>
-        <w:rPr>
-          <w:lang w:eastAsia="zh-TW"/>
-        </w:rPr>
-        <w:t>跨執行環境比較</w:t>
+        <w:t>Q5. 加分題</w:t>
       </w:r>
     </w:p>
     <w:p>
@@ -5448,7 +5360,7 @@
         </w:rPr>
       </w:pPr>
       <w:r>
-        <w:t>x86_64 WSL 與 arm64 Mac 使用相同來源、GNU GCC release 16.2.0、逐字相同旗標及 FE_TONEAREST，計算 (2^53+1)-2^53。pair checker 的 compiler family、release、flags、來源雜湊皆 MATCH；vendor build 與 target 不同，configuration 已保存。</w:t>
+        <w:t>x86_64 WSL 與 arm64 Mac 使用相同來源、GNU GCC release 16.2.0、逐字相同旗標，計算 (2^53+1)-2^53。兩端均先設定 FE_TONEAREST；compiler family、release、flags 與來源雜湊皆核對一致。vendor build 與 target 不同，完整 configuration 已保存。</w:t>
       </w:r>
     </w:p>
     <w:p>
@@ -5492,7 +5404,7 @@
       <w:r>
         <w:drawing>
           <wp:inline xmlns:a="http://schemas.openxmlformats.org/drawingml/2006/main" xmlns:pic="http://schemas.openxmlformats.org/drawingml/2006/picture">
-            <wp:extent cx="4754880" cy="2741893"/>
+            <wp:extent cx="4754880" cy="1041919"/>
             <wp:docPr id="24" name="Picture 24"/>
             <wp:cNvGraphicFramePr>
               <a:graphicFrameLocks noChangeAspect="1"/>
@@ -5506,6 +5418,7 @@
                   </pic:nvPicPr>
                   <pic:blipFill>
                     <a:blip r:embed="rId24"/>
+                    <a:srcRect b="62000"/>
                     <a:stretch>
                       <a:fillRect/>
                     </a:stretch>
@@ -5513,7 +5426,7 @@
                   <pic:spPr>
                     <a:xfrm>
                       <a:off x="0" y="0"/>
-                      <a:ext cx="4754880" cy="2741893"/>
+                      <a:ext cx="4754880" cy="1041919"/>
                     </a:xfrm>
                     <a:prstGeom prst="rect"/>
                   </pic:spPr>
@@ -5532,7 +5445,7 @@
         <w:rPr>
           <w:sz w:val="18"/>
         </w:rPr>
-        <w:t>圖 5-1 WSL 四模式輸出，ABI 案例皆先設定 nearest。</w:t>
+        <w:t>圖 5-1 WSL 在 FE_TONEAREST 下的型態參數與結果 1。</w:t>
       </w:r>
     </w:p>
     <w:p>
@@ -5871,7 +5784,7 @@
           </w:tcPr>
           <w:p>
             <w:pPr>
-              <w:keepNext/>
+              <w:keepNext w:val="0"/>
               <w:spacing w:after="40" w:before="40"/>
             </w:pPr>
             <w:r>
@@ -5890,7 +5803,7 @@
           </w:tcPr>
           <w:p>
             <w:pPr>
-              <w:keepNext/>
+              <w:keepNext w:val="0"/>
               <w:spacing w:after="40" w:before="40"/>
             </w:pPr>
             <w:r>
@@ -5909,92 +5822,6 @@
           </w:tcPr>
           <w:p>
             <w:pPr>
-              <w:keepNext/>
-              <w:spacing w:after="40" w:before="40"/>
-            </w:pPr>
-            <w:r>
-              <w:rPr>
-                <w:b w:val="0"/>
-                <w:sz w:val="20"/>
-              </w:rPr>
-              <w:t>0，hex 0x0p+0</w:t>
-            </w:r>
-          </w:p>
-        </w:tc>
-      </w:tr>
-      <w:tr>
-        <w:trPr>
-          <w:cantSplit/>
-        </w:trPr>
-        <w:tc>
-          <w:tcPr>
-            <w:tcW w:type="dxa" w:w="4176"/>
-            <w:shd w:fill="FFFFFF"/>
-          </w:tcPr>
-          <w:p>
-            <w:pPr>
-              <w:keepNext/>
-              <w:spacing w:after="40" w:before="40"/>
-            </w:pPr>
-            <w:r>
-              <w:rPr>
-                <w:b w:val="0"/>
-                <w:sz w:val="20"/>
-              </w:rPr>
-              <w:t>double 1+2^-53：nearest／down／towardzero</w:t>
-            </w:r>
-          </w:p>
-        </w:tc>
-        <w:tc>
-          <w:tcPr>
-            <w:tcW w:type="dxa" w:w="2592"/>
-            <w:shd w:fill="FFFFFF"/>
-          </w:tcPr>
-          <w:p>
-            <w:pPr>
-              <w:keepNext/>
-              <w:spacing w:after="40" w:before="40"/>
-            </w:pPr>
-            <w:r>
-              <w:rPr>
-                <w:b w:val="0"/>
-                <w:sz w:val="20"/>
-              </w:rPr>
-              <w:t>0x1p+0</w:t>
-            </w:r>
-          </w:p>
-        </w:tc>
-        <w:tc>
-          <w:tcPr>
-            <w:tcW w:type="dxa" w:w="2592"/>
-            <w:shd w:fill="FFFFFF"/>
-          </w:tcPr>
-          <w:p>
-            <w:pPr>
-              <w:keepNext/>
-              <w:spacing w:after="40" w:before="40"/>
-            </w:pPr>
-            <w:r>
-              <w:rPr>
-                <w:b w:val="0"/>
-                <w:sz w:val="20"/>
-              </w:rPr>
-              <w:t>0x1p+0</w:t>
-            </w:r>
-          </w:p>
-        </w:tc>
-      </w:tr>
-      <w:tr>
-        <w:trPr>
-          <w:cantSplit/>
-        </w:trPr>
-        <w:tc>
-          <w:tcPr>
-            <w:tcW w:type="dxa" w:w="4176"/>
-            <w:shd w:fill="F7F8FA"/>
-          </w:tcPr>
-          <w:p>
-            <w:pPr>
               <w:keepNext w:val="0"/>
               <w:spacing w:after="40" w:before="40"/>
             </w:pPr>
@@ -6003,45 +5830,7 @@
                 <w:b w:val="0"/>
                 <w:sz w:val="20"/>
               </w:rPr>
-              <w:t>double 1+2^-53：upward</w:t>
-            </w:r>
-          </w:p>
-        </w:tc>
-        <w:tc>
-          <w:tcPr>
-            <w:tcW w:type="dxa" w:w="2592"/>
-            <w:shd w:fill="F7F8FA"/>
-          </w:tcPr>
-          <w:p>
-            <w:pPr>
-              <w:keepNext w:val="0"/>
-              <w:spacing w:after="40" w:before="40"/>
-            </w:pPr>
-            <w:r>
-              <w:rPr>
-                <w:b w:val="0"/>
-                <w:sz w:val="20"/>
-              </w:rPr>
-              <w:t>0x1.0000000000001p+0</w:t>
-            </w:r>
-          </w:p>
-        </w:tc>
-        <w:tc>
-          <w:tcPr>
-            <w:tcW w:type="dxa" w:w="2592"/>
-            <w:shd w:fill="F7F8FA"/>
-          </w:tcPr>
-          <w:p>
-            <w:pPr>
-              <w:keepNext w:val="0"/>
-              <w:spacing w:after="40" w:before="40"/>
-            </w:pPr>
-            <w:r>
-              <w:rPr>
-                <w:b w:val="0"/>
-                <w:sz w:val="20"/>
-              </w:rPr>
-              <w:t>0x1.0000000000001p+0</w:t>
+              <w:t>0，hex 0x0p+0</w:t>
             </w:r>
           </w:p>
         </w:tc>
@@ -6054,7 +5843,7 @@
       <w:r>
         <w:drawing>
           <wp:inline xmlns:a="http://schemas.openxmlformats.org/drawingml/2006/main" xmlns:pic="http://schemas.openxmlformats.org/drawingml/2006/picture">
-            <wp:extent cx="4754880" cy="2582266"/>
+            <wp:extent cx="4754880" cy="929616"/>
             <wp:docPr id="25" name="Picture 25"/>
             <wp:cNvGraphicFramePr>
               <a:graphicFrameLocks noChangeAspect="1"/>
@@ -6068,6 +5857,7 @@
                   </pic:nvPicPr>
                   <pic:blipFill>
                     <a:blip r:embed="rId29"/>
+                    <a:srcRect b="64000"/>
                     <a:stretch>
                       <a:fillRect/>
                     </a:stretch>
@@ -6075,7 +5865,7 @@
                   <pic:spPr>
                     <a:xfrm>
                       <a:off x="0" y="0"/>
-                      <a:ext cx="4754880" cy="2582266"/>
+                      <a:ext cx="4754880" cy="929616"/>
                     </a:xfrm>
                     <a:prstGeom prst="rect"/>
                   </pic:spPr>
@@ -6091,7 +5881,7 @@
         <w:rPr>
           <w:sz w:val="18"/>
         </w:rPr>
-        <w:t>圖 5-3 Mac long double 在 nearest 下得到 0。</w:t>
+        <w:t>圖 5-3 Mac 在 FE_TONEAREST 下的型態參數與結果 0。</w:t>
       </w:r>
     </w:p>
     <w:p>
@@ -6173,7 +5963,7 @@
         </w:rPr>
       </w:pPr>
       <w:r>
-        <w:t>WSL long double 有 64 位精度，保留 2^53+1，減回得 1；Mac 只有 53 位，2^53 附近間距為 2，+1 是中點，nearest 存回 2^53，減回得 0，符合 Apple arm64 ABI。[6] 同 binary 的 double 1+2^-53 在兩端 nearest／downward／towardzero 得 1，upward 得下一個表示值。型態參數、捨入控制、輸出與產生碼共同支持環境差異的解釋。</w:t>
+        <w:t>WSL long double 有 64 位精度，保留 2^53+1，減回得 1；Mac 只有 53 位，2^53 附近間距為 2，+1 是中點，nearest 存回 2^53，減回得 0，符合 Apple arm64 ABI。[6] 相同來源、compiler release 與旗標下，型態參數、實測結果及產生碼共同支持 ABI 差異為原因。</w:t>
       </w:r>
     </w:p>
     <w:p>
@@ -6186,17 +5976,7 @@
         </w:rPr>
       </w:pPr>
       <w:r>
-        <w:rPr>
-          <w:lang w:eastAsia="zh-TW"/>
-        </w:rPr>
-        <w:lastRenderedPageBreak/>
-        <w:t xml:space="preserve">Q6 </w:t>
-      </w:r>
-      <w:r>
-        <w:rPr>
-          <w:lang w:eastAsia="zh-TW"/>
-        </w:rPr>
-        <w:t>總結與額外浮點問題</w:t>
+        <w:t>Q6. 總結</w:t>
       </w:r>
     </w:p>
     <w:p>
@@ -6562,7 +6342,7 @@
         </w:rPr>
       </w:pPr>
       <w:r>
-        <w:t>Q7 AI 使用揭露</w:t>
+        <w:t>Q7. AI 使用自我揭露（不記入作業分數）</w:t>
       </w:r>
     </w:p>
     <w:p>
@@ -6573,7 +6353,7 @@
         </w:rPr>
       </w:pPr>
       <w:r>
-        <w:t>學生提供設備資訊，執行 Windows／WSL Q0～Q6、Mac Q5 並截圖。Codex 協助程式、保存腳本、工具鏈設定、來源查閱、流程預檢、數據整理與分析草稿。正式數據來自 student 結果目錄，assistant 試跑另存。分析仍須由學生確認理解。</w:t>
+        <w:t>學生提供設備資訊，執行 Windows／WSL Q0～Q6、Mac Q5 並截圖。Codex 協助程式、工具鏈設定、來源查閱、預檢、數據整理與分析草稿；學生負責確認結果與理解原因。</w:t>
       </w:r>
     </w:p>
     <w:p>
@@ -6699,19 +6479,6 @@
         <w:t>[6] Apple Writing ARM64 code</w:t>
         <w:br/>
         <w:t>https://developer.apple.com/documentation/xcode/writing-arm64-code-for-apple-platforms</w:t>
-      </w:r>
-    </w:p>
-    <w:p>
-      <w:pPr>
-        <w:pStyle w:val="21"/>
-      </w:pPr>
-      <w:r>
-        <w:t>原始資料與重現檔案</w:t>
-      </w:r>
-    </w:p>
-    <w:p>
-      <w:r>
-        <w:t>完整數據、案例、來源雜湊與產生碼：results/linux-20261004-201349/、results/q5-darwin-20261004-211048-student-wdBjAR/。原圖：screenshot／mac截圖。獨立重現方式：各題 experiments README。</w:t>
       </w:r>
     </w:p>
     <w:sectPr>

</xml_diff>

<commit_message>
Explain experiment procedures and retain only critical screenshots
</commit_message>
<xml_diff>
--- a/Floating_Point_Report_Q0.docx
+++ b/Floating_Point_Report_Q0.docx
@@ -1977,108 +1977,6 @@
     </w:p>
     <w:p>
       <w:pPr>
-        <w:keepNext/>
-        <w:spacing w:after="80"/>
-      </w:pPr>
-      <w:r>
-        <w:drawing>
-          <wp:inline xmlns:a="http://schemas.openxmlformats.org/drawingml/2006/main" xmlns:pic="http://schemas.openxmlformats.org/drawingml/2006/picture">
-            <wp:extent cx="5943600" cy="1431867"/>
-            <wp:docPr id="4" name="Picture 4"/>
-            <wp:cNvGraphicFramePr>
-              <a:graphicFrameLocks noChangeAspect="1"/>
-            </wp:cNvGraphicFramePr>
-            <a:graphic>
-              <a:graphicData uri="http://schemas.openxmlformats.org/drawingml/2006/picture">
-                <pic:pic>
-                  <pic:nvPicPr>
-                    <pic:cNvPr id="0" name="Screenshot 2026-10-04 201840.png"/>
-                    <pic:cNvPicPr/>
-                  </pic:nvPicPr>
-                  <pic:blipFill>
-                    <a:blip r:embed="rId11"/>
-                    <a:srcRect l="0" t="0" r="52111" b="0"/>
-                    <a:stretch>
-                      <a:fillRect/>
-                    </a:stretch>
-                  </pic:blipFill>
-                  <pic:spPr>
-                    <a:xfrm>
-                      <a:off x="0" y="0"/>
-                      <a:ext cx="5943600" cy="1431867"/>
-                    </a:xfrm>
-                    <a:prstGeom prst="rect"/>
-                  </pic:spPr>
-                </pic:pic>
-              </a:graphicData>
-            </a:graphic>
-          </wp:inline>
-        </w:drawing>
-      </w:r>
-    </w:p>
-    <w:p>
-      <w:pPr>
-        <w:spacing w:after="100" w:before="0"/>
-      </w:pPr>
-      <w:r>
-        <w:rPr>
-          <w:sz w:val="18"/>
-        </w:rPr>
-        <w:t>圖 0-1 q0-types.txt 的 sizeof、digits 與執行環境。</w:t>
-      </w:r>
-    </w:p>
-    <w:p>
-      <w:pPr>
-        <w:keepNext/>
-      </w:pPr>
-      <w:r>
-        <w:drawing>
-          <wp:inline xmlns:a="http://schemas.openxmlformats.org/drawingml/2006/main" xmlns:pic="http://schemas.openxmlformats.org/drawingml/2006/picture">
-            <wp:extent cx="4297680" cy="2014396"/>
-            <wp:docPr id="19" name="Picture 19"/>
-            <wp:cNvGraphicFramePr>
-              <a:graphicFrameLocks noChangeAspect="1"/>
-            </wp:cNvGraphicFramePr>
-            <a:graphic>
-              <a:graphicData uri="http://schemas.openxmlformats.org/drawingml/2006/picture">
-                <pic:pic>
-                  <pic:nvPicPr>
-                    <pic:cNvPr id="0" name="截圖 2026-10-04 晚上9.15.04.png"/>
-                    <pic:cNvPicPr/>
-                  </pic:nvPicPr>
-                  <pic:blipFill>
-                    <a:blip r:embed="rId27"/>
-                    <a:stretch>
-                      <a:fillRect/>
-                    </a:stretch>
-                  </pic:blipFill>
-                  <pic:spPr>
-                    <a:xfrm>
-                      <a:off x="0" y="0"/>
-                      <a:ext cx="4297680" cy="2014396"/>
-                    </a:xfrm>
-                    <a:prstGeom prst="rect"/>
-                  </pic:spPr>
-                </pic:pic>
-              </a:graphicData>
-            </a:graphic>
-          </wp:inline>
-        </w:drawing>
-      </w:r>
-    </w:p>
-    <w:p>
-      <w:pPr>
-        <w:spacing w:after="100" w:before="0"/>
-      </w:pPr>
-      <w:r>
-        <w:rPr>
-          <w:sz w:val="18"/>
-        </w:rPr>
-        <w:t>圖 0-2 Mac 的 OS、M4、記憶體與 GCC target。</w:t>
-      </w:r>
-    </w:p>
-    <w:p>
-      <w:pPr>
         <w:pStyle w:val="1"/>
         <w:pageBreakBefore w:val="0"/>
         <w:spacing w:after="100"/>
@@ -2100,7 +1998,7 @@
         </w:rPr>
       </w:pPr>
       <w:r>
-        <w:t>目的與方法</w:t>
+        <w:t>實驗方法</w:t>
       </w:r>
     </w:p>
     <w:p>
@@ -2111,7 +2009,7 @@
         </w:rPr>
       </w:pPr>
       <w:r>
-        <w:t>比較三型態相同 scalar kernel 的加減、乘、除；一條相依鏈測連續運算，四條獨立鏈測可重疊運算。</w:t>
+        <w:t>以 float、double、long double 執行相同加減、乘、除 kernel，分別建立一條相依鏈與四條獨立鏈。固定 seed 與 factor，先編譯，再暖機、計時，最後比較各型態與運算的中位數。相依鏈的下一步依賴前一步，獨立鏈則允許重疊運算。</w:t>
       </w:r>
     </w:p>
     <w:p>
@@ -2135,7 +2033,7 @@
         </w:rPr>
       </w:pPr>
       <w:r>
-        <w:t>每組暖機 2 次、量測 7 回合，每回合 5,000,000 迭代；一鏈／四鏈各為 2／8 次算術運算。seed=20261004、factor=1+1/1024，初值於執行期產生；steady_clock 計時、輪換型態順序、取中位數。</w:t>
+        <w:t>每組先暖機 2 次，再量測 7 回合，每回合 5,000,000 迭代。seed=20261004、factor=1+1/1024，初值於執行期產生。以 steady_clock 記錄耗時，輪換型態順序；一鏈／四鏈每迭代各有 2／8 次算術運算，依此換算 ns/op，取 7 回合中位數。</w:t>
       </w:r>
     </w:p>
     <w:p>
@@ -2998,7 +2896,7 @@
         </w:rPr>
       </w:pPr>
       <w:r>
-        <w:t>正序／反序加總 10,000 組 [2^24,1,-2^24] 或 [2^53,1,-2^53]，輸入可精確表示，參考答案為整數 10,000。執行同一程式加 --precision-only。</w:t>
+        <w:t>另以 --precision-only 執行精度實驗：建立 10,000 組 [2^24,1,-2^24] 或 [2^53,1,-2^53]，分別以正序、反序加總。所有輸入可精確表示；以整數 10,000 為參考答案，計算各型態的絕對誤差，檢查加總順序是否改變結果。</w:t>
       </w:r>
     </w:p>
     <w:tbl>
@@ -3723,57 +3621,6 @@
     </w:p>
     <w:p>
       <w:pPr>
-        <w:keepNext/>
-        <w:spacing w:after="80"/>
-      </w:pPr>
-      <w:r>
-        <w:drawing>
-          <wp:inline xmlns:a="http://schemas.openxmlformats.org/drawingml/2006/main" xmlns:pic="http://schemas.openxmlformats.org/drawingml/2006/picture">
-            <wp:extent cx="5943600" cy="1220953"/>
-            <wp:docPr id="6" name="Picture 6"/>
-            <wp:cNvGraphicFramePr>
-              <a:graphicFrameLocks noChangeAspect="1"/>
-            </wp:cNvGraphicFramePr>
-            <a:graphic>
-              <a:graphicData uri="http://schemas.openxmlformats.org/drawingml/2006/picture">
-                <pic:pic>
-                  <pic:nvPicPr>
-                    <pic:cNvPr id="0" name="Screenshot 2025-07-15 221151.png"/>
-                    <pic:cNvPicPr/>
-                  </pic:nvPicPr>
-                  <pic:blipFill>
-                    <a:blip r:embed="rId13"/>
-                    <a:stretch>
-                      <a:fillRect/>
-                    </a:stretch>
-                  </pic:blipFill>
-                  <pic:spPr>
-                    <a:xfrm>
-                      <a:off x="0" y="0"/>
-                      <a:ext cx="5943600" cy="1220953"/>
-                    </a:xfrm>
-                    <a:prstGeom prst="rect"/>
-                  </pic:spPr>
-                </pic:pic>
-              </a:graphicData>
-            </a:graphic>
-          </wp:inline>
-        </w:drawing>
-      </w:r>
-    </w:p>
-    <w:p>
-      <w:pPr>
-        <w:spacing w:after="100" w:before="0"/>
-      </w:pPr>
-      <w:r>
-        <w:rPr>
-          <w:sz w:val="18"/>
-        </w:rPr>
-        <w:t>圖 1-2 型態與加總順序改變實測結果。</w:t>
-      </w:r>
-    </w:p>
-    <w:p>
-      <w:pPr>
         <w:pStyle w:val="21"/>
         <w:pageBreakBefore w:val="0"/>
         <w:spacing w:after="100"/>
@@ -3788,57 +3635,6 @@
       </w:pPr>
       <w:r>
         <w:t>binary32／binary64 的 sign、exponent、fraction 為 1／8／23 與 1／11／52，normal 有效位數為 24／53；WSL extended precision 為 1／15／64，共 80 位。產生碼為 float ADDSS／MULSS／DIVSS、double ADDSD／MULSD／DIVSD、long double x87 FADD／FMUL／FDIV，支持 Q0 型態參數與實際運算路徑。</w:t>
-      </w:r>
-    </w:p>
-    <w:p>
-      <w:pPr>
-        <w:keepNext/>
-        <w:spacing w:after="80"/>
-      </w:pPr>
-      <w:r>
-        <w:drawing>
-          <wp:inline xmlns:a="http://schemas.openxmlformats.org/drawingml/2006/main" xmlns:pic="http://schemas.openxmlformats.org/drawingml/2006/picture">
-            <wp:extent cx="3931920" cy="2437141"/>
-            <wp:docPr id="8" name="Picture 8"/>
-            <wp:cNvGraphicFramePr>
-              <a:graphicFrameLocks noChangeAspect="1"/>
-            </wp:cNvGraphicFramePr>
-            <a:graphic>
-              <a:graphicData uri="http://schemas.openxmlformats.org/drawingml/2006/picture">
-                <pic:pic>
-                  <pic:nvPicPr>
-                    <pic:cNvPr id="0" name="Screenshot 2026-10-04 202254.png"/>
-                    <pic:cNvPicPr/>
-                  </pic:nvPicPr>
-                  <pic:blipFill>
-                    <a:blip r:embed="rId15"/>
-                    <a:stretch>
-                      <a:fillRect/>
-                    </a:stretch>
-                  </pic:blipFill>
-                  <pic:spPr>
-                    <a:xfrm>
-                      <a:off x="0" y="0"/>
-                      <a:ext cx="3931920" cy="2437141"/>
-                    </a:xfrm>
-                    <a:prstGeom prst="rect"/>
-                  </pic:spPr>
-                </pic:pic>
-              </a:graphicData>
-            </a:graphic>
-          </wp:inline>
-        </w:drawing>
-      </w:r>
-    </w:p>
-    <w:p>
-      <w:pPr>
-        <w:spacing w:after="100" w:before="0"/>
-      </w:pPr>
-      <w:r>
-        <w:rPr>
-          <w:sz w:val="18"/>
-        </w:rPr>
-        <w:t>圖 1-3 double kernel 的 scalar SSE 算術指令。</w:t>
       </w:r>
     </w:p>
     <w:p>
@@ -3883,7 +3679,7 @@
         <w:spacing w:after="100"/>
       </w:pPr>
       <w:r>
-        <w:t>比較 builtin 與函式庫路徑</w:t>
+        <w:t>實驗方法</w:t>
       </w:r>
     </w:p>
     <w:p>
@@ -3909,7 +3705,7 @@
         <w:spacing w:after="100" w:before="0"/>
       </w:pPr>
       <w:r>
-        <w:t>編譯：bash scripts/build_all.sh；執行：./build/all/q2_cmath 2 與 ./build/all/q2_libm 2。兩版皆為 -O2 -fno-fast-math -frounding-math -ffp-contract=off -fno-lto，libm 版另加 -DHW2_FORCE_LIBM=1。</w:t>
+        <w:t>先用 bash scripts/build_all.sh 編譯 default 與 forced-libm 兩版，再執行 ./build/all/q2_cmath 2、./build/all/q2_libm 2。程式同時測試 4、2、-1、-0 等內建案例，逐項記錄數值、errno 與例外旗標，比較兩條路徑；再檢查反組譯的 SQRT 指令及函式呼叫。兩版共用 -O2 -fno-fast-math -frounding-math -ffp-contract=off -fno-lto，libm 版另加 -DHW2_FORCE_LIBM=1。</w:t>
       </w:r>
     </w:p>
     <w:p>
@@ -4313,7 +4109,7 @@
         </w:rPr>
       </w:pPr>
       <w:r>
-        <w:t>只改一個旗標的實驗</w:t>
+        <w:t>實驗方法</w:t>
       </w:r>
     </w:p>
     <w:p>
@@ -4324,7 +4120,7 @@
         </w:rPr>
       </w:pPr>
       <w:r>
-        <w:t>argv 輸入 a=1e16、b=-1e16、c=1，比較兩種括號順序與 NaN 的 x!=x。運算分檔且停用 LTO，避免常數折疊；兩版皆 -std=c++20 -O3 -fno-lto -ffp-contract=off，僅切換 -fno-fast-math／-ffast-math。</w:t>
+        <w:t>同一來源編譯為 strict、fast 兩版，皆使用 -std=c++20 -O3 -fno-lto -ffp-contract=off，僅切換 -fno-fast-math／-ffast-math。執行時透過 argv 輸入相同 a=1e16、b=-1e16、c=1，記錄兩種括號順序與 NaN 的 x!=x。先比較數值，再對照產生碼的加法順序；運算分檔且停用 LTO，避免常數折疊。</w:t>
       </w:r>
     </w:p>
     <w:p>
@@ -4717,7 +4513,7 @@
       <w:r>
         <w:drawing>
           <wp:inline xmlns:a="http://schemas.openxmlformats.org/drawingml/2006/main" xmlns:pic="http://schemas.openxmlformats.org/drawingml/2006/picture">
-            <wp:extent cx="4389120" cy="2685184"/>
+            <wp:extent cx="3931920" cy="2405477"/>
             <wp:docPr id="12" name="Picture 12"/>
             <wp:cNvGraphicFramePr>
               <a:graphicFrameLocks noChangeAspect="1"/>
@@ -4739,7 +4535,7 @@
                   <pic:spPr>
                     <a:xfrm>
                       <a:off x="0" y="0"/>
-                      <a:ext cx="4389120" cy="2685184"/>
+                      <a:ext cx="3931920" cy="2405477"/>
                     </a:xfrm>
                     <a:prstGeom prst="rect"/>
                   </pic:spPr>
@@ -4759,56 +4555,6 @@
           <w:sz w:val="18"/>
         </w:rPr>
         <w:t>圖 3-1 strict／fast 在相同輸入下的輸出。</w:t>
-      </w:r>
-    </w:p>
-    <w:p>
-      <w:pPr>
-        <w:keepNext/>
-      </w:pPr>
-      <w:r>
-        <w:drawing>
-          <wp:inline xmlns:a="http://schemas.openxmlformats.org/drawingml/2006/main" xmlns:pic="http://schemas.openxmlformats.org/drawingml/2006/picture">
-            <wp:extent cx="5212080" cy="2089692"/>
-            <wp:docPr id="23" name="Picture 23"/>
-            <wp:cNvGraphicFramePr>
-              <a:graphicFrameLocks noChangeAspect="1"/>
-            </wp:cNvGraphicFramePr>
-            <a:graphic>
-              <a:graphicData uri="http://schemas.openxmlformats.org/drawingml/2006/picture">
-                <pic:pic>
-                  <pic:nvPicPr>
-                    <pic:cNvPr id="0" name="image.png"/>
-                    <pic:cNvPicPr/>
-                  </pic:nvPicPr>
-                  <pic:blipFill>
-                    <a:blip r:embed="rId21"/>
-                    <a:stretch>
-                      <a:fillRect/>
-                    </a:stretch>
-                  </pic:blipFill>
-                  <pic:spPr>
-                    <a:xfrm>
-                      <a:off x="0" y="0"/>
-                      <a:ext cx="5212080" cy="2089692"/>
-                    </a:xfrm>
-                    <a:prstGeom prst="rect"/>
-                  </pic:spPr>
-                </pic:pic>
-              </a:graphicData>
-            </a:graphic>
-          </wp:inline>
-        </w:drawing>
-      </w:r>
-    </w:p>
-    <w:p>
-      <w:pPr>
-        <w:spacing w:after="100" w:before="0"/>
-      </w:pPr>
-      <w:r>
-        <w:rPr>
-          <w:sz w:val="18"/>
-        </w:rPr>
-        <w:t>圖 3-2 fast 改變加法順序並移除 NaN 比較。</w:t>
       </w:r>
     </w:p>
     <w:p>
@@ -4858,7 +4604,7 @@
         </w:rPr>
       </w:pPr>
       <w:r>
-        <w:t>反例與實驗</w:t>
+        <w:t>實驗方法</w:t>
       </w:r>
     </w:p>
     <w:p>
@@ -4869,7 +4615,7 @@
         </w:rPr>
       </w:pPr>
       <w:r>
-        <w:t>1/1024=0.0009765625 可精確以二進位表示，正好是九位小數的中點，排除字面值轉換誤差。比較 printf、iostream、正負值、nextafter 鄰居與四種捨入模式。</w:t>
+        <w:t>先以 ldexp(1.0,-10) 建立可精確表示的 1/1024=0.0009765625，作為九位小數的中點，排除字面值轉換誤差。再用 nextafter 建立兩側鄰居，測試正負值；每次設定 nearest、upward、downward 或 towardzero，用 printf 與 iostream 輸出相同值，比較字串是否一致及中點如何捨入。</w:t>
       </w:r>
     </w:p>
     <w:p>
@@ -4879,10 +4625,9 @@
       </w:pPr>
       <w:r>
         <w:rPr>
-          <w:rFonts w:ascii="DejaVu Sans Mono" w:hAnsi="DejaVu Sans Mono"/>
-          <w:sz w:val="17"/>
+          <w:sz w:val="20"/>
         </w:rPr>
-        <w:t>// 完整程式：experiments/q4_formatting/main.cpp</w:t>
+        <w:t>// experiments/q4_formatting/main.cpp</w:t>
         <w:br/>
         <w:t>double tie = std::ldexp(1.0, -10);</w:t>
         <w:br/>
@@ -4892,9 +4637,7 @@
         <w:br/>
         <w:t>std::cout &lt;&lt; std::fixed &lt;&lt; std::setprecision(9) &lt;&lt; tie;</w:t>
         <w:br/>
-        <w:t>// 另測負值、nextafter 與 upward／downward／towardzero。</w:t>
-        <w:br/>
-        <w:t>// 編譯：bash scripts/build_all.sh</w:t>
+        <w:t>// 建置：bash scripts/build_all.sh</w:t>
         <w:br/>
         <w:t>// 執行：./build/all/q4_formatting 0.0009765625</w:t>
       </w:r>
@@ -5349,7 +5092,7 @@
         </w:rPr>
       </w:pPr>
       <w:r>
-        <w:t>跨平台條件與程式</w:t>
+        <w:t>實驗方法</w:t>
       </w:r>
     </w:p>
     <w:p>
@@ -5360,17 +5103,7 @@
         </w:rPr>
       </w:pPr>
       <w:r>
-        <w:t>x86_64 WSL 與 arm64 Mac 使用相同來源、GNU GCC release 16.2.0、逐字相同旗標，計算 (2^53+1)-2^53。兩端均先設定 FE_TONEAREST；compiler family、release、flags 與來源雜湊皆核對一致。vendor build 與 target 不同，完整 configuration 已保存。</w:t>
-      </w:r>
-    </w:p>
-    <w:p>
-      <w:pPr>
-        <w:pStyle w:val="21"/>
-        <w:pageBreakBefore w:val="0"/>
-        <w:spacing w:after="100"/>
-      </w:pPr>
-      <w:r>
-        <w:t>跨平台輸出與指令</w:t>
+        <w:t>在 x86_64 WSL 與 arm64 Mac 編譯、執行相同來源，使用 GNU GCC release 16.2.0 與逐字相同旗標。程式先設 FE_TONEAREST，以 long double 計算 (2^53+1)-2^53，記錄 sizeof、digits 與十六進位結果。完成後執行 scripts/verify_q5_pair.py，核對 compiler family、release、flags 與來源雜湊；四項皆一致，再對照兩端產生碼。vendor build 與 target 不同，完整 configuration 已保存。</w:t>
       </w:r>
     </w:p>
     <w:p>
@@ -5460,56 +5193,6 @@
         <w:t>編譯／執行：CXX=g++-16 bash scripts/run_q5.sh run。旗標：-std=c++20 -Wall -Wextra -fno-lto -ffp-contract=off -O2 -fno-fast-math -frounding-math。以 scripts/verify_q5_pair.py 核對兩端條件。</w:t>
       </w:r>
     </w:p>
-    <w:p>
-      <w:pPr>
-        <w:keepNext/>
-      </w:pPr>
-      <w:r>
-        <w:drawing>
-          <wp:inline xmlns:a="http://schemas.openxmlformats.org/drawingml/2006/main" xmlns:pic="http://schemas.openxmlformats.org/drawingml/2006/picture">
-            <wp:extent cx="5943600" cy="976001"/>
-            <wp:docPr id="20" name="Picture 20"/>
-            <wp:cNvGraphicFramePr>
-              <a:graphicFrameLocks noChangeAspect="1"/>
-            </wp:cNvGraphicFramePr>
-            <a:graphic>
-              <a:graphicData uri="http://schemas.openxmlformats.org/drawingml/2006/picture">
-                <pic:pic>
-                  <pic:nvPicPr>
-                    <pic:cNvPr id="0" name="截圖 2026-10-04 晚上9.15.48.png"/>
-                    <pic:cNvPicPr/>
-                  </pic:nvPicPr>
-                  <pic:blipFill>
-                    <a:blip r:embed="rId28"/>
-                    <a:stretch>
-                      <a:fillRect/>
-                    </a:stretch>
-                  </pic:blipFill>
-                  <pic:spPr>
-                    <a:xfrm>
-                      <a:off x="0" y="0"/>
-                      <a:ext cx="5943600" cy="976001"/>
-                    </a:xfrm>
-                    <a:prstGeom prst="rect"/>
-                  </pic:spPr>
-                </pic:pic>
-              </a:graphicData>
-            </a:graphic>
-          </wp:inline>
-        </w:drawing>
-      </w:r>
-    </w:p>
-    <w:p>
-      <w:pPr>
-        <w:spacing w:after="100" w:before="0"/>
-      </w:pPr>
-      <w:r>
-        <w:rPr>
-          <w:sz w:val="18"/>
-        </w:rPr>
-        <w:t>圖 5-2 來源、GCC release 與逐字旗標核對一致。</w:t>
-      </w:r>
-    </w:p>
     <w:tbl>
       <w:tblPr>
         <w:tblW w:type="auto" w:w="0"/>
@@ -5881,57 +5564,7 @@
         <w:rPr>
           <w:sz w:val="18"/>
         </w:rPr>
-        <w:t>圖 5-3 Mac 在 FE_TONEAREST 下的型態參數與結果 0。</w:t>
-      </w:r>
-    </w:p>
-    <w:p>
-      <w:pPr>
-        <w:keepNext/>
-      </w:pPr>
-      <w:r>
-        <w:drawing>
-          <wp:inline xmlns:a="http://schemas.openxmlformats.org/drawingml/2006/main" xmlns:pic="http://schemas.openxmlformats.org/drawingml/2006/picture">
-            <wp:extent cx="4754880" cy="1589147"/>
-            <wp:docPr id="22" name="Picture 22"/>
-            <wp:cNvGraphicFramePr>
-              <a:graphicFrameLocks noChangeAspect="1"/>
-            </wp:cNvGraphicFramePr>
-            <a:graphic>
-              <a:graphicData uri="http://schemas.openxmlformats.org/drawingml/2006/picture">
-                <pic:pic>
-                  <pic:nvPicPr>
-                    <pic:cNvPr id="0" name="截圖 2026-10-04 晚上9.17.09.png"/>
-                    <pic:cNvPicPr/>
-                  </pic:nvPicPr>
-                  <pic:blipFill>
-                    <a:blip r:embed="rId30"/>
-                    <a:stretch>
-                      <a:fillRect/>
-                    </a:stretch>
-                  </pic:blipFill>
-                  <pic:spPr>
-                    <a:xfrm>
-                      <a:off x="0" y="0"/>
-                      <a:ext cx="4754880" cy="1589147"/>
-                    </a:xfrm>
-                    <a:prstGeom prst="rect"/>
-                  </pic:spPr>
-                </pic:pic>
-              </a:graphicData>
-            </a:graphic>
-          </wp:inline>
-        </w:drawing>
-      </w:r>
-    </w:p>
-    <w:p>
-      <w:pPr>
-        <w:spacing w:after="100" w:before="0"/>
-      </w:pPr>
-      <w:r>
-        <w:rPr>
-          <w:sz w:val="18"/>
-        </w:rPr>
-        <w:t>圖 5-4 Mac FADD D、STR／LDR、FSUB：存回後才相減。</w:t>
+        <w:t>圖 5-2 Mac 在 FE_TONEAREST 下的型態參數與結果 0。</w:t>
       </w:r>
     </w:p>
     <w:p>
@@ -5940,19 +5573,6 @@
       </w:pPr>
       <w:r>
         <w:t>WSL 為 FLDT／FADD／FSTPT／FLDT／FSUBP；Mac 為 FADD D／STR／LDR／FSUB D。兩端保留加法、存回與減法，排除計算消去；輸入有限、不溢位且無越界或未初始化值。inline asm 使用 GCC 支援擴充。</w:t>
-      </w:r>
-    </w:p>
-    <w:p>
-      <w:pPr>
-        <w:pStyle w:val="21"/>
-        <w:pageBreakBefore w:val="0"/>
-        <w:spacing w:after="100"/>
-        <w:rPr>
-          <w:lang w:eastAsia="zh-TW"/>
-        </w:rPr>
-      </w:pPr>
-      <w:r>
-        <w:t>ABI 差異的數值驗證</w:t>
       </w:r>
     </w:p>
     <w:p>

</xml_diff>

<commit_message>
Simplify report explanations around test methods and observed results
</commit_message>
<xml_diff>
--- a/Floating_Point_Report_Q0.docx
+++ b/Floating_Point_Report_Q0.docx
@@ -94,7 +94,7 @@
         </w:rPr>
       </w:pPr>
       <w:r>
-        <w:t>平台與重現條件</w:t>
+        <w:t>測試設備</w:t>
       </w:r>
     </w:p>
     <w:tbl>
@@ -1254,7 +1254,7 @@
         <w:spacing w:after="100" w:before="0"/>
       </w:pPr>
       <w:r>
-        <w:t>測試日期：2026/10/04。WSL 的 12／24 為虛擬拓樸；未固定 P/E 核心、頻率與溫度，Q1 僅比較本次執行。Mac 僅測 Q5，未比較跨平台速度。</w:t>
+        <w:t>測試日期為 2026/10/04。Windows 的程式在 WSL Ubuntu 執行，Mac 只測 Q5。Q1 未固定 CPU 頻率與溫度，因此速度數字代表這次執行，不能視為任何情況下的固定速度。</w:t>
       </w:r>
     </w:p>
     <w:p>
@@ -1262,7 +1262,7 @@
         <w:spacing w:after="100" w:before="0"/>
       </w:pPr>
       <w:r>
-        <w:t>重現：Windows 執行 experiments/q0_environment/collect_windows.ps1；WSL 執行 bash scripts/run_all.sh；Mac 執行 CXX=g++-16 bash scripts/run_q5.sh run。腳本保存命令、版本、來源雜湊與輸出。</w:t>
+        <w:t>重跑方式：Windows 執行 experiments/q0_environment/collect_windows.ps1；WSL 執行 bash scripts/run_all.sh；Mac 執行 CXX=g++-16 bash scripts/run_q5.sh run。版本、命令與完整輸出均保存在 results。</w:t>
       </w:r>
     </w:p>
     <w:p>
@@ -1272,7 +1272,7 @@
         <w:pageBreakBefore w:val="0"/>
       </w:pPr>
       <w:r>
-        <w:t>型態的實測參數</w:t>
+        <w:t>浮點數能保留多少精度</w:t>
       </w:r>
     </w:p>
     <w:p>
@@ -1280,7 +1280,7 @@
         <w:spacing w:after="100" w:before="0"/>
       </w:pPr>
       <w:r>
-        <w:t>q0-types.txt 量得 WSL 三型態有效位數為 24／53／64；long double 的 16-byte 儲存空間包含填補，並非 binary128。Mac 為 8 bytes／53 位，Q5 再以數值與指令交叉驗證。</w:t>
+        <w:t>下表是 WSL 程式讀到的型態資訊。sizeof 是儲存所需的 bytes；digits 是可保留的二進位有效位數，越多通常能分辨越小的數值差異。WSL 的 long double 雖占 16 bytes，實際使用 80 位元格式，其中有效位數為 64；Mac 的 long double 則只有 53 位，與 double 相同。</w:t>
       </w:r>
     </w:p>
     <w:tbl>
@@ -1972,7 +1972,7 @@
         <w:spacing w:after="100" w:before="0"/>
       </w:pPr>
       <w:r>
-        <w:t>WSL：FLT_EVAL_METHOD=0、FE_TONEAREST、fast-math=false；epsilon=2^-23／2^-52／2^-63。__float128 未列入 benchmark。</w:t>
+        <w:t>本次比較 float、double、long double，不納入 __float128。測試採用預設的「最接近值」捨入方式，並關閉 fast-math。</w:t>
       </w:r>
     </w:p>
     <w:p>
@@ -2009,20 +2009,7 @@
         </w:rPr>
       </w:pPr>
       <w:r>
-        <w:t>以 float、double、long double 執行相同加減、乘、除 kernel，分別建立一條相依鏈與四條獨立鏈。固定 seed 與 factor，先編譯，再暖機、計時，最後比較各型態與運算的中位數。相依鏈的下一步依賴前一步，獨立鏈則允許重疊運算。</w:t>
-      </w:r>
-    </w:p>
-    <w:p>
-      <w:pPr>
-        <w:pStyle w:val="21"/>
-        <w:pageBreakBefore w:val="0"/>
-        <w:spacing w:after="100"/>
-        <w:rPr>
-          <w:lang w:eastAsia="zh-TW"/>
-        </w:rPr>
-      </w:pPr>
-      <w:r>
-        <w:t>計時與防止最佳化</w:t>
+        <w:t>比較 float、double、long double 做加減、乘法與除法的速度。每種運算測兩種方式：「連續計算」每一步使用上一步的答案；「四組並行」則交替計算四組互不依賴的數值，讓 CPU 有機會同時處理。三種型態使用相同輸入與運算次數。</w:t>
       </w:r>
     </w:p>
     <w:p>
@@ -2033,7 +2020,7 @@
         </w:rPr>
       </w:pPr>
       <w:r>
-        <w:t>每組先暖機 2 次，再量測 7 回合，每回合 5,000,000 迭代。seed=20261004、factor=1+1/1024，初值於執行期產生。以 steady_clock 記錄耗時，輪換型態順序；一鏈／四鏈每迭代各有 2／8 次算術運算，依此換算 ns/op，取 7 回合中位數。</w:t>
+        <w:t>每組先跑 2 次暖機，再計時 7 次，每次重複 5,000,000 回合。總時間除以實際算術次數，得到每次運算的奈秒數（ns/op），取 7 次的中位數；數字越小越快。</w:t>
       </w:r>
     </w:p>
     <w:p>
@@ -2044,7 +2031,7 @@
         </w:rPr>
       </w:pPr>
       <w:r>
-        <w:t>kernel 分檔編譯、noinline，停用 LTO、fast-math、FMA contraction 與向量化；barrier 與 checksum 防止消去。反組譯保留算術迴圈與分支。ns/op 含迴圈與呼叫成本，不等同硬體單指令 latency。</w:t>
+        <w:t>程式保留最後答案並輸出檢查值，加入限制以免編譯器直接刪掉待測計算。編譯後也檢查 CPU 指令，確認運算仍在迴圈內。計時包含迴圈等成本，所以這是程式的平均速度。</w:t>
       </w:r>
     </w:p>
     <w:p>
@@ -2069,7 +2056,7 @@
         <w:spacing w:after="100"/>
       </w:pPr>
       <w:r>
-        <w:t>速度結果與證據</w:t>
+        <w:t>測試結果</w:t>
       </w:r>
     </w:p>
     <w:p>
@@ -2077,7 +2064,7 @@
         <w:spacing w:after="100" w:before="0"/>
       </w:pPr>
       <w:r>
-        <w:t>18 組中位數如下，ns/op＝總秒數×10^9÷算術次數。126 筆原始樣本與範圍保留於 q1-timing-and-precision.txt、q1-summary.csv。</w:t>
+        <w:t>以下為實測的每次運算時間，單位 ns/op。完整計時記錄保存在 q1-timing-and-precision.txt。</w:t>
       </w:r>
     </w:p>
     <w:tbl>
@@ -2213,7 +2200,7 @@
                 <w:b w:val="0"/>
                 <w:sz w:val="20"/>
               </w:rPr>
-              <w:t>add_sub</w:t>
+              <w:t>加減</w:t>
             </w:r>
           </w:p>
         </w:tc>
@@ -2232,7 +2219,7 @@
                 <w:b w:val="0"/>
                 <w:sz w:val="20"/>
               </w:rPr>
-              <w:t>相依鏈</w:t>
+              <w:t>連續計算</w:t>
             </w:r>
           </w:p>
         </w:tc>
@@ -2313,7 +2300,7 @@
                 <w:b w:val="0"/>
                 <w:sz w:val="20"/>
               </w:rPr>
-              <w:t>add_sub</w:t>
+              <w:t>加減</w:t>
             </w:r>
           </w:p>
         </w:tc>
@@ -2332,7 +2319,7 @@
                 <w:b w:val="0"/>
                 <w:sz w:val="20"/>
               </w:rPr>
-              <w:t>四獨立鏈</w:t>
+              <w:t>四組並行</w:t>
             </w:r>
           </w:p>
         </w:tc>
@@ -2413,7 +2400,7 @@
                 <w:b w:val="0"/>
                 <w:sz w:val="20"/>
               </w:rPr>
-              <w:t>multiply</w:t>
+              <w:t>乘法</w:t>
             </w:r>
           </w:p>
         </w:tc>
@@ -2432,7 +2419,7 @@
                 <w:b w:val="0"/>
                 <w:sz w:val="20"/>
               </w:rPr>
-              <w:t>相依鏈</w:t>
+              <w:t>連續計算</w:t>
             </w:r>
           </w:p>
         </w:tc>
@@ -2513,7 +2500,7 @@
                 <w:b w:val="0"/>
                 <w:sz w:val="20"/>
               </w:rPr>
-              <w:t>multiply</w:t>
+              <w:t>乘法</w:t>
             </w:r>
           </w:p>
         </w:tc>
@@ -2532,7 +2519,7 @@
                 <w:b w:val="0"/>
                 <w:sz w:val="20"/>
               </w:rPr>
-              <w:t>四獨立鏈</w:t>
+              <w:t>四組並行</w:t>
             </w:r>
           </w:p>
         </w:tc>
@@ -2613,7 +2600,7 @@
                 <w:b w:val="0"/>
                 <w:sz w:val="20"/>
               </w:rPr>
-              <w:t>divide</w:t>
+              <w:t>除法</w:t>
             </w:r>
           </w:p>
         </w:tc>
@@ -2632,7 +2619,7 @@
                 <w:b w:val="0"/>
                 <w:sz w:val="20"/>
               </w:rPr>
-              <w:t>相依鏈</w:t>
+              <w:t>連續計算</w:t>
             </w:r>
           </w:p>
         </w:tc>
@@ -2713,7 +2700,7 @@
                 <w:b w:val="0"/>
                 <w:sz w:val="20"/>
               </w:rPr>
-              <w:t>divide</w:t>
+              <w:t>除法</w:t>
             </w:r>
           </w:p>
         </w:tc>
@@ -2732,7 +2719,7 @@
                 <w:b w:val="0"/>
                 <w:sz w:val="20"/>
               </w:rPr>
-              <w:t>四獨立鏈</w:t>
+              <w:t>四組並行</w:t>
             </w:r>
           </w:p>
         </w:tc>
@@ -2853,26 +2840,13 @@
     </w:p>
     <w:p>
       <w:pPr>
-        <w:pStyle w:val="21"/>
-        <w:pageBreakBefore w:val="0"/>
-        <w:spacing w:after="100"/>
-        <w:rPr>
-          <w:lang w:eastAsia="zh-TW"/>
-        </w:rPr>
-      </w:pPr>
-      <w:r>
-        <w:t>速度差異的本機證據</w:t>
-      </w:r>
-    </w:p>
-    <w:p>
-      <w:pPr>
         <w:spacing w:after="100" w:before="0"/>
         <w:rPr>
           <w:lang w:eastAsia="zh-TW"/>
         </w:rPr>
       </w:pPr>
       <w:r>
-        <w:t>單鏈乘法三型態皆約 0.86 ns/op；除法為 2.333／3.000／3.327 ns/op。四鏈除法降至 0.618／0.828／0.923，支持獨立運算提高吞吐量。反組譯顯示 float／double 走 scalar SSE，long double 走 x87；型態大小無法單獨解釋速度。[4]</w:t>
+        <w:t>連續乘法的三種型態都約為 0.86 ns/op，速度相近；連續除法則是 float 最快、long double 最慢。四組並行的除法都更快，表示互不依賴的計算可以提高處理效率。CPU 指令也顯示 float、double 使用 SSE 浮點指令，long double 使用較舊的 x87 指令；不同指令的處理方式會影響速度，不能只用型態大小判斷。[4]</w:t>
       </w:r>
     </w:p>
     <w:p>
@@ -2885,7 +2859,7 @@
         </w:rPr>
       </w:pPr>
       <w:r>
-        <w:t>精度實驗與結果</w:t>
+        <w:t>精度測試</w:t>
       </w:r>
     </w:p>
     <w:p>
@@ -2896,7 +2870,7 @@
         </w:rPr>
       </w:pPr>
       <w:r>
-        <w:t>另以 --precision-only 執行精度實驗：建立 10,000 組 [2^24,1,-2^24] 或 [2^53,1,-2^53]，分別以正序、反序加總。所有輸入可精確表示；以整數 10,000 為參考答案，計算各型態的絕對誤差，檢查加總順序是否改變結果。</w:t>
+        <w:t>另外準備 10,000 組 [大數, 1, -大數]，大數分別取 2^24 與 2^53。用 --precision-only 正序與反序加總，數學答案都是 10,000；比較實際答案是否相同，以及與 10,000 相差多少。</w:t>
       </w:r>
     </w:p>
     <w:tbl>
@@ -3621,20 +3595,10 @@
     </w:p>
     <w:p>
       <w:pPr>
-        <w:pStyle w:val="21"/>
-        <w:pageBreakBefore w:val="0"/>
-        <w:spacing w:after="100"/>
-      </w:pPr>
-      <w:r>
-        <w:t>表示方式與運算指令</w:t>
-      </w:r>
-    </w:p>
-    <w:p>
-      <w:pPr>
         <w:spacing w:after="100" w:before="0"/>
       </w:pPr>
       <w:r>
-        <w:t>binary32／binary64 的 sign、exponent、fraction 為 1／8／23 與 1／11／52，normal 有效位數為 24／53；WSL extended precision 為 1／15／64，共 80 位。產生碼為 float ADDSS／MULSS／DIVSS、double ADDSD／MULSD／DIVSD、long double x87 FADD／FMUL／FDIV，支持 Q0 型態參數與實際運算路徑。</w:t>
+        <w:t>浮點數以「正負號、指數、有效數字」儲存。指數決定數值大小，有效數字決定精度。float、double 分別有 24、53 個二進位有效位數；WSL 的 long double 有 64 個。加法要先對齊兩數的小數位置，再把存不下的部分捨入；因此大數加上小數時，小數可能消失。[3][4]</w:t>
       </w:r>
     </w:p>
     <w:p>
@@ -3645,7 +3609,7 @@
         </w:rPr>
       </w:pPr>
       <w:r>
-        <w:t>加減對齊指數後只能保留有限有效位數；乘除也需正規化與捨入。實測 float 在 2^24、double 在 2^53 正序丟失 +1，反序得到 10,000；long double 保住兩案例增量，float 在 2^53 兩順序皆丟失。數值與指令共同支持精度解釋；CPU 內部微架構仍不能僅由反組譯確認。[3][4]</w:t>
+        <w:t>實測中，float 在 2^24 的正序加總得到 0，反序得到 10,000；double 在 2^53 也出現相同差異。long double 在兩個案例都得到 10,000。這表示較高精度能保留這些小增量，但加總順序仍是需要注意的因素。</w:t>
       </w:r>
     </w:p>
     <w:p>
@@ -3669,7 +3633,7 @@
         </w:rPr>
       </w:pPr>
       <w:r>
-        <w:t>選用 std::sqrt。C++20 overload 回傳 float、double、long double，整數呼叫等效使用 double，static_assert 已核對。函式求非負平方根；負值的 domain error 依 math_errhandling 處理。[1][5]</w:t>
+        <w:t>選用 std::sqrt，功能是求平方根。C++ 提供 float、double、long double 版本；整數輸入使用 double。負數沒有實數平方根，會依函式庫的錯誤處理規則回報錯誤。[1][5]</w:t>
       </w:r>
     </w:p>
     <w:p>
@@ -3695,8 +3659,6 @@
         <w:t>double sqrt_path(double x) { return std::sqrt(x); }</w:t>
         <w:br/>
         <w:t>long double sqrt_path(long double x) { return std::sqrt(x); }</w:t>
-        <w:br/>
-        <w:t>// 實際函式加 noinline；forced-libm 以 volatile function pointer 呼叫 symbol。</w:t>
       </w:r>
     </w:p>
     <w:p>
@@ -3705,7 +3667,7 @@
         <w:spacing w:after="100" w:before="0"/>
       </w:pPr>
       <w:r>
-        <w:t>先用 bash scripts/build_all.sh 編譯 default 與 forced-libm 兩版，再執行 ./build/all/q2_cmath 2、./build/all/q2_libm 2。程式同時測試 4、2、-1、-0 等內建案例，逐項記錄數值、errno 與例外旗標，比較兩條路徑；再檢查反組譯的 SQRT 指令及函式呼叫。兩版共用 -O2 -fno-fast-math -frounding-math -ffp-contract=off -fno-lto，libm 版另加 -DHW2_FORCE_LIBM=1。</w:t>
+        <w:t>用 bash scripts/build_all.sh 編譯兩版：一般呼叫，以及強制呼叫數學函式庫的版本。執行 ./build/all/q2_cmath 2 和 ./build/all/q2_libm 2，測試 4、2、-1、-0 等值，比較答案與錯誤紀錄，再檢查平方根是由 CPU 指令還是函式庫處理。兩版共用 -O2 -fno-fast-math -frounding-math -ffp-contract=off -fno-lto；函式庫版另加 -DHW2_FORCE_LIBM=1。</w:t>
       </w:r>
     </w:p>
     <w:p>
@@ -3715,7 +3677,7 @@
         <w:spacing w:after="100"/>
       </w:pPr>
       <w:r>
-        <w:t>本機路徑與輸出</w:t>
+        <w:t>測試結果與本機實作</w:t>
       </w:r>
     </w:p>
     <w:p>
@@ -3723,7 +3685,7 @@
         <w:spacing w:after="100" w:before="0"/>
       </w:pPr>
       <w:r>
-        <w:t>default 產生碼為 SQRTSS／SQRTSD／FSQRT，負值轉呼叫 sqrtf／sqrt／sqrtl；forced-libm 的 finite implementation 也含硬體 sqrt。30 組輸入／型態的兩路徑輸出與例外旗標一致：sqrt(4)=2 且精確、sqrt(2) 設 inexact、sqrt(-1) 回 NaN 且 errno=33／invalid=true、sqrt(-0) 保留負號。</w:t>
+        <w:t>兩版共 30 組輸入與型態，答案和錯誤紀錄全部相同。sqrt(4)=2，能精確表示；sqrt(2) 只能保留近似值；sqrt(-1) 得到 NaN（不是有效數值），並回報錯誤；sqrt(-0) 保留負號。本機的一般版本使用下表的 CPU 平方根指令，負數則交給函式庫處理；強制呼叫函式庫後，內部也使用硬體平方根指令。</w:t>
       </w:r>
     </w:p>
     <w:p>
@@ -3774,17 +3736,7 @@
         <w:rPr>
           <w:sz w:val="18"/>
         </w:rPr>
-        <w:t>圖 2-1 default 的 sqrt 指令與負值 fallback；forced-libm 載入函式符號。</w:t>
-      </w:r>
-    </w:p>
-    <w:p>
-      <w:pPr>
-        <w:pStyle w:val="21"/>
-        <w:pageBreakBefore w:val="0"/>
-        <w:spacing w:after="100"/>
-      </w:pPr>
-      <w:r>
-        <w:t>指令證據與演算法的界線</w:t>
+        <w:t>圖 2-1 編譯後仍可看到平方根指令；另一版本呼叫函式庫。</w:t>
       </w:r>
     </w:p>
     <w:tbl>
@@ -3840,16 +3792,8 @@
             <w:shd w:fill="E8EDF2"/>
           </w:tcPr>
           <w:p>
-            <w:pPr>
-              <w:keepNext/>
-              <w:spacing w:after="40" w:before="40"/>
-            </w:pPr>
-            <w:r>
-              <w:rPr>
-                <w:b/>
-                <w:sz w:val="20"/>
-              </w:rPr>
-              <w:t>default 指令／fallback</w:t>
+            <w:r>
+              <w:t>CPU 指令／負數處理</w:t>
             </w:r>
           </w:p>
         </w:tc>
@@ -4075,7 +4019,7 @@
     </w:tbl>
     <w:p>
       <w:r>
-        <w:t>glibc generic 軟體 sqrt 先縮放與正規化，再用 reciprocal-sqrt 表格初值、多項式修正及誤差補償，最後捨入。此 master 來源未與本機套件精確匹配，只作演算法參考；本機已證明的是硬體 SQRT 與錯誤處理路徑。[5a]</w:t>
+        <w:t>這台機器的關鍵做法是直接使用硬體平方根指令，不是以 sin 等函數常見的方式縮小角度範圍。作為軟體演算法參考，glibc 的通用 sqrt 程式會先調整數值大小，查表取得「平方根倒數」的初步估計，再用多項式修正與誤差補償提高精度，最後捨入。這份通用原始碼只用來理解軟體算法，不能當作本機實際執行的路徑。[5a]</w:t>
       </w:r>
     </w:p>
     <w:p>
@@ -4096,7 +4040,7 @@
         </w:rPr>
       </w:pPr>
       <w:r>
-        <w:t>關閉 -ffast-math 時，本例保留括號順序與 NaN 判斷；開啟後允許重結合、假定有限值，並放寬 errno、signed zero 與動態捨入要求，以增加最佳化空間。IEEE 754 的有限精度加法不具一般結合律，因此結果可能改變。[2]</w:t>
+        <w:t>-ffast-math 讓編譯器用較寬鬆的浮點數規則換取最佳化機會，例如改變加法順序、假設沒有 NaN 或無窮大，並放寬負零、錯誤回報與捨入模式的處理。浮點數每一步都可能捨入，所以改變順序可能改變答案。[2]</w:t>
       </w:r>
     </w:p>
     <w:p>
@@ -4120,7 +4064,7 @@
         </w:rPr>
       </w:pPr>
       <w:r>
-        <w:t>同一來源編譯為 strict、fast 兩版，皆使用 -std=c++20 -O3 -fno-lto -ffp-contract=off，僅切換 -fno-fast-math／-ffast-math。執行時透過 argv 輸入相同 a=1e16、b=-1e16、c=1，記錄兩種括號順序與 NaN 的 x!=x。先比較數值，再對照產生碼的加法順序；運算分檔且停用 LTO，避免常數折疊。</w:t>
+        <w:t>同一程式編譯兩次，一版關閉 fast-math，一版開啟；其他參數相同：-std=c++20 -O3 -fno-lto -ffp-contract=off。兩版都輸入 a=1e16、b=-1e16、c=1，比較 (a+b)+c 與 a+(b+c)，也測試 NaN 是否會滿足 x!=x。輸入在執行時提供，避免編譯器預先算出答案。</w:t>
       </w:r>
     </w:p>
     <w:p>
@@ -4145,7 +4089,7 @@
         <w:spacing w:after="100"/>
       </w:pPr>
       <w:r>
-        <w:t>結果與產生碼證據</w:t>
+        <w:t>測試結果</w:t>
       </w:r>
     </w:p>
     <w:tbl>
@@ -4201,16 +4145,8 @@
             <w:shd w:fill="E8EDF2"/>
           </w:tcPr>
           <w:p>
-            <w:pPr>
-              <w:keepNext/>
-              <w:spacing w:after="40" w:before="40"/>
-            </w:pPr>
-            <w:r>
-              <w:rPr>
-                <w:b/>
-                <w:sz w:val="20"/>
-              </w:rPr>
-              <w:t>strict</w:t>
+            <w:r>
+              <w:t>關閉 fast-math</w:t>
             </w:r>
           </w:p>
         </w:tc>
@@ -4221,16 +4157,8 @@
             <w:shd w:fill="E8EDF2"/>
           </w:tcPr>
           <w:p>
-            <w:pPr>
-              <w:keepNext/>
-              <w:spacing w:after="40" w:before="40"/>
-            </w:pPr>
-            <w:r>
-              <w:rPr>
-                <w:b/>
-                <w:sz w:val="20"/>
-              </w:rPr>
-              <w:t>fast</w:t>
+            <w:r>
+              <w:t>開啟 fast-math</w:t>
             </w:r>
           </w:p>
         </w:tc>
@@ -4445,16 +4373,8 @@
             <w:shd w:fill="F7F8FA"/>
           </w:tcPr>
           <w:p>
-            <w:pPr>
-              <w:keepNext w:val="0"/>
-              <w:spacing w:after="40" w:before="40"/>
-            </w:pPr>
-            <w:r>
-              <w:rPr>
-                <w:b w:val="0"/>
-                <w:sz w:val="20"/>
-              </w:rPr>
-              <w:t>finite control</w:t>
+            <w:r>
+              <w:t>一般數值對照組</w:t>
             </w:r>
           </w:p>
         </w:tc>
@@ -4559,26 +4479,13 @@
     </w:p>
     <w:p>
       <w:pPr>
-        <w:pStyle w:val="21"/>
-        <w:pageBreakBefore w:val="0"/>
-        <w:spacing w:after="100"/>
-        <w:rPr>
-          <w:lang w:eastAsia="zh-TW"/>
-        </w:rPr>
-      </w:pPr>
-      <w:r>
-        <w:t>輸出與指令如何對應</w:t>
-      </w:r>
-    </w:p>
-    <w:p>
-      <w:pPr>
         <w:spacing w:after="100" w:before="0"/>
         <w:rPr>
           <w:lang w:eastAsia="zh-TW"/>
         </w:rPr>
       </w:pPr>
       <w:r>
-        <w:t>strict 左結合先抵消再加 1，得 1；右結合的 -1e16+1 捨入回 -1e16，得 0。fast 產生碼先算 b+c，左結合也變 0。NaN 的 x!=x 由 strict 的 true 變為 fast 的 XOR／false。相同輸入與其他旗標、對照輸出及產生碼共同支持 fast-math 為差異原因；兩版已停用 FMA contraction。[2]</w:t>
+        <w:t>關閉 fast-math 時，(a+b)+c 先把兩個大數抵消，再加 1，得到 1；a+(b+c) 則先算 -1e16+1，這個 1 因精度不足而消失，最後得到 0。開啟後，編譯器改變了第一式的計算順序，兩式都得到 0；NaN 的判斷也由 true 變為 false。只有 fast-math 選項不同就改變答案，因此需要保留這些行為時，不能直接開啟它。[2]</w:t>
       </w:r>
     </w:p>
     <w:p>
@@ -4615,7 +4522,7 @@
         </w:rPr>
       </w:pPr>
       <w:r>
-        <w:t>先以 ldexp(1.0,-10) 建立可精確表示的 1/1024=0.0009765625，作為九位小數的中點，排除字面值轉換誤差。再用 nextafter 建立兩側鄰居，測試正負值；每次設定 nearest、upward、downward 或 towardzero，用 printf 與 iostream 輸出相同值，比較字串是否一致及中點如何捨入。</w:t>
+        <w:t>測試 printf("%.9f") 與 std::fixed &lt;&lt; std::setprecision(9)。選 1/1024=0.0009765625：它能被 double 精確儲存，剛好位於第九位小數進位與不進位的中間。再測它兩側最接近的浮點值與負值，並切換四種捨入方式，觀察兩種輸出是否一致。</w:t>
       </w:r>
     </w:p>
     <w:p>
@@ -4695,16 +4602,8 @@
             <w:shd w:fill="E8EDF2"/>
           </w:tcPr>
           <w:p>
-            <w:pPr>
-              <w:keepNext/>
-              <w:spacing w:after="40" w:before="40"/>
-            </w:pPr>
-            <w:r>
-              <w:rPr>
-                <w:b/>
-                <w:sz w:val="20"/>
-              </w:rPr>
-              <w:t>正中點：兩 API</w:t>
+            <w:r>
+              <w:t>正中點：兩種輸出</w:t>
             </w:r>
           </w:p>
         </w:tc>
@@ -4715,16 +4614,8 @@
             <w:shd w:fill="E8EDF2"/>
           </w:tcPr>
           <w:p>
-            <w:pPr>
-              <w:keepNext/>
-              <w:spacing w:after="40" w:before="40"/>
-            </w:pPr>
-            <w:r>
-              <w:rPr>
-                <w:b/>
-                <w:sz w:val="20"/>
-              </w:rPr>
-              <w:t>負中點：兩 API</w:t>
+            <w:r>
+              <w:t>負中點：兩種輸出</w:t>
             </w:r>
           </w:p>
         </w:tc>
@@ -4741,16 +4632,8 @@
             <w:shd w:fill="FFFFFF"/>
           </w:tcPr>
           <w:p>
-            <w:pPr>
-              <w:keepNext/>
-              <w:spacing w:after="40" w:before="40"/>
-            </w:pPr>
-            <w:r>
-              <w:rPr>
-                <w:b w:val="0"/>
-                <w:sz w:val="20"/>
-              </w:rPr>
-              <w:t>nearest</w:t>
+            <w:r>
+              <w:t>最接近值</w:t>
             </w:r>
           </w:p>
         </w:tc>
@@ -4807,16 +4690,8 @@
             <w:shd w:fill="F7F8FA"/>
           </w:tcPr>
           <w:p>
-            <w:pPr>
-              <w:keepNext/>
-              <w:spacing w:after="40" w:before="40"/>
-            </w:pPr>
-            <w:r>
-              <w:rPr>
-                <w:b w:val="0"/>
-                <w:sz w:val="20"/>
-              </w:rPr>
-              <w:t>upward</w:t>
+            <w:r>
+              <w:t>向上</w:t>
             </w:r>
           </w:p>
         </w:tc>
@@ -4873,16 +4748,8 @@
             <w:shd w:fill="FFFFFF"/>
           </w:tcPr>
           <w:p>
-            <w:pPr>
-              <w:keepNext/>
-              <w:spacing w:after="40" w:before="40"/>
-            </w:pPr>
-            <w:r>
-              <w:rPr>
-                <w:b w:val="0"/>
-                <w:sz w:val="20"/>
-              </w:rPr>
-              <w:t>downward</w:t>
+            <w:r>
+              <w:t>向下</w:t>
             </w:r>
           </w:p>
         </w:tc>
@@ -4939,16 +4806,8 @@
             <w:shd w:fill="F7F8FA"/>
           </w:tcPr>
           <w:p>
-            <w:pPr>
-              <w:keepNext w:val="0"/>
-              <w:spacing w:after="40" w:before="40"/>
-            </w:pPr>
-            <w:r>
-              <w:rPr>
-                <w:b w:val="0"/>
-                <w:sz w:val="20"/>
-              </w:rPr>
-              <w:t>towardzero</w:t>
+            <w:r>
+              <w:t>朝零</w:t>
             </w:r>
           </w:p>
         </w:tc>
@@ -5004,7 +4863,7 @@
         <w:spacing w:after="100" w:before="0"/>
       </w:pPr>
       <w:r>
-        <w:t>nearest 的兩 API 都輸出 0.000976562，反駁「中點一律進位」；較小／較大鄰居輸出 0.000976562／0.000976563。四模式共 16 組結果，兩 API 一致。</w:t>
+        <w:t>預設的「最接近值」模式下，兩種輸出都得到 0.000976562，最後的 5 沒有使第九位進位。中點兩側的值則分別輸出 0.000976562、0.000976563。四種模式共 16 組測試，兩種輸出的結果全部相同。</w:t>
       </w:r>
     </w:p>
     <w:p>
@@ -5055,7 +4914,7 @@
         <w:rPr>
           <w:sz w:val="18"/>
         </w:rPr>
-        <w:t>圖 4-1 精確中點、鄰近值與四模式的關鍵輸出。</w:t>
+        <w:t>圖 4-1 中點、鄰近值與不同捨入方式的輸出。</w:t>
       </w:r>
     </w:p>
     <w:p>
@@ -5066,7 +4925,7 @@
         </w:rPr>
       </w:pPr>
       <w:r>
-        <w:t>本機 nearest 符合 ties-to-even；upward／downward 改變輸出，證明格式化受捨入環境影響。精確說法是「將實際儲存值格式化至指定小數位」，不能一概稱為原始十進位數的四捨五入。[5b]</w:t>
+        <w:t>因此，「一定是四捨五入」不夠精確。本機在最接近值模式下，剛好位於中點時選擇末位為偶數的答案；改成向上或向下捨入，輸出也會改變。這兩種寫法是把「實際儲存的值」格式化到九位小數，不保證符合十進位的逢五進一。[5b]</w:t>
       </w:r>
     </w:p>
     <w:p>
@@ -5092,7 +4951,7 @@
         </w:rPr>
       </w:pPr>
       <w:r>
-        <w:t>實驗方法</w:t>
+        <w:t>找到的例子與測試方法</w:t>
       </w:r>
     </w:p>
     <w:p>
@@ -5103,7 +4962,7 @@
         </w:rPr>
       </w:pPr>
       <w:r>
-        <w:t>在 x86_64 WSL 與 arm64 Mac 編譯、執行相同來源，使用 GNU GCC release 16.2.0 與逐字相同旗標。程式先設 FE_TONEAREST，以 long double 計算 (2^53+1)-2^53，記錄 sizeof、digits 與十六進位結果。完成後執行 scripts/verify_q5_pair.py，核對 compiler family、release、flags 與來源雜湊；四項皆一致，再對照兩端產生碼。vendor build 與 target 不同，完整 configuration 已保存。</w:t>
+        <w:t>相同的 long double 算式 (2^53+1)-2^53，在 Windows／WSL 得到 1，在 Mac 得到 0，數學答案是 1。兩台使用相同原始碼、GNU GCC 16.2.0 與相同編譯參數，也都設定為「最接近值」捨入。先執行程式，再用 scripts/verify_q5_pair.py 核對原始碼、編譯器系列、版本與參數，四項皆一致。兩平台的編譯器安裝來源與目標架構不同，完整資訊保存在 results。</w:t>
       </w:r>
     </w:p>
     <w:p>
@@ -5115,7 +4974,7 @@
         </w:rPr>
       </w:pPr>
       <w:r>
-        <w:t>// experiments/q5_portability/operations.cpp；獨立函式加 noinline</w:t>
+        <w:t>// experiments/q5_portability/operations.cpp</w:t>
         <w:br/>
         <w:t>long double increment_long_double(long double a, long double b) {</w:t>
         <w:br/>
@@ -5127,7 +4986,7 @@
         <w:br/>
         <w:t>}</w:t>
         <w:br/>
-        <w:t>// 輸入 a=2^53、b=1；memory barrier 強制中間值存回平台型態。</w:t>
+        <w:t>// a=2^53、b=1；中間答案先存回 long double，再做減法。</w:t>
       </w:r>
     </w:p>
     <w:p>
@@ -5178,7 +5037,7 @@
         <w:rPr>
           <w:sz w:val="18"/>
         </w:rPr>
-        <w:t>圖 5-1 WSL 在 FE_TONEAREST 下的型態參數與結果 1。</w:t>
+        <w:t>圖 5-1 Windows／WSL：long_double_increment=1。</w:t>
       </w:r>
     </w:p>
     <w:p>
@@ -5190,7 +5049,7 @@
         </w:rPr>
       </w:pPr>
       <w:r>
-        <w:t>編譯／執行：CXX=g++-16 bash scripts/run_q5.sh run。旗標：-std=c++20 -Wall -Wextra -fno-lto -ffp-contract=off -O2 -fno-fast-math -frounding-math。以 scripts/verify_q5_pair.py 核對兩端條件。</w:t>
+        <w:t>兩台編譯與執行：CXX=g++-16 bash scripts/run_q5.sh run。相同參數：-std=c++20 -Wall -Wextra -fno-lto -ffp-contract=off -O2 -fno-fast-math -frounding-math。</w:t>
       </w:r>
     </w:p>
     <w:tbl>
@@ -5280,16 +5139,8 @@
             <w:shd w:fill="FFFFFF"/>
           </w:tcPr>
           <w:p>
-            <w:pPr>
-              <w:keepNext/>
-              <w:spacing w:after="40" w:before="40"/>
-            </w:pPr>
-            <w:r>
-              <w:rPr>
-                <w:b w:val="0"/>
-                <w:sz w:val="20"/>
-              </w:rPr>
-              <w:t>long double sizeof／digits</w:t>
+            <w:r>
+              <w:t>儲存空間／有效位數</w:t>
             </w:r>
           </w:p>
         </w:tc>
@@ -5404,16 +5255,8 @@
             <w:shd w:fill="FFFFFF"/>
           </w:tcPr>
           <w:p>
-            <w:pPr>
-              <w:keepNext/>
-              <w:spacing w:after="40" w:before="40"/>
-            </w:pPr>
-            <w:r>
-              <w:rPr>
-                <w:b w:val="0"/>
-                <w:sz w:val="20"/>
-              </w:rPr>
-              <w:t>ABI 案例捨入狀態</w:t>
+            <w:r>
+              <w:t>捨入方式</w:t>
             </w:r>
           </w:p>
         </w:tc>
@@ -5564,7 +5407,7 @@
         <w:rPr>
           <w:sz w:val="18"/>
         </w:rPr>
-        <w:t>圖 5-2 Mac 在 FE_TONEAREST 下的型態參數與結果 0。</w:t>
+        <w:t>圖 5-2 Mac：long_double_increment=0。</w:t>
       </w:r>
     </w:p>
     <w:p>
@@ -5572,7 +5415,7 @@
         <w:spacing w:after="100" w:before="0"/>
       </w:pPr>
       <w:r>
-        <w:t>WSL 為 FLDT／FADD／FSTPT／FLDT／FSUBP；Mac 為 FADD D／STR／LDR／FSUB D。兩端保留加法、存回與減法，排除計算消去；輸入有限、不溢位且無越界或未初始化值。inline asm 使用 GCC 支援擴充。</w:t>
+        <w:t>兩台編譯後都保留加法、儲存與減法，待測計算沒有被刪掉。程式使用有限數值，沒有溢位、越界或未初始化讀取；上面的 asm 是 GCC 支援的擴充，用來要求中間答案存回記憶體。</w:t>
       </w:r>
     </w:p>
     <w:p>
@@ -5583,7 +5426,7 @@
         </w:rPr>
       </w:pPr>
       <w:r>
-        <w:t>WSL long double 有 64 位精度，保留 2^53+1，減回得 1；Mac 只有 53 位，2^53 附近間距為 2，+1 是中點，nearest 存回 2^53，減回得 0，符合 Apple arm64 ABI。[6] 相同來源、compiler release 與旗標下，型態參數、實測結果及產生碼共同支持 ABI 差異為原因。</w:t>
+        <w:t>差異來自兩平台對 long double 的規定。WSL 有 64 個有效位，存得下 2^53+1，所以減回得到 1。Mac 只有 53 個有效位，這個大小附近只能以 2 為間隔表示數值；2^53+1 在中間，捨入後變回 2^53，所以減回得到 0。Apple 的 ARM64 平台規定 long double 與 double 同樣精度，與實測吻合。[6] 這就是相同程式、相同編譯器版本與參數，仍因執行平台不同而得到不同答案的例子。</w:t>
       </w:r>
     </w:p>
     <w:p>
@@ -5994,7 +5837,7 @@
         </w:rPr>
       </w:pPr>
       <w:r>
-        <w:t>本機路徑以輸出與反組譯驗證，規格以參考文件解釋。查閱日期：2026/10/04。</w:t>
+        <w:t>規格與原因參考以下文件，本機行為則以測試輸出及 CPU 指令核對。查閱日期：2026/10/04。</w:t>
       </w:r>
     </w:p>
     <w:p>

</xml_diff>

<commit_message>
Reorganize homework report into seven pages with verified evidence
</commit_message>
<xml_diff>
--- a/Floating_Point_Report_Q0.docx
+++ b/Floating_Point_Report_Q0.docx
@@ -84,19 +84,6 @@
         <w:t>Q0. 實驗環境</w:t>
       </w:r>
     </w:p>
-    <w:p>
-      <w:pPr>
-        <w:pStyle w:val="21"/>
-        <w:pageBreakBefore w:val="0"/>
-        <w:spacing w:after="100"/>
-        <w:rPr>
-          <w:lang w:eastAsia="zh-TW"/>
-        </w:rPr>
-      </w:pPr>
-      <w:r>
-        <w:t>測試設備</w:t>
-      </w:r>
-    </w:p>
     <w:tbl>
       <w:tblPr>
         <w:tblW w:w="0" w:type="auto"/>
@@ -144,6 +131,7 @@
             <w:r>
               <w:rPr>
                 <w:b/>
+                <w:color w:val="000000"/>
                 <w:sz w:val="20"/>
               </w:rPr>
               <w:t>項目</w:t>
@@ -171,6 +159,7 @@
             <w:r>
               <w:rPr>
                 <w:b/>
+                <w:color w:val="000000"/>
                 <w:sz w:val="20"/>
               </w:rPr>
               <w:t>主要平台（實測）</w:t>
@@ -198,6 +187,7 @@
             <w:r>
               <w:rPr>
                 <w:b/>
+                <w:color w:val="000000"/>
                 <w:sz w:val="20"/>
               </w:rPr>
               <w:t>輔助平台（實測）</w:t>
@@ -731,8 +721,8 @@
               <w:bottom w:val="single" w:sz="4" w:space="0" w:color="D9D9D9"/>
               <w:right w:val="single" w:sz="4" w:space="0" w:color="D9D9D9"/>
             </w:tcBorders>
-            <w:shd w:fill="FFFFFF"/>
-            <w:shd w:fill="FFFFFF"/>
+            <w:shd w:fill="F7F8FA"/>
+            <w:shd w:fill="F7F8FA"/>
           </w:tcPr>
           <w:p>
             <w:pPr>
@@ -744,10 +734,70 @@
                 <w:b w:val="0"/>
                 <w:sz w:val="20"/>
               </w:rPr>
-              <w:t>Q0 編譯參數</w:t>
-            </w:r>
-          </w:p>
-        </w:tc>
+              <w:t>核心／執行緒</w:t>
+            </w:r>
+          </w:p>
+        </w:tc>
+        <w:tc>
+          <w:tcPr>
+            <w:tcW w:w="3312" w:type="dxa"/>
+            <w:tcBorders>
+              <w:top w:val="single" w:sz="4" w:space="0" w:color="D9D9D9"/>
+              <w:left w:val="single" w:sz="4" w:space="0" w:color="D9D9D9"/>
+              <w:bottom w:val="single" w:sz="4" w:space="0" w:color="D9D9D9"/>
+              <w:right w:val="single" w:sz="4" w:space="0" w:color="D9D9D9"/>
+            </w:tcBorders>
+            <w:shd w:fill="F7F8FA"/>
+            <w:shd w:fill="F7F8FA"/>
+          </w:tcPr>
+          <w:p>
+            <w:pPr>
+              <w:keepNext/>
+              <w:spacing w:before="40" w:after="40"/>
+            </w:pPr>
+            <w:r>
+              <w:rPr>
+                <w:b w:val="0"/>
+                <w:sz w:val="20"/>
+              </w:rPr>
+              <w:t>Windows：16／24</w:t>
+              <w:br/>
+              <w:t>WSL 虛擬拓樸：12／24</w:t>
+            </w:r>
+          </w:p>
+        </w:tc>
+        <w:tc>
+          <w:tcPr>
+            <w:tcW w:w="3312" w:type="dxa"/>
+            <w:tcBorders>
+              <w:top w:val="single" w:sz="4" w:space="0" w:color="D9D9D9"/>
+              <w:left w:val="single" w:sz="4" w:space="0" w:color="D9D9D9"/>
+              <w:bottom w:val="single" w:sz="4" w:space="0" w:color="D9D9D9"/>
+              <w:right w:val="single" w:sz="4" w:space="0" w:color="D9D9D9"/>
+            </w:tcBorders>
+            <w:shd w:fill="F7F8FA"/>
+            <w:shd w:fill="F7F8FA"/>
+          </w:tcPr>
+          <w:p>
+            <w:pPr>
+              <w:keepNext/>
+              <w:spacing w:before="40" w:after="40"/>
+            </w:pPr>
+            <w:r>
+              <w:rPr>
+                <w:b w:val="0"/>
+                <w:sz w:val="20"/>
+              </w:rPr>
+              <w:t>實體核心 10／執行緒 10</w:t>
+            </w:r>
+          </w:p>
+        </w:tc>
+      </w:tr>
+      <w:tr>
+        <w:trPr>
+          <w:cantSplit/>
+          <w:cantSplit/>
+        </w:trPr>
         <w:tc>
           <w:tcPr>
             <w:tcW w:w="3312" w:type="dxa"/>
@@ -763,18 +813,14 @@
           <w:p>
             <w:pPr>
               <w:keepNext/>
-              <w:spacing w:after="40" w:before="40"/>
+              <w:spacing w:before="40" w:after="40"/>
             </w:pPr>
             <w:r>
               <w:rPr>
                 <w:b w:val="0"/>
                 <w:sz w:val="20"/>
               </w:rPr>
-              <w:t>-std=c++20 -Wall -Wextra -fno-lto</w:t>
-              <w:br/>
-              <w:t>-ffp-contract=off -O2</w:t>
-              <w:br/>
-              <w:t>-fno-fast-math -frounding-math</w:t>
+              <w:t>記憶體</w:t>
             </w:r>
           </w:p>
         </w:tc>
@@ -800,7 +846,27 @@
                 <w:b w:val="0"/>
                 <w:sz w:val="20"/>
               </w:rPr>
-              <w:t>Q5 同旗標（見 Q5）</w:t>
+              <w:t>實體 32 GiB；WSL 約 15 GiB</w:t>
+              <w:br/>
+              <w:t>WSL swap 4 GiB</w:t>
+            </w:r>
+          </w:p>
+        </w:tc>
+        <w:tc>
+          <w:tcPr>
+            <w:tcW w:w="3312" w:type="dxa"/>
+            <w:tcBorders>
+              <w:top w:val="single" w:sz="4" w:space="0" w:color="D9D9D9"/>
+              <w:left w:val="single" w:sz="4" w:space="0" w:color="D9D9D9"/>
+              <w:bottom w:val="single" w:sz="4" w:space="0" w:color="D9D9D9"/>
+              <w:right w:val="single" w:sz="4" w:space="0" w:color="D9D9D9"/>
+            </w:tcBorders>
+            <w:shd w:fill="FFFFFF"/>
+            <w:shd w:fill="FFFFFF"/>
+          </w:tcPr>
+          <w:p>
+            <w:r>
+              <w:t>24 GiB</w:t>
             </w:r>
           </w:p>
         </w:tc>
@@ -832,7 +898,7 @@
                 <w:b w:val="0"/>
                 <w:sz w:val="20"/>
               </w:rPr>
-              <w:t>核心／執行緒</w:t>
+              <w:t>WSL／kernel</w:t>
             </w:r>
           </w:p>
         </w:tc>
@@ -858,9 +924,9 @@
                 <w:b w:val="0"/>
                 <w:sz w:val="20"/>
               </w:rPr>
-              <w:t>Windows：16／24</w:t>
+              <w:t>WSL 2.7.3.0</w:t>
               <w:br/>
-              <w:t>WSL 虛擬拓樸：12／24</w:t>
+              <w:t>6.6.114.1-microsoft-standard-WSL2</w:t>
             </w:r>
           </w:p>
         </w:tc>
@@ -886,7 +952,9 @@
                 <w:b w:val="0"/>
                 <w:sz w:val="20"/>
               </w:rPr>
-              <w:t>實體核心 10／執行緒 10</w:t>
+              <w:t>Darwin 27.0.0</w:t>
+              <w:br/>
+              <w:t>ARM64_T8132</w:t>
             </w:r>
           </w:p>
         </w:tc>
@@ -918,7 +986,7 @@
                 <w:b w:val="0"/>
                 <w:sz w:val="20"/>
               </w:rPr>
-              <w:t>記憶體</w:t>
+              <w:t>函式庫</w:t>
             </w:r>
           </w:p>
         </w:tc>
@@ -937,16 +1005,16 @@
           <w:p>
             <w:pPr>
               <w:keepNext/>
-              <w:spacing w:before="40" w:after="40"/>
+              <w:spacing w:after="40" w:before="40"/>
             </w:pPr>
             <w:r>
               <w:rPr>
                 <w:b w:val="0"/>
                 <w:sz w:val="20"/>
               </w:rPr>
-              <w:t>實體 32 GiB；WSL 約 15 GiB</w:t>
+              <w:t>glibc 2.43-2ubuntu2.4</w:t>
               <w:br/>
-              <w:t>WSL swap 4 GiB</w:t>
+              <w:t>本地 GCC 16.2.0 的 libstdc++／libgcc_s</w:t>
             </w:r>
           </w:p>
         </w:tc>
@@ -972,273 +1040,9 @@
                 <w:b w:val="0"/>
                 <w:sz w:val="20"/>
               </w:rPr>
-              <w:t>25,769,803,776 bytes</w:t>
-              <w:br/>
-              <w:t>24 GiB（sysctl 實測）</w:t>
-            </w:r>
-          </w:p>
-        </w:tc>
-      </w:tr>
-      <w:tr>
-        <w:trPr>
-          <w:cantSplit/>
-          <w:cantSplit/>
-        </w:trPr>
-        <w:tc>
-          <w:tcPr>
-            <w:tcW w:w="3312" w:type="dxa"/>
-            <w:tcBorders>
-              <w:top w:val="single" w:sz="4" w:space="0" w:color="D9D9D9"/>
-              <w:left w:val="single" w:sz="4" w:space="0" w:color="D9D9D9"/>
-              <w:bottom w:val="single" w:sz="4" w:space="0" w:color="D9D9D9"/>
-              <w:right w:val="single" w:sz="4" w:space="0" w:color="D9D9D9"/>
-            </w:tcBorders>
-            <w:shd w:fill="F7F8FA"/>
-            <w:shd w:fill="F7F8FA"/>
-          </w:tcPr>
-          <w:p>
-            <w:pPr>
-              <w:keepNext/>
-              <w:spacing w:before="40" w:after="40"/>
-            </w:pPr>
-            <w:r>
-              <w:rPr>
-                <w:b w:val="0"/>
-                <w:sz w:val="20"/>
-              </w:rPr>
-              <w:t>WSL／kernel</w:t>
-            </w:r>
-          </w:p>
-        </w:tc>
-        <w:tc>
-          <w:tcPr>
-            <w:tcW w:w="3312" w:type="dxa"/>
-            <w:tcBorders>
-              <w:top w:val="single" w:sz="4" w:space="0" w:color="D9D9D9"/>
-              <w:left w:val="single" w:sz="4" w:space="0" w:color="D9D9D9"/>
-              <w:bottom w:val="single" w:sz="4" w:space="0" w:color="D9D9D9"/>
-              <w:right w:val="single" w:sz="4" w:space="0" w:color="D9D9D9"/>
-            </w:tcBorders>
-            <w:shd w:fill="F7F8FA"/>
-            <w:shd w:fill="F7F8FA"/>
-          </w:tcPr>
-          <w:p>
-            <w:pPr>
-              <w:keepNext/>
-              <w:spacing w:before="40" w:after="40"/>
-            </w:pPr>
-            <w:r>
-              <w:rPr>
-                <w:b w:val="0"/>
-                <w:sz w:val="20"/>
-              </w:rPr>
-              <w:t>WSL 2.7.3.0</w:t>
-              <w:br/>
-              <w:t>6.6.114.1-microsoft-standard-WSL2</w:t>
-            </w:r>
-          </w:p>
-        </w:tc>
-        <w:tc>
-          <w:tcPr>
-            <w:tcW w:w="3312" w:type="dxa"/>
-            <w:tcBorders>
-              <w:top w:val="single" w:sz="4" w:space="0" w:color="D9D9D9"/>
-              <w:left w:val="single" w:sz="4" w:space="0" w:color="D9D9D9"/>
-              <w:bottom w:val="single" w:sz="4" w:space="0" w:color="D9D9D9"/>
-              <w:right w:val="single" w:sz="4" w:space="0" w:color="D9D9D9"/>
-            </w:tcBorders>
-            <w:shd w:fill="F7F8FA"/>
-            <w:shd w:fill="F7F8FA"/>
-          </w:tcPr>
-          <w:p>
-            <w:pPr>
-              <w:keepNext/>
-              <w:spacing w:before="40" w:after="40"/>
-            </w:pPr>
-            <w:r>
-              <w:rPr>
-                <w:b w:val="0"/>
-                <w:sz w:val="20"/>
-              </w:rPr>
-              <w:t>Darwin 27.0.0</w:t>
-              <w:br/>
-              <w:t>ARM64_T8132</w:t>
-            </w:r>
-          </w:p>
-        </w:tc>
-      </w:tr>
-      <w:tr>
-        <w:trPr>
-          <w:cantSplit/>
-          <w:cantSplit/>
-        </w:trPr>
-        <w:tc>
-          <w:tcPr>
-            <w:tcW w:w="3312" w:type="dxa"/>
-            <w:tcBorders>
-              <w:top w:val="single" w:sz="4" w:space="0" w:color="D9D9D9"/>
-              <w:left w:val="single" w:sz="4" w:space="0" w:color="D9D9D9"/>
-              <w:bottom w:val="single" w:sz="4" w:space="0" w:color="D9D9D9"/>
-              <w:right w:val="single" w:sz="4" w:space="0" w:color="D9D9D9"/>
-            </w:tcBorders>
-            <w:shd w:fill="FFFFFF"/>
-            <w:shd w:fill="FFFFFF"/>
-          </w:tcPr>
-          <w:p>
-            <w:pPr>
-              <w:keepNext/>
-              <w:spacing w:before="40" w:after="40"/>
-            </w:pPr>
-            <w:r>
-              <w:rPr>
-                <w:b w:val="0"/>
-                <w:sz w:val="20"/>
-              </w:rPr>
-              <w:t>函式庫</w:t>
-            </w:r>
-          </w:p>
-        </w:tc>
-        <w:tc>
-          <w:tcPr>
-            <w:tcW w:w="3312" w:type="dxa"/>
-            <w:tcBorders>
-              <w:top w:val="single" w:sz="4" w:space="0" w:color="D9D9D9"/>
-              <w:left w:val="single" w:sz="4" w:space="0" w:color="D9D9D9"/>
-              <w:bottom w:val="single" w:sz="4" w:space="0" w:color="D9D9D9"/>
-              <w:right w:val="single" w:sz="4" w:space="0" w:color="D9D9D9"/>
-            </w:tcBorders>
-            <w:shd w:fill="FFFFFF"/>
-            <w:shd w:fill="FFFFFF"/>
-          </w:tcPr>
-          <w:p>
-            <w:pPr>
-              <w:keepNext/>
-              <w:spacing w:after="40" w:before="40"/>
-            </w:pPr>
-            <w:r>
-              <w:rPr>
-                <w:b w:val="0"/>
-                <w:sz w:val="20"/>
-              </w:rPr>
-              <w:t>glibc 2.43-2ubuntu2.4</w:t>
-              <w:br/>
-              <w:t>本地 GCC 16.2.0 的 libstdc++／libgcc_s</w:t>
-            </w:r>
-          </w:p>
-        </w:tc>
-        <w:tc>
-          <w:tcPr>
-            <w:tcW w:w="3312" w:type="dxa"/>
-            <w:tcBorders>
-              <w:top w:val="single" w:sz="4" w:space="0" w:color="D9D9D9"/>
-              <w:left w:val="single" w:sz="4" w:space="0" w:color="D9D9D9"/>
-              <w:bottom w:val="single" w:sz="4" w:space="0" w:color="D9D9D9"/>
-              <w:right w:val="single" w:sz="4" w:space="0" w:color="D9D9D9"/>
-            </w:tcBorders>
-            <w:shd w:fill="FFFFFF"/>
-            <w:shd w:fill="FFFFFF"/>
-          </w:tcPr>
-          <w:p>
-            <w:pPr>
-              <w:keepNext/>
-              <w:spacing w:before="40" w:after="40"/>
-            </w:pPr>
-            <w:r>
-              <w:rPr>
-                <w:b w:val="0"/>
-                <w:sz w:val="20"/>
-              </w:rPr>
               <w:t>Homebrew libstdc++.6.dylib</w:t>
               <w:br/>
               <w:t>系統 libSystem.B.dylib</w:t>
-            </w:r>
-          </w:p>
-        </w:tc>
-      </w:tr>
-      <w:tr>
-        <w:trPr>
-          <w:cantSplit/>
-          <w:cantSplit/>
-        </w:trPr>
-        <w:tc>
-          <w:tcPr>
-            <w:tcW w:w="3312" w:type="dxa"/>
-            <w:tcBorders>
-              <w:top w:val="single" w:sz="4" w:space="0" w:color="D9D9D9"/>
-              <w:left w:val="single" w:sz="4" w:space="0" w:color="D9D9D9"/>
-              <w:bottom w:val="single" w:sz="4" w:space="0" w:color="D9D9D9"/>
-              <w:right w:val="single" w:sz="4" w:space="0" w:color="D9D9D9"/>
-            </w:tcBorders>
-            <w:shd w:fill="F7F8FA"/>
-            <w:shd w:fill="F7F8FA"/>
-          </w:tcPr>
-          <w:p>
-            <w:pPr>
-              <w:keepNext w:val="0"/>
-              <w:spacing w:before="40" w:after="40"/>
-            </w:pPr>
-            <w:r>
-              <w:rPr>
-                <w:b w:val="0"/>
-                <w:sz w:val="20"/>
-              </w:rPr>
-              <w:t>電源與採集日期</w:t>
-            </w:r>
-          </w:p>
-        </w:tc>
-        <w:tc>
-          <w:tcPr>
-            <w:tcW w:w="3312" w:type="dxa"/>
-            <w:tcBorders>
-              <w:top w:val="single" w:sz="4" w:space="0" w:color="D9D9D9"/>
-              <w:left w:val="single" w:sz="4" w:space="0" w:color="D9D9D9"/>
-              <w:bottom w:val="single" w:sz="4" w:space="0" w:color="D9D9D9"/>
-              <w:right w:val="single" w:sz="4" w:space="0" w:color="D9D9D9"/>
-            </w:tcBorders>
-            <w:shd w:fill="F7F8FA"/>
-            <w:shd w:fill="F7F8FA"/>
-          </w:tcPr>
-          <w:p>
-            <w:pPr>
-              <w:keepNext w:val="0"/>
-              <w:spacing w:before="40" w:after="40"/>
-            </w:pPr>
-            <w:r>
-              <w:rPr>
-                <w:b w:val="0"/>
-                <w:sz w:val="20"/>
-              </w:rPr>
-              <w:t>平衡／AC／100%</w:t>
-              <w:br/>
-              <w:t>2026/10/04</w:t>
-            </w:r>
-          </w:p>
-        </w:tc>
-        <w:tc>
-          <w:tcPr>
-            <w:tcW w:w="3312" w:type="dxa"/>
-            <w:tcBorders>
-              <w:top w:val="single" w:sz="4" w:space="0" w:color="D9D9D9"/>
-              <w:left w:val="single" w:sz="4" w:space="0" w:color="D9D9D9"/>
-              <w:bottom w:val="single" w:sz="4" w:space="0" w:color="D9D9D9"/>
-              <w:right w:val="single" w:sz="4" w:space="0" w:color="D9D9D9"/>
-            </w:tcBorders>
-            <w:shd w:fill="F7F8FA"/>
-            <w:shd w:fill="F7F8FA"/>
-          </w:tcPr>
-          <w:p>
-            <w:pPr>
-              <w:keepNext w:val="0"/>
-              <w:spacing w:before="40" w:after="40"/>
-            </w:pPr>
-            <w:r>
-              <w:rPr>
-                <w:b w:val="0"/>
-                <w:sz w:val="20"/>
-              </w:rPr>
-              <w:t>2026/10/04</w:t>
-              <w:br/>
-              <w:t>電源未採集</w:t>
             </w:r>
           </w:p>
         </w:tc>
@@ -1254,7 +1058,7 @@
         <w:spacing w:after="100" w:before="0"/>
       </w:pPr>
       <w:r>
-        <w:t>測試日期為 2026/10/04。Windows 的程式在 WSL Ubuntu 執行，Mac 只測 Q5。Q1 未固定 CPU 頻率與溫度，因此速度數字代表這次執行，不能視為任何情況下的固定速度。</w:t>
+        <w:t>測試日期為 2026/10/04。Windows 的程式在 WSL Ubuntu 執行，Mac 用於 Q5 的平台比較。Q1 未固定 CPU 頻率與溫度，因此時間代表本次測試，不是所有情況下的固定速度。</w:t>
       </w:r>
     </w:p>
     <w:p>
@@ -1262,17 +1066,7 @@
         <w:spacing w:after="100" w:before="0"/>
       </w:pPr>
       <w:r>
-        <w:t>重跑方式：Windows 執行 experiments/q0_environment/collect_windows.ps1；WSL 執行 bash scripts/run_all.sh；Mac 執行 CXX=g++-16 bash scripts/run_q5.sh run。版本、命令與完整輸出均保存在 results。</w:t>
-      </w:r>
-    </w:p>
-    <w:p>
-      <w:pPr>
-        <w:pStyle w:val="21"/>
-        <w:spacing w:after="100"/>
-        <w:pageBreakBefore w:val="0"/>
-      </w:pPr>
-      <w:r>
-        <w:t>浮點數能保留多少精度</w:t>
+        <w:t>在專案根目錄執行 bash scripts/run_all.sh 可重跑 WSL 全部實驗；Mac 使用 CXX=g++-16 bash scripts/run_q5.sh run。原始輸出保存在 results/linux-20261004-201349 與 results/q5-darwin-20261004-211048-student-wdBjAR。</w:t>
       </w:r>
     </w:p>
     <w:p>
@@ -1280,7 +1074,7 @@
         <w:spacing w:after="100" w:before="0"/>
       </w:pPr>
       <w:r>
-        <w:t>下表是 WSL 程式讀到的型態資訊。sizeof 是儲存所需的 bytes；digits 是可保留的二進位有效位數，越多通常能分辨越小的數值差異。WSL 的 long double 雖占 16 bytes，實際使用 80 位元格式，其中有效位數為 64；Mac 的 long double 則只有 53 位，與 double 相同。</w:t>
+        <w:t>WSL 以程式讀出以下型態資訊。儲存空間不等於運算精度：long double 占 16 bytes，但使用 80 位元格式，另有填補空間；其中 64 位是有效數字。Mac 的 long double 只有 53 個有效位，與 double 相同。</w:t>
       </w:r>
     </w:p>
     <w:tbl>
@@ -1301,9 +1095,6 @@
         <w:gridCol w:w="1656"/>
         <w:gridCol w:w="1656"/>
         <w:gridCol w:w="1656"/>
-        <w:gridCol w:w="1656"/>
-        <w:gridCol w:w="1656"/>
-        <w:gridCol w:w="1656"/>
       </w:tblGrid>
       <w:tr>
         <w:trPr>
@@ -1314,7 +1105,7 @@
         </w:trPr>
         <w:tc>
           <w:tcPr>
-            <w:tcW w:w="1656" w:type="dxa"/>
+            <w:tcW w:w="2880" w:type="dxa"/>
             <w:tcBorders>
               <w:top w:val="single" w:sz="4" w:space="0" w:color="D9D9D9"/>
               <w:left w:val="single" w:sz="4" w:space="0" w:color="D9D9D9"/>
@@ -1326,14 +1117,10 @@
             <w:shd w:fill="E8EDF2"/>
           </w:tcPr>
           <w:p>
-            <w:pPr>
-              <w:keepNext/>
-              <w:spacing w:before="40" w:after="40"/>
-            </w:pPr>
             <w:r>
               <w:rPr>
                 <w:b/>
-                <w:sz w:val="20"/>
+                <w:color w:val="000000"/>
               </w:rPr>
               <w:t>型態</w:t>
             </w:r>
@@ -1341,7 +1128,7 @@
         </w:tc>
         <w:tc>
           <w:tcPr>
-            <w:tcW w:w="1656" w:type="dxa"/>
+            <w:tcW w:w="2880" w:type="dxa"/>
             <w:tcBorders>
               <w:top w:val="single" w:sz="4" w:space="0" w:color="D9D9D9"/>
               <w:left w:val="single" w:sz="4" w:space="0" w:color="D9D9D9"/>
@@ -1353,22 +1140,18 @@
             <w:shd w:fill="E8EDF2"/>
           </w:tcPr>
           <w:p>
-            <w:pPr>
-              <w:keepNext/>
-              <w:spacing w:before="40" w:after="40"/>
-            </w:pPr>
             <w:r>
               <w:rPr>
                 <w:b/>
-                <w:sz w:val="20"/>
-              </w:rPr>
-              <w:t>sizeof</w:t>
-            </w:r>
-          </w:p>
-        </w:tc>
-        <w:tc>
-          <w:tcPr>
-            <w:tcW w:w="1656" w:type="dxa"/>
+                <w:color w:val="000000"/>
+              </w:rPr>
+              <w:t>儲存空間（bytes）</w:t>
+            </w:r>
+          </w:p>
+        </w:tc>
+        <w:tc>
+          <w:tcPr>
+            <w:tcW w:w="2880" w:type="dxa"/>
             <w:tcBorders>
               <w:top w:val="single" w:sz="4" w:space="0" w:color="D9D9D9"/>
               <w:left w:val="single" w:sz="4" w:space="0" w:color="D9D9D9"/>
@@ -1380,97 +1163,12 @@
             <w:shd w:fill="E8EDF2"/>
           </w:tcPr>
           <w:p>
-            <w:pPr>
-              <w:keepNext/>
-              <w:spacing w:before="40" w:after="40"/>
-            </w:pPr>
             <w:r>
               <w:rPr>
                 <w:b/>
-                <w:sz w:val="20"/>
-              </w:rPr>
-              <w:t>digits</w:t>
-            </w:r>
-          </w:p>
-        </w:tc>
-        <w:tc>
-          <w:tcPr>
-            <w:tcW w:w="1656" w:type="dxa"/>
-            <w:tcBorders>
-              <w:top w:val="single" w:sz="4" w:space="0" w:color="D9D9D9"/>
-              <w:left w:val="single" w:sz="4" w:space="0" w:color="D9D9D9"/>
-              <w:bottom w:val="single" w:sz="4" w:space="0" w:color="D9D9D9"/>
-              <w:right w:val="single" w:sz="4" w:space="0" w:color="D9D9D9"/>
-            </w:tcBorders>
-            <w:shd w:val="clear" w:color="auto" w:fill="E8EDF2"/>
-            <w:shd w:fill="E8EDF2"/>
-            <w:shd w:fill="E8EDF2"/>
-          </w:tcPr>
-          <w:p>
-            <w:pPr>
-              <w:keepNext/>
-              <w:spacing w:before="40" w:after="40"/>
-            </w:pPr>
-            <w:r>
-              <w:rPr>
-                <w:b/>
-                <w:sz w:val="20"/>
-              </w:rPr>
-              <w:t>digits10</w:t>
-            </w:r>
-          </w:p>
-        </w:tc>
-        <w:tc>
-          <w:tcPr>
-            <w:tcW w:w="1656" w:type="dxa"/>
-            <w:tcBorders>
-              <w:top w:val="single" w:sz="4" w:space="0" w:color="D9D9D9"/>
-              <w:left w:val="single" w:sz="4" w:space="0" w:color="D9D9D9"/>
-              <w:bottom w:val="single" w:sz="4" w:space="0" w:color="D9D9D9"/>
-              <w:right w:val="single" w:sz="4" w:space="0" w:color="D9D9D9"/>
-            </w:tcBorders>
-            <w:shd w:val="clear" w:color="auto" w:fill="E8EDF2"/>
-            <w:shd w:fill="E8EDF2"/>
-            <w:shd w:fill="E8EDF2"/>
-          </w:tcPr>
-          <w:p>
-            <w:pPr>
-              <w:keepNext/>
-              <w:spacing w:before="40" w:after="40"/>
-            </w:pPr>
-            <w:r>
-              <w:rPr>
-                <w:b/>
-                <w:sz w:val="20"/>
-              </w:rPr>
-              <w:t>max_digits10</w:t>
-            </w:r>
-          </w:p>
-        </w:tc>
-        <w:tc>
-          <w:tcPr>
-            <w:tcW w:w="1656" w:type="dxa"/>
-            <w:tcBorders>
-              <w:top w:val="single" w:sz="4" w:space="0" w:color="D9D9D9"/>
-              <w:left w:val="single" w:sz="4" w:space="0" w:color="D9D9D9"/>
-              <w:bottom w:val="single" w:sz="4" w:space="0" w:color="D9D9D9"/>
-              <w:right w:val="single" w:sz="4" w:space="0" w:color="D9D9D9"/>
-            </w:tcBorders>
-            <w:shd w:val="clear" w:color="auto" w:fill="E8EDF2"/>
-            <w:shd w:fill="E8EDF2"/>
-            <w:shd w:fill="E8EDF2"/>
-          </w:tcPr>
-          <w:p>
-            <w:pPr>
-              <w:keepNext/>
-              <w:spacing w:before="40" w:after="40"/>
-            </w:pPr>
-            <w:r>
-              <w:rPr>
-                <w:b/>
-                <w:sz w:val="20"/>
-              </w:rPr>
-              <w:t>is_iec559</w:t>
+                <w:color w:val="000000"/>
+              </w:rPr>
+              <w:t>有效位數（二進位）</w:t>
             </w:r>
           </w:p>
         </w:tc>
@@ -1482,7 +1180,7 @@
         </w:trPr>
         <w:tc>
           <w:tcPr>
-            <w:tcW w:w="1656" w:type="dxa"/>
+            <w:tcW w:w="2880" w:type="dxa"/>
             <w:tcBorders>
               <w:top w:val="single" w:sz="4" w:space="0" w:color="D9D9D9"/>
               <w:left w:val="single" w:sz="4" w:space="0" w:color="D9D9D9"/>
@@ -1508,7 +1206,7 @@
         </w:tc>
         <w:tc>
           <w:tcPr>
-            <w:tcW w:w="1656" w:type="dxa"/>
+            <w:tcW w:w="2880" w:type="dxa"/>
             <w:tcBorders>
               <w:top w:val="single" w:sz="4" w:space="0" w:color="D9D9D9"/>
               <w:left w:val="single" w:sz="4" w:space="0" w:color="D9D9D9"/>
@@ -1534,7 +1232,7 @@
         </w:tc>
         <w:tc>
           <w:tcPr>
-            <w:tcW w:w="1656" w:type="dxa"/>
+            <w:tcW w:w="2880" w:type="dxa"/>
             <w:tcBorders>
               <w:top w:val="single" w:sz="4" w:space="0" w:color="D9D9D9"/>
               <w:left w:val="single" w:sz="4" w:space="0" w:color="D9D9D9"/>
@@ -1558,9 +1256,99 @@
             </w:r>
           </w:p>
         </w:tc>
-        <w:tc>
-          <w:tcPr>
-            <w:tcW w:w="1656" w:type="dxa"/>
+      </w:tr>
+      <w:tr>
+        <w:trPr>
+          <w:cantSplit/>
+          <w:cantSplit/>
+        </w:trPr>
+        <w:tc>
+          <w:tcPr>
+            <w:tcW w:w="2880" w:type="dxa"/>
+            <w:tcBorders>
+              <w:top w:val="single" w:sz="4" w:space="0" w:color="D9D9D9"/>
+              <w:left w:val="single" w:sz="4" w:space="0" w:color="D9D9D9"/>
+              <w:bottom w:val="single" w:sz="4" w:space="0" w:color="D9D9D9"/>
+              <w:right w:val="single" w:sz="4" w:space="0" w:color="D9D9D9"/>
+            </w:tcBorders>
+            <w:shd w:fill="F7F8FA"/>
+            <w:shd w:fill="F7F8FA"/>
+          </w:tcPr>
+          <w:p>
+            <w:pPr>
+              <w:keepNext/>
+              <w:spacing w:before="40" w:after="40"/>
+            </w:pPr>
+            <w:r>
+              <w:rPr>
+                <w:b w:val="0"/>
+                <w:sz w:val="20"/>
+              </w:rPr>
+              <w:t>double</w:t>
+            </w:r>
+          </w:p>
+        </w:tc>
+        <w:tc>
+          <w:tcPr>
+            <w:tcW w:w="2880" w:type="dxa"/>
+            <w:tcBorders>
+              <w:top w:val="single" w:sz="4" w:space="0" w:color="D9D9D9"/>
+              <w:left w:val="single" w:sz="4" w:space="0" w:color="D9D9D9"/>
+              <w:bottom w:val="single" w:sz="4" w:space="0" w:color="D9D9D9"/>
+              <w:right w:val="single" w:sz="4" w:space="0" w:color="D9D9D9"/>
+            </w:tcBorders>
+            <w:shd w:fill="F7F8FA"/>
+            <w:shd w:fill="F7F8FA"/>
+          </w:tcPr>
+          <w:p>
+            <w:pPr>
+              <w:keepNext/>
+              <w:spacing w:before="40" w:after="40"/>
+            </w:pPr>
+            <w:r>
+              <w:rPr>
+                <w:b w:val="0"/>
+                <w:sz w:val="20"/>
+              </w:rPr>
+              <w:t>8</w:t>
+            </w:r>
+          </w:p>
+        </w:tc>
+        <w:tc>
+          <w:tcPr>
+            <w:tcW w:w="2880" w:type="dxa"/>
+            <w:tcBorders>
+              <w:top w:val="single" w:sz="4" w:space="0" w:color="D9D9D9"/>
+              <w:left w:val="single" w:sz="4" w:space="0" w:color="D9D9D9"/>
+              <w:bottom w:val="single" w:sz="4" w:space="0" w:color="D9D9D9"/>
+              <w:right w:val="single" w:sz="4" w:space="0" w:color="D9D9D9"/>
+            </w:tcBorders>
+            <w:shd w:fill="F7F8FA"/>
+            <w:shd w:fill="F7F8FA"/>
+          </w:tcPr>
+          <w:p>
+            <w:pPr>
+              <w:keepNext/>
+              <w:spacing w:before="40" w:after="40"/>
+            </w:pPr>
+            <w:r>
+              <w:rPr>
+                <w:b w:val="0"/>
+                <w:sz w:val="20"/>
+              </w:rPr>
+              <w:t>53</w:t>
+            </w:r>
+          </w:p>
+        </w:tc>
+      </w:tr>
+      <w:tr>
+        <w:trPr>
+          <w:cantSplit/>
+          <w:cantSplit/>
+        </w:trPr>
+        <w:tc>
+          <w:tcPr>
+            <w:tcW w:w="2880" w:type="dxa"/>
             <w:tcBorders>
               <w:top w:val="single" w:sz="4" w:space="0" w:color="D9D9D9"/>
               <w:left w:val="single" w:sz="4" w:space="0" w:color="D9D9D9"/>
@@ -1572,7 +1360,7 @@
           </w:tcPr>
           <w:p>
             <w:pPr>
-              <w:keepNext/>
+              <w:keepNext w:val="0"/>
               <w:spacing w:before="40" w:after="40"/>
             </w:pPr>
             <w:r>
@@ -1580,13 +1368,13 @@
                 <w:b w:val="0"/>
                 <w:sz w:val="20"/>
               </w:rPr>
-              <w:t>6</w:t>
-            </w:r>
-          </w:p>
-        </w:tc>
-        <w:tc>
-          <w:tcPr>
-            <w:tcW w:w="1656" w:type="dxa"/>
+              <w:t>long double</w:t>
+            </w:r>
+          </w:p>
+        </w:tc>
+        <w:tc>
+          <w:tcPr>
+            <w:tcW w:w="2880" w:type="dxa"/>
             <w:tcBorders>
               <w:top w:val="single" w:sz="4" w:space="0" w:color="D9D9D9"/>
               <w:left w:val="single" w:sz="4" w:space="0" w:color="D9D9D9"/>
@@ -1598,7 +1386,7 @@
           </w:tcPr>
           <w:p>
             <w:pPr>
-              <w:keepNext/>
+              <w:keepNext w:val="0"/>
               <w:spacing w:before="40" w:after="40"/>
             </w:pPr>
             <w:r>
@@ -1606,13 +1394,13 @@
                 <w:b w:val="0"/>
                 <w:sz w:val="20"/>
               </w:rPr>
-              <w:t>9</w:t>
-            </w:r>
-          </w:p>
-        </w:tc>
-        <w:tc>
-          <w:tcPr>
-            <w:tcW w:w="1656" w:type="dxa"/>
+              <w:t>16</w:t>
+            </w:r>
+          </w:p>
+        </w:tc>
+        <w:tc>
+          <w:tcPr>
+            <w:tcW w:w="2880" w:type="dxa"/>
             <w:tcBorders>
               <w:top w:val="single" w:sz="4" w:space="0" w:color="D9D9D9"/>
               <w:left w:val="single" w:sz="4" w:space="0" w:color="D9D9D9"/>
@@ -1624,200 +1412,6 @@
           </w:tcPr>
           <w:p>
             <w:pPr>
-              <w:keepNext/>
-              <w:spacing w:before="40" w:after="40"/>
-            </w:pPr>
-            <w:r>
-              <w:rPr>
-                <w:b w:val="0"/>
-                <w:sz w:val="20"/>
-              </w:rPr>
-              <w:t>true</w:t>
-            </w:r>
-          </w:p>
-        </w:tc>
-      </w:tr>
-      <w:tr>
-        <w:trPr>
-          <w:cantSplit/>
-          <w:cantSplit/>
-        </w:trPr>
-        <w:tc>
-          <w:tcPr>
-            <w:tcW w:w="1656" w:type="dxa"/>
-            <w:tcBorders>
-              <w:top w:val="single" w:sz="4" w:space="0" w:color="D9D9D9"/>
-              <w:left w:val="single" w:sz="4" w:space="0" w:color="D9D9D9"/>
-              <w:bottom w:val="single" w:sz="4" w:space="0" w:color="D9D9D9"/>
-              <w:right w:val="single" w:sz="4" w:space="0" w:color="D9D9D9"/>
-            </w:tcBorders>
-            <w:shd w:fill="F7F8FA"/>
-            <w:shd w:fill="F7F8FA"/>
-          </w:tcPr>
-          <w:p>
-            <w:pPr>
-              <w:keepNext/>
-              <w:spacing w:before="40" w:after="40"/>
-            </w:pPr>
-            <w:r>
-              <w:rPr>
-                <w:b w:val="0"/>
-                <w:sz w:val="20"/>
-              </w:rPr>
-              <w:t>double</w:t>
-            </w:r>
-          </w:p>
-        </w:tc>
-        <w:tc>
-          <w:tcPr>
-            <w:tcW w:w="1656" w:type="dxa"/>
-            <w:tcBorders>
-              <w:top w:val="single" w:sz="4" w:space="0" w:color="D9D9D9"/>
-              <w:left w:val="single" w:sz="4" w:space="0" w:color="D9D9D9"/>
-              <w:bottom w:val="single" w:sz="4" w:space="0" w:color="D9D9D9"/>
-              <w:right w:val="single" w:sz="4" w:space="0" w:color="D9D9D9"/>
-            </w:tcBorders>
-            <w:shd w:fill="F7F8FA"/>
-            <w:shd w:fill="F7F8FA"/>
-          </w:tcPr>
-          <w:p>
-            <w:pPr>
-              <w:keepNext/>
-              <w:spacing w:before="40" w:after="40"/>
-            </w:pPr>
-            <w:r>
-              <w:rPr>
-                <w:b w:val="0"/>
-                <w:sz w:val="20"/>
-              </w:rPr>
-              <w:t>8</w:t>
-            </w:r>
-          </w:p>
-        </w:tc>
-        <w:tc>
-          <w:tcPr>
-            <w:tcW w:w="1656" w:type="dxa"/>
-            <w:tcBorders>
-              <w:top w:val="single" w:sz="4" w:space="0" w:color="D9D9D9"/>
-              <w:left w:val="single" w:sz="4" w:space="0" w:color="D9D9D9"/>
-              <w:bottom w:val="single" w:sz="4" w:space="0" w:color="D9D9D9"/>
-              <w:right w:val="single" w:sz="4" w:space="0" w:color="D9D9D9"/>
-            </w:tcBorders>
-            <w:shd w:fill="F7F8FA"/>
-            <w:shd w:fill="F7F8FA"/>
-          </w:tcPr>
-          <w:p>
-            <w:pPr>
-              <w:keepNext/>
-              <w:spacing w:before="40" w:after="40"/>
-            </w:pPr>
-            <w:r>
-              <w:rPr>
-                <w:b w:val="0"/>
-                <w:sz w:val="20"/>
-              </w:rPr>
-              <w:t>53</w:t>
-            </w:r>
-          </w:p>
-        </w:tc>
-        <w:tc>
-          <w:tcPr>
-            <w:tcW w:w="1656" w:type="dxa"/>
-            <w:tcBorders>
-              <w:top w:val="single" w:sz="4" w:space="0" w:color="D9D9D9"/>
-              <w:left w:val="single" w:sz="4" w:space="0" w:color="D9D9D9"/>
-              <w:bottom w:val="single" w:sz="4" w:space="0" w:color="D9D9D9"/>
-              <w:right w:val="single" w:sz="4" w:space="0" w:color="D9D9D9"/>
-            </w:tcBorders>
-            <w:shd w:fill="F7F8FA"/>
-            <w:shd w:fill="F7F8FA"/>
-          </w:tcPr>
-          <w:p>
-            <w:pPr>
-              <w:keepNext/>
-              <w:spacing w:before="40" w:after="40"/>
-            </w:pPr>
-            <w:r>
-              <w:rPr>
-                <w:b w:val="0"/>
-                <w:sz w:val="20"/>
-              </w:rPr>
-              <w:t>15</w:t>
-            </w:r>
-          </w:p>
-        </w:tc>
-        <w:tc>
-          <w:tcPr>
-            <w:tcW w:w="1656" w:type="dxa"/>
-            <w:tcBorders>
-              <w:top w:val="single" w:sz="4" w:space="0" w:color="D9D9D9"/>
-              <w:left w:val="single" w:sz="4" w:space="0" w:color="D9D9D9"/>
-              <w:bottom w:val="single" w:sz="4" w:space="0" w:color="D9D9D9"/>
-              <w:right w:val="single" w:sz="4" w:space="0" w:color="D9D9D9"/>
-            </w:tcBorders>
-            <w:shd w:fill="F7F8FA"/>
-            <w:shd w:fill="F7F8FA"/>
-          </w:tcPr>
-          <w:p>
-            <w:pPr>
-              <w:keepNext/>
-              <w:spacing w:before="40" w:after="40"/>
-            </w:pPr>
-            <w:r>
-              <w:rPr>
-                <w:b w:val="0"/>
-                <w:sz w:val="20"/>
-              </w:rPr>
-              <w:t>17</w:t>
-            </w:r>
-          </w:p>
-        </w:tc>
-        <w:tc>
-          <w:tcPr>
-            <w:tcW w:w="1656" w:type="dxa"/>
-            <w:tcBorders>
-              <w:top w:val="single" w:sz="4" w:space="0" w:color="D9D9D9"/>
-              <w:left w:val="single" w:sz="4" w:space="0" w:color="D9D9D9"/>
-              <w:bottom w:val="single" w:sz="4" w:space="0" w:color="D9D9D9"/>
-              <w:right w:val="single" w:sz="4" w:space="0" w:color="D9D9D9"/>
-            </w:tcBorders>
-            <w:shd w:fill="F7F8FA"/>
-            <w:shd w:fill="F7F8FA"/>
-          </w:tcPr>
-          <w:p>
-            <w:pPr>
-              <w:keepNext/>
-              <w:spacing w:before="40" w:after="40"/>
-            </w:pPr>
-            <w:r>
-              <w:rPr>
-                <w:b w:val="0"/>
-                <w:sz w:val="20"/>
-              </w:rPr>
-              <w:t>true</w:t>
-            </w:r>
-          </w:p>
-        </w:tc>
-      </w:tr>
-      <w:tr>
-        <w:trPr>
-          <w:cantSplit/>
-          <w:cantSplit/>
-        </w:trPr>
-        <w:tc>
-          <w:tcPr>
-            <w:tcW w:w="1656" w:type="dxa"/>
-            <w:tcBorders>
-              <w:top w:val="single" w:sz="4" w:space="0" w:color="D9D9D9"/>
-              <w:left w:val="single" w:sz="4" w:space="0" w:color="D9D9D9"/>
-              <w:bottom w:val="single" w:sz="4" w:space="0" w:color="D9D9D9"/>
-              <w:right w:val="single" w:sz="4" w:space="0" w:color="D9D9D9"/>
-            </w:tcBorders>
-            <w:shd w:fill="FFFFFF"/>
-            <w:shd w:fill="FFFFFF"/>
-          </w:tcPr>
-          <w:p>
-            <w:pPr>
               <w:keepNext w:val="0"/>
               <w:spacing w:before="40" w:after="40"/>
             </w:pPr>
@@ -1826,137 +1420,7 @@
                 <w:b w:val="0"/>
                 <w:sz w:val="20"/>
               </w:rPr>
-              <w:t>long double</w:t>
-            </w:r>
-          </w:p>
-        </w:tc>
-        <w:tc>
-          <w:tcPr>
-            <w:tcW w:w="1656" w:type="dxa"/>
-            <w:tcBorders>
-              <w:top w:val="single" w:sz="4" w:space="0" w:color="D9D9D9"/>
-              <w:left w:val="single" w:sz="4" w:space="0" w:color="D9D9D9"/>
-              <w:bottom w:val="single" w:sz="4" w:space="0" w:color="D9D9D9"/>
-              <w:right w:val="single" w:sz="4" w:space="0" w:color="D9D9D9"/>
-            </w:tcBorders>
-            <w:shd w:fill="FFFFFF"/>
-            <w:shd w:fill="FFFFFF"/>
-          </w:tcPr>
-          <w:p>
-            <w:pPr>
-              <w:keepNext w:val="0"/>
-              <w:spacing w:before="40" w:after="40"/>
-            </w:pPr>
-            <w:r>
-              <w:rPr>
-                <w:b w:val="0"/>
-                <w:sz w:val="20"/>
-              </w:rPr>
-              <w:t>16</w:t>
-            </w:r>
-          </w:p>
-        </w:tc>
-        <w:tc>
-          <w:tcPr>
-            <w:tcW w:w="1656" w:type="dxa"/>
-            <w:tcBorders>
-              <w:top w:val="single" w:sz="4" w:space="0" w:color="D9D9D9"/>
-              <w:left w:val="single" w:sz="4" w:space="0" w:color="D9D9D9"/>
-              <w:bottom w:val="single" w:sz="4" w:space="0" w:color="D9D9D9"/>
-              <w:right w:val="single" w:sz="4" w:space="0" w:color="D9D9D9"/>
-            </w:tcBorders>
-            <w:shd w:fill="FFFFFF"/>
-            <w:shd w:fill="FFFFFF"/>
-          </w:tcPr>
-          <w:p>
-            <w:pPr>
-              <w:keepNext w:val="0"/>
-              <w:spacing w:before="40" w:after="40"/>
-            </w:pPr>
-            <w:r>
-              <w:rPr>
-                <w:b w:val="0"/>
-                <w:sz w:val="20"/>
-              </w:rPr>
               <w:t>64</w:t>
-            </w:r>
-          </w:p>
-        </w:tc>
-        <w:tc>
-          <w:tcPr>
-            <w:tcW w:w="1656" w:type="dxa"/>
-            <w:tcBorders>
-              <w:top w:val="single" w:sz="4" w:space="0" w:color="D9D9D9"/>
-              <w:left w:val="single" w:sz="4" w:space="0" w:color="D9D9D9"/>
-              <w:bottom w:val="single" w:sz="4" w:space="0" w:color="D9D9D9"/>
-              <w:right w:val="single" w:sz="4" w:space="0" w:color="D9D9D9"/>
-            </w:tcBorders>
-            <w:shd w:fill="FFFFFF"/>
-            <w:shd w:fill="FFFFFF"/>
-          </w:tcPr>
-          <w:p>
-            <w:pPr>
-              <w:keepNext w:val="0"/>
-              <w:spacing w:before="40" w:after="40"/>
-            </w:pPr>
-            <w:r>
-              <w:rPr>
-                <w:b w:val="0"/>
-                <w:sz w:val="20"/>
-              </w:rPr>
-              <w:t>18</w:t>
-            </w:r>
-          </w:p>
-        </w:tc>
-        <w:tc>
-          <w:tcPr>
-            <w:tcW w:w="1656" w:type="dxa"/>
-            <w:tcBorders>
-              <w:top w:val="single" w:sz="4" w:space="0" w:color="D9D9D9"/>
-              <w:left w:val="single" w:sz="4" w:space="0" w:color="D9D9D9"/>
-              <w:bottom w:val="single" w:sz="4" w:space="0" w:color="D9D9D9"/>
-              <w:right w:val="single" w:sz="4" w:space="0" w:color="D9D9D9"/>
-            </w:tcBorders>
-            <w:shd w:fill="FFFFFF"/>
-            <w:shd w:fill="FFFFFF"/>
-          </w:tcPr>
-          <w:p>
-            <w:pPr>
-              <w:keepNext w:val="0"/>
-              <w:spacing w:before="40" w:after="40"/>
-            </w:pPr>
-            <w:r>
-              <w:rPr>
-                <w:b w:val="0"/>
-                <w:sz w:val="20"/>
-              </w:rPr>
-              <w:t>21</w:t>
-            </w:r>
-          </w:p>
-        </w:tc>
-        <w:tc>
-          <w:tcPr>
-            <w:tcW w:w="1656" w:type="dxa"/>
-            <w:tcBorders>
-              <w:top w:val="single" w:sz="4" w:space="0" w:color="D9D9D9"/>
-              <w:left w:val="single" w:sz="4" w:space="0" w:color="D9D9D9"/>
-              <w:bottom w:val="single" w:sz="4" w:space="0" w:color="D9D9D9"/>
-              <w:right w:val="single" w:sz="4" w:space="0" w:color="D9D9D9"/>
-            </w:tcBorders>
-            <w:shd w:fill="FFFFFF"/>
-            <w:shd w:fill="FFFFFF"/>
-          </w:tcPr>
-          <w:p>
-            <w:pPr>
-              <w:keepNext w:val="0"/>
-              <w:spacing w:before="40" w:after="40"/>
-            </w:pPr>
-            <w:r>
-              <w:rPr>
-                <w:b w:val="0"/>
-                <w:sz w:val="20"/>
-              </w:rPr>
-              <w:t>true</w:t>
             </w:r>
           </w:p>
         </w:tc>
@@ -1972,7 +1436,7 @@
         <w:spacing w:after="100" w:before="0"/>
       </w:pPr>
       <w:r>
-        <w:t>本次比較 float、double、long double，不納入 __float128。測試採用預設的「最接近值」捨入方式，並關閉 fast-math。</w:t>
+        <w:t>本次比較 float、double、long double，不納入 __float128。除 Q3 開啟 fast-math 的對照及 Q4 捨入模式測試外，採最接近值捨入，並關閉 fast-math。</w:t>
       </w:r>
     </w:p>
     <w:p>
@@ -1998,7 +1462,7 @@
         </w:rPr>
       </w:pPr>
       <w:r>
-        <w:t>實驗方法</w:t>
+        <w:t>速度比較</w:t>
       </w:r>
     </w:p>
     <w:p>
@@ -2009,7 +1473,7 @@
         </w:rPr>
       </w:pPr>
       <w:r>
-        <w:t>比較 float、double、long double 做加減、乘法與除法的速度。每種運算測兩種方式：「連續計算」每一步使用上一步的答案；「四組並行」則交替計算四組互不依賴的數值，讓 CPU 有機會同時處理。三種型態使用相同輸入與運算次數。</w:t>
+        <w:t>三種型態以相同輸入做加減、乘法與除法。「連續計算」每一步使用上一步的答案；「四組並行」交替計算四組互不依賴的值，讓 CPU 有機會重疊處理。每組暖機 2 次，再計時 7 次，每次 5,000,000 回合，取中位數。</w:t>
       </w:r>
     </w:p>
     <w:p>
@@ -2020,18 +1484,7 @@
         </w:rPr>
       </w:pPr>
       <w:r>
-        <w:t>每組先跑 2 次暖機，再計時 7 次，每次重複 5,000,000 回合。總時間除以實際算術次數，得到每次運算的奈秒數（ns/op），取 7 次的中位數；數字越小越快。</w:t>
-      </w:r>
-    </w:p>
-    <w:p>
-      <w:pPr>
-        <w:spacing w:after="100" w:before="0"/>
-        <w:rPr>
-          <w:lang w:eastAsia="zh-TW"/>
-        </w:rPr>
-      </w:pPr>
-      <w:r>
-        <w:t>程式保留最後答案並輸出檢查值，加入限制以免編譯器直接刪掉待測計算。編譯後也檢查 CPU 指令，確認運算仍在迴圈內。計時包含迴圈等成本，所以這是程式的平均速度。</w:t>
+        <w:t>一回合分別包含 2 或 8 次算術運算；總耗時除以算術次數得到 ns/op（奈秒／次），越小越快。程式保存並檢查最後答案，待測函式分開編譯、停用跨檔最佳化與向量化，再檢查 CPU 指令確認迴圈未被刪掉。時間包含迴圈等成本。</w:t>
       </w:r>
     </w:p>
     <w:p>
@@ -2046,17 +1499,7 @@
         <w:br/>
         <w:t>執行：./build/q1-scalar/q1_benchmark --iterations 5000000 --repeats 7 --warmup 2 --seed 20261004</w:t>
         <w:br/>
-        <w:t>旗標：-std=c++20 -O3 -fno-fast-math -ffp-contract=off -fno-lto -fno-tree-vectorize</w:t>
-      </w:r>
-    </w:p>
-    <w:p>
-      <w:pPr>
-        <w:pStyle w:val="21"/>
-        <w:pageBreakBefore w:val="0"/>
-        <w:spacing w:after="100"/>
-      </w:pPr>
-      <w:r>
-        <w:t>測試結果</w:t>
+        <w:t>參數：-std=c++20 -O3 -Wall -Wextra -fno-fast-math -ffp-contract=off -fno-lto -fno-tree-vectorize</w:t>
       </w:r>
     </w:p>
     <w:p>
@@ -2064,7 +1507,7 @@
         <w:spacing w:after="100" w:before="0"/>
       </w:pPr>
       <w:r>
-        <w:t>以下為實測的每次運算時間，單位 ns/op。完整計時記錄保存在 q1-timing-and-precision.txt。</w:t>
+        <w:t>下表為每次運算時間（ns/op）；原始 126 筆計時樣本及摘要均已保存。</w:t>
       </w:r>
     </w:p>
     <w:tbl>
@@ -2072,6 +1515,14 @@
         <w:tblW w:type="auto" w:w="0"/>
         <w:tblLayout w:type="fixed"/>
         <w:tblLook w:firstColumn="1" w:firstRow="1" w:lastColumn="0" w:lastRow="0" w:noHBand="0" w:noVBand="1" w:val="04A0"/>
+        <w:tblBorders>
+          <w:top w:val="single" w:sz="4" w:color="D9D9D9"/>
+          <w:left w:val="single" w:sz="4" w:color="D9D9D9"/>
+          <w:bottom w:val="single" w:sz="4" w:color="D9D9D9"/>
+          <w:right w:val="single" w:sz="4" w:color="D9D9D9"/>
+          <w:insideH w:val="single" w:sz="4" w:color="D9D9D9"/>
+          <w:insideV w:val="single" w:sz="4" w:color="D9D9D9"/>
+        </w:tblBorders>
       </w:tblPr>
       <w:tblGrid>
         <w:gridCol w:w="1584"/>
@@ -2098,6 +1549,7 @@
             <w:r>
               <w:rPr>
                 <w:b/>
+                <w:color w:val="000000"/>
                 <w:sz w:val="20"/>
               </w:rPr>
               <w:t>運算</w:t>
@@ -2117,6 +1569,7 @@
             <w:r>
               <w:rPr>
                 <w:b/>
+                <w:color w:val="000000"/>
                 <w:sz w:val="20"/>
               </w:rPr>
               <w:t>模式</w:t>
@@ -2136,6 +1589,7 @@
             <w:r>
               <w:rPr>
                 <w:b/>
+                <w:color w:val="000000"/>
                 <w:sz w:val="20"/>
               </w:rPr>
               <w:t>float</w:t>
@@ -2155,6 +1609,7 @@
             <w:r>
               <w:rPr>
                 <w:b/>
+                <w:color w:val="000000"/>
                 <w:sz w:val="20"/>
               </w:rPr>
               <w:t>double</w:t>
@@ -2174,6 +1629,7 @@
             <w:r>
               <w:rPr>
                 <w:b/>
+                <w:color w:val="000000"/>
                 <w:sz w:val="20"/>
               </w:rPr>
               <w:t>long double</w:t>
@@ -2846,7 +2302,7 @@
         </w:rPr>
       </w:pPr>
       <w:r>
-        <w:t>連續乘法的三種型態都約為 0.86 ns/op，速度相近；連續除法則是 float 最快、long double 最慢。四組並行的除法都更快，表示互不依賴的計算可以提高處理效率。CPU 指令也顯示 float、double 使用 SSE 浮點指令，long double 使用較舊的 x87 指令；不同指令的處理方式會影響速度，不能只用型態大小判斷。[4]</w:t>
+        <w:t>連續乘法三種型態都約 0.86 ns/op；連續除法則為 2.333、3.000、3.327 ns/op，float 最快。四組並行除法降至 0.618、0.828、0.923 ns/op，符合獨立運算能重疊處理的預期。指令顯示 float、double 使用 SSE，long double 使用 x87；不同型態與運算走不同指令，所以速度不能只由儲存大小推論。[4]</w:t>
       </w:r>
     </w:p>
     <w:p>
@@ -2859,7 +2315,7 @@
         </w:rPr>
       </w:pPr>
       <w:r>
-        <w:t>精度測試</w:t>
+        <w:t>大數加總的精度差異</w:t>
       </w:r>
     </w:p>
     <w:p>
@@ -2870,7 +2326,7 @@
         </w:rPr>
       </w:pPr>
       <w:r>
-        <w:t>另外準備 10,000 組 [大數, 1, -大數]，大數分別取 2^24 與 2^53。用 --precision-only 正序與反序加總，數學答案都是 10,000；比較實際答案是否相同，以及與 10,000 相差多少。</w:t>
+        <w:t>另外將 [大數, 1, -大數] 重複 10,000 組，分別正序、反序加總；大數取 2^24 與 2^53，數學答案都是 10,000。以同一執行檔加上 --precision-only 可重跑。</w:t>
       </w:r>
     </w:p>
     <w:tbl>
@@ -2878,6 +2334,14 @@
         <w:tblW w:type="auto" w:w="0"/>
         <w:tblLayout w:type="fixed"/>
         <w:tblLook w:firstColumn="1" w:firstRow="1" w:lastColumn="0" w:lastRow="0" w:noHBand="0" w:noVBand="1" w:val="04A0"/>
+        <w:tblBorders>
+          <w:top w:val="single" w:sz="4" w:color="D9D9D9"/>
+          <w:left w:val="single" w:sz="4" w:color="D9D9D9"/>
+          <w:bottom w:val="single" w:sz="4" w:color="D9D9D9"/>
+          <w:right w:val="single" w:sz="4" w:color="D9D9D9"/>
+          <w:insideH w:val="single" w:sz="4" w:color="D9D9D9"/>
+          <w:insideV w:val="single" w:sz="4" w:color="D9D9D9"/>
+        </w:tblBorders>
       </w:tblPr>
       <w:tblGrid>
         <w:gridCol w:w="1872"/>
@@ -2904,6 +2368,7 @@
             <w:r>
               <w:rPr>
                 <w:b/>
+                <w:color w:val="000000"/>
                 <w:sz w:val="20"/>
               </w:rPr>
               <w:t>型態</w:t>
@@ -2923,6 +2388,7 @@
             <w:r>
               <w:rPr>
                 <w:b/>
+                <w:color w:val="000000"/>
                 <w:sz w:val="20"/>
               </w:rPr>
               <w:t>大數</w:t>
@@ -2942,6 +2408,7 @@
             <w:r>
               <w:rPr>
                 <w:b/>
+                <w:color w:val="000000"/>
                 <w:sz w:val="20"/>
               </w:rPr>
               <w:t>正序結果</w:t>
@@ -2961,6 +2428,7 @@
             <w:r>
               <w:rPr>
                 <w:b/>
+                <w:color w:val="000000"/>
                 <w:sz w:val="20"/>
               </w:rPr>
               <w:t>反序結果</w:t>
@@ -2980,6 +2448,7 @@
             <w:r>
               <w:rPr>
                 <w:b/>
+                <w:color w:val="000000"/>
                 <w:sz w:val="20"/>
               </w:rPr>
               <w:t>絕對誤差 正／反</w:t>
@@ -3598,7 +3067,7 @@
         <w:spacing w:after="100" w:before="0"/>
       </w:pPr>
       <w:r>
-        <w:t>浮點數以「正負號、指數、有效數字」儲存。指數決定數值大小，有效數字決定精度。float、double 分別有 24、53 個二進位有效位數；WSL 的 long double 有 64 個。加法要先對齊兩數的小數位置，再把存不下的部分捨入；因此大數加上小數時，小數可能消失。[3][4]</w:t>
+        <w:t>硬體以正負號、指數、有效數字儲存浮點數。float 的配置為 1／8／23 位，double 為 1／11／52 位；一般非零值還有隱含的最高位，所以有效位數為 24／53。x87 的 80 位元格式則有 1 位符號、15 位指數、64 位有效數字。加減先對齊指數，再捨入至可保存的位數；乘除也需調整指數與捨入。因此大數加上 1 時，這個增量可能存不下。[3][4]</w:t>
       </w:r>
     </w:p>
     <w:p>
@@ -3609,7 +3078,7 @@
         </w:rPr>
       </w:pPr>
       <w:r>
-        <w:t>實測中，float 在 2^24 的正序加總得到 0，反序得到 10,000；double 在 2^53 也出現相同差異。long double 在兩個案例都得到 10,000。這表示較高精度能保留這些小增量，但加總順序仍是需要注意的因素。</w:t>
+        <w:t>float 在 2^24 正序得到 0，反序得到 10,000；double 在 2^53 也出現相同差異。WSL long double 在兩案例都得到 10,000。這些輸出顯示精度與加總順序都會影響答案；float 在 2^53 甚至兩種順序都失去增量。</w:t>
       </w:r>
     </w:p>
     <w:p>
@@ -3633,21 +3102,12 @@
         </w:rPr>
       </w:pPr>
       <w:r>
-        <w:t>選用 std::sqrt，功能是求平方根。C++ 提供 float、double、long double 版本；整數輸入使用 double。負數沒有實數平方根，會依函式庫的錯誤處理規則回報錯誤。[1][5]</w:t>
+        <w:t>選用 &lt;cmath&gt; 的 std::sqrt。C++20 提供 float、double、long double 版本，回傳型態對應輸入型態；整數輸入使用 double，程式以 static_assert 核對。函式求非負平方根；負有限值屬於定義域錯誤，錯誤回報依 math_errhandling 決定。規格並未要求一定呼叫函式庫或使用特定 CPU 指令。[1][5]</w:t>
       </w:r>
     </w:p>
     <w:p>
       <w:pPr>
-        <w:pStyle w:val="21"/>
-        <w:pageBreakBefore w:val="0"/>
-        <w:spacing w:after="100"/>
-      </w:pPr>
-      <w:r>
-        <w:t>實驗方法</w:t>
-      </w:r>
-    </w:p>
-    <w:p>
-      <w:pPr>
+        <w:keepNext w:val="0"/>
         <w:keepLines/>
         <w:spacing w:after="100" w:before="0"/>
       </w:pPr>
@@ -3667,17 +3127,7 @@
         <w:spacing w:after="100" w:before="0"/>
       </w:pPr>
       <w:r>
-        <w:t>用 bash scripts/build_all.sh 編譯兩版：一般呼叫，以及強制呼叫數學函式庫的版本。執行 ./build/all/q2_cmath 2 和 ./build/all/q2_libm 2，測試 4、2、-1、-0 等值，比較答案與錯誤紀錄，再檢查平方根是由 CPU 指令還是函式庫處理。兩版共用 -O2 -fno-fast-math -frounding-math -ffp-contract=off -fno-lto；函式庫版另加 -DHW2_FORCE_LIBM=1。</w:t>
-      </w:r>
-    </w:p>
-    <w:p>
-      <w:pPr>
-        <w:pStyle w:val="21"/>
-        <w:pageBreakBefore w:val="0"/>
-        <w:spacing w:after="100"/>
-      </w:pPr>
-      <w:r>
-        <w:t>測試結果與本機實作</w:t>
+        <w:t>使用 bash scripts/build_all.sh 編譯一般版本與強制呼叫數學函式庫的版本，執行 ./build/all/q2_cmath 2、./build/all/q2_libm 2，比較 4、2、-1、±0 等輸入。兩版共用 -std=c++20 -O2 -Wall -Wextra -fno-lto -ffp-contract=off -fno-fast-math -frounding-math；函式庫版另加 -DHW2_FORCE_LIBM=1，透過函式指標呼叫 sqrtf／sqrt／sqrtl。</w:t>
       </w:r>
     </w:p>
     <w:p>
@@ -3685,58 +3135,28 @@
         <w:spacing w:after="100" w:before="0"/>
       </w:pPr>
       <w:r>
-        <w:t>兩版共 30 組輸入與型態，答案和錯誤紀錄全部相同。sqrt(4)=2，能精確表示；sqrt(2) 只能保留近似值；sqrt(-1) 得到 NaN（不是有效數值），並回報錯誤；sqrt(-0) 保留負號。本機的一般版本使用下表的 CPU 平方根指令，負數則交給函式庫處理；強制呼叫函式庫後，內部也使用硬體平方根指令。</w:t>
+        <w:t>本機一般版本直接使用 SQRTSS、SQRTSD、FSQRT；遇負數則轉交函式庫。強制呼叫函式庫後，實際 glibc 的有限值實作仍包含相同硬體指令。以下為保存的 assembly 關鍵行，分別來自 q2-default.s 與 q2-libm-address-ranges.disasm.txt：</w:t>
       </w:r>
     </w:p>
     <w:p>
       <w:pPr>
-        <w:keepNext/>
+        <w:keepNext w:val="0"/>
         <w:spacing w:after="80"/>
       </w:pPr>
       <w:r>
-        <w:drawing>
-          <wp:inline xmlns:a="http://schemas.openxmlformats.org/drawingml/2006/main" xmlns:pic="http://schemas.openxmlformats.org/drawingml/2006/picture">
-            <wp:extent cx="4389120" cy="2785829"/>
-            <wp:docPr id="9" name="Picture 9"/>
-            <wp:cNvGraphicFramePr>
-              <a:graphicFrameLocks noChangeAspect="1"/>
-            </wp:cNvGraphicFramePr>
-            <a:graphic>
-              <a:graphicData uri="http://schemas.openxmlformats.org/drawingml/2006/picture">
-                <pic:pic>
-                  <pic:nvPicPr>
-                    <pic:cNvPr id="0" name="Screenshot 2026-10-04 202449.png"/>
-                    <pic:cNvPicPr/>
-                  </pic:nvPicPr>
-                  <pic:blipFill>
-                    <a:blip r:embed="rId16"/>
-                    <a:stretch>
-                      <a:fillRect/>
-                    </a:stretch>
-                  </pic:blipFill>
-                  <pic:spPr>
-                    <a:xfrm>
-                      <a:off x="0" y="0"/>
-                      <a:ext cx="4389120" cy="2785829"/>
-                    </a:xfrm>
-                    <a:prstGeom prst="rect"/>
-                  </pic:spPr>
-                </pic:pic>
-              </a:graphicData>
-            </a:graphic>
-          </wp:inline>
-        </w:drawing>
-      </w:r>
-    </w:p>
-    <w:p>
-      <w:pPr>
-        <w:spacing w:after="100" w:before="0"/>
-      </w:pPr>
-      <w:r>
         <w:rPr>
-          <w:sz w:val="18"/>
+          <w:rFonts w:ascii="Consolas" w:hAnsi="Consolas"/>
+          <w:sz w:val="20"/>
         </w:rPr>
-        <w:t>圖 2-1 編譯後仍可看到平方根指令；另一版本呼叫函式庫。</w:t>
+        <w:t>一般呼叫：float → sqrtss；double → sqrtsd；long double → fsqrt</w:t>
+        <w:br/>
+        <w:t>libm 的 __sqrt_finite（double）：</w:t>
+        <w:br/>
+        <w:t xml:space="preserve">    sqrtsd %xmm0, %xmm0</w:t>
+        <w:br/>
+        <w:t xml:space="preserve">    ret</w:t>
+        <w:br/>
+        <w:t>libm 的 __sqrtl_finite（long double）：fsqrt</w:t>
       </w:r>
     </w:p>
     <w:tbl>
@@ -3779,6 +3199,7 @@
             <w:r>
               <w:rPr>
                 <w:b/>
+                <w:color w:val="000000"/>
                 <w:sz w:val="20"/>
               </w:rPr>
               <w:t>型態</w:t>
@@ -3793,6 +3214,10 @@
           </w:tcPr>
           <w:p>
             <w:r>
+              <w:rPr>
+                <w:b/>
+                <w:color w:val="000000"/>
+              </w:rPr>
               <w:t>CPU 指令／負數處理</w:t>
             </w:r>
           </w:p>
@@ -3811,6 +3236,7 @@
             <w:r>
               <w:rPr>
                 <w:b/>
+                <w:color w:val="000000"/>
                 <w:sz w:val="20"/>
               </w:rPr>
               <w:t>sqrt(2) 實測</w:t>
@@ -4018,8 +3444,14 @@
       </w:tr>
     </w:tbl>
     <w:p>
+      <w:pPr>
+        <w:keepNext w:val="0"/>
+      </w:pPr>
       <w:r>
-        <w:t>這台機器的關鍵做法是直接使用硬體平方根指令，不是以 sin 等函數常見的方式縮小角度範圍。作為軟體演算法參考，glibc 的通用 sqrt 程式會先調整數值大小，查表取得「平方根倒數」的初步估計，再用多項式修正與誤差補償提高精度，最後捨入。這份通用原始碼只用來理解軟體算法，不能當作本機實際執行的路徑。[5a]</w:t>
+        <w:t>兩版共 30 組輸入／型態，數值與錯誤紀錄全部一致。sqrt(4)=2，能精確表示；sqrt(2) 只能近似；sqrt(-1) 得到 NaN，errno=33 且 FE_INVALID=true；sqrt(-0) 保留負號。表中保留 sqrt(2) 的精度差異。</w:t>
+        <w:br/>
+        <w:br/>
+        <w:t>硬體路徑將平方根計算交給 CPU；反組譯不能證明 CPU 內部採哪種迭代算法。作為軟體實作參考，glibc 的通用 double sqrt 先將 x 拆成 s×2^(2k)，把 s 調整至約 [0.5,2)，查表估計 t≈1/√s，再以 e=1-s×t² 和多項式修正 t。接著算 s×t、補償誤差、檢查乘積以決定捨入，最後乘回 2^k；極小值先放大再計算。這份原始碼未匹配本機套件版本，僅作算法參考，本機執行路徑由上述硬體指令證明。[5a]</w:t>
       </w:r>
     </w:p>
     <w:p>
@@ -4040,20 +3472,7 @@
         </w:rPr>
       </w:pPr>
       <w:r>
-        <w:t>-ffast-math 讓編譯器用較寬鬆的浮點數規則換取最佳化機會，例如改變加法順序、假設沒有 NaN 或無窮大，並放寬負零、錯誤回報與捨入模式的處理。浮點數每一步都可能捨入，所以改變順序可能改變答案。[2]</w:t>
-      </w:r>
-    </w:p>
-    <w:p>
-      <w:pPr>
-        <w:pStyle w:val="21"/>
-        <w:pageBreakBefore w:val="0"/>
-        <w:spacing w:after="100"/>
-        <w:rPr>
-          <w:lang w:eastAsia="zh-TW"/>
-        </w:rPr>
-      </w:pPr>
-      <w:r>
-        <w:t>實驗方法</w:t>
+        <w:t>-ffast-math 放寬編譯器必須保留的浮點數行為，例如允許改變加法順序、假定沒有 NaN 或無窮大，並放寬負零、errno 與動態捨入的要求，以增加最佳化機會。IEEE 754 浮點數每一步都可能捨入，不能像實數一樣任意交換括號。[2]</w:t>
       </w:r>
     </w:p>
     <w:p>
@@ -4064,7 +3483,7 @@
         </w:rPr>
       </w:pPr>
       <w:r>
-        <w:t>同一程式編譯兩次，一版關閉 fast-math，一版開啟；其他參數相同：-std=c++20 -O3 -fno-lto -ffp-contract=off。兩版都輸入 a=1e16、b=-1e16、c=1，比較 (a+b)+c 與 a+(b+c)，也測試 NaN 是否會滿足 x!=x。輸入在執行時提供，避免編譯器預先算出答案。</w:t>
+        <w:t>同一程式僅切換 -fno-fast-math／-ffast-math，其他參數相同：-std=c++20 -O3 -Wall -Wextra -fno-lto -ffp-contract=off。兩版都在執行時輸入 a=1e16、b=-1e16、c=1，比較 (a+b)+c 與 a+(b+c)，另外測 NaN 的 x!=x。</w:t>
       </w:r>
     </w:p>
     <w:p>
@@ -4080,16 +3499,6 @@
         <w:t>執行：./build/all/q3_strict 1e16 -1e16 1</w:t>
         <w:br/>
         <w:t xml:space="preserve">      ./build/all/q3_fast 1e16 -1e16 1</w:t>
-      </w:r>
-    </w:p>
-    <w:p>
-      <w:pPr>
-        <w:pStyle w:val="21"/>
-        <w:pageBreakBefore w:val="0"/>
-        <w:spacing w:after="100"/>
-      </w:pPr>
-      <w:r>
-        <w:t>測試結果</w:t>
       </w:r>
     </w:p>
     <w:tbl>
@@ -4132,6 +3541,7 @@
             <w:r>
               <w:rPr>
                 <w:b/>
+                <w:color w:val="000000"/>
                 <w:sz w:val="20"/>
               </w:rPr>
               <w:t>觀察</w:t>
@@ -4146,6 +3556,10 @@
           </w:tcPr>
           <w:p>
             <w:r>
+              <w:rPr>
+                <w:b/>
+                <w:color w:val="000000"/>
+              </w:rPr>
               <w:t>關閉 fast-math</w:t>
             </w:r>
           </w:p>
@@ -4158,6 +3572,10 @@
           </w:tcPr>
           <w:p>
             <w:r>
+              <w:rPr>
+                <w:b/>
+                <w:color w:val="000000"/>
+              </w:rPr>
               <w:t>開啟 fast-math</w:t>
             </w:r>
           </w:p>
@@ -4485,7 +3903,7 @@
         </w:rPr>
       </w:pPr>
       <w:r>
-        <w:t>關閉 fast-math 時，(a+b)+c 先把兩個大數抵消，再加 1，得到 1；a+(b+c) 則先算 -1e16+1，這個 1 因精度不足而消失，最後得到 0。開啟後，編譯器改變了第一式的計算順序，兩式都得到 0；NaN 的判斷也由 true 變為 false。只有 fast-math 選項不同就改變答案，因此需要保留這些行為時，不能直接開啟它。[2]</w:t>
+        <w:t>關閉時，(a+b)+c 先抵消大數再加 1，得到 1；a+(b+c) 先算 -1e16+1，增量因精度不足而消失，最後得到 0。開啟後第一式也變成 0；assembly 顯示它先算 b+c，再加 a。NaN 的判斷也由 true 變為 false。這個例子只改 fast-math 就改變答案，使用前必須確認程式能接受這些行為。[2]</w:t>
       </w:r>
     </w:p>
     <w:p>
@@ -4503,26 +3921,13 @@
     </w:p>
     <w:p>
       <w:pPr>
-        <w:pStyle w:val="21"/>
-        <w:pageBreakBefore w:val="0"/>
-        <w:spacing w:after="100"/>
-        <w:rPr>
-          <w:lang w:eastAsia="zh-TW"/>
-        </w:rPr>
-      </w:pPr>
-      <w:r>
-        <w:t>實驗方法</w:t>
-      </w:r>
-    </w:p>
-    <w:p>
-      <w:pPr>
         <w:spacing w:after="100" w:before="0"/>
         <w:rPr>
           <w:lang w:eastAsia="zh-TW"/>
         </w:rPr>
       </w:pPr>
       <w:r>
-        <w:t>測試 printf("%.9f") 與 std::fixed &lt;&lt; std::setprecision(9)。選 1/1024=0.0009765625：它能被 double 精確儲存，剛好位於第九位小數進位與不進位的中間。再測它兩側最接近的浮點值與負值，並切換四種捨入方式，觀察兩種輸出是否一致。</w:t>
+        <w:t>若「四捨五入」指中點一律進位，這個說法不精確。測試 printf("%.9f") 與 std::fixed &lt;&lt; std::setprecision(9)，選用可被 double 精確儲存的 1/1024=0.0009765625；它正好位於九位小數的中點，不混入字面值轉換誤差。再測兩側鄰近值、負值與四種捨入方式。</w:t>
       </w:r>
     </w:p>
     <w:p>
@@ -4589,6 +3994,7 @@
             <w:r>
               <w:rPr>
                 <w:b/>
+                <w:color w:val="000000"/>
                 <w:sz w:val="20"/>
               </w:rPr>
               <w:t>模式</w:t>
@@ -4603,6 +4009,10 @@
           </w:tcPr>
           <w:p>
             <w:r>
+              <w:rPr>
+                <w:b/>
+                <w:color w:val="000000"/>
+              </w:rPr>
               <w:t>正中點：兩種輸出</w:t>
             </w:r>
           </w:p>
@@ -4615,6 +4025,10 @@
           </w:tcPr>
           <w:p>
             <w:r>
+              <w:rPr>
+                <w:b/>
+                <w:color w:val="000000"/>
+              </w:rPr>
               <w:t>負中點：兩種輸出</w:t>
             </w:r>
           </w:p>
@@ -4863,7 +4277,7 @@
         <w:spacing w:after="100" w:before="0"/>
       </w:pPr>
       <w:r>
-        <w:t>預設的「最接近值」模式下，兩種輸出都得到 0.000976562，最後的 5 沒有使第九位進位。中點兩側的值則分別輸出 0.000976562、0.000976563。四種模式共 16 組測試，兩種輸出的結果全部相同。</w:t>
+        <w:t>在最接近值模式下，兩種輸出都是 0.000976562，第十位的 5 沒有讓第九位進位，已構成反例。兩側鄰近值分別輸出 0.000976562、0.000976563；四模式共 16 組比較，兩種輸出均一致。</w:t>
       </w:r>
     </w:p>
     <w:p>
@@ -4925,7 +4339,7 @@
         </w:rPr>
       </w:pPr>
       <w:r>
-        <w:t>因此，「一定是四捨五入」不夠精確。本機在最接近值模式下，剛好位於中點時選擇末位為偶數的答案；改成向上或向下捨入，輸出也會改變。這兩種寫法是把「實際儲存的值」格式化到九位小數，不保證符合十進位的逢五進一。[5b]</w:t>
+        <w:t>本機中點採末位為偶數的答案，向上／向下捨入則會改變輸出。較精確的描述是「把實際儲存值格式化至九位小數」，不能一概視為原始十進位數的逢五進一。[5b]</w:t>
       </w:r>
     </w:p>
     <w:p>
@@ -4943,26 +4357,13 @@
     </w:p>
     <w:p>
       <w:pPr>
-        <w:pStyle w:val="21"/>
-        <w:pageBreakBefore w:val="0"/>
-        <w:spacing w:after="100"/>
-        <w:rPr>
-          <w:lang w:eastAsia="zh-TW"/>
-        </w:rPr>
-      </w:pPr>
-      <w:r>
-        <w:t>找到的例子與測試方法</w:t>
-      </w:r>
-    </w:p>
-    <w:p>
-      <w:pPr>
         <w:spacing w:after="100" w:before="0"/>
         <w:rPr>
           <w:lang w:eastAsia="zh-TW"/>
         </w:rPr>
       </w:pPr>
       <w:r>
-        <w:t>相同的 long double 算式 (2^53+1)-2^53，在 Windows／WSL 得到 1，在 Mac 得到 0，數學答案是 1。兩台使用相同原始碼、GNU GCC 16.2.0 與相同編譯參數，也都設定為「最接近值」捨入。先執行程式，再用 scripts/verify_q5_pair.py 核對原始碼、編譯器系列、版本與參數，四項皆一致。兩平台的編譯器安裝來源與目標架構不同，完整資訊保存在 results。</w:t>
+        <w:t>同一 long double 算式 (2^53+1)-2^53，在 WSL x86-64 得到 1，在 Apple M4 arm64 得到 0，數學答案是 1。兩台都使用 GNU GCC release 16.2.0、相同來源與逐字相同參數，且計算前設定 FE_TONEAREST。scripts/verify_q5_pair.py 核對原始碼雜湊、編譯器系列、release 與參數，四項皆 MATCH。WSL 為本地建置、Mac 為 Homebrew；這是相同 release 的跨平台編譯器，並非同一份編譯器二進位檔。</w:t>
       </w:r>
     </w:p>
     <w:p>
@@ -5056,6 +4457,14 @@
       <w:tblPr>
         <w:tblW w:type="auto" w:w="0"/>
         <w:tblLook w:firstColumn="1" w:firstRow="1" w:lastColumn="0" w:lastRow="0" w:noHBand="0" w:noVBand="1" w:val="04A0"/>
+        <w:tblBorders>
+          <w:top w:val="single" w:sz="4" w:color="D9D9D9"/>
+          <w:left w:val="single" w:sz="4" w:color="D9D9D9"/>
+          <w:bottom w:val="single" w:sz="4" w:color="D9D9D9"/>
+          <w:right w:val="single" w:sz="4" w:color="D9D9D9"/>
+          <w:insideH w:val="single" w:sz="4" w:color="D9D9D9"/>
+          <w:insideV w:val="single" w:sz="4" w:color="D9D9D9"/>
+        </w:tblBorders>
       </w:tblPr>
       <w:tblGrid>
         <w:gridCol w:w="3312"/>
@@ -5082,6 +4491,7 @@
             <w:r>
               <w:rPr>
                 <w:b/>
+                <w:color w:val="000000"/>
                 <w:sz w:val="20"/>
               </w:rPr>
               <w:t>觀察</w:t>
@@ -5102,6 +4512,7 @@
             <w:r>
               <w:rPr>
                 <w:b/>
+                <w:color w:val="000000"/>
                 <w:sz w:val="20"/>
               </w:rPr>
               <w:t xml:space="preserve">Windows／WSL </w:t>
@@ -5122,6 +4533,7 @@
             <w:r>
               <w:rPr>
                 <w:b/>
+                <w:color w:val="000000"/>
                 <w:sz w:val="20"/>
               </w:rPr>
               <w:t xml:space="preserve">Apple M4 Mac </w:t>
@@ -5415,7 +4827,7 @@
         <w:spacing w:after="100" w:before="0"/>
       </w:pPr>
       <w:r>
-        <w:t>兩台編譯後都保留加法、儲存與減法，待測計算沒有被刪掉。程式使用有限數值，沒有溢位、越界或未初始化讀取；上面的 asm 是 GCC 支援的擴充，用來要求中間答案存回記憶體。</w:t>
+        <w:t>兩端 assembly 都保留加法、存回與減法：WSL 為 FADD／FSTPT／FLDT／FSUBP，Mac 為 FADD／STR／LDR／FSUB。asm 是 GCC 支援的擴充，要求中間答案存回平台的 long double。輸入有限，沒有溢位、越界或未初始化讀取，差異來自平台規定的精度。</w:t>
       </w:r>
     </w:p>
     <w:p>
@@ -5426,13 +4838,13 @@
         </w:rPr>
       </w:pPr>
       <w:r>
-        <w:t>差異來自兩平台對 long double 的規定。WSL 有 64 個有效位，存得下 2^53+1，所以減回得到 1。Mac 只有 53 個有效位，這個大小附近只能以 2 為間隔表示數值；2^53+1 在中間，捨入後變回 2^53，所以減回得到 0。Apple 的 ARM64 平台規定 long double 與 double 同樣精度，與實測吻合。[6] 這就是相同程式、相同編譯器版本與參數，仍因執行平台不同而得到不同答案的例子。</w:t>
+        <w:t>WSL 有 64 個有效位，能保留 2^53+1，減回得到 1；Mac 只有 53 個有效位，2^53 附近的可表示值間隔為 2，+1 恰為中點，捨入回 2^53 後減回得到 0。這與 Apple arm64 ABI 規定 long double 與 double 同精度吻合。[6] 型態參數、輸出及保留的算術指令共同支持這個平台差異。</w:t>
       </w:r>
     </w:p>
     <w:p>
       <w:pPr>
         <w:pStyle w:val="1"/>
-        <w:pageBreakBefore/>
+        <w:pageBreakBefore w:val="0"/>
         <w:spacing w:after="100"/>
         <w:rPr>
           <w:lang w:eastAsia="zh-TW"/>
@@ -5444,39 +4856,42 @@
     </w:p>
     <w:p>
       <w:pPr>
+        <w:keepNext w:val="0"/>
         <w:spacing w:after="100" w:before="0"/>
         <w:rPr>
           <w:lang w:eastAsia="zh-TW"/>
         </w:rPr>
       </w:pPr>
       <w:r>
-        <w:t>這些實驗讓我把安全性視為誤差與重現要求：Q1 顯示需按值域選精度，速度要實測；Q2 顯示規格、函式庫与硬體是不同層次；Q3 顯示 fast-math 會改答案；Q4 顯示短輸出可能遮住儲存值與捨入規則；Q5 顯示 long double 名稱相同仍可能有不同精度。科學計算或碰撞判定應先訂誤差容忍度，再選演算法；比較值時依用途使用絕對／相對容差，診斷時保留 max_digits10 或 hexfloat。</w:t>
+        <w:t>浮點數能用於科學計算與物理碰撞，但要先決定可接受的誤差。Q1 顯示精度、加總順序與運算種類會影響答案及速度；Q2 確認 std::sqrt 在本機可走硬體指令；Q3 顯示 fast-math 可能改答案；Q4 的九位小數輸出不等於逢五進一；Q5 則證明相同 long double 名稱在兩平台可有不同精度。實作時應依值域選型態、依用途設定絕對或相對誤差容忍度，並保留足夠位數供檢查；跨平台時也要核對型態規格。</w:t>
       </w:r>
     </w:p>
     <w:p>
       <w:pPr>
+        <w:keepNext w:val="0"/>
         <w:spacing w:after="100" w:before="0"/>
         <w:rPr>
           <w:lang w:eastAsia="zh-TW"/>
         </w:rPr>
       </w:pPr>
       <w:r>
-        <w:t>我另測 gradual underflow，回答「結果是 subnormal 是否就一定觸發 underflow？」測三算式 min_normal×0.5、denorm_min×0.5、denorm_min×1，記錄分類與 FE_UNDERFLOW／FE_INEXACT。</w:t>
+        <w:t>前面未討論的細節是接近零時的 subnormal（非正規數）：它讓數值低於一般最小正數後仍可逐漸接近零，稱為 gradual underflow，但有效精度會下降。以最小一般正數 min_normal、最小 subnormal denorm_min 做以下三組乘法，檢查結果及 underflow／inexact（不精確）旗標。</w:t>
       </w:r>
     </w:p>
     <w:p>
       <w:pPr>
+        <w:keepNext w:val="0"/>
         <w:spacing w:after="100" w:before="0"/>
         <w:rPr>
           <w:lang w:eastAsia="zh-TW"/>
         </w:rPr>
       </w:pPr>
       <w:r>
-        <w:t>來源：experiments/q6_extra/main.cpp、operations.cpp。</w:t>
+        <w:t>程式：experiments/q6_extra/main.cpp、operations.cpp。</w:t>
         <w:br/>
-        <w:t>編譯：bash scripts/build_all.sh；執行：./build/all/q6_extra。</w:t>
+        <w:t>建置：bash scripts/build_all.sh；執行：./build/all/q6_extra。</w:t>
         <w:br/>
-        <w:t>nearest 下讀到 MXCSR=0x1f80、FTZ／DAZ=false；未更動其設定。</w:t>
+        <w:t>本次採最接近值模式；讀到 SSE 的 FTZ／DAZ=false，未更動設定。這項紀錄不代表 x87 的控制狀態。</w:t>
       </w:r>
     </w:p>
     <w:tbl>
@@ -5484,6 +4899,14 @@
         <w:tblW w:type="auto" w:w="0"/>
         <w:tblLayout w:type="fixed"/>
         <w:tblLook w:firstColumn="1" w:firstRow="1" w:lastColumn="0" w:lastRow="0" w:noHBand="0" w:noVBand="1" w:val="04A0"/>
+        <w:tblBorders>
+          <w:top w:val="single" w:sz="4" w:color="D9D9D9"/>
+          <w:left w:val="single" w:sz="4" w:color="D9D9D9"/>
+          <w:bottom w:val="single" w:sz="4" w:color="D9D9D9"/>
+          <w:right w:val="single" w:sz="4" w:color="D9D9D9"/>
+          <w:insideH w:val="single" w:sz="4" w:color="D9D9D9"/>
+          <w:insideV w:val="single" w:sz="4" w:color="D9D9D9"/>
+        </w:tblBorders>
       </w:tblPr>
       <w:tblGrid>
         <w:gridCol w:w="3168"/>
@@ -5507,6 +4930,7 @@
             <w:r>
               <w:rPr>
                 <w:b/>
+                <w:color w:val="000000"/>
                 <w:sz w:val="20"/>
               </w:rPr>
               <w:t>算式</w:t>
@@ -5525,6 +4949,7 @@
             <w:r>
               <w:rPr>
                 <w:b/>
+                <w:color w:val="000000"/>
                 <w:sz w:val="20"/>
               </w:rPr>
               <w:t>三型態結果分類</w:t>
@@ -5543,6 +4968,7 @@
             <w:r>
               <w:rPr>
                 <w:b/>
+                <w:color w:val="000000"/>
                 <w:sz w:val="20"/>
               </w:rPr>
               <w:t>UF／inexact</w:t>
@@ -5735,70 +5161,20 @@
     </w:p>
     <w:p>
       <w:pPr>
-        <w:keepNext/>
-        <w:spacing w:after="80"/>
-      </w:pPr>
-      <w:r>
-        <w:drawing>
-          <wp:inline xmlns:a="http://schemas.openxmlformats.org/drawingml/2006/main" xmlns:pic="http://schemas.openxmlformats.org/drawingml/2006/picture">
-            <wp:extent cx="4754880" cy="3918433"/>
-            <wp:docPr id="18" name="Picture 18"/>
-            <wp:cNvGraphicFramePr>
-              <a:graphicFrameLocks noChangeAspect="1"/>
-            </wp:cNvGraphicFramePr>
-            <a:graphic>
-              <a:graphicData uri="http://schemas.openxmlformats.org/drawingml/2006/picture">
-                <pic:pic>
-                  <pic:nvPicPr>
-                    <pic:cNvPr id="0" name="Screenshot 2026-10-04 203307.png"/>
-                    <pic:cNvPicPr/>
-                  </pic:nvPicPr>
-                  <pic:blipFill>
-                    <a:blip r:embed="rId25"/>
-                    <a:stretch>
-                      <a:fillRect/>
-                    </a:stretch>
-                  </pic:blipFill>
-                  <pic:spPr>
-                    <a:xfrm>
-                      <a:off x="0" y="0"/>
-                      <a:ext cx="4754880" cy="3918433"/>
-                    </a:xfrm>
-                    <a:prstGeom prst="rect"/>
-                  </pic:spPr>
-                </pic:pic>
-              </a:graphicData>
-            </a:graphic>
-          </wp:inline>
-        </w:drawing>
-      </w:r>
-    </w:p>
-    <w:p>
-      <w:pPr>
-        <w:spacing w:after="100" w:before="0"/>
-      </w:pPr>
-      <w:r>
-        <w:rPr>
-          <w:sz w:val="18"/>
-        </w:rPr>
-        <w:t>圖 6-1 float 的三個案例；nearest、FTZ／DAZ=false，subnormal 與 exception flags 已區分。</w:t>
-      </w:r>
-    </w:p>
-    <w:p>
-      <w:pPr>
+        <w:keepNext w:val="0"/>
         <w:spacing w:after="100" w:before="0"/>
         <w:rPr>
           <w:lang w:eastAsia="zh-TW"/>
         </w:rPr>
       </w:pPr>
       <w:r>
-        <w:t>三型態結果一致：精確 subnormal 不設 UF／inexact；最小 subnormal 再乘 0.5 捨入為零，兩旗標皆 true；乘 1 則保留。這證明「很小」「subnormal」「underflow exception」是不同判斷。接近零時相對精度下降，flush 設定也需注意；MXCSR 僅支持 SSE 狀態解釋，不能代替 x87 控制字。本次未量測 subnormal 速度。</w:t>
+        <w:t>三種型態的結果一致：精確的 subnormal 不觸發 underflow；最小 subnormal 再乘 0.5 捨入成零，才同時出現 underflow 與 inexact。可見「數值很小」不等於「一定回報 underflow」。接近零時要注意精度下降與將極小值當零的設定；本次未測這類運算的速度。</w:t>
       </w:r>
     </w:p>
     <w:p>
       <w:pPr>
         <w:pStyle w:val="1"/>
-        <w:pageBreakBefore/>
+        <w:pageBreakBefore w:val="0"/>
         <w:spacing w:after="100"/>
         <w:rPr>
           <w:lang w:eastAsia="zh-TW"/>
@@ -5810,13 +5186,14 @@
     </w:p>
     <w:p>
       <w:pPr>
+        <w:keepNext w:val="0"/>
         <w:spacing w:after="100" w:before="0"/>
         <w:rPr>
           <w:lang w:eastAsia="zh-TW"/>
         </w:rPr>
       </w:pPr>
       <w:r>
-        <w:t>學生提供設備資訊，執行 Windows／WSL Q0～Q6、Mac Q5 並截圖。Codex 協助程式、工具鏈設定、來源查閱、預檢、數據整理與分析草稿；學生負責確認結果與理解原因。</w:t>
+        <w:t>學生提供設備資訊，執行 Windows／WSL Q0～Q6 與 Mac Q5、觀察並截圖。Codex 協助程式、環境設定、準備階段測試、資料查閱及報告整理。報告使用正式執行輸出，學生需確認數據並理解解釋。</w:t>
       </w:r>
     </w:p>
     <w:p>
@@ -5837,7 +5214,7 @@
         </w:rPr>
       </w:pPr>
       <w:r>
-        <w:t>規格與原因參考以下文件，本機行為則以測試輸出及 CPU 指令核對。查閱日期：2026/10/04。</w:t>
+        <w:t>規格與算法參考下列資料；執行路徑另以本機輸出及 assembly 核對。查閱日期：2026/10/04；本次整理於 2026/10/05 再核對 [1]、[2]、[5a]、[6]。</w:t>
       </w:r>
     </w:p>
     <w:p>

</xml_diff>

<commit_message>
Polish report narrative and remove experiment-log material
</commit_message>
<xml_diff>
--- a/Floating_Point_Report_Q0.docx
+++ b/Floating_Point_Report_Q0.docx
@@ -124,15 +124,10 @@
             <w:shd w:fill="E8EDF2"/>
           </w:tcPr>
           <w:p>
-            <w:pPr>
-              <w:keepNext/>
-              <w:spacing w:before="40" w:after="40"/>
-            </w:pPr>
             <w:r>
               <w:rPr>
                 <w:b/>
-                <w:color w:val="000000"/>
-                <w:sz w:val="20"/>
+                <w:sz w:val="22"/>
               </w:rPr>
               <w:t>項目</w:t>
             </w:r>
@@ -152,17 +147,12 @@
             <w:shd w:fill="E8EDF2"/>
           </w:tcPr>
           <w:p>
-            <w:pPr>
-              <w:keepNext/>
-              <w:spacing w:before="40" w:after="40"/>
-            </w:pPr>
             <w:r>
               <w:rPr>
                 <w:b/>
-                <w:color w:val="000000"/>
-                <w:sz w:val="20"/>
-              </w:rPr>
-              <w:t>主要平台（實測）</w:t>
+                <w:sz w:val="22"/>
+              </w:rPr>
+              <w:t>主要平台</w:t>
             </w:r>
           </w:p>
         </w:tc>
@@ -180,17 +170,12 @@
             <w:shd w:fill="E8EDF2"/>
           </w:tcPr>
           <w:p>
-            <w:pPr>
-              <w:keepNext/>
-              <w:spacing w:before="40" w:after="40"/>
-            </w:pPr>
             <w:r>
               <w:rPr>
                 <w:b/>
-                <w:color w:val="000000"/>
-                <w:sz w:val="20"/>
-              </w:rPr>
-              <w:t>輔助平台（實測）</w:t>
+                <w:sz w:val="22"/>
+              </w:rPr>
+              <w:t>輔助平台</w:t>
             </w:r>
           </w:p>
         </w:tc>
@@ -213,14 +198,10 @@
             <w:shd w:fill="FFFFFF"/>
           </w:tcPr>
           <w:p>
-            <w:pPr>
-              <w:keepNext/>
-              <w:spacing w:before="40" w:after="40"/>
-            </w:pPr>
             <w:r>
               <w:rPr>
                 <w:b w:val="0"/>
-                <w:sz w:val="20"/>
+                <w:sz w:val="22"/>
               </w:rPr>
               <w:t>裝置</w:t>
             </w:r>
@@ -239,16 +220,12 @@
             <w:shd w:fill="FFFFFF"/>
           </w:tcPr>
           <w:p>
-            <w:pPr>
-              <w:keepNext/>
-              <w:spacing w:before="40" w:after="40"/>
-            </w:pPr>
             <w:r>
               <w:rPr>
                 <w:b w:val="0"/>
-                <w:sz w:val="20"/>
-              </w:rPr>
-              <w:t>ASUS TUF Gaming F16 FX608JMR</w:t>
+                <w:sz w:val="22"/>
+              </w:rPr>
+              <w:t>ASUS TUF Gaming F16</w:t>
             </w:r>
           </w:p>
         </w:tc>
@@ -265,14 +242,10 @@
             <w:shd w:fill="FFFFFF"/>
           </w:tcPr>
           <w:p>
-            <w:pPr>
-              <w:keepNext/>
-              <w:spacing w:before="40" w:after="40"/>
-            </w:pPr>
             <w:r>
               <w:rPr>
                 <w:b w:val="0"/>
-                <w:sz w:val="20"/>
+                <w:sz w:val="22"/>
               </w:rPr>
               <w:t>MacBook Air（2025）</w:t>
             </w:r>
@@ -297,16 +270,12 @@
             <w:shd w:fill="F7F8FA"/>
           </w:tcPr>
           <w:p>
-            <w:pPr>
-              <w:keepNext/>
-              <w:spacing w:before="40" w:after="40"/>
-            </w:pPr>
             <w:r>
               <w:rPr>
                 <w:b w:val="0"/>
-                <w:sz w:val="20"/>
-              </w:rPr>
-              <w:t>處理器</w:t>
+                <w:sz w:val="22"/>
+              </w:rPr>
+              <w:t>CPU／架構</w:t>
             </w:r>
           </w:p>
         </w:tc>
@@ -323,16 +292,12 @@
             <w:shd w:fill="F7F8FA"/>
           </w:tcPr>
           <w:p>
-            <w:pPr>
-              <w:keepNext/>
-              <w:spacing w:before="40" w:after="40"/>
-            </w:pPr>
             <w:r>
               <w:rPr>
                 <w:b w:val="0"/>
-                <w:sz w:val="20"/>
-              </w:rPr>
-              <w:t>Intel Core i7-14650HX</w:t>
+                <w:sz w:val="22"/>
+              </w:rPr>
+              <w:t>Intel Core i7-14650HX／x86-64</w:t>
             </w:r>
           </w:p>
         </w:tc>
@@ -349,16 +314,12 @@
             <w:shd w:fill="F7F8FA"/>
           </w:tcPr>
           <w:p>
-            <w:pPr>
-              <w:keepNext/>
-              <w:spacing w:before="40" w:after="40"/>
-            </w:pPr>
             <w:r>
               <w:rPr>
                 <w:b w:val="0"/>
-                <w:sz w:val="20"/>
-              </w:rPr>
-              <w:t>Apple M4</w:t>
+                <w:sz w:val="22"/>
+              </w:rPr>
+              <w:t>Apple M4／arm64</w:t>
             </w:r>
           </w:p>
         </w:tc>
@@ -381,16 +342,12 @@
             <w:shd w:fill="FFFFFF"/>
           </w:tcPr>
           <w:p>
-            <w:pPr>
-              <w:keepNext/>
-              <w:spacing w:before="40" w:after="40"/>
-            </w:pPr>
             <w:r>
               <w:rPr>
                 <w:b w:val="0"/>
-                <w:sz w:val="20"/>
-              </w:rPr>
-              <w:t>架構／target</w:t>
+                <w:sz w:val="22"/>
+              </w:rPr>
+              <w:t>系統</w:t>
             </w:r>
           </w:p>
         </w:tc>
@@ -407,16 +364,14 @@
             <w:shd w:fill="FFFFFF"/>
           </w:tcPr>
           <w:p>
-            <w:pPr>
-              <w:keepNext/>
-              <w:spacing w:after="40" w:before="40"/>
-            </w:pPr>
             <w:r>
               <w:rPr>
                 <w:b w:val="0"/>
-                <w:sz w:val="20"/>
-              </w:rPr>
-              <w:t>x86_64-pc-linux-gnu</w:t>
+                <w:sz w:val="22"/>
+              </w:rPr>
+              <w:t>Windows 11／WSL2</w:t>
+              <w:br/>
+              <w:t>Ubuntu 26.04.1 LTS</w:t>
             </w:r>
           </w:p>
         </w:tc>
@@ -433,16 +388,12 @@
             <w:shd w:fill="FFFFFF"/>
           </w:tcPr>
           <w:p>
-            <w:pPr>
-              <w:keepNext/>
-              <w:spacing w:before="40" w:after="40"/>
-            </w:pPr>
             <w:r>
               <w:rPr>
                 <w:b w:val="0"/>
-                <w:sz w:val="20"/>
-              </w:rPr>
-              <w:t>aarch64-apple-darwin27</w:t>
+                <w:sz w:val="22"/>
+              </w:rPr>
+              <w:t>macOS 27.0.1</w:t>
             </w:r>
           </w:p>
         </w:tc>
@@ -465,16 +416,12 @@
             <w:shd w:fill="F7F8FA"/>
           </w:tcPr>
           <w:p>
-            <w:pPr>
-              <w:keepNext/>
-              <w:spacing w:before="40" w:after="40"/>
-            </w:pPr>
             <w:r>
               <w:rPr>
                 <w:b w:val="0"/>
-                <w:sz w:val="20"/>
-              </w:rPr>
-              <w:t>主機系統</w:t>
+                <w:sz w:val="22"/>
+              </w:rPr>
+              <w:t>編譯器</w:t>
             </w:r>
           </w:p>
         </w:tc>
@@ -491,18 +438,12 @@
             <w:shd w:fill="F7F8FA"/>
           </w:tcPr>
           <w:p>
-            <w:pPr>
-              <w:keepNext/>
-              <w:spacing w:after="40" w:before="40"/>
-            </w:pPr>
             <w:r>
               <w:rPr>
                 <w:b w:val="0"/>
-                <w:sz w:val="20"/>
-              </w:rPr>
-              <w:t>Windows 11 家用版 25H2</w:t>
-              <w:br/>
-              <w:t>Build 26200.9457</w:t>
+                <w:sz w:val="22"/>
+              </w:rPr>
+              <w:t>GNU GCC 16.2.0（本地建置）</w:t>
             </w:r>
           </w:p>
         </w:tc>
@@ -519,18 +460,12 @@
             <w:shd w:fill="F7F8FA"/>
           </w:tcPr>
           <w:p>
-            <w:pPr>
-              <w:keepNext/>
-              <w:spacing w:before="40" w:after="40"/>
-            </w:pPr>
             <w:r>
               <w:rPr>
                 <w:b w:val="0"/>
-                <w:sz w:val="20"/>
-              </w:rPr>
-              <w:t>macOS 27.0.1</w:t>
-              <w:br/>
-              <w:t>Build 26A434</w:t>
+                <w:sz w:val="22"/>
+              </w:rPr>
+              <w:t>GNU GCC 16.2.0（Homebrew）</w:t>
             </w:r>
           </w:p>
         </w:tc>
@@ -553,16 +488,12 @@
             <w:shd w:fill="FFFFFF"/>
           </w:tcPr>
           <w:p>
-            <w:pPr>
-              <w:keepNext/>
-              <w:spacing w:before="40" w:after="40"/>
-            </w:pPr>
             <w:r>
               <w:rPr>
                 <w:b w:val="0"/>
-                <w:sz w:val="20"/>
-              </w:rPr>
-              <w:t>執行環境</w:t>
+                <w:sz w:val="22"/>
+              </w:rPr>
+              <w:t>數學函式庫</w:t>
             </w:r>
           </w:p>
         </w:tc>
@@ -579,16 +510,12 @@
             <w:shd w:fill="FFFFFF"/>
           </w:tcPr>
           <w:p>
-            <w:pPr>
-              <w:keepNext/>
-              <w:spacing w:before="40" w:after="40"/>
-            </w:pPr>
             <w:r>
               <w:rPr>
                 <w:b w:val="0"/>
-                <w:sz w:val="20"/>
-              </w:rPr>
-              <w:t>WSL2／Ubuntu 26.04.1 LTS</w:t>
+                <w:sz w:val="22"/>
+              </w:rPr>
+              <w:t>glibc 2.43-2ubuntu2.4</w:t>
             </w:r>
           </w:p>
         </w:tc>
@@ -605,444 +532,12 @@
             <w:shd w:fill="FFFFFF"/>
           </w:tcPr>
           <w:p>
-            <w:pPr>
-              <w:keepNext/>
-              <w:spacing w:before="40" w:after="40"/>
-            </w:pPr>
             <w:r>
               <w:rPr>
                 <w:b w:val="0"/>
-                <w:sz w:val="20"/>
-              </w:rPr>
-              <w:t>macOS 原生環境</w:t>
-            </w:r>
-          </w:p>
-        </w:tc>
-      </w:tr>
-      <w:tr>
-        <w:trPr>
-          <w:cantSplit/>
-          <w:cantSplit/>
-        </w:trPr>
-        <w:tc>
-          <w:tcPr>
-            <w:tcW w:w="3312" w:type="dxa"/>
-            <w:tcBorders>
-              <w:top w:val="single" w:sz="4" w:space="0" w:color="D9D9D9"/>
-              <w:left w:val="single" w:sz="4" w:space="0" w:color="D9D9D9"/>
-              <w:bottom w:val="single" w:sz="4" w:space="0" w:color="D9D9D9"/>
-              <w:right w:val="single" w:sz="4" w:space="0" w:color="D9D9D9"/>
-            </w:tcBorders>
-            <w:shd w:fill="F7F8FA"/>
-            <w:shd w:fill="F7F8FA"/>
-          </w:tcPr>
-          <w:p>
-            <w:pPr>
-              <w:keepNext/>
-              <w:spacing w:before="40" w:after="40"/>
-            </w:pPr>
-            <w:r>
-              <w:rPr>
-                <w:b w:val="0"/>
-                <w:sz w:val="20"/>
-              </w:rPr>
-              <w:t>編譯器與版本</w:t>
-            </w:r>
-          </w:p>
-        </w:tc>
-        <w:tc>
-          <w:tcPr>
-            <w:tcW w:w="3312" w:type="dxa"/>
-            <w:tcBorders>
-              <w:top w:val="single" w:sz="4" w:space="0" w:color="D9D9D9"/>
-              <w:left w:val="single" w:sz="4" w:space="0" w:color="D9D9D9"/>
-              <w:bottom w:val="single" w:sz="4" w:space="0" w:color="D9D9D9"/>
-              <w:right w:val="single" w:sz="4" w:space="0" w:color="D9D9D9"/>
-            </w:tcBorders>
-            <w:shd w:fill="F7F8FA"/>
-            <w:shd w:fill="F7F8FA"/>
-          </w:tcPr>
-          <w:p>
-            <w:pPr>
-              <w:keepNext/>
-              <w:spacing w:after="40" w:before="40"/>
-            </w:pPr>
-            <w:r>
-              <w:rPr>
-                <w:b w:val="0"/>
-                <w:sz w:val="20"/>
-              </w:rPr>
-              <w:t>GNU GCC 16.2.0</w:t>
-              <w:br/>
-              <w:t>HW2 local GCC 16.2.0</w:t>
-            </w:r>
-          </w:p>
-        </w:tc>
-        <w:tc>
-          <w:tcPr>
-            <w:tcW w:w="3312" w:type="dxa"/>
-            <w:tcBorders>
-              <w:top w:val="single" w:sz="4" w:space="0" w:color="D9D9D9"/>
-              <w:left w:val="single" w:sz="4" w:space="0" w:color="D9D9D9"/>
-              <w:bottom w:val="single" w:sz="4" w:space="0" w:color="D9D9D9"/>
-              <w:right w:val="single" w:sz="4" w:space="0" w:color="D9D9D9"/>
-            </w:tcBorders>
-            <w:shd w:fill="F7F8FA"/>
-            <w:shd w:fill="F7F8FA"/>
-          </w:tcPr>
-          <w:p>
-            <w:pPr>
-              <w:keepNext/>
-              <w:spacing w:before="40" w:after="40"/>
-            </w:pPr>
-            <w:r>
-              <w:rPr>
-                <w:b w:val="0"/>
-                <w:sz w:val="20"/>
-              </w:rPr>
-              <w:t>GNU GCC 16.2.0</w:t>
-              <w:br/>
-              <w:t>Homebrew GCC 16.2.0</w:t>
-            </w:r>
-          </w:p>
-        </w:tc>
-      </w:tr>
-      <w:tr>
-        <w:trPr>
-          <w:cantSplit/>
-          <w:cantSplit/>
-        </w:trPr>
-        <w:tc>
-          <w:tcPr>
-            <w:tcW w:w="3312" w:type="dxa"/>
-            <w:tcBorders>
-              <w:top w:val="single" w:sz="4" w:space="0" w:color="D9D9D9"/>
-              <w:left w:val="single" w:sz="4" w:space="0" w:color="D9D9D9"/>
-              <w:bottom w:val="single" w:sz="4" w:space="0" w:color="D9D9D9"/>
-              <w:right w:val="single" w:sz="4" w:space="0" w:color="D9D9D9"/>
-            </w:tcBorders>
-            <w:shd w:fill="F7F8FA"/>
-            <w:shd w:fill="F7F8FA"/>
-          </w:tcPr>
-          <w:p>
-            <w:pPr>
-              <w:keepNext/>
-              <w:spacing w:before="40" w:after="40"/>
-            </w:pPr>
-            <w:r>
-              <w:rPr>
-                <w:b w:val="0"/>
-                <w:sz w:val="20"/>
-              </w:rPr>
-              <w:t>核心／執行緒</w:t>
-            </w:r>
-          </w:p>
-        </w:tc>
-        <w:tc>
-          <w:tcPr>
-            <w:tcW w:w="3312" w:type="dxa"/>
-            <w:tcBorders>
-              <w:top w:val="single" w:sz="4" w:space="0" w:color="D9D9D9"/>
-              <w:left w:val="single" w:sz="4" w:space="0" w:color="D9D9D9"/>
-              <w:bottom w:val="single" w:sz="4" w:space="0" w:color="D9D9D9"/>
-              <w:right w:val="single" w:sz="4" w:space="0" w:color="D9D9D9"/>
-            </w:tcBorders>
-            <w:shd w:fill="F7F8FA"/>
-            <w:shd w:fill="F7F8FA"/>
-          </w:tcPr>
-          <w:p>
-            <w:pPr>
-              <w:keepNext/>
-              <w:spacing w:before="40" w:after="40"/>
-            </w:pPr>
-            <w:r>
-              <w:rPr>
-                <w:b w:val="0"/>
-                <w:sz w:val="20"/>
-              </w:rPr>
-              <w:t>Windows：16／24</w:t>
-              <w:br/>
-              <w:t>WSL 虛擬拓樸：12／24</w:t>
-            </w:r>
-          </w:p>
-        </w:tc>
-        <w:tc>
-          <w:tcPr>
-            <w:tcW w:w="3312" w:type="dxa"/>
-            <w:tcBorders>
-              <w:top w:val="single" w:sz="4" w:space="0" w:color="D9D9D9"/>
-              <w:left w:val="single" w:sz="4" w:space="0" w:color="D9D9D9"/>
-              <w:bottom w:val="single" w:sz="4" w:space="0" w:color="D9D9D9"/>
-              <w:right w:val="single" w:sz="4" w:space="0" w:color="D9D9D9"/>
-            </w:tcBorders>
-            <w:shd w:fill="F7F8FA"/>
-            <w:shd w:fill="F7F8FA"/>
-          </w:tcPr>
-          <w:p>
-            <w:pPr>
-              <w:keepNext/>
-              <w:spacing w:before="40" w:after="40"/>
-            </w:pPr>
-            <w:r>
-              <w:rPr>
-                <w:b w:val="0"/>
-                <w:sz w:val="20"/>
-              </w:rPr>
-              <w:t>實體核心 10／執行緒 10</w:t>
-            </w:r>
-          </w:p>
-        </w:tc>
-      </w:tr>
-      <w:tr>
-        <w:trPr>
-          <w:cantSplit/>
-          <w:cantSplit/>
-        </w:trPr>
-        <w:tc>
-          <w:tcPr>
-            <w:tcW w:w="3312" w:type="dxa"/>
-            <w:tcBorders>
-              <w:top w:val="single" w:sz="4" w:space="0" w:color="D9D9D9"/>
-              <w:left w:val="single" w:sz="4" w:space="0" w:color="D9D9D9"/>
-              <w:bottom w:val="single" w:sz="4" w:space="0" w:color="D9D9D9"/>
-              <w:right w:val="single" w:sz="4" w:space="0" w:color="D9D9D9"/>
-            </w:tcBorders>
-            <w:shd w:fill="FFFFFF"/>
-            <w:shd w:fill="FFFFFF"/>
-          </w:tcPr>
-          <w:p>
-            <w:pPr>
-              <w:keepNext/>
-              <w:spacing w:before="40" w:after="40"/>
-            </w:pPr>
-            <w:r>
-              <w:rPr>
-                <w:b w:val="0"/>
-                <w:sz w:val="20"/>
-              </w:rPr>
-              <w:t>記憶體</w:t>
-            </w:r>
-          </w:p>
-        </w:tc>
-        <w:tc>
-          <w:tcPr>
-            <w:tcW w:w="3312" w:type="dxa"/>
-            <w:tcBorders>
-              <w:top w:val="single" w:sz="4" w:space="0" w:color="D9D9D9"/>
-              <w:left w:val="single" w:sz="4" w:space="0" w:color="D9D9D9"/>
-              <w:bottom w:val="single" w:sz="4" w:space="0" w:color="D9D9D9"/>
-              <w:right w:val="single" w:sz="4" w:space="0" w:color="D9D9D9"/>
-            </w:tcBorders>
-            <w:shd w:fill="FFFFFF"/>
-            <w:shd w:fill="FFFFFF"/>
-          </w:tcPr>
-          <w:p>
-            <w:pPr>
-              <w:keepNext/>
-              <w:spacing w:before="40" w:after="40"/>
-            </w:pPr>
-            <w:r>
-              <w:rPr>
-                <w:b w:val="0"/>
-                <w:sz w:val="20"/>
-              </w:rPr>
-              <w:t>實體 32 GiB；WSL 約 15 GiB</w:t>
-              <w:br/>
-              <w:t>WSL swap 4 GiB</w:t>
-            </w:r>
-          </w:p>
-        </w:tc>
-        <w:tc>
-          <w:tcPr>
-            <w:tcW w:w="3312" w:type="dxa"/>
-            <w:tcBorders>
-              <w:top w:val="single" w:sz="4" w:space="0" w:color="D9D9D9"/>
-              <w:left w:val="single" w:sz="4" w:space="0" w:color="D9D9D9"/>
-              <w:bottom w:val="single" w:sz="4" w:space="0" w:color="D9D9D9"/>
-              <w:right w:val="single" w:sz="4" w:space="0" w:color="D9D9D9"/>
-            </w:tcBorders>
-            <w:shd w:fill="FFFFFF"/>
-            <w:shd w:fill="FFFFFF"/>
-          </w:tcPr>
-          <w:p>
-            <w:r>
-              <w:t>24 GiB</w:t>
-            </w:r>
-          </w:p>
-        </w:tc>
-      </w:tr>
-      <w:tr>
-        <w:trPr>
-          <w:cantSplit/>
-          <w:cantSplit/>
-        </w:trPr>
-        <w:tc>
-          <w:tcPr>
-            <w:tcW w:w="3312" w:type="dxa"/>
-            <w:tcBorders>
-              <w:top w:val="single" w:sz="4" w:space="0" w:color="D9D9D9"/>
-              <w:left w:val="single" w:sz="4" w:space="0" w:color="D9D9D9"/>
-              <w:bottom w:val="single" w:sz="4" w:space="0" w:color="D9D9D9"/>
-              <w:right w:val="single" w:sz="4" w:space="0" w:color="D9D9D9"/>
-            </w:tcBorders>
-            <w:shd w:fill="F7F8FA"/>
-            <w:shd w:fill="F7F8FA"/>
-          </w:tcPr>
-          <w:p>
-            <w:pPr>
-              <w:keepNext/>
-              <w:spacing w:before="40" w:after="40"/>
-            </w:pPr>
-            <w:r>
-              <w:rPr>
-                <w:b w:val="0"/>
-                <w:sz w:val="20"/>
-              </w:rPr>
-              <w:t>WSL／kernel</w:t>
-            </w:r>
-          </w:p>
-        </w:tc>
-        <w:tc>
-          <w:tcPr>
-            <w:tcW w:w="3312" w:type="dxa"/>
-            <w:tcBorders>
-              <w:top w:val="single" w:sz="4" w:space="0" w:color="D9D9D9"/>
-              <w:left w:val="single" w:sz="4" w:space="0" w:color="D9D9D9"/>
-              <w:bottom w:val="single" w:sz="4" w:space="0" w:color="D9D9D9"/>
-              <w:right w:val="single" w:sz="4" w:space="0" w:color="D9D9D9"/>
-            </w:tcBorders>
-            <w:shd w:fill="F7F8FA"/>
-            <w:shd w:fill="F7F8FA"/>
-          </w:tcPr>
-          <w:p>
-            <w:pPr>
-              <w:keepNext/>
-              <w:spacing w:before="40" w:after="40"/>
-            </w:pPr>
-            <w:r>
-              <w:rPr>
-                <w:b w:val="0"/>
-                <w:sz w:val="20"/>
-              </w:rPr>
-              <w:t>WSL 2.7.3.0</w:t>
-              <w:br/>
-              <w:t>6.6.114.1-microsoft-standard-WSL2</w:t>
-            </w:r>
-          </w:p>
-        </w:tc>
-        <w:tc>
-          <w:tcPr>
-            <w:tcW w:w="3312" w:type="dxa"/>
-            <w:tcBorders>
-              <w:top w:val="single" w:sz="4" w:space="0" w:color="D9D9D9"/>
-              <w:left w:val="single" w:sz="4" w:space="0" w:color="D9D9D9"/>
-              <w:bottom w:val="single" w:sz="4" w:space="0" w:color="D9D9D9"/>
-              <w:right w:val="single" w:sz="4" w:space="0" w:color="D9D9D9"/>
-            </w:tcBorders>
-            <w:shd w:fill="F7F8FA"/>
-            <w:shd w:fill="F7F8FA"/>
-          </w:tcPr>
-          <w:p>
-            <w:pPr>
-              <w:keepNext/>
-              <w:spacing w:before="40" w:after="40"/>
-            </w:pPr>
-            <w:r>
-              <w:rPr>
-                <w:b w:val="0"/>
-                <w:sz w:val="20"/>
-              </w:rPr>
-              <w:t>Darwin 27.0.0</w:t>
-              <w:br/>
-              <w:t>ARM64_T8132</w:t>
-            </w:r>
-          </w:p>
-        </w:tc>
-      </w:tr>
-      <w:tr>
-        <w:trPr>
-          <w:cantSplit/>
-          <w:cantSplit/>
-        </w:trPr>
-        <w:tc>
-          <w:tcPr>
-            <w:tcW w:w="3312" w:type="dxa"/>
-            <w:tcBorders>
-              <w:top w:val="single" w:sz="4" w:space="0" w:color="D9D9D9"/>
-              <w:left w:val="single" w:sz="4" w:space="0" w:color="D9D9D9"/>
-              <w:bottom w:val="single" w:sz="4" w:space="0" w:color="D9D9D9"/>
-              <w:right w:val="single" w:sz="4" w:space="0" w:color="D9D9D9"/>
-            </w:tcBorders>
-            <w:shd w:fill="FFFFFF"/>
-            <w:shd w:fill="FFFFFF"/>
-          </w:tcPr>
-          <w:p>
-            <w:pPr>
-              <w:keepNext/>
-              <w:spacing w:before="40" w:after="40"/>
-            </w:pPr>
-            <w:r>
-              <w:rPr>
-                <w:b w:val="0"/>
-                <w:sz w:val="20"/>
-              </w:rPr>
-              <w:t>函式庫</w:t>
-            </w:r>
-          </w:p>
-        </w:tc>
-        <w:tc>
-          <w:tcPr>
-            <w:tcW w:w="3312" w:type="dxa"/>
-            <w:tcBorders>
-              <w:top w:val="single" w:sz="4" w:space="0" w:color="D9D9D9"/>
-              <w:left w:val="single" w:sz="4" w:space="0" w:color="D9D9D9"/>
-              <w:bottom w:val="single" w:sz="4" w:space="0" w:color="D9D9D9"/>
-              <w:right w:val="single" w:sz="4" w:space="0" w:color="D9D9D9"/>
-            </w:tcBorders>
-            <w:shd w:fill="FFFFFF"/>
-            <w:shd w:fill="FFFFFF"/>
-          </w:tcPr>
-          <w:p>
-            <w:pPr>
-              <w:keepNext/>
-              <w:spacing w:after="40" w:before="40"/>
-            </w:pPr>
-            <w:r>
-              <w:rPr>
-                <w:b w:val="0"/>
-                <w:sz w:val="20"/>
-              </w:rPr>
-              <w:t>glibc 2.43-2ubuntu2.4</w:t>
-              <w:br/>
-              <w:t>本地 GCC 16.2.0 的 libstdc++／libgcc_s</w:t>
-            </w:r>
-          </w:p>
-        </w:tc>
-        <w:tc>
-          <w:tcPr>
-            <w:tcW w:w="3312" w:type="dxa"/>
-            <w:tcBorders>
-              <w:top w:val="single" w:sz="4" w:space="0" w:color="D9D9D9"/>
-              <w:left w:val="single" w:sz="4" w:space="0" w:color="D9D9D9"/>
-              <w:bottom w:val="single" w:sz="4" w:space="0" w:color="D9D9D9"/>
-              <w:right w:val="single" w:sz="4" w:space="0" w:color="D9D9D9"/>
-            </w:tcBorders>
-            <w:shd w:fill="FFFFFF"/>
-            <w:shd w:fill="FFFFFF"/>
-          </w:tcPr>
-          <w:p>
-            <w:pPr>
-              <w:keepNext/>
-              <w:spacing w:before="40" w:after="40"/>
-            </w:pPr>
-            <w:r>
-              <w:rPr>
-                <w:b w:val="0"/>
-                <w:sz w:val="20"/>
-              </w:rPr>
-              <w:t>Homebrew libstdc++.6.dylib</w:t>
-              <w:br/>
-              <w:t>系統 libSystem.B.dylib</w:t>
+                <w:sz w:val="22"/>
+              </w:rPr>
+              <w:t>macOS 系統函式庫</w:t>
             </w:r>
           </w:p>
         </w:tc>
@@ -1058,7 +553,7 @@
         <w:spacing w:after="100" w:before="0"/>
       </w:pPr>
       <w:r>
-        <w:t>測試日期為 2026/10/04。Windows 的程式在 WSL Ubuntu 執行，Mac 用於 Q5 的平台比較。Q1 未固定 CPU 頻率與溫度，因此時間代表本次測試，不是所有情況下的固定速度。</w:t>
+        <w:t>測試於 2026/10/04 進行。主要平台在 WSL2 Ubuntu 執行，Mac 用於 Q5 的跨平台比較。未固定 CPU 頻率與溫度，因此 benchmark 數字代表本次測試條件。</w:t>
       </w:r>
     </w:p>
     <w:p>
@@ -1066,15 +561,7 @@
         <w:spacing w:after="100" w:before="0"/>
       </w:pPr>
       <w:r>
-        <w:t>在專案根目錄執行 bash scripts/run_all.sh 可重跑 WSL 全部實驗；Mac 使用 CXX=g++-16 bash scripts/run_q5.sh run。原始輸出保存在 results/linux-20261004-201349 與 results/q5-darwin-20261004-211048-student-wdBjAR。</w:t>
-      </w:r>
-    </w:p>
-    <w:p>
-      <w:pPr>
-        <w:spacing w:after="100" w:before="0"/>
-      </w:pPr>
-      <w:r>
-        <w:t>WSL 以程式讀出以下型態資訊。儲存空間不等於運算精度：long double 占 16 bytes，但使用 80 位元格式，另有填補空間；其中 64 位是有效數字。Mac 的 long double 只有 53 個有效位，與 double 相同。</w:t>
+        <w:t>型態的儲存空間與有效位數由程式讀出如下；digits 指二進位有效位數。WSL 的 long double 使用 80 位元格式，16 bytes 儲存空間含填補，不代表 128 位元運算精度。</w:t>
       </w:r>
     </w:p>
     <w:tbl>
@@ -1120,9 +607,9 @@
             <w:r>
               <w:rPr>
                 <w:b/>
-                <w:color w:val="000000"/>
-              </w:rPr>
-              <w:t>型態</w:t>
+                <w:sz w:val="22"/>
+              </w:rPr>
+              <w:t>平台／型態</w:t>
             </w:r>
           </w:p>
         </w:tc>
@@ -1143,7 +630,7 @@
             <w:r>
               <w:rPr>
                 <w:b/>
-                <w:color w:val="000000"/>
+                <w:sz w:val="22"/>
               </w:rPr>
               <w:t>儲存空間（bytes）</w:t>
             </w:r>
@@ -1166,9 +653,9 @@
             <w:r>
               <w:rPr>
                 <w:b/>
-                <w:color w:val="000000"/>
-              </w:rPr>
-              <w:t>有效位數（二進位）</w:t>
+                <w:sz w:val="22"/>
+              </w:rPr>
+              <w:t>有效位數（digits）</w:t>
             </w:r>
           </w:p>
         </w:tc>
@@ -1191,16 +678,12 @@
             <w:shd w:fill="FFFFFF"/>
           </w:tcPr>
           <w:p>
-            <w:pPr>
-              <w:keepNext/>
-              <w:spacing w:before="40" w:after="40"/>
-            </w:pPr>
             <w:r>
               <w:rPr>
                 <w:b w:val="0"/>
-                <w:sz w:val="20"/>
-              </w:rPr>
-              <w:t>float</w:t>
+                <w:sz w:val="22"/>
+              </w:rPr>
+              <w:t>WSL float</w:t>
             </w:r>
           </w:p>
         </w:tc>
@@ -1224,7 +707,7 @@
             <w:r>
               <w:rPr>
                 <w:b w:val="0"/>
-                <w:sz w:val="20"/>
+                <w:sz w:val="22"/>
               </w:rPr>
               <w:t>4</w:t>
             </w:r>
@@ -1250,7 +733,7 @@
             <w:r>
               <w:rPr>
                 <w:b w:val="0"/>
-                <w:sz w:val="20"/>
+                <w:sz w:val="22"/>
               </w:rPr>
               <w:t>24</w:t>
             </w:r>
@@ -1275,16 +758,12 @@
             <w:shd w:fill="F7F8FA"/>
           </w:tcPr>
           <w:p>
-            <w:pPr>
-              <w:keepNext/>
-              <w:spacing w:before="40" w:after="40"/>
-            </w:pPr>
             <w:r>
               <w:rPr>
                 <w:b w:val="0"/>
-                <w:sz w:val="20"/>
-              </w:rPr>
-              <w:t>double</w:t>
+                <w:sz w:val="22"/>
+              </w:rPr>
+              <w:t>WSL double</w:t>
             </w:r>
           </w:p>
         </w:tc>
@@ -1308,7 +787,7 @@
             <w:r>
               <w:rPr>
                 <w:b w:val="0"/>
-                <w:sz w:val="20"/>
+                <w:sz w:val="22"/>
               </w:rPr>
               <w:t>8</w:t>
             </w:r>
@@ -1334,7 +813,7 @@
             <w:r>
               <w:rPr>
                 <w:b w:val="0"/>
-                <w:sz w:val="20"/>
+                <w:sz w:val="22"/>
               </w:rPr>
               <w:t>53</w:t>
             </w:r>
@@ -1359,16 +838,12 @@
             <w:shd w:fill="FFFFFF"/>
           </w:tcPr>
           <w:p>
-            <w:pPr>
-              <w:keepNext w:val="0"/>
-              <w:spacing w:before="40" w:after="40"/>
-            </w:pPr>
             <w:r>
               <w:rPr>
                 <w:b w:val="0"/>
-                <w:sz w:val="20"/>
-              </w:rPr>
-              <w:t>long double</w:t>
+                <w:sz w:val="22"/>
+              </w:rPr>
+              <w:t>WSL long double</w:t>
             </w:r>
           </w:p>
         </w:tc>
@@ -1392,7 +867,7 @@
             <w:r>
               <w:rPr>
                 <w:b w:val="0"/>
-                <w:sz w:val="20"/>
+                <w:sz w:val="22"/>
               </w:rPr>
               <w:t>16</w:t>
             </w:r>
@@ -1418,9 +893,53 @@
             <w:r>
               <w:rPr>
                 <w:b w:val="0"/>
-                <w:sz w:val="20"/>
+                <w:sz w:val="22"/>
               </w:rPr>
               <w:t>64</w:t>
+            </w:r>
+          </w:p>
+        </w:tc>
+      </w:tr>
+      <w:tr>
+        <w:tc>
+          <w:tcPr>
+            <w:tcW w:type="dxa" w:w="1656"/>
+          </w:tcPr>
+          <w:p>
+            <w:r>
+              <w:rPr>
+                <w:b w:val="0"/>
+                <w:sz w:val="22"/>
+              </w:rPr>
+              <w:t>Mac long double</w:t>
+            </w:r>
+          </w:p>
+        </w:tc>
+        <w:tc>
+          <w:tcPr>
+            <w:tcW w:type="dxa" w:w="1656"/>
+          </w:tcPr>
+          <w:p>
+            <w:r>
+              <w:rPr>
+                <w:b w:val="0"/>
+                <w:sz w:val="22"/>
+              </w:rPr>
+              <w:t>8</w:t>
+            </w:r>
+          </w:p>
+        </w:tc>
+        <w:tc>
+          <w:tcPr>
+            <w:tcW w:type="dxa" w:w="1656"/>
+          </w:tcPr>
+          <w:p>
+            <w:r>
+              <w:rPr>
+                <w:b w:val="0"/>
+                <w:sz w:val="22"/>
+              </w:rPr>
+              <w:t>53</w:t>
             </w:r>
           </w:p>
         </w:tc>
@@ -1436,7 +955,7 @@
         <w:spacing w:after="100" w:before="0"/>
       </w:pPr>
       <w:r>
-        <w:t>本次比較 float、double、long double，不納入 __float128。除 Q3 開啟 fast-math 的對照及 Q4 捨入模式測試外，採最接近值捨入，並關閉 fast-math。</w:t>
+        <w:t>本次比較 float、double、long double。除 fast-math 對照與捨入模式測試外，採最接近值捨入，並關閉 fast-math。</w:t>
       </w:r>
     </w:p>
     <w:p>
@@ -1484,22 +1003,7 @@
         </w:rPr>
       </w:pPr>
       <w:r>
-        <w:t>一回合分別包含 2 或 8 次算術運算；總耗時除以算術次數得到 ns/op（奈秒／次），越小越快。程式保存並檢查最後答案，待測函式分開編譯、停用跨檔最佳化與向量化，再檢查 CPU 指令確認迴圈未被刪掉。時間包含迴圈等成本。</w:t>
-      </w:r>
-    </w:p>
-    <w:p>
-      <w:pPr>
-        <w:keepLines/>
-        <w:spacing w:after="100" w:before="0"/>
-      </w:pPr>
-      <w:r>
-        <w:t>來源：experiments/q1_benchmark/main.cpp、kernels.cpp。</w:t>
-        <w:br/>
-        <w:t>編譯：bash experiments/q1_benchmark/build.sh</w:t>
-        <w:br/>
-        <w:t>執行：./build/q1-scalar/q1_benchmark --iterations 5000000 --repeats 7 --warmup 2 --seed 20261004</w:t>
-        <w:br/>
-        <w:t>參數：-std=c++20 -O3 -Wall -Wextra -fno-fast-math -ffp-contract=off -fno-lto -fno-tree-vectorize</w:t>
+        <w:t>一回合分別包含 2 或 8 次算術運算；總耗時除以算術次數得到 ns/op（奈秒／次），越小越快。以 GCC 16.2.0、-O3 編譯，關閉 fast-math、融合乘加（FMA）、跨檔最佳化（LTO）及自動向量化。程式保留並檢查最後答案，且產生的 CPU 指令仍包含算術迴圈，確認待測計算未被刪掉。計時包含迴圈等成本。</w:t>
       </w:r>
     </w:p>
     <w:p>
@@ -1507,7 +1011,7 @@
         <w:spacing w:after="100" w:before="0"/>
       </w:pPr>
       <w:r>
-        <w:t>下表為每次運算時間（ns/op）；原始 126 筆計時樣本及摘要均已保存。</w:t>
+        <w:t>下表為 7 次計時的中位數，單位 ns/op。</w:t>
       </w:r>
     </w:p>
     <w:tbl>
@@ -1550,7 +1054,7 @@
               <w:rPr>
                 <w:b/>
                 <w:color w:val="000000"/>
-                <w:sz w:val="20"/>
+                <w:sz w:val="22"/>
               </w:rPr>
               <w:t>運算</w:t>
             </w:r>
@@ -1570,7 +1074,7 @@
               <w:rPr>
                 <w:b/>
                 <w:color w:val="000000"/>
-                <w:sz w:val="20"/>
+                <w:sz w:val="22"/>
               </w:rPr>
               <w:t>模式</w:t>
             </w:r>
@@ -1590,7 +1094,7 @@
               <w:rPr>
                 <w:b/>
                 <w:color w:val="000000"/>
-                <w:sz w:val="20"/>
+                <w:sz w:val="22"/>
               </w:rPr>
               <w:t>float</w:t>
             </w:r>
@@ -1610,7 +1114,7 @@
               <w:rPr>
                 <w:b/>
                 <w:color w:val="000000"/>
-                <w:sz w:val="20"/>
+                <w:sz w:val="22"/>
               </w:rPr>
               <w:t>double</w:t>
             </w:r>
@@ -1630,7 +1134,7 @@
               <w:rPr>
                 <w:b/>
                 <w:color w:val="000000"/>
-                <w:sz w:val="20"/>
+                <w:sz w:val="22"/>
               </w:rPr>
               <w:t>long double</w:t>
             </w:r>
@@ -1654,7 +1158,7 @@
             <w:r>
               <w:rPr>
                 <w:b w:val="0"/>
-                <w:sz w:val="20"/>
+                <w:sz w:val="22"/>
               </w:rPr>
               <w:t>加減</w:t>
             </w:r>
@@ -1673,7 +1177,7 @@
             <w:r>
               <w:rPr>
                 <w:b w:val="0"/>
-                <w:sz w:val="20"/>
+                <w:sz w:val="22"/>
               </w:rPr>
               <w:t>連續計算</w:t>
             </w:r>
@@ -1692,7 +1196,7 @@
             <w:r>
               <w:rPr>
                 <w:b w:val="0"/>
-                <w:sz w:val="20"/>
+                <w:sz w:val="22"/>
               </w:rPr>
               <w:t>0.432182</w:t>
             </w:r>
@@ -1711,7 +1215,7 @@
             <w:r>
               <w:rPr>
                 <w:b w:val="0"/>
-                <w:sz w:val="20"/>
+                <w:sz w:val="22"/>
               </w:rPr>
               <w:t>0.429384</w:t>
             </w:r>
@@ -1730,7 +1234,7 @@
             <w:r>
               <w:rPr>
                 <w:b w:val="0"/>
-                <w:sz w:val="20"/>
+                <w:sz w:val="22"/>
               </w:rPr>
               <w:t>0.645650</w:t>
             </w:r>
@@ -1754,7 +1258,7 @@
             <w:r>
               <w:rPr>
                 <w:b w:val="0"/>
-                <w:sz w:val="20"/>
+                <w:sz w:val="22"/>
               </w:rPr>
               <w:t>加減</w:t>
             </w:r>
@@ -1773,7 +1277,7 @@
             <w:r>
               <w:rPr>
                 <w:b w:val="0"/>
-                <w:sz w:val="20"/>
+                <w:sz w:val="22"/>
               </w:rPr>
               <w:t>四組並行</w:t>
             </w:r>
@@ -1792,7 +1296,7 @@
             <w:r>
               <w:rPr>
                 <w:b w:val="0"/>
-                <w:sz w:val="20"/>
+                <w:sz w:val="22"/>
               </w:rPr>
               <w:t>0.117829</w:t>
             </w:r>
@@ -1811,7 +1315,7 @@
             <w:r>
               <w:rPr>
                 <w:b w:val="0"/>
-                <w:sz w:val="20"/>
+                <w:sz w:val="22"/>
               </w:rPr>
               <w:t>0.117475</w:t>
             </w:r>
@@ -1830,7 +1334,7 @@
             <w:r>
               <w:rPr>
                 <w:b w:val="0"/>
-                <w:sz w:val="20"/>
+                <w:sz w:val="22"/>
               </w:rPr>
               <w:t>0.275822</w:t>
             </w:r>
@@ -1854,7 +1358,7 @@
             <w:r>
               <w:rPr>
                 <w:b w:val="0"/>
-                <w:sz w:val="20"/>
+                <w:sz w:val="22"/>
               </w:rPr>
               <w:t>乘法</w:t>
             </w:r>
@@ -1873,7 +1377,7 @@
             <w:r>
               <w:rPr>
                 <w:b w:val="0"/>
-                <w:sz w:val="20"/>
+                <w:sz w:val="22"/>
               </w:rPr>
               <w:t>連續計算</w:t>
             </w:r>
@@ -1892,7 +1396,7 @@
             <w:r>
               <w:rPr>
                 <w:b w:val="0"/>
-                <w:sz w:val="20"/>
+                <w:sz w:val="22"/>
               </w:rPr>
               <w:t>0.860375</w:t>
             </w:r>
@@ -1911,7 +1415,7 @@
             <w:r>
               <w:rPr>
                 <w:b w:val="0"/>
-                <w:sz w:val="20"/>
+                <w:sz w:val="22"/>
               </w:rPr>
               <w:t>0.858836</w:t>
             </w:r>
@@ -1930,7 +1434,7 @@
             <w:r>
               <w:rPr>
                 <w:b w:val="0"/>
-                <w:sz w:val="20"/>
+                <w:sz w:val="22"/>
               </w:rPr>
               <w:t>0.859048</w:t>
             </w:r>
@@ -1954,7 +1458,7 @@
             <w:r>
               <w:rPr>
                 <w:b w:val="0"/>
-                <w:sz w:val="20"/>
+                <w:sz w:val="22"/>
               </w:rPr>
               <w:t>乘法</w:t>
             </w:r>
@@ -1973,7 +1477,7 @@
             <w:r>
               <w:rPr>
                 <w:b w:val="0"/>
-                <w:sz w:val="20"/>
+                <w:sz w:val="22"/>
               </w:rPr>
               <w:t>四組並行</w:t>
             </w:r>
@@ -1992,7 +1496,7 @@
             <w:r>
               <w:rPr>
                 <w:b w:val="0"/>
-                <w:sz w:val="20"/>
+                <w:sz w:val="22"/>
               </w:rPr>
               <w:t>0.215455</w:t>
             </w:r>
@@ -2011,7 +1515,7 @@
             <w:r>
               <w:rPr>
                 <w:b w:val="0"/>
-                <w:sz w:val="20"/>
+                <w:sz w:val="22"/>
               </w:rPr>
               <w:t>0.215547</w:t>
             </w:r>
@@ -2030,7 +1534,7 @@
             <w:r>
               <w:rPr>
                 <w:b w:val="0"/>
-                <w:sz w:val="20"/>
+                <w:sz w:val="22"/>
               </w:rPr>
               <w:t>0.216369</w:t>
             </w:r>
@@ -2054,7 +1558,7 @@
             <w:r>
               <w:rPr>
                 <w:b w:val="0"/>
-                <w:sz w:val="20"/>
+                <w:sz w:val="22"/>
               </w:rPr>
               <w:t>除法</w:t>
             </w:r>
@@ -2073,7 +1577,7 @@
             <w:r>
               <w:rPr>
                 <w:b w:val="0"/>
-                <w:sz w:val="20"/>
+                <w:sz w:val="22"/>
               </w:rPr>
               <w:t>連續計算</w:t>
             </w:r>
@@ -2092,7 +1596,7 @@
             <w:r>
               <w:rPr>
                 <w:b w:val="0"/>
-                <w:sz w:val="20"/>
+                <w:sz w:val="22"/>
               </w:rPr>
               <w:t>2.333131</w:t>
             </w:r>
@@ -2111,7 +1615,7 @@
             <w:r>
               <w:rPr>
                 <w:b w:val="0"/>
-                <w:sz w:val="20"/>
+                <w:sz w:val="22"/>
               </w:rPr>
               <w:t>2.999956</w:t>
             </w:r>
@@ -2130,7 +1634,7 @@
             <w:r>
               <w:rPr>
                 <w:b w:val="0"/>
-                <w:sz w:val="20"/>
+                <w:sz w:val="22"/>
               </w:rPr>
               <w:t>3.326920</w:t>
             </w:r>
@@ -2154,7 +1658,7 @@
             <w:r>
               <w:rPr>
                 <w:b w:val="0"/>
-                <w:sz w:val="20"/>
+                <w:sz w:val="22"/>
               </w:rPr>
               <w:t>除法</w:t>
             </w:r>
@@ -2173,7 +1677,7 @@
             <w:r>
               <w:rPr>
                 <w:b w:val="0"/>
-                <w:sz w:val="20"/>
+                <w:sz w:val="22"/>
               </w:rPr>
               <w:t>四組並行</w:t>
             </w:r>
@@ -2192,7 +1696,7 @@
             <w:r>
               <w:rPr>
                 <w:b w:val="0"/>
-                <w:sz w:val="20"/>
+                <w:sz w:val="22"/>
               </w:rPr>
               <w:t>0.617730</w:t>
             </w:r>
@@ -2211,7 +1715,7 @@
             <w:r>
               <w:rPr>
                 <w:b w:val="0"/>
-                <w:sz w:val="20"/>
+                <w:sz w:val="22"/>
               </w:rPr>
               <w:t>0.828075</w:t>
             </w:r>
@@ -2230,7 +1734,7 @@
             <w:r>
               <w:rPr>
                 <w:b w:val="0"/>
-                <w:sz w:val="20"/>
+                <w:sz w:val="22"/>
               </w:rPr>
               <w:t>0.923359</w:t>
             </w:r>
@@ -2242,57 +1746,6 @@
       <w:pPr>
         <w:spacing w:after="100"/>
       </w:pPr>
-    </w:p>
-    <w:p>
-      <w:pPr>
-        <w:keepNext/>
-        <w:spacing w:after="80"/>
-      </w:pPr>
-      <w:r>
-        <w:drawing>
-          <wp:inline xmlns:a="http://schemas.openxmlformats.org/drawingml/2006/main" xmlns:pic="http://schemas.openxmlformats.org/drawingml/2006/picture">
-            <wp:extent cx="4023360" cy="3888269"/>
-            <wp:docPr id="5" name="Picture 5"/>
-            <wp:cNvGraphicFramePr>
-              <a:graphicFrameLocks noChangeAspect="1"/>
-            </wp:cNvGraphicFramePr>
-            <a:graphic>
-              <a:graphicData uri="http://schemas.openxmlformats.org/drawingml/2006/picture">
-                <pic:pic>
-                  <pic:nvPicPr>
-                    <pic:cNvPr id="0" name="Screenshot 2026-10-04 202051.png"/>
-                    <pic:cNvPicPr/>
-                  </pic:nvPicPr>
-                  <pic:blipFill>
-                    <a:blip r:embed="rId12"/>
-                    <a:stretch>
-                      <a:fillRect/>
-                    </a:stretch>
-                  </pic:blipFill>
-                  <pic:spPr>
-                    <a:xfrm>
-                      <a:off x="0" y="0"/>
-                      <a:ext cx="4023360" cy="3888269"/>
-                    </a:xfrm>
-                    <a:prstGeom prst="rect"/>
-                  </pic:spPr>
-                </pic:pic>
-              </a:graphicData>
-            </a:graphic>
-          </wp:inline>
-        </w:drawing>
-      </w:r>
-    </w:p>
-    <w:p>
-      <w:pPr>
-        <w:spacing w:after="100" w:before="0"/>
-      </w:pPr>
-      <w:r>
-        <w:rPr>
-          <w:sz w:val="18"/>
-        </w:rPr>
-        <w:t>圖 1-1 實測中位數與迭代設定。</w:t>
-      </w:r>
     </w:p>
     <w:p>
       <w:pPr>
@@ -2326,7 +1779,7 @@
         </w:rPr>
       </w:pPr>
       <w:r>
-        <w:t>另外將 [大數, 1, -大數] 重複 10,000 組，分別正序、反序加總；大數取 2^24 與 2^53，數學答案都是 10,000。以同一執行檔加上 --precision-only 可重跑。</w:t>
+        <w:t>為觀察運算順序對精度的影響，將 [大數, 1, -大數] 重複 10,000 組，分別正序、反序加總；大數取 2^24 與 2^53，數學答案都是 10,000。</w:t>
       </w:r>
     </w:p>
     <w:tbl>
@@ -2369,7 +1822,7 @@
               <w:rPr>
                 <w:b/>
                 <w:color w:val="000000"/>
-                <w:sz w:val="20"/>
+                <w:sz w:val="22"/>
               </w:rPr>
               <w:t>型態</w:t>
             </w:r>
@@ -2389,7 +1842,7 @@
               <w:rPr>
                 <w:b/>
                 <w:color w:val="000000"/>
-                <w:sz w:val="20"/>
+                <w:sz w:val="22"/>
               </w:rPr>
               <w:t>大數</w:t>
             </w:r>
@@ -2409,7 +1862,7 @@
               <w:rPr>
                 <w:b/>
                 <w:color w:val="000000"/>
-                <w:sz w:val="20"/>
+                <w:sz w:val="22"/>
               </w:rPr>
               <w:t>正序結果</w:t>
             </w:r>
@@ -2429,7 +1882,7 @@
               <w:rPr>
                 <w:b/>
                 <w:color w:val="000000"/>
-                <w:sz w:val="20"/>
+                <w:sz w:val="22"/>
               </w:rPr>
               <w:t>反序結果</w:t>
             </w:r>
@@ -2449,7 +1902,7 @@
               <w:rPr>
                 <w:b/>
                 <w:color w:val="000000"/>
-                <w:sz w:val="20"/>
+                <w:sz w:val="22"/>
               </w:rPr>
               <w:t>絕對誤差 正／反</w:t>
             </w:r>
@@ -2473,7 +1926,7 @@
             <w:r>
               <w:rPr>
                 <w:b w:val="0"/>
-                <w:sz w:val="20"/>
+                <w:sz w:val="22"/>
               </w:rPr>
               <w:t>float</w:t>
             </w:r>
@@ -2492,7 +1945,7 @@
             <w:r>
               <w:rPr>
                 <w:b w:val="0"/>
-                <w:sz w:val="20"/>
+                <w:sz w:val="22"/>
               </w:rPr>
               <w:t>2^24</w:t>
             </w:r>
@@ -2511,7 +1964,7 @@
             <w:r>
               <w:rPr>
                 <w:b w:val="0"/>
-                <w:sz w:val="20"/>
+                <w:sz w:val="22"/>
               </w:rPr>
               <w:t>0</w:t>
             </w:r>
@@ -2530,7 +1983,7 @@
             <w:r>
               <w:rPr>
                 <w:b w:val="0"/>
-                <w:sz w:val="20"/>
+                <w:sz w:val="22"/>
               </w:rPr>
               <w:t>10000</w:t>
             </w:r>
@@ -2549,7 +2002,7 @@
             <w:r>
               <w:rPr>
                 <w:b w:val="0"/>
-                <w:sz w:val="20"/>
+                <w:sz w:val="22"/>
               </w:rPr>
               <w:t>10000／0</w:t>
             </w:r>
@@ -2573,7 +2026,7 @@
             <w:r>
               <w:rPr>
                 <w:b w:val="0"/>
-                <w:sz w:val="20"/>
+                <w:sz w:val="22"/>
               </w:rPr>
               <w:t>double</w:t>
             </w:r>
@@ -2592,7 +2045,7 @@
             <w:r>
               <w:rPr>
                 <w:b w:val="0"/>
-                <w:sz w:val="20"/>
+                <w:sz w:val="22"/>
               </w:rPr>
               <w:t>2^24</w:t>
             </w:r>
@@ -2611,7 +2064,7 @@
             <w:r>
               <w:rPr>
                 <w:b w:val="0"/>
-                <w:sz w:val="20"/>
+                <w:sz w:val="22"/>
               </w:rPr>
               <w:t>10000</w:t>
             </w:r>
@@ -2630,7 +2083,7 @@
             <w:r>
               <w:rPr>
                 <w:b w:val="0"/>
-                <w:sz w:val="20"/>
+                <w:sz w:val="22"/>
               </w:rPr>
               <w:t>10000</w:t>
             </w:r>
@@ -2649,7 +2102,7 @@
             <w:r>
               <w:rPr>
                 <w:b w:val="0"/>
-                <w:sz w:val="20"/>
+                <w:sz w:val="22"/>
               </w:rPr>
               <w:t>0／0</w:t>
             </w:r>
@@ -2673,7 +2126,7 @@
             <w:r>
               <w:rPr>
                 <w:b w:val="0"/>
-                <w:sz w:val="20"/>
+                <w:sz w:val="22"/>
               </w:rPr>
               <w:t>long double</w:t>
             </w:r>
@@ -2692,7 +2145,7 @@
             <w:r>
               <w:rPr>
                 <w:b w:val="0"/>
-                <w:sz w:val="20"/>
+                <w:sz w:val="22"/>
               </w:rPr>
               <w:t>2^24</w:t>
             </w:r>
@@ -2711,7 +2164,7 @@
             <w:r>
               <w:rPr>
                 <w:b w:val="0"/>
-                <w:sz w:val="20"/>
+                <w:sz w:val="22"/>
               </w:rPr>
               <w:t>10000</w:t>
             </w:r>
@@ -2730,7 +2183,7 @@
             <w:r>
               <w:rPr>
                 <w:b w:val="0"/>
-                <w:sz w:val="20"/>
+                <w:sz w:val="22"/>
               </w:rPr>
               <w:t>10000</w:t>
             </w:r>
@@ -2749,7 +2202,7 @@
             <w:r>
               <w:rPr>
                 <w:b w:val="0"/>
-                <w:sz w:val="20"/>
+                <w:sz w:val="22"/>
               </w:rPr>
               <w:t>0／0</w:t>
             </w:r>
@@ -2773,7 +2226,7 @@
             <w:r>
               <w:rPr>
                 <w:b w:val="0"/>
-                <w:sz w:val="20"/>
+                <w:sz w:val="22"/>
               </w:rPr>
               <w:t>float</w:t>
             </w:r>
@@ -2792,7 +2245,7 @@
             <w:r>
               <w:rPr>
                 <w:b w:val="0"/>
-                <w:sz w:val="20"/>
+                <w:sz w:val="22"/>
               </w:rPr>
               <w:t>2^53</w:t>
             </w:r>
@@ -2811,7 +2264,7 @@
             <w:r>
               <w:rPr>
                 <w:b w:val="0"/>
-                <w:sz w:val="20"/>
+                <w:sz w:val="22"/>
               </w:rPr>
               <w:t>0</w:t>
             </w:r>
@@ -2830,7 +2283,7 @@
             <w:r>
               <w:rPr>
                 <w:b w:val="0"/>
-                <w:sz w:val="20"/>
+                <w:sz w:val="22"/>
               </w:rPr>
               <w:t>0</w:t>
             </w:r>
@@ -2849,7 +2302,7 @@
             <w:r>
               <w:rPr>
                 <w:b w:val="0"/>
-                <w:sz w:val="20"/>
+                <w:sz w:val="22"/>
               </w:rPr>
               <w:t>10000／10000</w:t>
             </w:r>
@@ -2873,7 +2326,7 @@
             <w:r>
               <w:rPr>
                 <w:b w:val="0"/>
-                <w:sz w:val="20"/>
+                <w:sz w:val="22"/>
               </w:rPr>
               <w:t>double</w:t>
             </w:r>
@@ -2892,7 +2345,7 @@
             <w:r>
               <w:rPr>
                 <w:b w:val="0"/>
-                <w:sz w:val="20"/>
+                <w:sz w:val="22"/>
               </w:rPr>
               <w:t>2^53</w:t>
             </w:r>
@@ -2911,7 +2364,7 @@
             <w:r>
               <w:rPr>
                 <w:b w:val="0"/>
-                <w:sz w:val="20"/>
+                <w:sz w:val="22"/>
               </w:rPr>
               <w:t>0</w:t>
             </w:r>
@@ -2930,7 +2383,7 @@
             <w:r>
               <w:rPr>
                 <w:b w:val="0"/>
-                <w:sz w:val="20"/>
+                <w:sz w:val="22"/>
               </w:rPr>
               <w:t>10000</w:t>
             </w:r>
@@ -2949,7 +2402,7 @@
             <w:r>
               <w:rPr>
                 <w:b w:val="0"/>
-                <w:sz w:val="20"/>
+                <w:sz w:val="22"/>
               </w:rPr>
               <w:t>10000／0</w:t>
             </w:r>
@@ -2973,7 +2426,7 @@
             <w:r>
               <w:rPr>
                 <w:b w:val="0"/>
-                <w:sz w:val="20"/>
+                <w:sz w:val="22"/>
               </w:rPr>
               <w:t>long double</w:t>
             </w:r>
@@ -2992,7 +2445,7 @@
             <w:r>
               <w:rPr>
                 <w:b w:val="0"/>
-                <w:sz w:val="20"/>
+                <w:sz w:val="22"/>
               </w:rPr>
               <w:t>2^53</w:t>
             </w:r>
@@ -3011,7 +2464,7 @@
             <w:r>
               <w:rPr>
                 <w:b w:val="0"/>
-                <w:sz w:val="20"/>
+                <w:sz w:val="22"/>
               </w:rPr>
               <w:t>10000</w:t>
             </w:r>
@@ -3030,7 +2483,7 @@
             <w:r>
               <w:rPr>
                 <w:b w:val="0"/>
-                <w:sz w:val="20"/>
+                <w:sz w:val="22"/>
               </w:rPr>
               <w:t>10000</w:t>
             </w:r>
@@ -3049,7 +2502,7 @@
             <w:r>
               <w:rPr>
                 <w:b w:val="0"/>
-                <w:sz w:val="20"/>
+                <w:sz w:val="22"/>
               </w:rPr>
               <w:t>0／0</w:t>
             </w:r>
@@ -3102,23 +2555,7 @@
         </w:rPr>
       </w:pPr>
       <w:r>
-        <w:t>選用 &lt;cmath&gt; 的 std::sqrt。C++20 提供 float、double、long double 版本，回傳型態對應輸入型態；整數輸入使用 double，程式以 static_assert 核對。函式求非負平方根；負有限值屬於定義域錯誤，錯誤回報依 math_errhandling 決定。規格並未要求一定呼叫函式庫或使用特定 CPU 指令。[1][5]</w:t>
-      </w:r>
-    </w:p>
-    <w:p>
-      <w:pPr>
-        <w:keepNext w:val="0"/>
-        <w:keepLines/>
-        <w:spacing w:after="100" w:before="0"/>
-      </w:pPr>
-      <w:r>
-        <w:t>// experiments/q2_cmath/sqrt_paths.cpp</w:t>
-        <w:br/>
-        <w:t>float sqrt_path(float x) { return std::sqrt(x); }</w:t>
-        <w:br/>
-        <w:t>double sqrt_path(double x) { return std::sqrt(x); }</w:t>
-        <w:br/>
-        <w:t>long double sqrt_path(long double x) { return std::sqrt(x); }</w:t>
+        <w:t>選用 &lt;cmath&gt; 的 std::sqrt。C++20 提供 float、double、long double 版本，回傳型態對應輸入型態；整數輸入使用 double。函式求非負平方根；負有限值屬於定義域錯誤，錯誤回報依 math_errhandling 決定。規格並未要求一定呼叫函式庫或使用特定 CPU 指令。[1][5]</w:t>
       </w:r>
     </w:p>
     <w:p>
@@ -3127,7 +2564,7 @@
         <w:spacing w:after="100" w:before="0"/>
       </w:pPr>
       <w:r>
-        <w:t>使用 bash scripts/build_all.sh 編譯一般版本與強制呼叫數學函式庫的版本，執行 ./build/all/q2_cmath 2、./build/all/q2_libm 2，比較 4、2、-1、±0 等輸入。兩版共用 -std=c++20 -O2 -Wall -Wextra -fno-lto -ffp-contract=off -fno-fast-math -frounding-math；函式庫版另加 -DHW2_FORCE_LIBM=1，透過函式指標呼叫 sqrtf／sqrt／sqrtl。</w:t>
+        <w:t>實作可由編譯器內建功能直接產生硬體指令，也可呼叫數學函式庫。本機以一般 std::sqrt 呼叫及強制經函式指標呼叫 sqrtf／sqrt／sqrtl 兩條路徑比較，保留正常值、負值與特殊值的處理。</w:t>
       </w:r>
     </w:p>
     <w:p>
@@ -3135,7 +2572,7 @@
         <w:spacing w:after="100" w:before="0"/>
       </w:pPr>
       <w:r>
-        <w:t>本機一般版本直接使用 SQRTSS、SQRTSD、FSQRT；遇負數則轉交函式庫。強制呼叫函式庫後，實際 glibc 的有限值實作仍包含相同硬體指令。以下為保存的 assembly 關鍵行，分別來自 q2-default.s 與 q2-libm-address-ranges.disasm.txt：</w:t>
+        <w:t>GCC 的一般版本直接產生 SQRTSS、SQRTSD、FSQRT；負數則轉交函式庫。強制呼叫 libm 後，本機 glibc 的有限值實作仍使用硬體平方根指令。反組譯的關鍵指令如下：</w:t>
       </w:r>
     </w:p>
     <w:p>
@@ -3146,17 +2583,24 @@
       <w:r>
         <w:rPr>
           <w:rFonts w:ascii="Consolas" w:hAnsi="Consolas"/>
-          <w:sz w:val="20"/>
+          <w:sz w:val="22"/>
         </w:rPr>
-        <w:t>一般呼叫：float → sqrtss；double → sqrtsd；long double → fsqrt</w:t>
+        <w:t>float：SQRTSS    double：SQRTSD    long double：FSQRT</w:t>
         <w:br/>
-        <w:t>libm 的 __sqrt_finite（double）：</w:t>
+        <w:t>libm 的 __sqrt_finite：sqrtsd %xmm0, %xmm0</w:t>
         <w:br/>
-        <w:t xml:space="preserve">    sqrtsd %xmm0, %xmm0</w:t>
+        <w:t>libm 的 __sqrtl_finite：fsqrt</w:t>
+      </w:r>
+    </w:p>
+    <w:p>
+      <w:pPr>
+        <w:keepNext w:val="0"/>
+      </w:pPr>
+      <w:r>
+        <w:t>硬體路徑將平方根計算交給 CPU；反組譯不能證明 CPU 內部採哪種迭代算法。作為軟體實作參考，glibc 的通用 double sqrt 先將 x 拆成 s×2^(2k)，把 s 調整至約 [0.5,2)，查表估計 t≈1/√s，再以 e=1-s×t² 和多項式修正 t。接著算 s×t、補償誤差、檢查乘積以決定捨入，最後乘回 2^k；極小值先放大再計算。這份原始碼未匹配本機套件版本，僅作算法參考，本機執行路徑由硬體指令證明。[5a]</w:t>
         <w:br/>
-        <w:t xml:space="preserve">    ret</w:t>
         <w:br/>
-        <w:t>libm 的 __sqrtl_finite（long double）：fsqrt</w:t>
+        <w:t>兩條路徑共 30 組輸入／型態的數值及錯誤紀錄一致。sqrt(4)=2，能精確表示；sqrt(2) 只能近似，如下表；sqrt(-1) 得到 NaN，errno=33 且 FE_INVALID=true。sqrt(-0) 保留負號，正無窮大與 NaN 分別得到正無窮大與 NaN。</w:t>
       </w:r>
     </w:p>
     <w:tbl>
@@ -3200,7 +2644,7 @@
               <w:rPr>
                 <w:b/>
                 <w:color w:val="000000"/>
-                <w:sz w:val="20"/>
+                <w:sz w:val="22"/>
               </w:rPr>
               <w:t>型態</w:t>
             </w:r>
@@ -3217,6 +2661,7 @@
               <w:rPr>
                 <w:b/>
                 <w:color w:val="000000"/>
+                <w:sz w:val="22"/>
               </w:rPr>
               <w:t>CPU 指令／負數處理</w:t>
             </w:r>
@@ -3237,7 +2682,7 @@
               <w:rPr>
                 <w:b/>
                 <w:color w:val="000000"/>
-                <w:sz w:val="20"/>
+                <w:sz w:val="22"/>
               </w:rPr>
               <w:t>sqrt(2) 實測</w:t>
             </w:r>
@@ -3263,7 +2708,7 @@
             <w:r>
               <w:rPr>
                 <w:b w:val="0"/>
-                <w:sz w:val="20"/>
+                <w:sz w:val="22"/>
               </w:rPr>
               <w:t>float</w:t>
             </w:r>
@@ -3283,7 +2728,7 @@
             <w:r>
               <w:rPr>
                 <w:b w:val="0"/>
-                <w:sz w:val="20"/>
+                <w:sz w:val="22"/>
               </w:rPr>
               <w:t>SQRTSS／sqrtf</w:t>
             </w:r>
@@ -3303,7 +2748,7 @@
             <w:r>
               <w:rPr>
                 <w:b w:val="0"/>
-                <w:sz w:val="20"/>
+                <w:sz w:val="22"/>
               </w:rPr>
               <w:t>1.41421354</w:t>
             </w:r>
@@ -3329,7 +2774,7 @@
             <w:r>
               <w:rPr>
                 <w:b w:val="0"/>
-                <w:sz w:val="20"/>
+                <w:sz w:val="22"/>
               </w:rPr>
               <w:t>double</w:t>
             </w:r>
@@ -3349,7 +2794,7 @@
             <w:r>
               <w:rPr>
                 <w:b w:val="0"/>
-                <w:sz w:val="20"/>
+                <w:sz w:val="22"/>
               </w:rPr>
               <w:t>SQRTSD／sqrt</w:t>
             </w:r>
@@ -3369,7 +2814,7 @@
             <w:r>
               <w:rPr>
                 <w:b w:val="0"/>
-                <w:sz w:val="20"/>
+                <w:sz w:val="22"/>
               </w:rPr>
               <w:t>1.4142135623730951</w:t>
             </w:r>
@@ -3395,7 +2840,7 @@
             <w:r>
               <w:rPr>
                 <w:b w:val="0"/>
-                <w:sz w:val="20"/>
+                <w:sz w:val="22"/>
               </w:rPr>
               <w:t>long double</w:t>
             </w:r>
@@ -3415,7 +2860,7 @@
             <w:r>
               <w:rPr>
                 <w:b w:val="0"/>
-                <w:sz w:val="20"/>
+                <w:sz w:val="22"/>
               </w:rPr>
               <w:t>FSQRT／sqrtl</w:t>
             </w:r>
@@ -3435,7 +2880,7 @@
             <w:r>
               <w:rPr>
                 <w:b w:val="0"/>
-                <w:sz w:val="20"/>
+                <w:sz w:val="22"/>
               </w:rPr>
               <w:t>1.41421356237309504876</w:t>
             </w:r>
@@ -3443,17 +2888,6 @@
         </w:tc>
       </w:tr>
     </w:tbl>
-    <w:p>
-      <w:pPr>
-        <w:keepNext w:val="0"/>
-      </w:pPr>
-      <w:r>
-        <w:t>兩版共 30 組輸入／型態，數值與錯誤紀錄全部一致。sqrt(4)=2，能精確表示；sqrt(2) 只能近似；sqrt(-1) 得到 NaN，errno=33 且 FE_INVALID=true；sqrt(-0) 保留負號。表中保留 sqrt(2) 的精度差異。</w:t>
-        <w:br/>
-        <w:br/>
-        <w:t>硬體路徑將平方根計算交給 CPU；反組譯不能證明 CPU 內部採哪種迭代算法。作為軟體實作參考，glibc 的通用 double sqrt 先將 x 拆成 s×2^(2k)，把 s 調整至約 [0.5,2)，查表估計 t≈1/√s，再以 e=1-s×t² 和多項式修正 t。接著算 s×t、補償誤差、檢查乘積以決定捨入，最後乘回 2^k；極小值先放大再計算。這份原始碼未匹配本機套件版本，僅作算法參考，本機執行路徑由上述硬體指令證明。[5a]</w:t>
-      </w:r>
-    </w:p>
     <w:p>
       <w:pPr>
         <w:pStyle w:val="1"/>
@@ -3483,22 +2917,7 @@
         </w:rPr>
       </w:pPr>
       <w:r>
-        <w:t>同一程式僅切換 -fno-fast-math／-ffast-math，其他參數相同：-std=c++20 -O3 -Wall -Wextra -fno-lto -ffp-contract=off。兩版都在執行時輸入 a=1e16、b=-1e16、c=1，比較 (a+b)+c 與 a+(b+c)，另外測 NaN 的 x!=x。</w:t>
-      </w:r>
-    </w:p>
-    <w:p>
-      <w:pPr>
-        <w:keepLines/>
-        <w:spacing w:after="100" w:before="0"/>
-      </w:pPr>
-      <w:r>
-        <w:t>來源：experiments/q3_fast_math/main.cpp、operations.cpp。</w:t>
-        <w:br/>
-        <w:t>編譯：bash scripts/build_all.sh</w:t>
-        <w:br/>
-        <w:t>執行：./build/all/q3_strict 1e16 -1e16 1</w:t>
-        <w:br/>
-        <w:t xml:space="preserve">      ./build/all/q3_fast 1e16 -1e16 1</w:t>
+        <w:t>同一程式與相同輸入僅切換 -fno-fast-math／-ffast-math，皆使用 GCC 16.2.0、-O3，並關閉 LTO 與 FMA。執行時提供 a=1e16、b=-1e16、c=1，比較 (a+b)+c 與 a+(b+c)，另外測 NaN 的 x!=x。</w:t>
       </w:r>
     </w:p>
     <w:tbl>
@@ -3542,7 +2961,7 @@
               <w:rPr>
                 <w:b/>
                 <w:color w:val="000000"/>
-                <w:sz w:val="20"/>
+                <w:sz w:val="22"/>
               </w:rPr>
               <w:t>觀察</w:t>
             </w:r>
@@ -3559,6 +2978,7 @@
               <w:rPr>
                 <w:b/>
                 <w:color w:val="000000"/>
+                <w:sz w:val="22"/>
               </w:rPr>
               <w:t>關閉 fast-math</w:t>
             </w:r>
@@ -3575,6 +2995,7 @@
               <w:rPr>
                 <w:b/>
                 <w:color w:val="000000"/>
+                <w:sz w:val="22"/>
               </w:rPr>
               <w:t>開啟 fast-math</w:t>
             </w:r>
@@ -3600,7 +3021,7 @@
             <w:r>
               <w:rPr>
                 <w:b w:val="0"/>
-                <w:sz w:val="20"/>
+                <w:sz w:val="22"/>
               </w:rPr>
               <w:t>(a+b)+c</w:t>
             </w:r>
@@ -3620,7 +3041,7 @@
             <w:r>
               <w:rPr>
                 <w:b w:val="0"/>
-                <w:sz w:val="20"/>
+                <w:sz w:val="22"/>
               </w:rPr>
               <w:t>1</w:t>
             </w:r>
@@ -3640,7 +3061,7 @@
             <w:r>
               <w:rPr>
                 <w:b w:val="0"/>
-                <w:sz w:val="20"/>
+                <w:sz w:val="22"/>
               </w:rPr>
               <w:t>0</w:t>
             </w:r>
@@ -3666,7 +3087,7 @@
             <w:r>
               <w:rPr>
                 <w:b w:val="0"/>
-                <w:sz w:val="20"/>
+                <w:sz w:val="22"/>
               </w:rPr>
               <w:t>a+(b+c)</w:t>
             </w:r>
@@ -3686,7 +3107,7 @@
             <w:r>
               <w:rPr>
                 <w:b w:val="0"/>
-                <w:sz w:val="20"/>
+                <w:sz w:val="22"/>
               </w:rPr>
               <w:t>0</w:t>
             </w:r>
@@ -3706,7 +3127,7 @@
             <w:r>
               <w:rPr>
                 <w:b w:val="0"/>
-                <w:sz w:val="20"/>
+                <w:sz w:val="22"/>
               </w:rPr>
               <w:t>0</w:t>
             </w:r>
@@ -3732,7 +3153,7 @@
             <w:r>
               <w:rPr>
                 <w:b w:val="0"/>
-                <w:sz w:val="20"/>
+                <w:sz w:val="22"/>
               </w:rPr>
               <w:t>NaN 的 x!=x</w:t>
             </w:r>
@@ -3752,7 +3173,7 @@
             <w:r>
               <w:rPr>
                 <w:b w:val="0"/>
-                <w:sz w:val="20"/>
+                <w:sz w:val="22"/>
               </w:rPr>
               <w:t>true</w:t>
             </w:r>
@@ -3772,7 +3193,7 @@
             <w:r>
               <w:rPr>
                 <w:b w:val="0"/>
-                <w:sz w:val="20"/>
+                <w:sz w:val="22"/>
               </w:rPr>
               <w:t>false</w:t>
             </w:r>
@@ -3792,6 +3213,10 @@
           </w:tcPr>
           <w:p>
             <w:r>
+              <w:rPr>
+                <w:b w:val="0"/>
+                <w:sz w:val="22"/>
+              </w:rPr>
               <w:t>一般數值對照組</w:t>
             </w:r>
           </w:p>
@@ -3810,7 +3235,7 @@
             <w:r>
               <w:rPr>
                 <w:b w:val="0"/>
-                <w:sz w:val="20"/>
+                <w:sz w:val="22"/>
               </w:rPr>
               <w:t>6</w:t>
             </w:r>
@@ -3830,7 +3255,7 @@
             <w:r>
               <w:rPr>
                 <w:b w:val="0"/>
-                <w:sz w:val="20"/>
+                <w:sz w:val="22"/>
               </w:rPr>
               <w:t>6</w:t>
             </w:r>
@@ -3851,7 +3276,7 @@
       <w:r>
         <w:drawing>
           <wp:inline xmlns:a="http://schemas.openxmlformats.org/drawingml/2006/main" xmlns:pic="http://schemas.openxmlformats.org/drawingml/2006/picture">
-            <wp:extent cx="3931920" cy="2405477"/>
+            <wp:extent cx="4389120" cy="2685183"/>
             <wp:docPr id="12" name="Picture 12"/>
             <wp:cNvGraphicFramePr>
               <a:graphicFrameLocks noChangeAspect="1"/>
@@ -3873,7 +3298,7 @@
                   <pic:spPr>
                     <a:xfrm>
                       <a:off x="0" y="0"/>
-                      <a:ext cx="3931920" cy="2405477"/>
+                      <a:ext cx="4389120" cy="2685183"/>
                     </a:xfrm>
                     <a:prstGeom prst="rect"/>
                   </pic:spPr>
@@ -3890,9 +3315,9 @@
       </w:pPr>
       <w:r>
         <w:rPr>
-          <w:sz w:val="18"/>
+          <w:sz w:val="20"/>
         </w:rPr>
-        <w:t>圖 3-1 strict／fast 在相同輸入下的輸出。</w:t>
+        <w:t>圖 3-1 相同輸入下，開啟 fast-math 後 left_grouped 由 1 變為 0，NaN 判斷由 true 變為 false。</w:t>
       </w:r>
     </w:p>
     <w:p>
@@ -3930,30 +3355,6 @@
         <w:t>若「四捨五入」指中點一律進位，這個說法不精確。測試 printf("%.9f") 與 std::fixed &lt;&lt; std::setprecision(9)，選用可被 double 精確儲存的 1/1024=0.0009765625；它正好位於九位小數的中點，不混入字面值轉換誤差。再測兩側鄰近值、負值與四種捨入方式。</w:t>
       </w:r>
     </w:p>
-    <w:p>
-      <w:pPr>
-        <w:keepLines/>
-        <w:spacing w:after="100" w:before="0"/>
-      </w:pPr>
-      <w:r>
-        <w:rPr>
-          <w:sz w:val="20"/>
-        </w:rPr>
-        <w:t>// experiments/q4_formatting/main.cpp</w:t>
-        <w:br/>
-        <w:t>double tie = std::ldexp(1.0, -10);</w:t>
-        <w:br/>
-        <w:t>std::fesetround(FE_TONEAREST);</w:t>
-        <w:br/>
-        <w:t>printf("%.9f\n", tie);</w:t>
-        <w:br/>
-        <w:t>std::cout &lt;&lt; std::fixed &lt;&lt; std::setprecision(9) &lt;&lt; tie;</w:t>
-        <w:br/>
-        <w:t>// 建置：bash scripts/build_all.sh</w:t>
-        <w:br/>
-        <w:t>// 執行：./build/all/q4_formatting 0.0009765625</w:t>
-      </w:r>
-    </w:p>
     <w:tbl>
       <w:tblPr>
         <w:tblW w:type="auto" w:w="0"/>
@@ -3995,7 +3396,7 @@
               <w:rPr>
                 <w:b/>
                 <w:color w:val="000000"/>
-                <w:sz w:val="20"/>
+                <w:sz w:val="22"/>
               </w:rPr>
               <w:t>模式</w:t>
             </w:r>
@@ -4012,6 +3413,7 @@
               <w:rPr>
                 <w:b/>
                 <w:color w:val="000000"/>
+                <w:sz w:val="22"/>
               </w:rPr>
               <w:t>正中點：兩種輸出</w:t>
             </w:r>
@@ -4028,6 +3430,7 @@
               <w:rPr>
                 <w:b/>
                 <w:color w:val="000000"/>
+                <w:sz w:val="22"/>
               </w:rPr>
               <w:t>負中點：兩種輸出</w:t>
             </w:r>
@@ -4047,6 +3450,10 @@
           </w:tcPr>
           <w:p>
             <w:r>
+              <w:rPr>
+                <w:b w:val="0"/>
+                <w:sz w:val="22"/>
+              </w:rPr>
               <w:t>最接近值</w:t>
             </w:r>
           </w:p>
@@ -4065,7 +3472,7 @@
             <w:r>
               <w:rPr>
                 <w:b w:val="0"/>
-                <w:sz w:val="20"/>
+                <w:sz w:val="22"/>
               </w:rPr>
               <w:t>0.000976562</w:t>
             </w:r>
@@ -4085,7 +3492,7 @@
             <w:r>
               <w:rPr>
                 <w:b w:val="0"/>
-                <w:sz w:val="20"/>
+                <w:sz w:val="22"/>
               </w:rPr>
               <w:t>-0.000976562</w:t>
             </w:r>
@@ -4105,6 +3512,10 @@
           </w:tcPr>
           <w:p>
             <w:r>
+              <w:rPr>
+                <w:b w:val="0"/>
+                <w:sz w:val="22"/>
+              </w:rPr>
               <w:t>向上</w:t>
             </w:r>
           </w:p>
@@ -4123,7 +3534,7 @@
             <w:r>
               <w:rPr>
                 <w:b w:val="0"/>
-                <w:sz w:val="20"/>
+                <w:sz w:val="22"/>
               </w:rPr>
               <w:t>0.000976563</w:t>
             </w:r>
@@ -4143,7 +3554,7 @@
             <w:r>
               <w:rPr>
                 <w:b w:val="0"/>
-                <w:sz w:val="20"/>
+                <w:sz w:val="22"/>
               </w:rPr>
               <w:t>-0.000976562</w:t>
             </w:r>
@@ -4163,6 +3574,10 @@
           </w:tcPr>
           <w:p>
             <w:r>
+              <w:rPr>
+                <w:b w:val="0"/>
+                <w:sz w:val="22"/>
+              </w:rPr>
               <w:t>向下</w:t>
             </w:r>
           </w:p>
@@ -4181,7 +3596,7 @@
             <w:r>
               <w:rPr>
                 <w:b w:val="0"/>
-                <w:sz w:val="20"/>
+                <w:sz w:val="22"/>
               </w:rPr>
               <w:t>0.000976562</w:t>
             </w:r>
@@ -4201,7 +3616,7 @@
             <w:r>
               <w:rPr>
                 <w:b w:val="0"/>
-                <w:sz w:val="20"/>
+                <w:sz w:val="22"/>
               </w:rPr>
               <w:t>-0.000976563</w:t>
             </w:r>
@@ -4221,6 +3636,10 @@
           </w:tcPr>
           <w:p>
             <w:r>
+              <w:rPr>
+                <w:b w:val="0"/>
+                <w:sz w:val="22"/>
+              </w:rPr>
               <w:t>朝零</w:t>
             </w:r>
           </w:p>
@@ -4239,7 +3658,7 @@
             <w:r>
               <w:rPr>
                 <w:b w:val="0"/>
-                <w:sz w:val="20"/>
+                <w:sz w:val="22"/>
               </w:rPr>
               <w:t>0.000976562</w:t>
             </w:r>
@@ -4259,7 +3678,7 @@
             <w:r>
               <w:rPr>
                 <w:b w:val="0"/>
-                <w:sz w:val="20"/>
+                <w:sz w:val="22"/>
               </w:rPr>
               <w:t>-0.000976562</w:t>
             </w:r>
@@ -4278,57 +3697,6 @@
       </w:pPr>
       <w:r>
         <w:t>在最接近值模式下，兩種輸出都是 0.000976562，第十位的 5 沒有讓第九位進位，已構成反例。兩側鄰近值分別輸出 0.000976562、0.000976563；四模式共 16 組比較，兩種輸出均一致。</w:t>
-      </w:r>
-    </w:p>
-    <w:p>
-      <w:pPr>
-        <w:keepNext/>
-        <w:spacing w:after="80"/>
-      </w:pPr>
-      <w:r>
-        <w:drawing>
-          <wp:inline xmlns:a="http://schemas.openxmlformats.org/drawingml/2006/main" xmlns:pic="http://schemas.openxmlformats.org/drawingml/2006/picture">
-            <wp:extent cx="3657600" cy="3097819"/>
-            <wp:docPr id="15" name="Picture 15"/>
-            <wp:cNvGraphicFramePr>
-              <a:graphicFrameLocks noChangeAspect="1"/>
-            </wp:cNvGraphicFramePr>
-            <a:graphic>
-              <a:graphicData uri="http://schemas.openxmlformats.org/drawingml/2006/picture">
-                <pic:pic>
-                  <pic:nvPicPr>
-                    <pic:cNvPr id="0" name="Screenshot 2026-10-04 203035.png"/>
-                    <pic:cNvPicPr/>
-                  </pic:nvPicPr>
-                  <pic:blipFill>
-                    <a:blip r:embed="rId22"/>
-                    <a:stretch>
-                      <a:fillRect/>
-                    </a:stretch>
-                  </pic:blipFill>
-                  <pic:spPr>
-                    <a:xfrm>
-                      <a:off x="0" y="0"/>
-                      <a:ext cx="3657600" cy="3097819"/>
-                    </a:xfrm>
-                    <a:prstGeom prst="rect"/>
-                  </pic:spPr>
-                </pic:pic>
-              </a:graphicData>
-            </a:graphic>
-          </wp:inline>
-        </w:drawing>
-      </w:r>
-    </w:p>
-    <w:p>
-      <w:pPr>
-        <w:spacing w:after="100" w:before="0"/>
-      </w:pPr>
-      <w:r>
-        <w:rPr>
-          <w:sz w:val="18"/>
-        </w:rPr>
-        <w:t>圖 4-1 中點、鄰近值與不同捨入方式的輸出。</w:t>
       </w:r>
     </w:p>
     <w:p>
@@ -4363,7 +3731,7 @@
         </w:rPr>
       </w:pPr>
       <w:r>
-        <w:t>同一 long double 算式 (2^53+1)-2^53，在 WSL x86-64 得到 1，在 Apple M4 arm64 得到 0，數學答案是 1。兩台都使用 GNU GCC release 16.2.0、相同來源與逐字相同參數，且計算前設定 FE_TONEAREST。scripts/verify_q5_pair.py 核對原始碼雜湊、編譯器系列、release 與參數，四項皆 MATCH。WSL 為本地建置、Mac 為 Homebrew；這是相同 release 的跨平台編譯器，並非同一份編譯器二進位檔。</w:t>
+        <w:t>同一 long double 算式 (2^53+1)-2^53，在 WSL x86-64 得到 1，在 Apple M4 arm64 得到 0，數學答案是 1。兩台使用 GNU GCC release 16.2.0，已確認來源與編譯參數一致，計算前均設定 FE_TONEAREST。WSL 為本地建置、Mac 為 Homebrew，屬相同 release 的跨平台編譯器，並非同一份編譯器二進位檔。</w:t>
       </w:r>
     </w:p>
     <w:p>
@@ -4375,19 +3743,15 @@
         </w:rPr>
       </w:pPr>
       <w:r>
-        <w:t>// experiments/q5_portability/operations.cpp</w:t>
+        <w:rPr>
+          <w:rFonts w:ascii="Consolas" w:hAnsi="Consolas"/>
+          <w:sz w:val="22"/>
+        </w:rPr>
+        <w:t>long double sum = a + b;</w:t>
         <w:br/>
-        <w:t>long double increment_long_double(long double a, long double b) {</w:t>
+        <w:t>asm volatile("" : "+m"(sum) : : "memory");</w:t>
         <w:br/>
-        <w:t xml:space="preserve">    long double sum = a + b;</w:t>
-        <w:br/>
-        <w:t xml:space="preserve">    asm volatile("" : "+m"(sum) : : "memory");</w:t>
-        <w:br/>
-        <w:t xml:space="preserve">    return sum - a;</w:t>
-        <w:br/>
-        <w:t>}</w:t>
-        <w:br/>
-        <w:t>// a=2^53、b=1；中間答案先存回 long double，再做減法。</w:t>
+        <w:t>return sum - a;</w:t>
       </w:r>
     </w:p>
     <w:p>
@@ -4436,9 +3800,9 @@
       </w:pPr>
       <w:r>
         <w:rPr>
-          <w:sz w:val="18"/>
+          <w:sz w:val="20"/>
         </w:rPr>
-        <w:t>圖 5-1 Windows／WSL：long_double_increment=1。</w:t>
+        <w:t>圖 5-1 WSL：long double 有 64 個有效位，增量計算得到 1。</w:t>
       </w:r>
     </w:p>
     <w:p>
@@ -4450,7 +3814,7 @@
         </w:rPr>
       </w:pPr>
       <w:r>
-        <w:t>兩台編譯與執行：CXX=g++-16 bash scripts/run_q5.sh run。相同參數：-std=c++20 -Wall -Wextra -fno-lto -ffp-contract=off -O2 -fno-fast-math -frounding-math。</w:t>
+        <w:t>兩台均以 -O2 編譯，關閉 fast-math、FMA 與 LTO，保留 -frounding-math。上面的 GCC 擴充要求中間答案存回平台的 long double 精度，再做減法；輸入 a=2^53、b=1。</w:t>
       </w:r>
     </w:p>
     <w:tbl>
@@ -4492,7 +3856,7 @@
               <w:rPr>
                 <w:b/>
                 <w:color w:val="000000"/>
-                <w:sz w:val="20"/>
+                <w:sz w:val="22"/>
               </w:rPr>
               <w:t>觀察</w:t>
             </w:r>
@@ -4513,7 +3877,7 @@
               <w:rPr>
                 <w:b/>
                 <w:color w:val="000000"/>
-                <w:sz w:val="20"/>
+                <w:sz w:val="22"/>
               </w:rPr>
               <w:t xml:space="preserve">Windows／WSL </w:t>
             </w:r>
@@ -4534,7 +3898,7 @@
               <w:rPr>
                 <w:b/>
                 <w:color w:val="000000"/>
-                <w:sz w:val="20"/>
+                <w:sz w:val="22"/>
               </w:rPr>
               <w:t xml:space="preserve">Apple M4 Mac </w:t>
             </w:r>
@@ -4552,6 +3916,10 @@
           </w:tcPr>
           <w:p>
             <w:r>
+              <w:rPr>
+                <w:b w:val="0"/>
+                <w:sz w:val="22"/>
+              </w:rPr>
               <w:t>儲存空間／有效位數</w:t>
             </w:r>
           </w:p>
@@ -4569,7 +3937,7 @@
             <w:r>
               <w:rPr>
                 <w:b w:val="0"/>
-                <w:sz w:val="20"/>
+                <w:sz w:val="22"/>
               </w:rPr>
               <w:t>16 bytes／64 bits</w:t>
             </w:r>
@@ -4588,7 +3956,7 @@
             <w:r>
               <w:rPr>
                 <w:b w:val="0"/>
-                <w:sz w:val="20"/>
+                <w:sz w:val="22"/>
               </w:rPr>
               <w:t>8 bytes／53 bits</w:t>
             </w:r>
@@ -4612,7 +3980,7 @@
             <w:r>
               <w:rPr>
                 <w:b w:val="0"/>
-                <w:sz w:val="20"/>
+                <w:sz w:val="22"/>
               </w:rPr>
               <w:t>max_exponent</w:t>
             </w:r>
@@ -4631,7 +3999,7 @@
             <w:r>
               <w:rPr>
                 <w:b w:val="0"/>
-                <w:sz w:val="20"/>
+                <w:sz w:val="22"/>
               </w:rPr>
               <w:t>16384</w:t>
             </w:r>
@@ -4650,7 +4018,7 @@
             <w:r>
               <w:rPr>
                 <w:b w:val="0"/>
-                <w:sz w:val="20"/>
+                <w:sz w:val="22"/>
               </w:rPr>
               <w:t>1024</w:t>
             </w:r>
@@ -4668,6 +4036,10 @@
           </w:tcPr>
           <w:p>
             <w:r>
+              <w:rPr>
+                <w:b w:val="0"/>
+                <w:sz w:val="22"/>
+              </w:rPr>
               <w:t>捨入方式</w:t>
             </w:r>
           </w:p>
@@ -4685,7 +4057,7 @@
             <w:r>
               <w:rPr>
                 <w:b w:val="0"/>
-                <w:sz w:val="20"/>
+                <w:sz w:val="22"/>
               </w:rPr>
               <w:t>FE_TONEAREST</w:t>
             </w:r>
@@ -4704,7 +4076,7 @@
             <w:r>
               <w:rPr>
                 <w:b w:val="0"/>
-                <w:sz w:val="20"/>
+                <w:sz w:val="22"/>
               </w:rPr>
               <w:t>FE_TONEAREST</w:t>
             </w:r>
@@ -4728,7 +4100,7 @@
             <w:r>
               <w:rPr>
                 <w:b w:val="0"/>
-                <w:sz w:val="20"/>
+                <w:sz w:val="22"/>
               </w:rPr>
               <w:t>(2^53+1)-2^53</w:t>
             </w:r>
@@ -4747,7 +4119,7 @@
             <w:r>
               <w:rPr>
                 <w:b w:val="0"/>
-                <w:sz w:val="20"/>
+                <w:sz w:val="22"/>
               </w:rPr>
               <w:t>1，hex 0x8p-3</w:t>
             </w:r>
@@ -4766,7 +4138,7 @@
             <w:r>
               <w:rPr>
                 <w:b w:val="0"/>
-                <w:sz w:val="20"/>
+                <w:sz w:val="22"/>
               </w:rPr>
               <w:t>0，hex 0x0p+0</w:t>
             </w:r>
@@ -4817,9 +4189,9 @@
     <w:p>
       <w:r>
         <w:rPr>
-          <w:sz w:val="18"/>
+          <w:sz w:val="20"/>
         </w:rPr>
-        <w:t>圖 5-2 Mac：long_double_increment=0。</w:t>
+        <w:t>圖 5-2 Apple M4 Mac：long double 有 53 個有效位，相同增量計算得到 0。</w:t>
       </w:r>
     </w:p>
     <w:p>
@@ -4827,7 +4199,7 @@
         <w:spacing w:after="100" w:before="0"/>
       </w:pPr>
       <w:r>
-        <w:t>兩端 assembly 都保留加法、存回與減法：WSL 為 FADD／FSTPT／FLDT／FSUBP，Mac 為 FADD／STR／LDR／FSUB。asm 是 GCC 支援的擴充，要求中間答案存回平台的 long double。輸入有限，沒有溢位、越界或未初始化讀取，差異來自平台規定的精度。</w:t>
+        <w:t>兩端 assembly 都保留加法、存回與減法：WSL 為 FADD／FSTPT／FLDT／FSUBP，Mac 為 FADD／STR／LDR／FSUB。輸入有限，沒有溢位、越界或未初始化讀取；不同答案不是由刪除運算或未定義行為造成。</w:t>
       </w:r>
     </w:p>
     <w:p>
@@ -4863,7 +4235,7 @@
         </w:rPr>
       </w:pPr>
       <w:r>
-        <w:t>浮點數能用於科學計算與物理碰撞，但要先決定可接受的誤差。Q1 顯示精度、加總順序與運算種類會影響答案及速度；Q2 確認 std::sqrt 在本機可走硬體指令；Q3 顯示 fast-math 可能改答案；Q4 的九位小數輸出不等於逢五進一；Q5 則證明相同 long double 名稱在兩平台可有不同精度。實作時應依值域選型態、依用途設定絕對或相對誤差容忍度，並保留足夠位數供檢查；跨平台時也要核對型態規格。</w:t>
+        <w:t>浮點數的安全性取決於能否掌握誤差，而不是只選一個較大的型態。有限精度讓大數旁的小增量可能消失，也讓運算順序影響答案；速度則需結合運算種類與本機指令實測。函式可以由硬體或函式庫實作，編譯器最佳化也可能改變數值行為。輸出到固定小數位只是格式化，不能代替精度檢查；跨平台時，同名型態還可能有不同精度。因此科學計算與碰撞判定應先訂誤差容忍度，再選型態及計算方式，並確認編譯選項、捨入規則與平台規格。</w:t>
       </w:r>
     </w:p>
     <w:p>
@@ -4887,10 +4259,6 @@
         </w:rPr>
       </w:pPr>
       <w:r>
-        <w:t>程式：experiments/q6_extra/main.cpp、operations.cpp。</w:t>
-        <w:br/>
-        <w:t>建置：bash scripts/build_all.sh；執行：./build/all/q6_extra。</w:t>
-        <w:br/>
         <w:t>本次採最接近值模式；讀到 SSE 的 FTZ／DAZ=false，未更動設定。這項紀錄不代表 x87 的控制狀態。</w:t>
       </w:r>
     </w:p>
@@ -4931,7 +4299,7 @@
               <w:rPr>
                 <w:b/>
                 <w:color w:val="000000"/>
-                <w:sz w:val="20"/>
+                <w:sz w:val="22"/>
               </w:rPr>
               <w:t>算式</w:t>
             </w:r>
@@ -4950,7 +4318,7 @@
               <w:rPr>
                 <w:b/>
                 <w:color w:val="000000"/>
-                <w:sz w:val="20"/>
+                <w:sz w:val="22"/>
               </w:rPr>
               <w:t>三型態結果分類</w:t>
             </w:r>
@@ -4969,7 +4337,7 @@
               <w:rPr>
                 <w:b/>
                 <w:color w:val="000000"/>
-                <w:sz w:val="20"/>
+                <w:sz w:val="22"/>
               </w:rPr>
               <w:t>UF／inexact</w:t>
             </w:r>
@@ -4992,7 +4360,7 @@
             <w:r>
               <w:rPr>
                 <w:b w:val="0"/>
-                <w:sz w:val="20"/>
+                <w:sz w:val="22"/>
               </w:rPr>
               <w:t>min_normal × 0.5</w:t>
             </w:r>
@@ -5010,7 +4378,7 @@
             <w:r>
               <w:rPr>
                 <w:b w:val="0"/>
-                <w:sz w:val="20"/>
+                <w:sz w:val="22"/>
               </w:rPr>
               <w:t>subnormal（精確）</w:t>
             </w:r>
@@ -5028,7 +4396,7 @@
             <w:r>
               <w:rPr>
                 <w:b w:val="0"/>
-                <w:sz w:val="20"/>
+                <w:sz w:val="22"/>
               </w:rPr>
               <w:t>false／false</w:t>
             </w:r>
@@ -5051,7 +4419,7 @@
             <w:r>
               <w:rPr>
                 <w:b w:val="0"/>
-                <w:sz w:val="20"/>
+                <w:sz w:val="22"/>
               </w:rPr>
               <w:t>denorm_min × 0.5</w:t>
             </w:r>
@@ -5069,7 +4437,7 @@
             <w:r>
               <w:rPr>
                 <w:b w:val="0"/>
-                <w:sz w:val="20"/>
+                <w:sz w:val="22"/>
               </w:rPr>
               <w:t>zero</w:t>
             </w:r>
@@ -5087,7 +4455,7 @@
             <w:r>
               <w:rPr>
                 <w:b w:val="0"/>
-                <w:sz w:val="20"/>
+                <w:sz w:val="22"/>
               </w:rPr>
               <w:t>true／true</w:t>
             </w:r>
@@ -5110,7 +4478,7 @@
             <w:r>
               <w:rPr>
                 <w:b w:val="0"/>
-                <w:sz w:val="20"/>
+                <w:sz w:val="22"/>
               </w:rPr>
               <w:t>denorm_min × 1</w:t>
             </w:r>
@@ -5128,7 +4496,7 @@
             <w:r>
               <w:rPr>
                 <w:b w:val="0"/>
-                <w:sz w:val="20"/>
+                <w:sz w:val="22"/>
               </w:rPr>
               <w:t>subnormal（保留）</w:t>
             </w:r>
@@ -5146,7 +4514,7 @@
             <w:r>
               <w:rPr>
                 <w:b w:val="0"/>
-                <w:sz w:val="20"/>
+                <w:sz w:val="22"/>
               </w:rPr>
               <w:t>false／false</w:t>
             </w:r>
@@ -5193,7 +4561,7 @@
         </w:rPr>
       </w:pPr>
       <w:r>
-        <w:t>學生提供設備資訊，執行 Windows／WSL Q0～Q6 與 Mac Q5、觀察並截圖。Codex 協助程式、環境設定、準備階段測試、資料查閱及報告整理。報告使用正式執行輸出，學生需確認數據並理解解釋。</w:t>
+        <w:t>學生親自執行 Windows／WSL Q0～Q6 與 Mac Q5 的平台比較，觀察、截圖並核對實驗結果。Codex／生成式 AI 協助程式撰寫與檢查、環境設定、準備階段測試、資料查閱、assembly 解讀及報告整理。</w:t>
       </w:r>
     </w:p>
     <w:p>
@@ -5214,7 +4582,7 @@
         </w:rPr>
       </w:pPr>
       <w:r>
-        <w:t>規格與算法參考下列資料；執行路徑另以本機輸出及 assembly 核對。查閱日期：2026/10/04；本次整理於 2026/10/05 再核對 [1]、[2]、[5a]、[6]。</w:t>
+        <w:t>規格與算法參考下列資料，執行行為以本機輸出及指令核對。</w:t>
       </w:r>
     </w:p>
     <w:p>
@@ -5223,7 +4591,7 @@
       </w:pPr>
       <w:r>
         <w:rPr>
-          <w:sz w:val="18"/>
+          <w:sz w:val="20"/>
         </w:rPr>
         <w:t>[1] C++ working draft c.math</w:t>
         <w:br/>
@@ -5236,7 +4604,7 @@
       </w:pPr>
       <w:r>
         <w:rPr>
-          <w:sz w:val="18"/>
+          <w:sz w:val="20"/>
         </w:rPr>
         <w:t>[2] GCC 16.2.0 Optimize Options</w:t>
         <w:br/>
@@ -5249,7 +4617,7 @@
       </w:pPr>
       <w:r>
         <w:rPr>
-          <w:sz w:val="18"/>
+          <w:sz w:val="20"/>
         </w:rPr>
         <w:t>[3] glibc Floating Point Parameters</w:t>
         <w:br/>
@@ -5262,7 +4630,7 @@
       </w:pPr>
       <w:r>
         <w:rPr>
-          <w:sz w:val="18"/>
+          <w:sz w:val="20"/>
         </w:rPr>
         <w:t>[4] Intel SDM 官方入口</w:t>
         <w:br/>
@@ -5275,7 +4643,7 @@
       </w:pPr>
       <w:r>
         <w:rPr>
-          <w:sz w:val="18"/>
+          <w:sz w:val="20"/>
         </w:rPr>
         <w:t>[5] glibc Exponents and Logarithms</w:t>
         <w:br/>
@@ -5288,7 +4656,7 @@
       </w:pPr>
       <w:r>
         <w:rPr>
-          <w:sz w:val="18"/>
+          <w:sz w:val="20"/>
         </w:rPr>
         <w:t>[5a] glibc generic double e_sqrt.c</w:t>
         <w:br/>
@@ -5301,7 +4669,7 @@
       </w:pPr>
       <w:r>
         <w:rPr>
-          <w:sz w:val="18"/>
+          <w:sz w:val="20"/>
         </w:rPr>
         <w:t>[5b] glibc Rounding Modes</w:t>
         <w:br/>
@@ -5314,7 +4682,7 @@
       </w:pPr>
       <w:r>
         <w:rPr>
-          <w:sz w:val="18"/>
+          <w:sz w:val="20"/>
         </w:rPr>
         <w:t>[6] Apple Writing ARM64 code</w:t>
         <w:br/>
@@ -5943,12 +5311,12 @@
     <w:qFormat/>
     <w:rsid w:val="00FC693F"/>
     <w:pPr>
-      <w:spacing w:after="140" w:line="252" w:lineRule="auto"/>
+      <w:spacing w:after="140" w:line="269" w:lineRule="auto"/>
     </w:pPr>
     <w:rPr>
       <w:rFonts w:ascii="Noto Sans CJK TC" w:eastAsia="Noto Sans CJK TC" w:hAnsi="Noto Sans CJK TC"/>
       <w:color w:val="000000"/>
-      <w:sz w:val="20"/>
+      <w:sz w:val="24"/>
     </w:rPr>
   </w:style>
   <w:style w:type="paragraph" w:styleId="1">

</xml_diff>

<commit_message>
Apply local final wording and code presentation polish
</commit_message>
<xml_diff>
--- a/Floating_Point_Report_Q0.docx
+++ b/Floating_Point_Report_Q0.docx
@@ -2520,7 +2520,7 @@
         <w:spacing w:after="100" w:before="0"/>
       </w:pPr>
       <w:r>
-        <w:t>硬體以正負號、指數、有效數字儲存浮點數。float 的配置為 1／8／23 位，double 為 1／11／52 位；一般非零值還有隱含的最高位，所以有效位數為 24／53。x87 的 80 位元格式則有 1 位符號、15 位指數、64 位有效數字。加減先對齊指數，再捨入至可保存的位數；乘除也需調整指數與捨入。因此大數加上 1 時，這個增量可能存不下。[3][4]</w:t>
+        <w:t>硬體以正負號、指數、有效數字儲存浮點數。float 的配置為 1／8／23 位，double 為 1／11／52 位；正規值還有隱含的最高位，所以有效位數為 24／53。x87 的 80 位元格式則有 1 位符號、15 位指數、64 位有效數字。加減先對齊指數，再捨入至可保存的位數；乘除也需調整指數與捨入。因此大數加上 1 時，這個增量可能存不下。[3][4]</w:t>
       </w:r>
     </w:p>
     <w:p>
@@ -3707,7 +3707,7 @@
         </w:rPr>
       </w:pPr>
       <w:r>
-        <w:t>本機中點採末位為偶數的答案，向上／向下捨入則會改變輸出。較精確的描述是「把實際儲存值格式化至九位小數」，不能一概視為原始十進位數的逢五進一。[5b]</w:t>
+        <w:t>本機中點採末位為偶數的答案，保留第九位的 2，向上／向下捨入則會改變輸出。較精確的描述是「把實際儲存值格式化至九位小數」，不能一概視為原始十進位數的逢五進一。[5b]</w:t>
       </w:r>
     </w:p>
     <w:p>
@@ -3736,8 +3736,22 @@
     </w:p>
     <w:p>
       <w:pPr>
+        <w:keepNext/>
         <w:keepLines/>
         <w:spacing w:after="100" w:before="0"/>
+        <w:rPr>
+          <w:lang w:eastAsia="zh-TW"/>
+        </w:rPr>
+      </w:pPr>
+      <w:r>
+        <w:t>兩台均以 -O2 編譯，關閉 fast-math、FMA 與 LTO，保留 -frounding-math。為使中間值按平台的 long double 精度儲存，以下 GCC inline assembly 的記憶體約束要求 sum 先存回記憶體，再進行減法；輸入 a=2^53、b=1。</w:t>
+      </w:r>
+    </w:p>
+    <w:p>
+      <w:pPr>
+        <w:keepLines/>
+        <w:spacing w:after="100" w:before="0"/>
+        <w:ind w:left="173"/>
         <w:rPr>
           <w:lang w:eastAsia="zh-TW"/>
         </w:rPr>
@@ -3803,18 +3817,6 @@
           <w:sz w:val="20"/>
         </w:rPr>
         <w:t>圖 5-1 WSL：long double 有 64 個有效位，增量計算得到 1。</w:t>
-      </w:r>
-    </w:p>
-    <w:p>
-      <w:pPr>
-        <w:keepLines/>
-        <w:spacing w:after="100" w:before="0"/>
-        <w:rPr>
-          <w:lang w:eastAsia="zh-TW"/>
-        </w:rPr>
-      </w:pPr>
-      <w:r>
-        <w:t>兩台均以 -O2 編譯，關閉 fast-math、FMA 與 LTO，保留 -frounding-math。上面的 GCC 擴充要求中間答案存回平台的 long double 精度，再做減法；輸入 a=2^53、b=1。</w:t>
       </w:r>
     </w:p>
     <w:tbl>
@@ -4561,7 +4563,7 @@
         </w:rPr>
       </w:pPr>
       <w:r>
-        <w:t>學生親自執行 Windows／WSL Q0～Q6 與 Mac Q5 的平台比較，觀察、截圖並核對實驗結果。Codex／生成式 AI 協助程式撰寫與檢查、環境設定、準備階段測試、資料查閱、assembly 解讀及報告整理。</w:t>
+        <w:t>本人親自執行 Windows／WSL Q0～Q6 與 Mac Q5 的平台比較，觀察、截圖並核對實驗結果。Codex／生成式 AI 協助程式撰寫與檢查、環境設定、準備階段測試、資料查閱、assembly 解讀及報告整理。</w:t>
       </w:r>
     </w:p>
     <w:p>

</xml_diff>